<commit_message>
feat: add detailed tic diagram
</commit_message>
<xml_diff>
--- a/doc/report/executive_report.docx
+++ b/doc/report/executive_report.docx
@@ -1,6 +1,6 @@
 
 <file path=word/document.xml><?xml version="1.0" encoding="utf-8"?>
-<w:document xmlns:wpc="http://schemas.microsoft.com/office/word/2010/wordprocessingCanvas" xmlns:mc="http://schemas.openxmlformats.org/markup-compatibility/2006" xmlns:o="urn:schemas-microsoft-com:office:office" xmlns:r="http://schemas.openxmlformats.org/officeDocument/2006/relationships" xmlns:m="http://schemas.openxmlformats.org/officeDocument/2006/math" xmlns:v="urn:schemas-microsoft-com:vml" xmlns:wp14="http://schemas.microsoft.com/office/word/2010/wordprocessingDrawing" xmlns:wp="http://schemas.openxmlformats.org/drawingml/2006/wordprocessingDrawing" xmlns:w10="urn:schemas-microsoft-com:office:word" xmlns:w="http://schemas.openxmlformats.org/wordprocessingml/2006/main" xmlns:w14="http://schemas.microsoft.com/office/word/2010/wordml" xmlns:w15="http://schemas.microsoft.com/office/word/2012/wordml" xmlns:wpg="http://schemas.microsoft.com/office/word/2010/wordprocessingGroup" xmlns:wpi="http://schemas.microsoft.com/office/word/2010/wordprocessingInk" xmlns:wne="http://schemas.microsoft.com/office/word/2006/wordml" xmlns:wps="http://schemas.microsoft.com/office/word/2010/wordprocessingShape" mc:Ignorable="w14 w15 wp14">
+<w:document xmlns:wpc="http://schemas.microsoft.com/office/word/2010/wordprocessingCanvas" xmlns:cx="http://schemas.microsoft.com/office/drawing/2014/chartex" xmlns:cx1="http://schemas.microsoft.com/office/drawing/2015/9/8/chartex" xmlns:cx2="http://schemas.microsoft.com/office/drawing/2015/10/21/chartex" xmlns:cx3="http://schemas.microsoft.com/office/drawing/2016/5/9/chartex" xmlns:cx4="http://schemas.microsoft.com/office/drawing/2016/5/10/chartex" xmlns:cx5="http://schemas.microsoft.com/office/drawing/2016/5/11/chartex" xmlns:cx6="http://schemas.microsoft.com/office/drawing/2016/5/12/chartex" xmlns:cx7="http://schemas.microsoft.com/office/drawing/2016/5/13/chartex" xmlns:cx8="http://schemas.microsoft.com/office/drawing/2016/5/14/chartex" xmlns:mc="http://schemas.openxmlformats.org/markup-compatibility/2006" xmlns:aink="http://schemas.microsoft.com/office/drawing/2016/ink" xmlns:am3d="http://schemas.microsoft.com/office/drawing/2017/model3d" xmlns:o="urn:schemas-microsoft-com:office:office" xmlns:oel="http://schemas.microsoft.com/office/2019/extlst" xmlns:r="http://schemas.openxmlformats.org/officeDocument/2006/relationships" xmlns:m="http://schemas.openxmlformats.org/officeDocument/2006/math" xmlns:v="urn:schemas-microsoft-com:vml" xmlns:wp14="http://schemas.microsoft.com/office/word/2010/wordprocessingDrawing" xmlns:wp="http://schemas.openxmlformats.org/drawingml/2006/wordprocessingDrawing" xmlns:w10="urn:schemas-microsoft-com:office:word" xmlns:w="http://schemas.openxmlformats.org/wordprocessingml/2006/main" xmlns:w14="http://schemas.microsoft.com/office/word/2010/wordml" xmlns:w15="http://schemas.microsoft.com/office/word/2012/wordml" xmlns:w16cex="http://schemas.microsoft.com/office/word/2018/wordml/cex" xmlns:w16cid="http://schemas.microsoft.com/office/word/2016/wordml/cid" xmlns:w16="http://schemas.microsoft.com/office/word/2018/wordml" xmlns:w16du="http://schemas.microsoft.com/office/word/2023/wordml/word16du" xmlns:w16sdtdh="http://schemas.microsoft.com/office/word/2020/wordml/sdtdatahash" xmlns:w16sdtfl="http://schemas.microsoft.com/office/word/2024/wordml/sdtformatlock" xmlns:w16se="http://schemas.microsoft.com/office/word/2015/wordml/symex" xmlns:wpg="http://schemas.microsoft.com/office/word/2010/wordprocessingGroup" xmlns:wpi="http://schemas.microsoft.com/office/word/2010/wordprocessingInk" xmlns:wne="http://schemas.microsoft.com/office/word/2006/wordml" xmlns:wps="http://schemas.microsoft.com/office/word/2010/wordprocessingShape" mc:Ignorable="w14 w15 w16se w16cid w16 w16cex w16sdtdh w16sdtfl w16du wp14">
   <w:body>
     <w:p>
       <w:r>
@@ -139,8 +139,17 @@
           <w:b/>
           <w:sz w:val="52"/>
         </w:rPr>
-        <w:t xml:space="preserve"> para QuetzalDev</w:t>
-      </w:r>
+        <w:t xml:space="preserve"> para </w:t>
+      </w:r>
+      <w:proofErr w:type="spellStart"/>
+      <w:r>
+        <w:rPr>
+          <w:b/>
+          <w:sz w:val="52"/>
+        </w:rPr>
+        <w:t>QuetzalDev</w:t>
+      </w:r>
+      <w:proofErr w:type="spellEnd"/>
     </w:p>
     <w:p/>
     <w:p/>
@@ -258,29 +267,8 @@
                 <w:lang w:val="en-US"/>
               </w:rPr>
             </w:pPr>
-            <w:proofErr w:type="spellStart"/>
-            <w:r>
-              <w:t>Enner</w:t>
-            </w:r>
-            <w:proofErr w:type="spellEnd"/>
-            <w:r>
-              <w:t xml:space="preserve"> </w:t>
-            </w:r>
-            <w:proofErr w:type="spellStart"/>
-            <w:r>
-              <w:t>Esaí</w:t>
-            </w:r>
-            <w:proofErr w:type="spellEnd"/>
-            <w:r>
-              <w:t xml:space="preserve"> </w:t>
-            </w:r>
-            <w:proofErr w:type="spellStart"/>
-            <w:r>
-              <w:t>Mendizabal</w:t>
-            </w:r>
-            <w:proofErr w:type="spellEnd"/>
-            <w:r>
-              <w:t xml:space="preserve"> Castro</w:t>
+            <w:r>
+              <w:t>Enner Esaí Mendizabal Castro</w:t>
             </w:r>
           </w:p>
         </w:tc>
@@ -368,7 +356,6 @@
         <w:t xml:space="preserve"> DEL AÑO 2026</w:t>
       </w:r>
     </w:p>
-    <w:p/>
     <w:p>
       <w:pPr>
         <w:jc w:val="center"/>
@@ -380,6 +367,7 @@
         <w:rPr>
           <w:b/>
         </w:rPr>
+        <w:lastRenderedPageBreak/>
         <w:t>INDICE</w:t>
       </w:r>
     </w:p>
@@ -398,11 +386,10 @@
           <w:docPartUnique/>
         </w:docPartObj>
       </w:sdtPr>
-      <w:sdtEndPr/>
       <w:sdtContent>
         <w:p>
           <w:pPr>
-            <w:pStyle w:val="TtulodeTDC"/>
+            <w:pStyle w:val="TtuloTDC"/>
             <w:rPr>
               <w:sz w:val="2"/>
               <w:szCs w:val="2"/>
@@ -6945,7 +6932,15 @@
       </w:r>
       <w:proofErr w:type="spellEnd"/>
       <w:r>
-        <w:t xml:space="preserve"> para QuetzalDev, empresa tecnológica que busca ampliar su alcance digital mediante la comercialización de productos de software derivados de sus líneas de servicio: ERP, desarrollo web y desarrollo de aplicaciones móviles.</w:t>
+        <w:t xml:space="preserve"> para </w:t>
+      </w:r>
+      <w:proofErr w:type="spellStart"/>
+      <w:r>
+        <w:t>QuetzalDev</w:t>
+      </w:r>
+      <w:proofErr w:type="spellEnd"/>
+      <w:r>
+        <w:t>, empresa tecnológica que busca ampliar su alcance digital mediante la comercialización de productos de software derivados de sus líneas de servicio: ERP, desarrollo web y desarrollo de aplicaciones móviles.</w:t>
       </w:r>
     </w:p>
     <w:p>
@@ -7029,7 +7024,15 @@
       </w:r>
       <w:proofErr w:type="spellEnd"/>
       <w:r>
-        <w:t xml:space="preserve"> para QuetzalDev que justifique, desde el análisis estratégico y la planificación ágil, la comercialización de tres productos de software con potencial de escalabilidad y adopción en el mercado digital.</w:t>
+        <w:t xml:space="preserve"> para </w:t>
+      </w:r>
+      <w:proofErr w:type="spellStart"/>
+      <w:r>
+        <w:t>QuetzalDev</w:t>
+      </w:r>
+      <w:proofErr w:type="spellEnd"/>
+      <w:r>
+        <w:t xml:space="preserve"> que justifique, desde el análisis estratégico y la planificación ágil, la comercialización de tres productos de software con potencial de escalabilidad y adopción en el mercado digital.</w:t>
       </w:r>
     </w:p>
     <w:p>
@@ -7075,23 +7078,7 @@
       </w:r>
       <w:proofErr w:type="spellEnd"/>
       <w:r>
-        <w:t xml:space="preserve"> VUCA, </w:t>
-      </w:r>
-      <w:proofErr w:type="spellStart"/>
-      <w:r>
-        <w:t>Diamond</w:t>
-      </w:r>
-      <w:proofErr w:type="spellEnd"/>
-      <w:r>
-        <w:t xml:space="preserve">, PEST, </w:t>
-      </w:r>
-      <w:proofErr w:type="spellStart"/>
-      <w:r>
-        <w:t>Five</w:t>
-      </w:r>
-      <w:proofErr w:type="spellEnd"/>
-      <w:r>
-        <w:t xml:space="preserve"> </w:t>
+        <w:t xml:space="preserve"> VUCA, Diamond, PEST, Five </w:t>
       </w:r>
       <w:proofErr w:type="spellStart"/>
       <w:r>
@@ -7229,23 +7216,7 @@
         <w:ind w:firstLine="360"/>
       </w:pPr>
       <w:r>
-        <w:t xml:space="preserve">El informe incluirá la aplicación estructurada de los siete marcos solicitados (VUCA, </w:t>
-      </w:r>
-      <w:proofErr w:type="spellStart"/>
-      <w:r>
-        <w:t>Diamond</w:t>
-      </w:r>
-      <w:proofErr w:type="spellEnd"/>
-      <w:r>
-        <w:t xml:space="preserve">, PEST, </w:t>
-      </w:r>
-      <w:proofErr w:type="spellStart"/>
-      <w:r>
-        <w:t>Five</w:t>
-      </w:r>
-      <w:proofErr w:type="spellEnd"/>
-      <w:r>
-        <w:t xml:space="preserve"> </w:t>
+        <w:t xml:space="preserve">El informe incluirá la aplicación estructurada de los siete marcos solicitados (VUCA, Diamond, PEST, Five </w:t>
       </w:r>
       <w:proofErr w:type="spellStart"/>
       <w:r>
@@ -7427,14 +7398,9 @@
       </w:pPr>
       <w:bookmarkStart w:id="12" w:name="_Toc223906546"/>
       <w:r>
-        <w:t xml:space="preserve">Producto 1 (basado en ERP): </w:t>
-      </w:r>
-      <w:proofErr w:type="spellStart"/>
-      <w:r>
-        <w:t>SafeCase</w:t>
+        <w:t>Producto 1 (basado en ERP): SafeCase</w:t>
       </w:r>
       <w:bookmarkEnd w:id="12"/>
-      <w:proofErr w:type="spellEnd"/>
     </w:p>
     <w:p/>
     <w:p>
@@ -7839,15 +7805,7 @@
         </w:numPr>
       </w:pPr>
       <w:r>
-        <w:t xml:space="preserve">Relación con la línea de servicio: desarrollo de </w:t>
-      </w:r>
-      <w:proofErr w:type="spellStart"/>
-      <w:r>
-        <w:t>apps</w:t>
-      </w:r>
-      <w:proofErr w:type="spellEnd"/>
-      <w:r>
-        <w:t xml:space="preserve"> móviles.</w:t>
+        <w:t>Relación con la línea de servicio: desarrollo de apps móviles.</w:t>
       </w:r>
     </w:p>
     <w:p>
@@ -8021,15 +7979,7 @@
         </w:numPr>
       </w:pPr>
       <w:r>
-        <w:t xml:space="preserve">Unifica la gestión de dispositivos en una sola </w:t>
-      </w:r>
-      <w:proofErr w:type="spellStart"/>
-      <w:r>
-        <w:t>app</w:t>
-      </w:r>
-      <w:proofErr w:type="spellEnd"/>
-      <w:r>
-        <w:t>.</w:t>
+        <w:t>Unifica la gestión de dispositivos en una sola app.</w:t>
       </w:r>
     </w:p>
     <w:p/>
@@ -8237,7 +8187,15 @@
             </w:r>
             <w:proofErr w:type="spellEnd"/>
             <w:r>
-              <w:t xml:space="preserve"> para QuetzalDev que venda 3 productos de software a partir de sus servicios base</w:t>
+              <w:t xml:space="preserve"> para </w:t>
+            </w:r>
+            <w:proofErr w:type="spellStart"/>
+            <w:r>
+              <w:t>QuetzalDev</w:t>
+            </w:r>
+            <w:proofErr w:type="spellEnd"/>
+            <w:r>
+              <w:t xml:space="preserve"> que venda 3 productos de software a partir de sus servicios base</w:t>
             </w:r>
             <w:r>
               <w:t>.</w:t>
@@ -9087,7 +9045,23 @@
           <w:b/>
           <w:bCs/>
         </w:rPr>
-        <w:t xml:space="preserve"> de QuetzalDev con éxito operativo.</w:t>
+        <w:t xml:space="preserve"> de </w:t>
+      </w:r>
+      <w:proofErr w:type="spellStart"/>
+      <w:r>
+        <w:rPr>
+          <w:b/>
+          <w:bCs/>
+        </w:rPr>
+        <w:t>QuetzalDev</w:t>
+      </w:r>
+      <w:proofErr w:type="spellEnd"/>
+      <w:r>
+        <w:rPr>
+          <w:b/>
+          <w:bCs/>
+        </w:rPr>
+        <w:t xml:space="preserve"> con éxito operativo.</w:t>
       </w:r>
     </w:p>
     <w:p>
@@ -10044,7 +10018,15 @@
       </w:r>
       <w:proofErr w:type="spellEnd"/>
       <w:r>
-        <w:t xml:space="preserve"> funcional para QuetzalDev que centralice el catálogo de productos, habilite carrito de compras y permita simulación de compra, integrando criterios de negocio, arquitectura de información y planeación ágil.</w:t>
+        <w:t xml:space="preserve"> funcional para </w:t>
+      </w:r>
+      <w:proofErr w:type="spellStart"/>
+      <w:r>
+        <w:t>QuetzalDev</w:t>
+      </w:r>
+      <w:proofErr w:type="spellEnd"/>
+      <w:r>
+        <w:t xml:space="preserve"> que centralice el catálogo de productos, habilite carrito de compras y permita simulación de compra, integrando criterios de negocio, arquitectura de información y planeación ágil.</w:t>
       </w:r>
     </w:p>
     <w:p>
@@ -10059,13 +10041,8 @@
           <w:numId w:val="8"/>
         </w:numPr>
       </w:pPr>
-      <w:proofErr w:type="spellStart"/>
-      <w:r>
-        <w:t>SafeCase</w:t>
-      </w:r>
-      <w:proofErr w:type="spellEnd"/>
-      <w:r>
-        <w:t xml:space="preserve"> (ERP): gestión y prevención del acoso laboral en entornos corporativos.</w:t>
+      <w:r>
+        <w:t>SafeCase (ERP): gestión y prevención del acoso laboral en entornos corporativos.</w:t>
       </w:r>
     </w:p>
     <w:p>
@@ -10097,15 +10074,7 @@
       </w:r>
       <w:proofErr w:type="spellEnd"/>
       <w:r>
-        <w:t xml:space="preserve"> (Móvil): centralización de dispositivos </w:t>
-      </w:r>
-      <w:proofErr w:type="spellStart"/>
-      <w:r>
-        <w:t>domóticos</w:t>
-      </w:r>
-      <w:proofErr w:type="spellEnd"/>
-      <w:r>
-        <w:t xml:space="preserve"> en una sola aplicación.</w:t>
+        <w:t xml:space="preserve"> (Móvil): centralización de dispositivos domóticos en una sola aplicación.</w:t>
       </w:r>
     </w:p>
     <w:p>
@@ -10148,23 +10117,7 @@
       </w:r>
       <w:proofErr w:type="spellEnd"/>
       <w:r>
-        <w:t xml:space="preserve"> de análisis (VUCA, </w:t>
-      </w:r>
-      <w:proofErr w:type="spellStart"/>
-      <w:r>
-        <w:t>Diamond</w:t>
-      </w:r>
-      <w:proofErr w:type="spellEnd"/>
-      <w:r>
-        <w:t xml:space="preserve">, PEST, </w:t>
-      </w:r>
-      <w:proofErr w:type="spellStart"/>
-      <w:r>
-        <w:t>Five</w:t>
-      </w:r>
-      <w:proofErr w:type="spellEnd"/>
-      <w:r>
-        <w:t xml:space="preserve"> </w:t>
+        <w:t xml:space="preserve"> de análisis (VUCA, Diamond, PEST, Five </w:t>
       </w:r>
       <w:proofErr w:type="spellStart"/>
       <w:r>
@@ -10299,9 +10252,77 @@
       <w:pPr>
         <w:pStyle w:val="Ttulo2"/>
       </w:pPr>
+      <w:r>
+        <w:lastRenderedPageBreak/>
+        <w:t>Mapa Detallado</w:t>
+      </w:r>
+    </w:p>
+    <w:p>
+      <w:r>
+        <w:rPr>
+          <w:noProof/>
+        </w:rPr>
+        <w:drawing>
+          <wp:inline distT="0" distB="0" distL="0" distR="0" wp14:anchorId="1AD80CEE" wp14:editId="54536FB5">
+            <wp:extent cx="5827795" cy="6019613"/>
+            <wp:effectExtent l="0" t="0" r="1905" b="635"/>
+            <wp:docPr id="2007547770" name="Imagen 1"/>
+            <wp:cNvGraphicFramePr>
+              <a:graphicFrameLocks xmlns:a="http://schemas.openxmlformats.org/drawingml/2006/main" noChangeAspect="1"/>
+            </wp:cNvGraphicFramePr>
+            <a:graphic xmlns:a="http://schemas.openxmlformats.org/drawingml/2006/main">
+              <a:graphicData uri="http://schemas.openxmlformats.org/drawingml/2006/picture">
+                <pic:pic xmlns:pic="http://schemas.openxmlformats.org/drawingml/2006/picture">
+                  <pic:nvPicPr>
+                    <pic:cNvPr id="0" name="Picture 1"/>
+                    <pic:cNvPicPr>
+                      <a:picLocks noChangeAspect="1" noChangeArrowheads="1"/>
+                    </pic:cNvPicPr>
+                  </pic:nvPicPr>
+                  <pic:blipFill rotWithShape="1">
+                    <a:blip r:embed="rId11" cstate="print">
+                      <a:extLst>
+                        <a:ext uri="{28A0092B-C50C-407E-A947-70E740481C1C}">
+                          <a14:useLocalDpi xmlns:a14="http://schemas.microsoft.com/office/drawing/2010/main" val="0"/>
+                        </a:ext>
+                      </a:extLst>
+                    </a:blip>
+                    <a:srcRect l="499" t="1027" r="1047" b="776"/>
+                    <a:stretch>
+                      <a:fillRect/>
+                    </a:stretch>
+                  </pic:blipFill>
+                  <pic:spPr bwMode="auto">
+                    <a:xfrm>
+                      <a:off x="0" y="0"/>
+                      <a:ext cx="5849723" cy="6042263"/>
+                    </a:xfrm>
+                    <a:prstGeom prst="rect">
+                      <a:avLst/>
+                    </a:prstGeom>
+                    <a:noFill/>
+                    <a:ln>
+                      <a:noFill/>
+                    </a:ln>
+                    <a:extLst>
+                      <a:ext uri="{53640926-AAD7-44D8-BBD7-CCE9431645EC}">
+                        <a14:shadowObscured xmlns:a14="http://schemas.microsoft.com/office/drawing/2010/main"/>
+                      </a:ext>
+                    </a:extLst>
+                  </pic:spPr>
+                </pic:pic>
+              </a:graphicData>
+            </a:graphic>
+          </wp:inline>
+        </w:drawing>
+      </w:r>
+    </w:p>
+    <w:p>
+      <w:pPr>
+        <w:pStyle w:val="Ttulo2"/>
+      </w:pPr>
       <w:bookmarkStart w:id="26" w:name="_Toc223906560"/>
       <w:r>
-        <w:lastRenderedPageBreak/>
         <w:t xml:space="preserve">Descripción </w:t>
       </w:r>
       <w:r>
@@ -10447,6 +10468,7 @@
           <w:bCs/>
           <w:lang w:val="es-GT"/>
         </w:rPr>
+        <w:lastRenderedPageBreak/>
         <w:t>Función en el ecosistema:</w:t>
       </w:r>
       <w:r>
@@ -11044,49 +11066,49 @@
         <w:rPr>
           <w:lang w:val="es-GT"/>
         </w:rPr>
-        <w:t xml:space="preserve"> Vista dinámica </w:t>
+        <w:t xml:space="preserve"> Vista dinámica parametrizada por </w:t>
       </w:r>
       <w:proofErr w:type="spellStart"/>
       <w:r>
         <w:rPr>
           <w:lang w:val="es-GT"/>
         </w:rPr>
-        <w:t>parametrizada</w:t>
+        <w:t>productId</w:t>
       </w:r>
       <w:proofErr w:type="spellEnd"/>
       <w:r>
         <w:rPr>
           <w:lang w:val="es-GT"/>
         </w:rPr>
-        <w:t xml:space="preserve"> por </w:t>
+        <w:t xml:space="preserve"> que actúa como el primer punto de </w:t>
       </w:r>
       <w:proofErr w:type="spellStart"/>
       <w:r>
         <w:rPr>
           <w:lang w:val="es-GT"/>
         </w:rPr>
-        <w:t>productId</w:t>
+        <w:t>onboarding</w:t>
       </w:r>
       <w:proofErr w:type="spellEnd"/>
       <w:r>
         <w:rPr>
           <w:lang w:val="es-GT"/>
         </w:rPr>
-        <w:t xml:space="preserve"> que actúa como el primer punto de </w:t>
+        <w:t xml:space="preserve"> </w:t>
       </w:r>
       <w:proofErr w:type="spellStart"/>
       <w:r>
         <w:rPr>
           <w:lang w:val="es-GT"/>
         </w:rPr>
-        <w:t>onboarding</w:t>
+        <w:t>post-compra</w:t>
       </w:r>
       <w:proofErr w:type="spellEnd"/>
       <w:r>
         <w:rPr>
           <w:lang w:val="es-GT"/>
         </w:rPr>
-        <w:t xml:space="preserve"> post-compra. Muestra </w:t>
+        <w:t xml:space="preserve">. Muestra </w:t>
       </w:r>
       <w:proofErr w:type="spellStart"/>
       <w:r>
@@ -11380,7 +11402,6 @@
           <w:bCs/>
           <w:lang w:val="es-GT"/>
         </w:rPr>
-        <w:lastRenderedPageBreak/>
         <w:t>Descripción:</w:t>
       </w:r>
       <w:r>
@@ -11401,35 +11422,7 @@
         <w:rPr>
           <w:lang w:val="es-GT"/>
         </w:rPr>
-        <w:t xml:space="preserve"> (empresa, NIT, email) se sincronizan con un CRM (</w:t>
-      </w:r>
-      <w:proofErr w:type="spellStart"/>
-      <w:r>
-        <w:rPr>
-          <w:lang w:val="es-GT"/>
-        </w:rPr>
-        <w:t>HubSpot</w:t>
-      </w:r>
-      <w:proofErr w:type="spellEnd"/>
-      <w:r>
-        <w:rPr>
-          <w:lang w:val="es-GT"/>
-        </w:rPr>
-        <w:t xml:space="preserve"> Free o </w:t>
-      </w:r>
-      <w:proofErr w:type="spellStart"/>
-      <w:r>
-        <w:rPr>
-          <w:lang w:val="es-GT"/>
-        </w:rPr>
-        <w:t>Zoho</w:t>
-      </w:r>
-      <w:proofErr w:type="spellEnd"/>
-      <w:r>
-        <w:rPr>
-          <w:lang w:val="es-GT"/>
-        </w:rPr>
-        <w:t xml:space="preserve"> CRM) para construir perfiles de cliente, identificar oportunidades de </w:t>
+        <w:t xml:space="preserve"> (empresa, NIT, email) se sincronizan con un CRM (HubSpot Free o Zoho CRM) para construir perfiles de cliente, identificar oportunidades de </w:t>
       </w:r>
       <w:proofErr w:type="spellStart"/>
       <w:r>
@@ -11499,12 +11492,15 @@
       </w:r>
     </w:p>
     <w:p/>
+    <w:p/>
+    <w:p/>
     <w:p>
       <w:pPr>
         <w:pStyle w:val="Ttulo2"/>
       </w:pPr>
       <w:bookmarkStart w:id="33" w:name="_Toc223906567"/>
       <w:r>
+        <w:lastRenderedPageBreak/>
         <w:t>Justificación estratégica del mapeo</w:t>
       </w:r>
       <w:bookmarkEnd w:id="33"/>
@@ -11530,15 +11526,7 @@
       </w:r>
       <w:proofErr w:type="spellEnd"/>
       <w:r>
-        <w:t>) y transformar prospectos en clientes recurrentes, maximizando el LTV (</w:t>
-      </w:r>
-      <w:proofErr w:type="spellStart"/>
-      <w:r>
-        <w:t>Life</w:t>
-      </w:r>
-      <w:proofErr w:type="spellEnd"/>
-      <w:r>
-        <w:t xml:space="preserve"> Time </w:t>
+        <w:t xml:space="preserve">) y transformar prospectos en clientes recurrentes, maximizando el LTV (Life Time </w:t>
       </w:r>
       <w:proofErr w:type="spellStart"/>
       <w:r>
@@ -11587,15 +11575,7 @@
         <w:ind w:firstLine="708"/>
       </w:pPr>
       <w:r>
-        <w:t>Para construir un panorama competitivo útil para la toma de decisiones, se seleccionaron 10 competidores considerando relación funcional con los tres productos del portafolio (</w:t>
-      </w:r>
-      <w:proofErr w:type="spellStart"/>
-      <w:r>
-        <w:t>SafeCase</w:t>
-      </w:r>
-      <w:proofErr w:type="spellEnd"/>
-      <w:r>
-        <w:t xml:space="preserve">, </w:t>
+        <w:t xml:space="preserve">Para construir un panorama competitivo útil para la toma de decisiones, se seleccionaron 10 competidores considerando relación funcional con los tres productos del portafolio (SafeCase, </w:t>
       </w:r>
       <w:proofErr w:type="spellStart"/>
       <w:r>
@@ -11823,13 +11803,8 @@
             <w:pPr>
               <w:jc w:val="center"/>
             </w:pPr>
-            <w:proofErr w:type="spellStart"/>
-            <w:r>
-              <w:t>SafeCase</w:t>
-            </w:r>
-            <w:proofErr w:type="spellEnd"/>
-            <w:r>
-              <w:t xml:space="preserve"> (ERP de denuncias)</w:t>
+            <w:r>
+              <w:t>SafeCase (ERP de denuncias)</w:t>
             </w:r>
           </w:p>
         </w:tc>
@@ -11909,6 +11884,316 @@
             <w:proofErr w:type="spellStart"/>
             <w:r>
               <w:t>AllVoices</w:t>
+            </w:r>
+            <w:proofErr w:type="spellEnd"/>
+          </w:p>
+        </w:tc>
+        <w:tc>
+          <w:tcPr>
+            <w:tcW w:w="0" w:type="auto"/>
+            <w:vAlign w:val="center"/>
+          </w:tcPr>
+          <w:p>
+            <w:pPr>
+              <w:jc w:val="center"/>
+            </w:pPr>
+            <w:r>
+              <w:t>SafeCase (ERP de denuncias)</w:t>
+            </w:r>
+          </w:p>
+        </w:tc>
+        <w:tc>
+          <w:tcPr>
+            <w:tcW w:w="0" w:type="auto"/>
+            <w:vAlign w:val="center"/>
+          </w:tcPr>
+          <w:p>
+            <w:pPr>
+              <w:jc w:val="center"/>
+            </w:pPr>
+            <w:r>
+              <w:t>Directo</w:t>
+            </w:r>
+          </w:p>
+        </w:tc>
+        <w:tc>
+          <w:tcPr>
+            <w:tcW w:w="0" w:type="auto"/>
+            <w:vAlign w:val="center"/>
+          </w:tcPr>
+          <w:p>
+            <w:pPr>
+              <w:jc w:val="center"/>
+            </w:pPr>
+            <w:r>
+              <w:t xml:space="preserve">Reportes confidenciales de acoso y conductas indebidas con </w:t>
+            </w:r>
+            <w:proofErr w:type="spellStart"/>
+            <w:r>
+              <w:t>analytics</w:t>
+            </w:r>
+            <w:proofErr w:type="spellEnd"/>
+            <w:r>
+              <w:t xml:space="preserve"> para RRHH.</w:t>
+            </w:r>
+          </w:p>
+        </w:tc>
+        <w:tc>
+          <w:tcPr>
+            <w:tcW w:w="0" w:type="auto"/>
+            <w:vAlign w:val="center"/>
+          </w:tcPr>
+          <w:p>
+            <w:pPr>
+              <w:jc w:val="center"/>
+            </w:pPr>
+            <w:r>
+              <w:t>Diferenciarse con localización normativa y precios más accesibles.</w:t>
+            </w:r>
+          </w:p>
+        </w:tc>
+      </w:tr>
+      <w:tr>
+        <w:tc>
+          <w:tcPr>
+            <w:tcW w:w="0" w:type="auto"/>
+            <w:vAlign w:val="center"/>
+          </w:tcPr>
+          <w:p>
+            <w:pPr>
+              <w:jc w:val="center"/>
+              <w:rPr>
+                <w:b/>
+              </w:rPr>
+            </w:pPr>
+            <w:r>
+              <w:rPr>
+                <w:b/>
+              </w:rPr>
+              <w:t>3</w:t>
+            </w:r>
+          </w:p>
+        </w:tc>
+        <w:tc>
+          <w:tcPr>
+            <w:tcW w:w="0" w:type="auto"/>
+            <w:vAlign w:val="center"/>
+          </w:tcPr>
+          <w:p>
+            <w:pPr>
+              <w:jc w:val="center"/>
+            </w:pPr>
+            <w:proofErr w:type="spellStart"/>
+            <w:r>
+              <w:t>FaceUp</w:t>
+            </w:r>
+            <w:proofErr w:type="spellEnd"/>
+          </w:p>
+        </w:tc>
+        <w:tc>
+          <w:tcPr>
+            <w:tcW w:w="0" w:type="auto"/>
+            <w:vAlign w:val="center"/>
+          </w:tcPr>
+          <w:p>
+            <w:pPr>
+              <w:jc w:val="center"/>
+            </w:pPr>
+            <w:r>
+              <w:t>SafeCase (ERP de denuncias)</w:t>
+            </w:r>
+          </w:p>
+        </w:tc>
+        <w:tc>
+          <w:tcPr>
+            <w:tcW w:w="0" w:type="auto"/>
+            <w:vAlign w:val="center"/>
+          </w:tcPr>
+          <w:p>
+            <w:pPr>
+              <w:jc w:val="center"/>
+            </w:pPr>
+            <w:r>
+              <w:t>Directo</w:t>
+            </w:r>
+          </w:p>
+        </w:tc>
+        <w:tc>
+          <w:tcPr>
+            <w:tcW w:w="0" w:type="auto"/>
+            <w:vAlign w:val="center"/>
+          </w:tcPr>
+          <w:p>
+            <w:pPr>
+              <w:jc w:val="center"/>
+            </w:pPr>
+            <w:r>
+              <w:t xml:space="preserve">Plataforma de </w:t>
+            </w:r>
+            <w:proofErr w:type="spellStart"/>
+            <w:r>
+              <w:t>whistleblowing</w:t>
+            </w:r>
+            <w:proofErr w:type="spellEnd"/>
+            <w:r>
+              <w:t xml:space="preserve"> con enfoque en seguridad del denunciante.</w:t>
+            </w:r>
+          </w:p>
+        </w:tc>
+        <w:tc>
+          <w:tcPr>
+            <w:tcW w:w="0" w:type="auto"/>
+            <w:vAlign w:val="center"/>
+          </w:tcPr>
+          <w:p>
+            <w:pPr>
+              <w:jc w:val="center"/>
+            </w:pPr>
+            <w:r>
+              <w:t>Ofrecer implementación rápida y enfoque educativo para cultura organizacional.</w:t>
+            </w:r>
+          </w:p>
+        </w:tc>
+      </w:tr>
+      <w:tr>
+        <w:tc>
+          <w:tcPr>
+            <w:tcW w:w="0" w:type="auto"/>
+            <w:vAlign w:val="center"/>
+          </w:tcPr>
+          <w:p>
+            <w:pPr>
+              <w:jc w:val="center"/>
+              <w:rPr>
+                <w:b/>
+              </w:rPr>
+            </w:pPr>
+            <w:r>
+              <w:rPr>
+                <w:b/>
+              </w:rPr>
+              <w:t>4</w:t>
+            </w:r>
+          </w:p>
+        </w:tc>
+        <w:tc>
+          <w:tcPr>
+            <w:tcW w:w="0" w:type="auto"/>
+            <w:vAlign w:val="center"/>
+          </w:tcPr>
+          <w:p>
+            <w:pPr>
+              <w:jc w:val="center"/>
+            </w:pPr>
+            <w:r>
+              <w:t>Clio</w:t>
+            </w:r>
+          </w:p>
+        </w:tc>
+        <w:tc>
+          <w:tcPr>
+            <w:tcW w:w="0" w:type="auto"/>
+            <w:vAlign w:val="center"/>
+          </w:tcPr>
+          <w:p>
+            <w:pPr>
+              <w:jc w:val="center"/>
+            </w:pPr>
+            <w:proofErr w:type="spellStart"/>
+            <w:r>
+              <w:t>LegalFlow</w:t>
+            </w:r>
+            <w:proofErr w:type="spellEnd"/>
+            <w:r>
+              <w:t xml:space="preserve"> (gestión legal web)</w:t>
+            </w:r>
+          </w:p>
+        </w:tc>
+        <w:tc>
+          <w:tcPr>
+            <w:tcW w:w="0" w:type="auto"/>
+            <w:vAlign w:val="center"/>
+          </w:tcPr>
+          <w:p>
+            <w:pPr>
+              <w:jc w:val="center"/>
+            </w:pPr>
+            <w:r>
+              <w:t>Directo</w:t>
+            </w:r>
+          </w:p>
+        </w:tc>
+        <w:tc>
+          <w:tcPr>
+            <w:tcW w:w="0" w:type="auto"/>
+            <w:vAlign w:val="center"/>
+          </w:tcPr>
+          <w:p>
+            <w:pPr>
+              <w:jc w:val="center"/>
+            </w:pPr>
+            <w:r>
+              <w:t xml:space="preserve">Suite </w:t>
+            </w:r>
+            <w:proofErr w:type="spellStart"/>
+            <w:r>
+              <w:t>cloud</w:t>
+            </w:r>
+            <w:proofErr w:type="spellEnd"/>
+            <w:r>
+              <w:t xml:space="preserve"> para gestión de bufetes: casos, documentos, agenda y facturación.</w:t>
+            </w:r>
+          </w:p>
+        </w:tc>
+        <w:tc>
+          <w:tcPr>
+            <w:tcW w:w="0" w:type="auto"/>
+            <w:vAlign w:val="center"/>
+          </w:tcPr>
+          <w:p>
+            <w:pPr>
+              <w:jc w:val="center"/>
+            </w:pPr>
+            <w:r>
+              <w:t>Posicionarse como alternativa más económica para firmas pequeñas.</w:t>
+            </w:r>
+          </w:p>
+        </w:tc>
+      </w:tr>
+      <w:tr>
+        <w:tc>
+          <w:tcPr>
+            <w:tcW w:w="0" w:type="auto"/>
+            <w:vAlign w:val="center"/>
+          </w:tcPr>
+          <w:p>
+            <w:pPr>
+              <w:jc w:val="center"/>
+              <w:rPr>
+                <w:b/>
+              </w:rPr>
+            </w:pPr>
+            <w:r>
+              <w:rPr>
+                <w:b/>
+              </w:rPr>
+              <w:lastRenderedPageBreak/>
+              <w:t>5</w:t>
+            </w:r>
+          </w:p>
+        </w:tc>
+        <w:tc>
+          <w:tcPr>
+            <w:tcW w:w="0" w:type="auto"/>
+            <w:vAlign w:val="center"/>
+          </w:tcPr>
+          <w:p>
+            <w:pPr>
+              <w:jc w:val="center"/>
+            </w:pPr>
+            <w:proofErr w:type="spellStart"/>
+            <w:r>
+              <w:t>MyCase</w:t>
             </w:r>
             <w:proofErr w:type="spellEnd"/>
           </w:p>
@@ -11924,11 +12209,11 @@
             </w:pPr>
             <w:proofErr w:type="spellStart"/>
             <w:r>
-              <w:t>SafeCase</w:t>
+              <w:t>LegalFlow</w:t>
             </w:r>
             <w:proofErr w:type="spellEnd"/>
             <w:r>
-              <w:t xml:space="preserve"> (ERP de denuncias)</w:t>
+              <w:t xml:space="preserve"> (gestión legal web)</w:t>
             </w:r>
           </w:p>
         </w:tc>
@@ -11956,15 +12241,7 @@
               <w:jc w:val="center"/>
             </w:pPr>
             <w:r>
-              <w:t xml:space="preserve">Reportes confidenciales de acoso y conductas indebidas con </w:t>
-            </w:r>
-            <w:proofErr w:type="spellStart"/>
-            <w:r>
-              <w:t>analytics</w:t>
-            </w:r>
-            <w:proofErr w:type="spellEnd"/>
-            <w:r>
-              <w:t xml:space="preserve"> para RRHH.</w:t>
+              <w:t>Gestión legal integral con portal de cliente y pagos en línea.</w:t>
             </w:r>
           </w:p>
         </w:tc>
@@ -11978,7 +12255,15 @@
               <w:jc w:val="center"/>
             </w:pPr>
             <w:r>
-              <w:t>Diferenciarse con localización normativa y precios más accesibles.</w:t>
+              <w:t xml:space="preserve">Diferenciarse con UX más clara y </w:t>
+            </w:r>
+            <w:proofErr w:type="spellStart"/>
+            <w:r>
+              <w:t>onboarding</w:t>
+            </w:r>
+            <w:proofErr w:type="spellEnd"/>
+            <w:r>
+              <w:t xml:space="preserve"> guiado en español.</w:t>
             </w:r>
           </w:p>
         </w:tc>
@@ -12000,7 +12285,7 @@
               <w:rPr>
                 <w:b/>
               </w:rPr>
-              <w:t>3</w:t>
+              <w:t>6</w:t>
             </w:r>
           </w:p>
         </w:tc>
@@ -12015,7 +12300,7 @@
             </w:pPr>
             <w:proofErr w:type="spellStart"/>
             <w:r>
-              <w:t>FaceUp</w:t>
+              <w:t>PracticePanther</w:t>
             </w:r>
             <w:proofErr w:type="spellEnd"/>
           </w:p>
@@ -12031,11 +12316,11 @@
             </w:pPr>
             <w:proofErr w:type="spellStart"/>
             <w:r>
-              <w:t>SafeCase</w:t>
+              <w:t>LegalFlow</w:t>
             </w:r>
             <w:proofErr w:type="spellEnd"/>
             <w:r>
-              <w:t xml:space="preserve"> (ERP de denuncias)</w:t>
+              <w:t xml:space="preserve"> (gestión legal web)</w:t>
             </w:r>
           </w:p>
         </w:tc>
@@ -12063,15 +12348,7 @@
               <w:jc w:val="center"/>
             </w:pPr>
             <w:r>
-              <w:t xml:space="preserve">Plataforma de </w:t>
-            </w:r>
-            <w:proofErr w:type="spellStart"/>
-            <w:r>
-              <w:t>whistleblowing</w:t>
-            </w:r>
-            <w:proofErr w:type="spellEnd"/>
-            <w:r>
-              <w:t xml:space="preserve"> con enfoque en seguridad del denunciante.</w:t>
+              <w:t>Automatización de flujos de trabajo legales y control financiero por expediente.</w:t>
             </w:r>
           </w:p>
         </w:tc>
@@ -12085,7 +12362,7 @@
               <w:jc w:val="center"/>
             </w:pPr>
             <w:r>
-              <w:t>Ofrecer implementación rápida y enfoque educativo para cultura organizacional.</w:t>
+              <w:t>Enfocarse en simplicidad operativa para despachos en crecimiento.</w:t>
             </w:r>
           </w:p>
         </w:tc>
@@ -12107,7 +12384,7 @@
               <w:rPr>
                 <w:b/>
               </w:rPr>
-              <w:t>4</w:t>
+              <w:t>7</w:t>
             </w:r>
           </w:p>
         </w:tc>
@@ -12120,9 +12397,12 @@
             <w:pPr>
               <w:jc w:val="center"/>
             </w:pPr>
+            <w:r>
+              <w:t xml:space="preserve">Samsung </w:t>
+            </w:r>
             <w:proofErr w:type="spellStart"/>
             <w:r>
-              <w:t>Clio</w:t>
+              <w:t>SmartThings</w:t>
             </w:r>
             <w:proofErr w:type="spellEnd"/>
           </w:p>
@@ -12138,11 +12418,11 @@
             </w:pPr>
             <w:proofErr w:type="spellStart"/>
             <w:r>
-              <w:t>LegalFlow</w:t>
+              <w:t>HomeHub</w:t>
             </w:r>
             <w:proofErr w:type="spellEnd"/>
             <w:r>
-              <w:t xml:space="preserve"> (gestión legal web)</w:t>
+              <w:t xml:space="preserve"> (app domótica)</w:t>
             </w:r>
           </w:p>
         </w:tc>
@@ -12170,15 +12450,7 @@
               <w:jc w:val="center"/>
             </w:pPr>
             <w:r>
-              <w:t xml:space="preserve">Suite </w:t>
-            </w:r>
-            <w:proofErr w:type="spellStart"/>
-            <w:r>
-              <w:t>cloud</w:t>
-            </w:r>
-            <w:proofErr w:type="spellEnd"/>
-            <w:r>
-              <w:t xml:space="preserve"> para gestión de bufetes: casos, documentos, agenda y facturación.</w:t>
+              <w:t>Plataforma para control y automatización de dispositivos IoT del hogar.</w:t>
             </w:r>
           </w:p>
         </w:tc>
@@ -12192,7 +12464,7 @@
               <w:jc w:val="center"/>
             </w:pPr>
             <w:r>
-              <w:t>Posicionarse como alternativa más económica para firmas pequeñas.</w:t>
+              <w:t>Competir con una experiencia unificada centrada en facilidad de uso.</w:t>
             </w:r>
           </w:p>
         </w:tc>
@@ -12214,8 +12486,7 @@
               <w:rPr>
                 <w:b/>
               </w:rPr>
-              <w:lastRenderedPageBreak/>
-              <w:t>5</w:t>
+              <w:t>8</w:t>
             </w:r>
           </w:p>
         </w:tc>
@@ -12228,9 +12499,12 @@
             <w:pPr>
               <w:jc w:val="center"/>
             </w:pPr>
+            <w:r>
+              <w:t xml:space="preserve">Home </w:t>
+            </w:r>
             <w:proofErr w:type="spellStart"/>
             <w:r>
-              <w:t>MyCase</w:t>
+              <w:t>Assistant</w:t>
             </w:r>
             <w:proofErr w:type="spellEnd"/>
           </w:p>
@@ -12246,11 +12520,11 @@
             </w:pPr>
             <w:proofErr w:type="spellStart"/>
             <w:r>
-              <w:t>LegalFlow</w:t>
+              <w:t>HomeHub</w:t>
             </w:r>
             <w:proofErr w:type="spellEnd"/>
             <w:r>
-              <w:t xml:space="preserve"> (gestión legal web)</w:t>
+              <w:t xml:space="preserve"> (app domótica)</w:t>
             </w:r>
           </w:p>
         </w:tc>
@@ -12278,7 +12552,15 @@
               <w:jc w:val="center"/>
             </w:pPr>
             <w:r>
-              <w:t>Gestión legal integral con portal de cliente y pagos en línea.</w:t>
+              <w:t>Ecosistema de automatización open-</w:t>
+            </w:r>
+            <w:proofErr w:type="spellStart"/>
+            <w:r>
+              <w:t>source</w:t>
+            </w:r>
+            <w:proofErr w:type="spellEnd"/>
+            <w:r>
+              <w:t xml:space="preserve"> altamente configurable.</w:t>
             </w:r>
           </w:p>
         </w:tc>
@@ -12292,15 +12574,7 @@
               <w:jc w:val="center"/>
             </w:pPr>
             <w:r>
-              <w:t xml:space="preserve">Diferenciarse con UX más clara y </w:t>
-            </w:r>
-            <w:proofErr w:type="spellStart"/>
-            <w:r>
-              <w:t>onboarding</w:t>
-            </w:r>
-            <w:proofErr w:type="spellEnd"/>
-            <w:r>
-              <w:t xml:space="preserve"> guiado en español.</w:t>
+              <w:t>Diferenciarse con menor complejidad técnica para usuario no experto.</w:t>
             </w:r>
           </w:p>
         </w:tc>
@@ -12322,7 +12596,29 @@
               <w:rPr>
                 <w:b/>
               </w:rPr>
-              <w:t>6</w:t>
+              <w:t>9</w:t>
+            </w:r>
+          </w:p>
+        </w:tc>
+        <w:tc>
+          <w:tcPr>
+            <w:tcW w:w="0" w:type="auto"/>
+            <w:vAlign w:val="center"/>
+          </w:tcPr>
+          <w:p>
+            <w:pPr>
+              <w:jc w:val="center"/>
+            </w:pPr>
+            <w:r>
+              <w:t>Apple Home (</w:t>
+            </w:r>
+            <w:proofErr w:type="spellStart"/>
+            <w:r>
+              <w:t>HomeKit</w:t>
+            </w:r>
+            <w:proofErr w:type="spellEnd"/>
+            <w:r>
+              <w:t>)</w:t>
             </w:r>
           </w:p>
         </w:tc>
@@ -12337,9 +12633,90 @@
             </w:pPr>
             <w:proofErr w:type="spellStart"/>
             <w:r>
-              <w:t>PracticePanther</w:t>
+              <w:t>HomeHub</w:t>
             </w:r>
             <w:proofErr w:type="spellEnd"/>
+            <w:r>
+              <w:t xml:space="preserve"> (app domótica)</w:t>
+            </w:r>
+          </w:p>
+        </w:tc>
+        <w:tc>
+          <w:tcPr>
+            <w:tcW w:w="0" w:type="auto"/>
+            <w:vAlign w:val="center"/>
+          </w:tcPr>
+          <w:p>
+            <w:pPr>
+              <w:jc w:val="center"/>
+            </w:pPr>
+            <w:r>
+              <w:t>Indirecto</w:t>
+            </w:r>
+          </w:p>
+        </w:tc>
+        <w:tc>
+          <w:tcPr>
+            <w:tcW w:w="0" w:type="auto"/>
+            <w:vAlign w:val="center"/>
+          </w:tcPr>
+          <w:p>
+            <w:pPr>
+              <w:jc w:val="center"/>
+            </w:pPr>
+            <w:r>
+              <w:t>Integración de hogar inteligente dentro del ecosistema Apple.</w:t>
+            </w:r>
+          </w:p>
+        </w:tc>
+        <w:tc>
+          <w:tcPr>
+            <w:tcW w:w="0" w:type="auto"/>
+            <w:vAlign w:val="center"/>
+          </w:tcPr>
+          <w:p>
+            <w:pPr>
+              <w:jc w:val="center"/>
+            </w:pPr>
+            <w:r>
+              <w:t>Apostar por compatibilidad multiplataforma sin dependencia de marca.</w:t>
+            </w:r>
+          </w:p>
+        </w:tc>
+      </w:tr>
+      <w:tr>
+        <w:tc>
+          <w:tcPr>
+            <w:tcW w:w="0" w:type="auto"/>
+            <w:vAlign w:val="center"/>
+          </w:tcPr>
+          <w:p>
+            <w:pPr>
+              <w:jc w:val="center"/>
+              <w:rPr>
+                <w:b/>
+              </w:rPr>
+            </w:pPr>
+            <w:r>
+              <w:rPr>
+                <w:b/>
+              </w:rPr>
+              <w:t>10</w:t>
+            </w:r>
+          </w:p>
+        </w:tc>
+        <w:tc>
+          <w:tcPr>
+            <w:tcW w:w="0" w:type="auto"/>
+            <w:vAlign w:val="center"/>
+          </w:tcPr>
+          <w:p>
+            <w:pPr>
+              <w:jc w:val="center"/>
+            </w:pPr>
+            <w:r>
+              <w:t>Google Home</w:t>
+            </w:r>
           </w:p>
         </w:tc>
         <w:tc>
@@ -12353,11 +12730,11 @@
             </w:pPr>
             <w:proofErr w:type="spellStart"/>
             <w:r>
-              <w:t>LegalFlow</w:t>
+              <w:t>HomeHub</w:t>
             </w:r>
             <w:proofErr w:type="spellEnd"/>
             <w:r>
-              <w:t xml:space="preserve"> (gestión legal web)</w:t>
+              <w:t xml:space="preserve"> (app domótica)</w:t>
             </w:r>
           </w:p>
         </w:tc>
@@ -12371,7 +12748,7 @@
               <w:jc w:val="center"/>
             </w:pPr>
             <w:r>
-              <w:t>Directo</w:t>
+              <w:t>Indirecto</w:t>
             </w:r>
           </w:p>
         </w:tc>
@@ -12385,7 +12762,7 @@
               <w:jc w:val="center"/>
             </w:pPr>
             <w:r>
-              <w:t>Automatización de flujos de trabajo legales y control financiero por expediente.</w:t>
+              <w:t>Control por voz y automatizaciones conectadas a servicios Google.</w:t>
             </w:r>
           </w:p>
         </w:tc>
@@ -12399,452 +12776,6 @@
               <w:jc w:val="center"/>
             </w:pPr>
             <w:r>
-              <w:t>Enfocarse en simplicidad operativa para despachos en crecimiento.</w:t>
-            </w:r>
-          </w:p>
-        </w:tc>
-      </w:tr>
-      <w:tr>
-        <w:tc>
-          <w:tcPr>
-            <w:tcW w:w="0" w:type="auto"/>
-            <w:vAlign w:val="center"/>
-          </w:tcPr>
-          <w:p>
-            <w:pPr>
-              <w:jc w:val="center"/>
-              <w:rPr>
-                <w:b/>
-              </w:rPr>
-            </w:pPr>
-            <w:r>
-              <w:rPr>
-                <w:b/>
-              </w:rPr>
-              <w:t>7</w:t>
-            </w:r>
-          </w:p>
-        </w:tc>
-        <w:tc>
-          <w:tcPr>
-            <w:tcW w:w="0" w:type="auto"/>
-            <w:vAlign w:val="center"/>
-          </w:tcPr>
-          <w:p>
-            <w:pPr>
-              <w:jc w:val="center"/>
-            </w:pPr>
-            <w:r>
-              <w:t xml:space="preserve">Samsung </w:t>
-            </w:r>
-            <w:proofErr w:type="spellStart"/>
-            <w:r>
-              <w:t>SmartThings</w:t>
-            </w:r>
-            <w:proofErr w:type="spellEnd"/>
-          </w:p>
-        </w:tc>
-        <w:tc>
-          <w:tcPr>
-            <w:tcW w:w="0" w:type="auto"/>
-            <w:vAlign w:val="center"/>
-          </w:tcPr>
-          <w:p>
-            <w:pPr>
-              <w:jc w:val="center"/>
-            </w:pPr>
-            <w:proofErr w:type="spellStart"/>
-            <w:r>
-              <w:t>HomeHub</w:t>
-            </w:r>
-            <w:proofErr w:type="spellEnd"/>
-            <w:r>
-              <w:t xml:space="preserve"> (</w:t>
-            </w:r>
-            <w:proofErr w:type="spellStart"/>
-            <w:r>
-              <w:t>app</w:t>
-            </w:r>
-            <w:proofErr w:type="spellEnd"/>
-            <w:r>
-              <w:t xml:space="preserve"> domótica)</w:t>
-            </w:r>
-          </w:p>
-        </w:tc>
-        <w:tc>
-          <w:tcPr>
-            <w:tcW w:w="0" w:type="auto"/>
-            <w:vAlign w:val="center"/>
-          </w:tcPr>
-          <w:p>
-            <w:pPr>
-              <w:jc w:val="center"/>
-            </w:pPr>
-            <w:r>
-              <w:t>Directo</w:t>
-            </w:r>
-          </w:p>
-        </w:tc>
-        <w:tc>
-          <w:tcPr>
-            <w:tcW w:w="0" w:type="auto"/>
-            <w:vAlign w:val="center"/>
-          </w:tcPr>
-          <w:p>
-            <w:pPr>
-              <w:jc w:val="center"/>
-            </w:pPr>
-            <w:r>
-              <w:t>Plataforma para control y automatización de dispositivos IoT del hogar.</w:t>
-            </w:r>
-          </w:p>
-        </w:tc>
-        <w:tc>
-          <w:tcPr>
-            <w:tcW w:w="0" w:type="auto"/>
-            <w:vAlign w:val="center"/>
-          </w:tcPr>
-          <w:p>
-            <w:pPr>
-              <w:jc w:val="center"/>
-            </w:pPr>
-            <w:r>
-              <w:t>Competir con una experiencia unificada centrada en facilidad de uso.</w:t>
-            </w:r>
-          </w:p>
-        </w:tc>
-      </w:tr>
-      <w:tr>
-        <w:tc>
-          <w:tcPr>
-            <w:tcW w:w="0" w:type="auto"/>
-            <w:vAlign w:val="center"/>
-          </w:tcPr>
-          <w:p>
-            <w:pPr>
-              <w:jc w:val="center"/>
-              <w:rPr>
-                <w:b/>
-              </w:rPr>
-            </w:pPr>
-            <w:r>
-              <w:rPr>
-                <w:b/>
-              </w:rPr>
-              <w:t>8</w:t>
-            </w:r>
-          </w:p>
-        </w:tc>
-        <w:tc>
-          <w:tcPr>
-            <w:tcW w:w="0" w:type="auto"/>
-            <w:vAlign w:val="center"/>
-          </w:tcPr>
-          <w:p>
-            <w:pPr>
-              <w:jc w:val="center"/>
-            </w:pPr>
-            <w:r>
-              <w:t xml:space="preserve">Home </w:t>
-            </w:r>
-            <w:proofErr w:type="spellStart"/>
-            <w:r>
-              <w:t>Assistant</w:t>
-            </w:r>
-            <w:proofErr w:type="spellEnd"/>
-          </w:p>
-        </w:tc>
-        <w:tc>
-          <w:tcPr>
-            <w:tcW w:w="0" w:type="auto"/>
-            <w:vAlign w:val="center"/>
-          </w:tcPr>
-          <w:p>
-            <w:pPr>
-              <w:jc w:val="center"/>
-            </w:pPr>
-            <w:proofErr w:type="spellStart"/>
-            <w:r>
-              <w:t>HomeHub</w:t>
-            </w:r>
-            <w:proofErr w:type="spellEnd"/>
-            <w:r>
-              <w:t xml:space="preserve"> (</w:t>
-            </w:r>
-            <w:proofErr w:type="spellStart"/>
-            <w:r>
-              <w:t>app</w:t>
-            </w:r>
-            <w:proofErr w:type="spellEnd"/>
-            <w:r>
-              <w:t xml:space="preserve"> domótica)</w:t>
-            </w:r>
-          </w:p>
-        </w:tc>
-        <w:tc>
-          <w:tcPr>
-            <w:tcW w:w="0" w:type="auto"/>
-            <w:vAlign w:val="center"/>
-          </w:tcPr>
-          <w:p>
-            <w:pPr>
-              <w:jc w:val="center"/>
-            </w:pPr>
-            <w:r>
-              <w:t>Directo</w:t>
-            </w:r>
-          </w:p>
-        </w:tc>
-        <w:tc>
-          <w:tcPr>
-            <w:tcW w:w="0" w:type="auto"/>
-            <w:vAlign w:val="center"/>
-          </w:tcPr>
-          <w:p>
-            <w:pPr>
-              <w:jc w:val="center"/>
-            </w:pPr>
-            <w:r>
-              <w:t>Ecosistema de automatización open-</w:t>
-            </w:r>
-            <w:proofErr w:type="spellStart"/>
-            <w:r>
-              <w:t>source</w:t>
-            </w:r>
-            <w:proofErr w:type="spellEnd"/>
-            <w:r>
-              <w:t xml:space="preserve"> altamente configurable.</w:t>
-            </w:r>
-          </w:p>
-        </w:tc>
-        <w:tc>
-          <w:tcPr>
-            <w:tcW w:w="0" w:type="auto"/>
-            <w:vAlign w:val="center"/>
-          </w:tcPr>
-          <w:p>
-            <w:pPr>
-              <w:jc w:val="center"/>
-            </w:pPr>
-            <w:r>
-              <w:t>Diferenciarse con menor complejidad técnica para usuario no experto.</w:t>
-            </w:r>
-          </w:p>
-        </w:tc>
-      </w:tr>
-      <w:tr>
-        <w:tc>
-          <w:tcPr>
-            <w:tcW w:w="0" w:type="auto"/>
-            <w:vAlign w:val="center"/>
-          </w:tcPr>
-          <w:p>
-            <w:pPr>
-              <w:jc w:val="center"/>
-              <w:rPr>
-                <w:b/>
-              </w:rPr>
-            </w:pPr>
-            <w:r>
-              <w:rPr>
-                <w:b/>
-              </w:rPr>
-              <w:t>9</w:t>
-            </w:r>
-          </w:p>
-        </w:tc>
-        <w:tc>
-          <w:tcPr>
-            <w:tcW w:w="0" w:type="auto"/>
-            <w:vAlign w:val="center"/>
-          </w:tcPr>
-          <w:p>
-            <w:pPr>
-              <w:jc w:val="center"/>
-            </w:pPr>
-            <w:r>
-              <w:t>Apple Home (</w:t>
-            </w:r>
-            <w:proofErr w:type="spellStart"/>
-            <w:r>
-              <w:t>HomeKit</w:t>
-            </w:r>
-            <w:proofErr w:type="spellEnd"/>
-            <w:r>
-              <w:t>)</w:t>
-            </w:r>
-          </w:p>
-        </w:tc>
-        <w:tc>
-          <w:tcPr>
-            <w:tcW w:w="0" w:type="auto"/>
-            <w:vAlign w:val="center"/>
-          </w:tcPr>
-          <w:p>
-            <w:pPr>
-              <w:jc w:val="center"/>
-            </w:pPr>
-            <w:proofErr w:type="spellStart"/>
-            <w:r>
-              <w:t>HomeHub</w:t>
-            </w:r>
-            <w:proofErr w:type="spellEnd"/>
-            <w:r>
-              <w:t xml:space="preserve"> (</w:t>
-            </w:r>
-            <w:proofErr w:type="spellStart"/>
-            <w:r>
-              <w:t>app</w:t>
-            </w:r>
-            <w:proofErr w:type="spellEnd"/>
-            <w:r>
-              <w:t xml:space="preserve"> domótica)</w:t>
-            </w:r>
-          </w:p>
-        </w:tc>
-        <w:tc>
-          <w:tcPr>
-            <w:tcW w:w="0" w:type="auto"/>
-            <w:vAlign w:val="center"/>
-          </w:tcPr>
-          <w:p>
-            <w:pPr>
-              <w:jc w:val="center"/>
-            </w:pPr>
-            <w:r>
-              <w:t>Indirecto</w:t>
-            </w:r>
-          </w:p>
-        </w:tc>
-        <w:tc>
-          <w:tcPr>
-            <w:tcW w:w="0" w:type="auto"/>
-            <w:vAlign w:val="center"/>
-          </w:tcPr>
-          <w:p>
-            <w:pPr>
-              <w:jc w:val="center"/>
-            </w:pPr>
-            <w:r>
-              <w:t>Integración de hogar inteligente dentro del ecosistema Apple.</w:t>
-            </w:r>
-          </w:p>
-        </w:tc>
-        <w:tc>
-          <w:tcPr>
-            <w:tcW w:w="0" w:type="auto"/>
-            <w:vAlign w:val="center"/>
-          </w:tcPr>
-          <w:p>
-            <w:pPr>
-              <w:jc w:val="center"/>
-            </w:pPr>
-            <w:r>
-              <w:t>Apostar por compatibilidad multiplataforma sin dependencia de marca.</w:t>
-            </w:r>
-          </w:p>
-        </w:tc>
-      </w:tr>
-      <w:tr>
-        <w:tc>
-          <w:tcPr>
-            <w:tcW w:w="0" w:type="auto"/>
-            <w:vAlign w:val="center"/>
-          </w:tcPr>
-          <w:p>
-            <w:pPr>
-              <w:jc w:val="center"/>
-              <w:rPr>
-                <w:b/>
-              </w:rPr>
-            </w:pPr>
-            <w:r>
-              <w:rPr>
-                <w:b/>
-              </w:rPr>
-              <w:t>10</w:t>
-            </w:r>
-          </w:p>
-        </w:tc>
-        <w:tc>
-          <w:tcPr>
-            <w:tcW w:w="0" w:type="auto"/>
-            <w:vAlign w:val="center"/>
-          </w:tcPr>
-          <w:p>
-            <w:pPr>
-              <w:jc w:val="center"/>
-            </w:pPr>
-            <w:r>
-              <w:t>Google Home</w:t>
-            </w:r>
-          </w:p>
-        </w:tc>
-        <w:tc>
-          <w:tcPr>
-            <w:tcW w:w="0" w:type="auto"/>
-            <w:vAlign w:val="center"/>
-          </w:tcPr>
-          <w:p>
-            <w:pPr>
-              <w:jc w:val="center"/>
-            </w:pPr>
-            <w:proofErr w:type="spellStart"/>
-            <w:r>
-              <w:t>HomeHub</w:t>
-            </w:r>
-            <w:proofErr w:type="spellEnd"/>
-            <w:r>
-              <w:t xml:space="preserve"> (</w:t>
-            </w:r>
-            <w:proofErr w:type="spellStart"/>
-            <w:r>
-              <w:t>app</w:t>
-            </w:r>
-            <w:proofErr w:type="spellEnd"/>
-            <w:r>
-              <w:t xml:space="preserve"> domótica)</w:t>
-            </w:r>
-          </w:p>
-        </w:tc>
-        <w:tc>
-          <w:tcPr>
-            <w:tcW w:w="0" w:type="auto"/>
-            <w:vAlign w:val="center"/>
-          </w:tcPr>
-          <w:p>
-            <w:pPr>
-              <w:jc w:val="center"/>
-            </w:pPr>
-            <w:r>
-              <w:t>Indirecto</w:t>
-            </w:r>
-          </w:p>
-        </w:tc>
-        <w:tc>
-          <w:tcPr>
-            <w:tcW w:w="0" w:type="auto"/>
-            <w:vAlign w:val="center"/>
-          </w:tcPr>
-          <w:p>
-            <w:pPr>
-              <w:jc w:val="center"/>
-            </w:pPr>
-            <w:r>
-              <w:t>Control por voz y automatizaciones conectadas a servicios Google.</w:t>
-            </w:r>
-          </w:p>
-        </w:tc>
-        <w:tc>
-          <w:tcPr>
-            <w:tcW w:w="0" w:type="auto"/>
-            <w:vAlign w:val="center"/>
-          </w:tcPr>
-          <w:p>
-            <w:pPr>
-              <w:jc w:val="center"/>
-            </w:pPr>
-            <w:r>
               <w:t>Destacar privacidad, personalización y consolidación de dispositivos heterogéneos.</w:t>
             </w:r>
           </w:p>
@@ -12889,7 +12820,6 @@
           <w:lang w:val="en-US"/>
         </w:rPr>
       </w:pPr>
-      <w:bookmarkStart w:id="37" w:name="_GoBack"/>
     </w:p>
     <w:p>
       <w:pPr>
@@ -12904,11 +12834,11 @@
       <w:pPr>
         <w:pStyle w:val="Ttulo3"/>
       </w:pPr>
-      <w:bookmarkStart w:id="38" w:name="_Toc223906571"/>
+      <w:bookmarkStart w:id="37" w:name="_Toc223906571"/>
       <w:r>
         <w:t>Implicaciones estratégicas para QuetzalDev:</w:t>
       </w:r>
-      <w:bookmarkEnd w:id="38"/>
+      <w:bookmarkEnd w:id="37"/>
     </w:p>
     <w:p>
       <w:pPr>
@@ -12943,15 +12873,7 @@
         </w:numPr>
       </w:pPr>
       <w:r>
-        <w:t>Diferenciación por verticalidad de solución: mantener productos especializados por nicho (</w:t>
-      </w:r>
-      <w:proofErr w:type="spellStart"/>
-      <w:r>
-        <w:t>SafeCase</w:t>
-      </w:r>
-      <w:proofErr w:type="spellEnd"/>
-      <w:r>
-        <w:t xml:space="preserve">, </w:t>
+        <w:t xml:space="preserve">Diferenciación por verticalidad de solución: mantener productos especializados por nicho (SafeCase, </w:t>
       </w:r>
       <w:proofErr w:type="spellStart"/>
       <w:r>
@@ -12993,10 +12915,17 @@
       </w:r>
       <w:proofErr w:type="spellEnd"/>
       <w:r>
-        <w:t>: QuetzalDev puede competir de manera efectiva no intentando superar a los líderes en amplitud funcional, sino reduciendo fricción, acelerando implementación y entregando valor específico por industria con una propuesta comercial digital simple y directa.</w:t>
-      </w:r>
-    </w:p>
-    <w:bookmarkEnd w:id="37"/>
+        <w:t xml:space="preserve">: </w:t>
+      </w:r>
+      <w:proofErr w:type="spellStart"/>
+      <w:r>
+        <w:t>QuetzalDev</w:t>
+      </w:r>
+      <w:proofErr w:type="spellEnd"/>
+      <w:r>
+        <w:t xml:space="preserve"> puede competir de manera efectiva no intentando superar a los líderes en amplitud funcional, sino reduciendo fricción, acelerando implementación y entregando valor específico por industria con una propuesta comercial digital simple y directa.</w:t>
+      </w:r>
+    </w:p>
     <w:p/>
     <w:p/>
     <w:p/>
@@ -13013,12 +12942,12 @@
       <w:pPr>
         <w:pStyle w:val="Ttulo2"/>
       </w:pPr>
-      <w:bookmarkStart w:id="39" w:name="_Toc223906572"/>
+      <w:bookmarkStart w:id="38" w:name="_Toc223906572"/>
       <w:r>
         <w:lastRenderedPageBreak/>
         <w:t>Análisis VUCA</w:t>
       </w:r>
-      <w:bookmarkEnd w:id="39"/>
+      <w:bookmarkEnd w:id="38"/>
     </w:p>
     <w:p/>
     <w:p>
@@ -13218,35 +13147,21 @@
               <w:rPr>
                 <w:lang w:val="es-GT"/>
               </w:rPr>
-              <w:t xml:space="preserve">, Next.js, </w:t>
+              <w:t xml:space="preserve">, Next.js, Vue) y los ecosistemas </w:t>
             </w:r>
             <w:proofErr w:type="spellStart"/>
             <w:r>
               <w:rPr>
                 <w:lang w:val="es-GT"/>
               </w:rPr>
-              <w:t>Vue</w:t>
+              <w:t>IoT</w:t>
             </w:r>
             <w:proofErr w:type="spellEnd"/>
             <w:r>
               <w:rPr>
                 <w:lang w:val="es-GT"/>
               </w:rPr>
-              <w:t>) y los ecosistemas IoT (</w:t>
-            </w:r>
-            <w:proofErr w:type="spellStart"/>
-            <w:r>
-              <w:rPr>
-                <w:lang w:val="es-GT"/>
-              </w:rPr>
-              <w:t>Matter</w:t>
-            </w:r>
-            <w:proofErr w:type="spellEnd"/>
-            <w:r>
-              <w:rPr>
-                <w:lang w:val="es-GT"/>
-              </w:rPr>
-              <w:t xml:space="preserve">, </w:t>
+              <w:t xml:space="preserve"> (Matter, </w:t>
             </w:r>
             <w:proofErr w:type="spellStart"/>
             <w:r>
@@ -13363,21 +13278,7 @@
               <w:rPr>
                 <w:lang w:val="es-GT"/>
               </w:rPr>
-              <w:t xml:space="preserve"> laboral (</w:t>
-            </w:r>
-            <w:proofErr w:type="spellStart"/>
-            <w:r>
-              <w:rPr>
-                <w:lang w:val="es-GT"/>
-              </w:rPr>
-              <w:t>SafeCase</w:t>
-            </w:r>
-            <w:proofErr w:type="spellEnd"/>
-            <w:r>
-              <w:rPr>
-                <w:lang w:val="es-GT"/>
-              </w:rPr>
-              <w:t xml:space="preserve">) depende de cambios regulatorios impredecibles en legislación laboral guatemalteca; la adopción de </w:t>
+              <w:t xml:space="preserve"> laboral (SafeCase) depende de cambios regulatorios impredecibles en legislación laboral guatemalteca; la adopción de </w:t>
             </w:r>
             <w:proofErr w:type="spellStart"/>
             <w:r>
@@ -13410,21 +13311,7 @@
               <w:rPr>
                 <w:lang w:val="es-GT"/>
               </w:rPr>
-              <w:t xml:space="preserve">Diseñar </w:t>
-            </w:r>
-            <w:proofErr w:type="spellStart"/>
-            <w:r>
-              <w:rPr>
-                <w:lang w:val="es-GT"/>
-              </w:rPr>
-              <w:t>SafeCase</w:t>
-            </w:r>
-            <w:proofErr w:type="spellEnd"/>
-            <w:r>
-              <w:rPr>
-                <w:lang w:val="es-GT"/>
-              </w:rPr>
-              <w:t xml:space="preserve"> con adaptabilidad regulatoria modular; lanzar </w:t>
+              <w:t xml:space="preserve">Diseñar SafeCase con adaptabilidad regulatoria modular; lanzar </w:t>
             </w:r>
             <w:proofErr w:type="spellStart"/>
             <w:r>
@@ -13629,56 +13516,34 @@
           <w:lang w:val="es-GT"/>
         </w:rPr>
       </w:pPr>
-      <w:bookmarkStart w:id="40" w:name="_Toc223906573"/>
+      <w:bookmarkStart w:id="39" w:name="_Toc223906573"/>
       <w:r>
         <w:rPr>
           <w:lang w:val="es-GT"/>
         </w:rPr>
         <w:lastRenderedPageBreak/>
-        <w:t xml:space="preserve">Diamante de </w:t>
-      </w:r>
-      <w:proofErr w:type="spellStart"/>
-      <w:r>
-        <w:rPr>
-          <w:lang w:val="es-GT"/>
-        </w:rPr>
-        <w:t>Porter</w:t>
-      </w:r>
-      <w:bookmarkEnd w:id="40"/>
-      <w:proofErr w:type="spellEnd"/>
-    </w:p>
-    <w:p>
-      <w:pPr>
-        <w:rPr>
-          <w:lang w:val="es-GT"/>
-        </w:rPr>
-      </w:pPr>
-    </w:p>
-    <w:p>
-      <w:pPr>
-        <w:rPr>
-          <w:lang w:val="es-GT"/>
-        </w:rPr>
-      </w:pPr>
-      <w:r>
-        <w:rPr>
-          <w:lang w:val="es-GT"/>
-        </w:rPr>
-        <w:t xml:space="preserve">El Diamante de </w:t>
-      </w:r>
-      <w:proofErr w:type="spellStart"/>
-      <w:r>
-        <w:rPr>
-          <w:lang w:val="es-GT"/>
-        </w:rPr>
-        <w:t>Porter</w:t>
-      </w:r>
-      <w:proofErr w:type="spellEnd"/>
-      <w:r>
-        <w:rPr>
-          <w:lang w:val="es-GT"/>
-        </w:rPr>
-        <w:t xml:space="preserve"> analiza las ventajas competitivas nacionales/regionales que favorecen o limitan a QuetzalDev.</w:t>
+        <w:t>Diamante de Porter</w:t>
+      </w:r>
+      <w:bookmarkEnd w:id="39"/>
+    </w:p>
+    <w:p>
+      <w:pPr>
+        <w:rPr>
+          <w:lang w:val="es-GT"/>
+        </w:rPr>
+      </w:pPr>
+    </w:p>
+    <w:p>
+      <w:pPr>
+        <w:rPr>
+          <w:lang w:val="es-GT"/>
+        </w:rPr>
+      </w:pPr>
+      <w:r>
+        <w:rPr>
+          <w:lang w:val="es-GT"/>
+        </w:rPr>
+        <w:t>El Diamante de Porter analiza las ventajas competitivas nacionales/regionales que favorecen o limitan a QuetzalDev.</w:t>
       </w:r>
     </w:p>
     <w:p>
@@ -13805,7 +13670,21 @@
               <w:rPr>
                 <w:lang w:val="es-GT"/>
               </w:rPr>
-              <w:t>/IoT.</w:t>
+              <w:t>/</w:t>
+            </w:r>
+            <w:proofErr w:type="spellStart"/>
+            <w:r>
+              <w:rPr>
+                <w:lang w:val="es-GT"/>
+              </w:rPr>
+              <w:t>IoT</w:t>
+            </w:r>
+            <w:proofErr w:type="spellEnd"/>
+            <w:r>
+              <w:rPr>
+                <w:lang w:val="es-GT"/>
+              </w:rPr>
+              <w:t>.</w:t>
             </w:r>
           </w:p>
         </w:tc>
@@ -13941,63 +13820,21 @@
               <w:rPr>
                 <w:lang w:val="es-GT"/>
               </w:rPr>
-              <w:t xml:space="preserve">, AWS y </w:t>
+              <w:t xml:space="preserve">, AWS y Azure tienen presencia regional, reduciendo costos de hosting. Ecosistemas como Google Home y Amazon Alexa ya están en el mercado guatemalteco, facilitando la adopción de </w:t>
             </w:r>
             <w:proofErr w:type="spellStart"/>
             <w:r>
               <w:rPr>
                 <w:lang w:val="es-GT"/>
               </w:rPr>
-              <w:t>Azure</w:t>
+              <w:t>HomeHub</w:t>
             </w:r>
             <w:proofErr w:type="spellEnd"/>
             <w:r>
               <w:rPr>
                 <w:lang w:val="es-GT"/>
               </w:rPr>
-              <w:t xml:space="preserve"> tienen presencia regional, reduciendo costos de </w:t>
-            </w:r>
-            <w:proofErr w:type="spellStart"/>
-            <w:r>
-              <w:rPr>
-                <w:lang w:val="es-GT"/>
-              </w:rPr>
-              <w:t>hosting</w:t>
-            </w:r>
-            <w:proofErr w:type="spellEnd"/>
-            <w:r>
-              <w:rPr>
-                <w:lang w:val="es-GT"/>
-              </w:rPr>
-              <w:t xml:space="preserve">. Ecosistemas como Google Home y Amazon Alexa ya están en el mercado guatemalteco, facilitando la adopción de </w:t>
-            </w:r>
-            <w:proofErr w:type="spellStart"/>
-            <w:r>
-              <w:rPr>
-                <w:lang w:val="es-GT"/>
-              </w:rPr>
-              <w:t>HomeHub</w:t>
-            </w:r>
-            <w:proofErr w:type="spellEnd"/>
-            <w:r>
-              <w:rPr>
-                <w:lang w:val="es-GT"/>
-              </w:rPr>
-              <w:t>. La industria de telecomunicaciones (</w:t>
-            </w:r>
-            <w:proofErr w:type="spellStart"/>
-            <w:r>
-              <w:rPr>
-                <w:lang w:val="es-GT"/>
-              </w:rPr>
-              <w:t>Tigo</w:t>
-            </w:r>
-            <w:proofErr w:type="spellEnd"/>
-            <w:r>
-              <w:rPr>
-                <w:lang w:val="es-GT"/>
-              </w:rPr>
-              <w:t>, Claro) impulsa la conectividad necesaria para productos IoT.</w:t>
+              <w:t>. La industria de telecomunicaciones (Tigo, Claro) impulsa la conectividad necesaria para productos IoT.</w:t>
             </w:r>
           </w:p>
         </w:tc>
@@ -14124,7 +13961,7 @@
           <w:lang w:val="es-GT"/>
         </w:rPr>
       </w:pPr>
-      <w:bookmarkStart w:id="41" w:name="_Toc223906574"/>
+      <w:bookmarkStart w:id="40" w:name="_Toc223906574"/>
       <w:r>
         <w:rPr>
           <w:lang w:val="es-GT"/>
@@ -14132,7 +13969,7 @@
         <w:lastRenderedPageBreak/>
         <w:t>Análisis PEST</w:t>
       </w:r>
-      <w:bookmarkEnd w:id="41"/>
+      <w:bookmarkEnd w:id="40"/>
     </w:p>
     <w:p>
       <w:pPr>
@@ -14286,19 +14123,11 @@
                 <w:lang w:val="es-GT"/>
               </w:rPr>
             </w:pPr>
-            <w:proofErr w:type="spellStart"/>
-            <w:r>
-              <w:rPr>
-                <w:lang w:val="es-GT"/>
-              </w:rPr>
-              <w:t>SafeCase</w:t>
-            </w:r>
-            <w:proofErr w:type="spellEnd"/>
-            <w:r>
-              <w:rPr>
-                <w:lang w:val="es-GT"/>
-              </w:rPr>
-              <w:t xml:space="preserve"> se beneficia de mayor regulación laboral. Riesgo moderado por protección de datos; mitigación con cifrado.</w:t>
+            <w:r>
+              <w:rPr>
+                <w:lang w:val="es-GT"/>
+              </w:rPr>
+              <w:t>SafeCase se beneficia de mayor regulación laboral. Riesgo moderado por protección de datos; mitigación con cifrado.</w:t>
             </w:r>
           </w:p>
         </w:tc>
@@ -14482,21 +14311,21 @@
               <w:rPr>
                 <w:lang w:val="es-GT"/>
               </w:rPr>
-              <w:t xml:space="preserve">Expansión 5G; dispositivos IoT con </w:t>
+              <w:t xml:space="preserve">Expansión 5G; dispositivos </w:t>
             </w:r>
             <w:proofErr w:type="spellStart"/>
             <w:r>
               <w:rPr>
                 <w:lang w:val="es-GT"/>
               </w:rPr>
-              <w:t>Matter</w:t>
+              <w:t>IoT</w:t>
             </w:r>
             <w:proofErr w:type="spellEnd"/>
             <w:r>
               <w:rPr>
                 <w:lang w:val="es-GT"/>
               </w:rPr>
-              <w:t xml:space="preserve">; estandarización de </w:t>
+              <w:t xml:space="preserve"> con Matter; estandarización de </w:t>
             </w:r>
             <w:proofErr w:type="spellStart"/>
             <w:r>
@@ -14570,22 +14399,14 @@
           <w:lang w:val="es-GT"/>
         </w:rPr>
       </w:pPr>
-      <w:bookmarkStart w:id="42" w:name="_Toc223906575"/>
-      <w:r>
-        <w:rPr>
-          <w:lang w:val="es-GT"/>
-        </w:rPr>
-        <w:t xml:space="preserve">Las 5 Fuerzas de </w:t>
-      </w:r>
-      <w:proofErr w:type="spellStart"/>
-      <w:r>
-        <w:rPr>
-          <w:lang w:val="es-GT"/>
-        </w:rPr>
-        <w:t>Porter</w:t>
-      </w:r>
-      <w:bookmarkEnd w:id="42"/>
-      <w:proofErr w:type="spellEnd"/>
+      <w:bookmarkStart w:id="41" w:name="_Toc223906575"/>
+      <w:r>
+        <w:rPr>
+          <w:lang w:val="es-GT"/>
+        </w:rPr>
+        <w:t>Las 5 Fuerzas de Porter</w:t>
+      </w:r>
+      <w:bookmarkEnd w:id="41"/>
     </w:p>
     <w:p>
       <w:pPr>
@@ -14594,7 +14415,7 @@
           <w:lang w:val="es-GT"/>
         </w:rPr>
       </w:pPr>
-      <w:bookmarkStart w:id="43" w:name="_Toc223906576"/>
+      <w:bookmarkStart w:id="42" w:name="_Toc223906576"/>
       <w:r>
         <w:rPr>
           <w:lang w:val="es-GT"/>
@@ -14609,7 +14430,7 @@
         </w:rPr>
         <w:t>Media-Alta</w:t>
       </w:r>
-      <w:bookmarkEnd w:id="43"/>
+      <w:bookmarkEnd w:id="42"/>
     </w:p>
     <w:p>
       <w:pPr>
@@ -14663,21 +14484,7 @@
         <w:rPr>
           <w:lang w:val="es-GT"/>
         </w:rPr>
-        <w:t xml:space="preserve">) con catálogos de miles de productos introduce una presión de precio permanente. La rivalidad aumenta si actores regionales como </w:t>
-      </w:r>
-      <w:proofErr w:type="spellStart"/>
-      <w:r>
-        <w:rPr>
-          <w:lang w:val="es-GT"/>
-        </w:rPr>
-        <w:t>ContaPyme</w:t>
-      </w:r>
-      <w:proofErr w:type="spellEnd"/>
-      <w:r>
-        <w:rPr>
-          <w:lang w:val="es-GT"/>
-        </w:rPr>
-        <w:t xml:space="preserve"> o Bitrix24 deciden expandirse al mercado guatemalteco con campañas agresivas.</w:t>
+        <w:t>) con catálogos de miles de productos introduce una presión de precio permanente. La rivalidad aumenta si actores regionales como ContaPyme o Bitrix24 deciden expandirse al mercado guatemalteco con campañas agresivas.</w:t>
       </w:r>
     </w:p>
     <w:p>
@@ -14694,7 +14501,7 @@
           <w:lang w:val="es-GT"/>
         </w:rPr>
       </w:pPr>
-      <w:bookmarkStart w:id="44" w:name="_Toc223906577"/>
+      <w:bookmarkStart w:id="43" w:name="_Toc223906577"/>
       <w:r>
         <w:rPr>
           <w:lang w:val="es-GT"/>
@@ -14709,7 +14516,7 @@
         </w:rPr>
         <w:t>Alta</w:t>
       </w:r>
-      <w:bookmarkEnd w:id="44"/>
+      <w:bookmarkEnd w:id="43"/>
     </w:p>
     <w:p>
       <w:pPr>
@@ -14745,7 +14552,6 @@
         <w:t xml:space="preserve">Sin embargo, la barrera real para QuetzalDev es la diferenciación por soporte local, conocimiento regulatorio guatemalteco </w:t>
       </w:r>
       <w:proofErr w:type="spellStart"/>
-      <w:proofErr w:type="gramStart"/>
       <w:r>
         <w:rPr>
           <w:lang w:val="es-GT"/>
@@ -14753,7 +14559,6 @@
         <w:t>y</w:t>
       </w:r>
       <w:proofErr w:type="spellEnd"/>
-      <w:proofErr w:type="gramEnd"/>
       <w:r>
         <w:rPr>
           <w:lang w:val="es-GT"/>
@@ -14789,7 +14594,7 @@
           <w:lang w:val="es-GT"/>
         </w:rPr>
       </w:pPr>
-      <w:bookmarkStart w:id="45" w:name="_Toc223906578"/>
+      <w:bookmarkStart w:id="44" w:name="_Toc223906578"/>
       <w:r>
         <w:rPr>
           <w:lang w:val="es-GT"/>
@@ -14805,7 +14610,7 @@
         </w:rPr>
         <w:t>Bajo</w:t>
       </w:r>
-      <w:bookmarkEnd w:id="45"/>
+      <w:bookmarkEnd w:id="44"/>
     </w:p>
     <w:p>
       <w:pPr>
@@ -14883,7 +14688,7 @@
           <w:lang w:val="es-GT"/>
         </w:rPr>
       </w:pPr>
-      <w:bookmarkStart w:id="46" w:name="_Toc223906579"/>
+      <w:bookmarkStart w:id="45" w:name="_Toc223906579"/>
       <w:r>
         <w:rPr>
           <w:lang w:val="es-GT"/>
@@ -14898,7 +14703,7 @@
         </w:rPr>
         <w:t>Media</w:t>
       </w:r>
-      <w:bookmarkEnd w:id="46"/>
+      <w:bookmarkEnd w:id="45"/>
     </w:p>
     <w:p>
       <w:pPr>
@@ -14934,7 +14739,7 @@
           <w:lang w:val="es-GT"/>
         </w:rPr>
       </w:pPr>
-      <w:bookmarkStart w:id="47" w:name="_Toc223906580"/>
+      <w:bookmarkStart w:id="46" w:name="_Toc223906580"/>
       <w:r>
         <w:rPr>
           <w:lang w:val="es-GT"/>
@@ -14949,7 +14754,7 @@
         </w:rPr>
         <w:t>Media</w:t>
       </w:r>
-      <w:bookmarkEnd w:id="47"/>
+      <w:bookmarkEnd w:id="46"/>
     </w:p>
     <w:p>
       <w:pPr>
@@ -14978,21 +14783,7 @@
         <w:rPr>
           <w:lang w:val="es-GT"/>
         </w:rPr>
-        <w:t>Excel/</w:t>
-      </w:r>
-      <w:proofErr w:type="spellStart"/>
-      <w:r>
-        <w:rPr>
-          <w:lang w:val="es-GT"/>
-        </w:rPr>
-        <w:t>Sheets</w:t>
-      </w:r>
-      <w:proofErr w:type="spellEnd"/>
-      <w:r>
-        <w:rPr>
-          <w:lang w:val="es-GT"/>
-        </w:rPr>
-        <w:t xml:space="preserve"> para gestión de casos legales,</w:t>
+        <w:t>Excel/Sheets para gestión de casos legales,</w:t>
       </w:r>
     </w:p>
     <w:p>
@@ -15005,19 +14796,11 @@
           <w:lang w:val="es-GT"/>
         </w:rPr>
       </w:pPr>
-      <w:proofErr w:type="spellStart"/>
-      <w:r>
-        <w:rPr>
-          <w:lang w:val="es-GT"/>
-        </w:rPr>
-        <w:t>WhatsApp</w:t>
-      </w:r>
-      <w:proofErr w:type="spellEnd"/>
-      <w:r>
-        <w:rPr>
-          <w:lang w:val="es-GT"/>
-        </w:rPr>
-        <w:t>/correo para denuncias laborales,</w:t>
+      <w:r>
+        <w:rPr>
+          <w:lang w:val="es-GT"/>
+        </w:rPr>
+        <w:t>WhatsApp/correo para denuncias laborales,</w:t>
       </w:r>
     </w:p>
     <w:p>
@@ -15155,7 +14938,7 @@
           <w:lang w:val="es-GT"/>
         </w:rPr>
       </w:pPr>
-      <w:bookmarkStart w:id="48" w:name="_Toc223906581"/>
+      <w:bookmarkStart w:id="47" w:name="_Toc223906581"/>
       <w:r>
         <w:rPr>
           <w:lang w:val="es-GT"/>
@@ -15163,7 +14946,7 @@
         <w:lastRenderedPageBreak/>
         <w:t>Análisis SWOT / FODA</w:t>
       </w:r>
-      <w:bookmarkEnd w:id="48"/>
+      <w:bookmarkEnd w:id="47"/>
     </w:p>
     <w:p>
       <w:pPr>
@@ -15640,21 +15423,7 @@
                 <w:lang w:val="es-GT"/>
               </w:rPr>
               <w:br/>
-              <w:t xml:space="preserve">A5. Cambios regulatorios para </w:t>
-            </w:r>
-            <w:proofErr w:type="spellStart"/>
-            <w:r>
-              <w:rPr>
-                <w:lang w:val="es-GT"/>
-              </w:rPr>
-              <w:t>SafeCase</w:t>
-            </w:r>
-            <w:proofErr w:type="spellEnd"/>
-            <w:r>
-              <w:rPr>
-                <w:lang w:val="es-GT"/>
-              </w:rPr>
-              <w:t>.</w:t>
+              <w:t>A5. Cambios regulatorios para SafeCase.</w:t>
             </w:r>
           </w:p>
         </w:tc>
@@ -15723,7 +15492,7 @@
           <w:lang w:val="es-GT"/>
         </w:rPr>
       </w:pPr>
-      <w:bookmarkStart w:id="49" w:name="_Toc223906582"/>
+      <w:bookmarkStart w:id="48" w:name="_Toc223906582"/>
       <w:r>
         <w:rPr>
           <w:lang w:val="es-GT"/>
@@ -15731,7 +15500,7 @@
         <w:lastRenderedPageBreak/>
         <w:t>Análisis TOWS / CAME</w:t>
       </w:r>
-      <w:bookmarkEnd w:id="49"/>
+      <w:bookmarkEnd w:id="48"/>
     </w:p>
     <w:p>
       <w:pPr>
@@ -15918,21 +15687,7 @@
               <w:rPr>
                 <w:lang w:val="es-GT"/>
               </w:rPr>
-              <w:t xml:space="preserve">F5+F3+O1+O5 → modelo de reventa para </w:t>
-            </w:r>
-            <w:proofErr w:type="spellStart"/>
-            <w:r>
-              <w:rPr>
-                <w:lang w:val="es-GT"/>
-              </w:rPr>
-              <w:t>SafeCase</w:t>
-            </w:r>
-            <w:proofErr w:type="spellEnd"/>
-            <w:r>
-              <w:rPr>
-                <w:lang w:val="es-GT"/>
-              </w:rPr>
-              <w:t>.</w:t>
+              <w:t>F5+F3+O1+O5 → modelo de reventa para SafeCase.</w:t>
             </w:r>
           </w:p>
         </w:tc>
@@ -16008,21 +15763,7 @@
               <w:rPr>
                 <w:lang w:val="es-GT"/>
               </w:rPr>
-              <w:t xml:space="preserve"> como </w:t>
-            </w:r>
-            <w:proofErr w:type="spellStart"/>
-            <w:r>
-              <w:rPr>
-                <w:lang w:val="es-GT"/>
-              </w:rPr>
-              <w:t>app</w:t>
-            </w:r>
-            <w:proofErr w:type="spellEnd"/>
-            <w:r>
-              <w:rPr>
-                <w:lang w:val="es-GT"/>
-              </w:rPr>
-              <w:t xml:space="preserve"> local con soporte en español.</w:t>
+              <w:t xml:space="preserve"> como app local con soporte en español.</w:t>
             </w:r>
           </w:p>
         </w:tc>
@@ -16138,36 +15879,8 @@
                 <w:bCs/>
                 <w:lang w:val="es-GT"/>
               </w:rPr>
-              <w:t xml:space="preserve">FA1 — </w:t>
-            </w:r>
-            <w:proofErr w:type="spellStart"/>
-            <w:r>
-              <w:rPr>
-                <w:b/>
-                <w:bCs/>
-                <w:lang w:val="es-GT"/>
-              </w:rPr>
-              <w:t>Moat</w:t>
-            </w:r>
-            <w:proofErr w:type="spellEnd"/>
-            <w:r>
-              <w:rPr>
-                <w:b/>
-                <w:bCs/>
-                <w:lang w:val="es-GT"/>
-              </w:rPr>
-              <w:t xml:space="preserve"> regulatorio para </w:t>
-            </w:r>
-            <w:proofErr w:type="spellStart"/>
-            <w:r>
-              <w:rPr>
-                <w:b/>
-                <w:bCs/>
-                <w:lang w:val="es-GT"/>
-              </w:rPr>
-              <w:t>SafeCase</w:t>
-            </w:r>
-            <w:proofErr w:type="spellEnd"/>
+              <w:t>FA1 — Moat regulatorio para SafeCase</w:t>
+            </w:r>
           </w:p>
         </w:tc>
         <w:tc>
@@ -16585,21 +16298,7 @@
               <w:rPr>
                 <w:lang w:val="es-GT"/>
               </w:rPr>
-              <w:t xml:space="preserve">D1+A3 → contenido en </w:t>
-            </w:r>
-            <w:proofErr w:type="spellStart"/>
-            <w:r>
-              <w:rPr>
-                <w:lang w:val="es-GT"/>
-              </w:rPr>
-              <w:t>LinkedIn</w:t>
-            </w:r>
-            <w:proofErr w:type="spellEnd"/>
-            <w:r>
-              <w:rPr>
-                <w:lang w:val="es-GT"/>
-              </w:rPr>
-              <w:t>/YouTube para construir confianza.</w:t>
+              <w:t>D1+A3 → contenido en LinkedIn/YouTube para construir confianza.</w:t>
             </w:r>
           </w:p>
         </w:tc>
@@ -16670,7 +16369,7 @@
           <w:lang w:val="es-GT"/>
         </w:rPr>
       </w:pPr>
-      <w:bookmarkStart w:id="50" w:name="_Toc223906583"/>
+      <w:bookmarkStart w:id="49" w:name="_Toc223906583"/>
       <w:r>
         <w:rPr>
           <w:lang w:val="es-GT"/>
@@ -16678,7 +16377,7 @@
         <w:lastRenderedPageBreak/>
         <w:t>Análisis SOAR</w:t>
       </w:r>
-      <w:bookmarkEnd w:id="50"/>
+      <w:bookmarkEnd w:id="49"/>
     </w:p>
     <w:p>
       <w:pPr>
@@ -16806,21 +16505,7 @@
               <w:rPr>
                 <w:lang w:val="es-GT"/>
               </w:rPr>
-              <w:t xml:space="preserve">; tres verticales diferenciados; UX </w:t>
-            </w:r>
-            <w:proofErr w:type="spellStart"/>
-            <w:r>
-              <w:rPr>
-                <w:lang w:val="es-GT"/>
-              </w:rPr>
-              <w:t>premium</w:t>
-            </w:r>
-            <w:proofErr w:type="spellEnd"/>
-            <w:r>
-              <w:rPr>
-                <w:lang w:val="es-GT"/>
-              </w:rPr>
-              <w:t>; precios bajos; sin licencias externas.</w:t>
+              <w:t>; tres verticales diferenciados; UX premium; precios bajos; sin licencias externas.</w:t>
             </w:r>
           </w:p>
         </w:tc>
@@ -16940,21 +16625,7 @@
               <w:rPr>
                 <w:lang w:val="es-GT"/>
               </w:rPr>
-              <w:t xml:space="preserve">Ser referente #1 en software empaquetado en GT; lanzar versión </w:t>
-            </w:r>
-            <w:proofErr w:type="spellStart"/>
-            <w:r>
-              <w:rPr>
-                <w:lang w:val="es-GT"/>
-              </w:rPr>
-              <w:t>SaaS</w:t>
-            </w:r>
-            <w:proofErr w:type="spellEnd"/>
-            <w:r>
-              <w:rPr>
-                <w:lang w:val="es-GT"/>
-              </w:rPr>
-              <w:t xml:space="preserve"> al año 2; expandir </w:t>
+              <w:t xml:space="preserve">Ser referente #1 en software empaquetado en GT; lanzar versión SaaS al año 2; expandir </w:t>
             </w:r>
             <w:proofErr w:type="spellStart"/>
             <w:r>
@@ -17014,21 +16685,7 @@
               <w:rPr>
                 <w:lang w:val="es-GT"/>
               </w:rPr>
-              <w:t>15 ventas en primer mes; NPS ≥70; tiempos de soporte &lt;4h; ingresos Q15</w:t>
-            </w:r>
-            <w:proofErr w:type="gramStart"/>
-            <w:r>
-              <w:rPr>
-                <w:lang w:val="es-GT"/>
-              </w:rPr>
-              <w:t>,000</w:t>
-            </w:r>
-            <w:proofErr w:type="gramEnd"/>
-            <w:r>
-              <w:rPr>
-                <w:lang w:val="es-GT"/>
-              </w:rPr>
-              <w:t>/3 meses; 3 reseñas verificadas por producto.</w:t>
+              <w:t>15 ventas en primer mes; NPS ≥70; tiempos de soporte &lt;4h; ingresos Q15,000/3 meses; 3 reseñas verificadas por producto.</w:t>
             </w:r>
           </w:p>
         </w:tc>
@@ -17090,7 +16747,7 @@
       <w:pPr>
         <w:pStyle w:val="Ttulo1"/>
       </w:pPr>
-      <w:bookmarkStart w:id="51" w:name="_Toc223906584"/>
+      <w:bookmarkStart w:id="50" w:name="_Toc223906584"/>
       <w:r>
         <w:lastRenderedPageBreak/>
         <w:t>A</w:t>
@@ -17101,24 +16758,24 @@
       <w:r>
         <w:t xml:space="preserve"> DEL SITIO</w:t>
       </w:r>
+      <w:bookmarkEnd w:id="50"/>
+    </w:p>
+    <w:p/>
+    <w:p>
+      <w:pPr>
+        <w:pStyle w:val="Ttulo2"/>
+        <w:rPr>
+          <w:lang w:val="es-GT"/>
+        </w:rPr>
+      </w:pPr>
+      <w:bookmarkStart w:id="51" w:name="_Toc223906585"/>
+      <w:r>
+        <w:rPr>
+          <w:lang w:val="es-GT"/>
+        </w:rPr>
+        <w:t>Decisiones Técnicas</w:t>
+      </w:r>
       <w:bookmarkEnd w:id="51"/>
-    </w:p>
-    <w:p/>
-    <w:p>
-      <w:pPr>
-        <w:pStyle w:val="Ttulo2"/>
-        <w:rPr>
-          <w:lang w:val="es-GT"/>
-        </w:rPr>
-      </w:pPr>
-      <w:bookmarkStart w:id="52" w:name="_Toc223906585"/>
-      <w:r>
-        <w:rPr>
-          <w:lang w:val="es-GT"/>
-        </w:rPr>
-        <w:t>Decisiones Técnicas</w:t>
-      </w:r>
-      <w:bookmarkEnd w:id="52"/>
     </w:p>
     <w:tbl>
       <w:tblPr>
@@ -17277,19 +16934,11 @@
                 <w:lang w:val="es-GT"/>
               </w:rPr>
             </w:pPr>
-            <w:proofErr w:type="spellStart"/>
-            <w:r>
-              <w:rPr>
-                <w:lang w:val="es-GT"/>
-              </w:rPr>
-              <w:t>Tipado</w:t>
-            </w:r>
-            <w:proofErr w:type="spellEnd"/>
-            <w:r>
-              <w:rPr>
-                <w:lang w:val="es-GT"/>
-              </w:rPr>
-              <w:t xml:space="preserve"> estático, ecosistema maduro</w:t>
+            <w:r>
+              <w:rPr>
+                <w:lang w:val="es-GT"/>
+              </w:rPr>
+              <w:t>Tipado estático, ecosistema maduro</w:t>
             </w:r>
           </w:p>
         </w:tc>
@@ -17318,16 +16967,8 @@
               <w:rPr>
                 <w:lang w:val="es-GT"/>
               </w:rPr>
-              <w:t xml:space="preserve"> </w:t>
-            </w:r>
-            <w:proofErr w:type="spellStart"/>
-            <w:r>
-              <w:rPr>
-                <w:lang w:val="es-GT"/>
-              </w:rPr>
-              <w:t>Tool</w:t>
-            </w:r>
-            <w:proofErr w:type="spellEnd"/>
+              <w:t xml:space="preserve"> Tool</w:t>
+            </w:r>
           </w:p>
         </w:tc>
         <w:tc>
@@ -17696,14 +17337,14 @@
           <w:lang w:val="es-GT"/>
         </w:rPr>
       </w:pPr>
-      <w:bookmarkStart w:id="53" w:name="_Toc223906586"/>
+      <w:bookmarkStart w:id="52" w:name="_Toc223906586"/>
       <w:r>
         <w:rPr>
           <w:lang w:val="es-GT"/>
         </w:rPr>
         <w:t>Mapa de Rutas de la Aplicación</w:t>
       </w:r>
-      <w:bookmarkEnd w:id="53"/>
+      <w:bookmarkEnd w:id="52"/>
     </w:p>
     <w:p>
       <w:pPr>
@@ -17891,14 +17532,14 @@
         <w:rPr>
           <w:lang w:val="es-GT"/>
         </w:rPr>
-        <w:t>└── /bienvenida/</w:t>
+        <w:t>└── /bienvenida</w:t>
       </w:r>
       <w:proofErr w:type="gramStart"/>
       <w:r>
         <w:rPr>
           <w:lang w:val="es-GT"/>
         </w:rPr>
-        <w:t>:</w:t>
+        <w:t>/:</w:t>
       </w:r>
       <w:proofErr w:type="spellStart"/>
       <w:r>
@@ -17938,14 +17579,14 @@
           <w:lang w:val="es-GT"/>
         </w:rPr>
       </w:pPr>
-      <w:bookmarkStart w:id="54" w:name="_Toc223906587"/>
+      <w:bookmarkStart w:id="53" w:name="_Toc223906587"/>
       <w:r>
         <w:rPr>
           <w:lang w:val="es-GT"/>
         </w:rPr>
         <w:t>Descripción Funcional por Vista</w:t>
       </w:r>
-      <w:bookmarkEnd w:id="54"/>
+      <w:bookmarkEnd w:id="53"/>
     </w:p>
     <w:p>
       <w:pPr>
@@ -17956,23 +17597,13 @@
           <w:lang w:val="es-GT"/>
         </w:rPr>
       </w:pPr>
-      <w:proofErr w:type="spellStart"/>
       <w:r>
         <w:rPr>
           <w:b/>
           <w:bCs/>
           <w:lang w:val="es-GT"/>
         </w:rPr>
-        <w:t>Landing</w:t>
-      </w:r>
-      <w:proofErr w:type="spellEnd"/>
-      <w:r>
-        <w:rPr>
-          <w:b/>
-          <w:bCs/>
-          <w:lang w:val="es-GT"/>
-        </w:rPr>
-        <w:t xml:space="preserve"> Page — /</w:t>
+        <w:t>Landing Page — /</w:t>
       </w:r>
     </w:p>
     <w:p>
@@ -18463,7 +18094,7 @@
           <w:bCs/>
           <w:lang w:val="es-GT"/>
         </w:rPr>
-        <w:t>Bienvenida — /bienvenida/</w:t>
+        <w:t>Bienvenida — /bienvenida</w:t>
       </w:r>
       <w:proofErr w:type="gramStart"/>
       <w:r>
@@ -18472,7 +18103,7 @@
           <w:bCs/>
           <w:lang w:val="es-GT"/>
         </w:rPr>
-        <w:t>:</w:t>
+        <w:t>/:</w:t>
       </w:r>
       <w:proofErr w:type="spellStart"/>
       <w:r>
@@ -18569,7 +18200,7 @@
           <w:lang w:val="es-GT"/>
         </w:rPr>
       </w:pPr>
-      <w:bookmarkStart w:id="55" w:name="_Toc223906588"/>
+      <w:bookmarkStart w:id="54" w:name="_Toc223906588"/>
       <w:r>
         <w:rPr>
           <w:lang w:val="es-GT"/>
@@ -18604,7 +18235,7 @@
         </w:rPr>
         <w:t>)</w:t>
       </w:r>
-      <w:bookmarkEnd w:id="55"/>
+      <w:bookmarkEnd w:id="54"/>
     </w:p>
     <w:p>
       <w:pPr>
@@ -18841,23 +18472,15 @@
         <w:rPr>
           <w:lang w:val="es-GT"/>
         </w:rPr>
-        <w:t xml:space="preserve">└── </w:t>
-      </w:r>
-      <w:proofErr w:type="spellStart"/>
-      <w:r>
-        <w:rPr>
-          <w:lang w:val="es-GT"/>
-        </w:rPr>
-        <w:t>Footer</w:t>
-      </w:r>
-      <w:proofErr w:type="spellEnd"/>
+        <w:t>└── Footer</w:t>
+      </w:r>
     </w:p>
     <w:p/>
     <w:p>
       <w:pPr>
         <w:pStyle w:val="Ttulo2"/>
       </w:pPr>
-      <w:bookmarkStart w:id="56" w:name="_Toc223906589"/>
+      <w:bookmarkStart w:id="55" w:name="_Toc223906589"/>
       <w:r>
         <w:lastRenderedPageBreak/>
         <w:t>Estructura del si</w:t>
@@ -18865,54 +18488,54 @@
       <w:r>
         <w:t>tio (secciones y navegación)</w:t>
       </w:r>
+      <w:bookmarkEnd w:id="55"/>
+    </w:p>
+    <w:p>
+      <w:pPr>
+        <w:ind w:firstLine="708"/>
+      </w:pPr>
+      <w:r>
+        <w:t xml:space="preserve">La arquitectura del sitio se implementa bajo una estructura jerárquica clara con </w:t>
+      </w:r>
+      <w:proofErr w:type="spellStart"/>
+      <w:r>
+        <w:t>layout</w:t>
+      </w:r>
+      <w:proofErr w:type="spellEnd"/>
+      <w:r>
+        <w:t xml:space="preserve"> persistente (</w:t>
+      </w:r>
+      <w:proofErr w:type="spellStart"/>
+      <w:r>
+        <w:t>navbar</w:t>
+      </w:r>
+      <w:proofErr w:type="spellEnd"/>
+      <w:r>
+        <w:t xml:space="preserve"> + contenido + </w:t>
+      </w:r>
+      <w:proofErr w:type="spellStart"/>
+      <w:r>
+        <w:t>footer</w:t>
+      </w:r>
+      <w:proofErr w:type="spellEnd"/>
+      <w:r>
+        <w:t>), permitiendo navegación consistente en todo el recorrido de compra.</w:t>
+      </w:r>
+    </w:p>
+    <w:p>
+      <w:pPr>
+        <w:ind w:firstLine="708"/>
+      </w:pPr>
+    </w:p>
+    <w:p>
+      <w:pPr>
+        <w:pStyle w:val="Ttulo3"/>
+      </w:pPr>
+      <w:bookmarkStart w:id="56" w:name="_Toc223906590"/>
+      <w:r>
+        <w:t>Mapa de páginas y rutas principales:</w:t>
+      </w:r>
       <w:bookmarkEnd w:id="56"/>
-    </w:p>
-    <w:p>
-      <w:pPr>
-        <w:ind w:firstLine="708"/>
-      </w:pPr>
-      <w:r>
-        <w:t xml:space="preserve">La arquitectura del sitio se implementa bajo una estructura jerárquica clara con </w:t>
-      </w:r>
-      <w:proofErr w:type="spellStart"/>
-      <w:r>
-        <w:t>layout</w:t>
-      </w:r>
-      <w:proofErr w:type="spellEnd"/>
-      <w:r>
-        <w:t xml:space="preserve"> persistente (</w:t>
-      </w:r>
-      <w:proofErr w:type="spellStart"/>
-      <w:r>
-        <w:t>navbar</w:t>
-      </w:r>
-      <w:proofErr w:type="spellEnd"/>
-      <w:r>
-        <w:t xml:space="preserve"> + contenido + </w:t>
-      </w:r>
-      <w:proofErr w:type="spellStart"/>
-      <w:r>
-        <w:t>footer</w:t>
-      </w:r>
-      <w:proofErr w:type="spellEnd"/>
-      <w:r>
-        <w:t>), permitiendo navegación consistente en todo el recorrido de compra.</w:t>
-      </w:r>
-    </w:p>
-    <w:p>
-      <w:pPr>
-        <w:ind w:firstLine="708"/>
-      </w:pPr>
-    </w:p>
-    <w:p>
-      <w:pPr>
-        <w:pStyle w:val="Ttulo3"/>
-      </w:pPr>
-      <w:bookmarkStart w:id="57" w:name="_Toc223906590"/>
-      <w:r>
-        <w:t>Mapa de páginas y rutas principales:</w:t>
-      </w:r>
-      <w:bookmarkEnd w:id="57"/>
     </w:p>
     <w:p>
       <w:pPr>
@@ -18964,53 +18587,6 @@
                 <pic:pic xmlns:pic="http://schemas.openxmlformats.org/drawingml/2006/picture">
                   <pic:nvPicPr>
                     <pic:cNvPr id="2" name="landing1.png"/>
-                    <pic:cNvPicPr/>
-                  </pic:nvPicPr>
-                  <pic:blipFill>
-                    <a:blip r:embed="rId11" cstate="print">
-                      <a:extLst>
-                        <a:ext uri="{28A0092B-C50C-407E-A947-70E740481C1C}">
-                          <a14:useLocalDpi xmlns:a14="http://schemas.microsoft.com/office/drawing/2010/main" val="0"/>
-                        </a:ext>
-                      </a:extLst>
-                    </a:blip>
-                    <a:stretch>
-                      <a:fillRect/>
-                    </a:stretch>
-                  </pic:blipFill>
-                  <pic:spPr>
-                    <a:xfrm>
-                      <a:off x="0" y="0"/>
-                      <a:ext cx="4303115" cy="2286000"/>
-                    </a:xfrm>
-                    <a:prstGeom prst="rect">
-                      <a:avLst/>
-                    </a:prstGeom>
-                  </pic:spPr>
-                </pic:pic>
-              </a:graphicData>
-            </a:graphic>
-          </wp:inline>
-        </w:drawing>
-      </w:r>
-      <w:r>
-        <w:rPr>
-          <w:noProof/>
-          <w:lang w:eastAsia="es-ES"/>
-        </w:rPr>
-        <w:drawing>
-          <wp:inline distT="0" distB="0" distL="0" distR="0" wp14:anchorId="6F7BD36C" wp14:editId="7C6ABB76">
-            <wp:extent cx="4303115" cy="2286000"/>
-            <wp:effectExtent l="0" t="0" r="2540" b="0"/>
-            <wp:docPr id="3" name="Imagen 3"/>
-            <wp:cNvGraphicFramePr>
-              <a:graphicFrameLocks xmlns:a="http://schemas.openxmlformats.org/drawingml/2006/main" noChangeAspect="1"/>
-            </wp:cNvGraphicFramePr>
-            <a:graphic xmlns:a="http://schemas.openxmlformats.org/drawingml/2006/main">
-              <a:graphicData uri="http://schemas.openxmlformats.org/drawingml/2006/picture">
-                <pic:pic xmlns:pic="http://schemas.openxmlformats.org/drawingml/2006/picture">
-                  <pic:nvPicPr>
-                    <pic:cNvPr id="3" name="landing2.png"/>
                     <pic:cNvPicPr/>
                   </pic:nvPicPr>
                   <pic:blipFill>
@@ -19045,12 +18621,11 @@
           <w:noProof/>
           <w:lang w:eastAsia="es-ES"/>
         </w:rPr>
-        <w:lastRenderedPageBreak/>
         <w:drawing>
-          <wp:inline distT="0" distB="0" distL="0" distR="0" wp14:anchorId="25A686FE" wp14:editId="0095921F">
+          <wp:inline distT="0" distB="0" distL="0" distR="0" wp14:anchorId="6F7BD36C" wp14:editId="7C6ABB76">
             <wp:extent cx="4303115" cy="2286000"/>
             <wp:effectExtent l="0" t="0" r="2540" b="0"/>
-            <wp:docPr id="4" name="Imagen 4"/>
+            <wp:docPr id="3" name="Imagen 3"/>
             <wp:cNvGraphicFramePr>
               <a:graphicFrameLocks xmlns:a="http://schemas.openxmlformats.org/drawingml/2006/main" noChangeAspect="1"/>
             </wp:cNvGraphicFramePr>
@@ -19058,7 +18633,7 @@
               <a:graphicData uri="http://schemas.openxmlformats.org/drawingml/2006/picture">
                 <pic:pic xmlns:pic="http://schemas.openxmlformats.org/drawingml/2006/picture">
                   <pic:nvPicPr>
-                    <pic:cNvPr id="4" name="landing3.png"/>
+                    <pic:cNvPr id="3" name="landing2.png"/>
                     <pic:cNvPicPr/>
                   </pic:nvPicPr>
                   <pic:blipFill>
@@ -19093,11 +18668,12 @@
           <w:noProof/>
           <w:lang w:eastAsia="es-ES"/>
         </w:rPr>
+        <w:lastRenderedPageBreak/>
         <w:drawing>
-          <wp:inline distT="0" distB="0" distL="0" distR="0" wp14:anchorId="05136C8F" wp14:editId="55384D64">
+          <wp:inline distT="0" distB="0" distL="0" distR="0" wp14:anchorId="25A686FE" wp14:editId="0095921F">
             <wp:extent cx="4303115" cy="2286000"/>
             <wp:effectExtent l="0" t="0" r="2540" b="0"/>
-            <wp:docPr id="5" name="Imagen 5"/>
+            <wp:docPr id="4" name="Imagen 4"/>
             <wp:cNvGraphicFramePr>
               <a:graphicFrameLocks xmlns:a="http://schemas.openxmlformats.org/drawingml/2006/main" noChangeAspect="1"/>
             </wp:cNvGraphicFramePr>
@@ -19105,7 +18681,7 @@
               <a:graphicData uri="http://schemas.openxmlformats.org/drawingml/2006/picture">
                 <pic:pic xmlns:pic="http://schemas.openxmlformats.org/drawingml/2006/picture">
                   <pic:nvPicPr>
-                    <pic:cNvPr id="5" name="landing4.png"/>
+                    <pic:cNvPr id="4" name="landing3.png"/>
                     <pic:cNvPicPr/>
                   </pic:nvPicPr>
                   <pic:blipFill>
@@ -19135,41 +18711,16 @@
           </wp:inline>
         </w:drawing>
       </w:r>
-    </w:p>
-    <w:p>
-      <w:pPr>
-        <w:pStyle w:val="Prrafodelista"/>
-        <w:numPr>
-          <w:ilvl w:val="0"/>
-          <w:numId w:val="13"/>
-        </w:numPr>
-      </w:pPr>
-      <w:r>
-        <w:t>/catalogo Catálogo (</w:t>
-      </w:r>
-      <w:proofErr w:type="spellStart"/>
-      <w:r>
-        <w:t>CatalogPage</w:t>
-      </w:r>
-      <w:proofErr w:type="spellEnd"/>
-      <w:r>
-        <w:t>): visualización de los 3 productos con ficha comercial completa y acción de agregar al carrito.</w:t>
-      </w:r>
-    </w:p>
-    <w:p>
-      <w:pPr>
-        <w:jc w:val="center"/>
-      </w:pPr>
       <w:r>
         <w:rPr>
           <w:noProof/>
           <w:lang w:eastAsia="es-ES"/>
         </w:rPr>
         <w:drawing>
-          <wp:inline distT="0" distB="0" distL="0" distR="0" wp14:anchorId="6BFDD771" wp14:editId="043EEA0A">
+          <wp:inline distT="0" distB="0" distL="0" distR="0" wp14:anchorId="05136C8F" wp14:editId="55384D64">
             <wp:extent cx="4303115" cy="2286000"/>
             <wp:effectExtent l="0" t="0" r="2540" b="0"/>
-            <wp:docPr id="6" name="Imagen 6"/>
+            <wp:docPr id="5" name="Imagen 5"/>
             <wp:cNvGraphicFramePr>
               <a:graphicFrameLocks xmlns:a="http://schemas.openxmlformats.org/drawingml/2006/main" noChangeAspect="1"/>
             </wp:cNvGraphicFramePr>
@@ -19177,7 +18728,7 @@
               <a:graphicData uri="http://schemas.openxmlformats.org/drawingml/2006/picture">
                 <pic:pic xmlns:pic="http://schemas.openxmlformats.org/drawingml/2006/picture">
                   <pic:nvPicPr>
-                    <pic:cNvPr id="6" name="catalogo.png"/>
+                    <pic:cNvPr id="5" name="landing4.png"/>
                     <pic:cNvPicPr/>
                   </pic:nvPicPr>
                   <pic:blipFill>
@@ -19217,23 +18768,15 @@
         </w:numPr>
       </w:pPr>
       <w:r>
-        <w:t>/carrito </w:t>
+        <w:t>/catalogo Catálogo (</w:t>
       </w:r>
       <w:proofErr w:type="spellStart"/>
       <w:r>
-        <w:t>Carrito</w:t>
+        <w:t>CatalogPage</w:t>
       </w:r>
       <w:proofErr w:type="spellEnd"/>
       <w:r>
-        <w:t xml:space="preserve"> (</w:t>
-      </w:r>
-      <w:proofErr w:type="spellStart"/>
-      <w:r>
-        <w:t>CartPage</w:t>
-      </w:r>
-      <w:proofErr w:type="spellEnd"/>
-      <w:r>
-        <w:t>): gestión de productos seleccionados, cantidades, eliminación y resumen total.</w:t>
+        <w:t>): visualización de los 3 productos con ficha comercial completa y acción de agregar al carrito.</w:t>
       </w:r>
     </w:p>
     <w:p>
@@ -19245,12 +18788,11 @@
           <w:noProof/>
           <w:lang w:eastAsia="es-ES"/>
         </w:rPr>
-        <w:lastRenderedPageBreak/>
         <w:drawing>
-          <wp:inline distT="0" distB="0" distL="0" distR="0" wp14:anchorId="7CA528F7" wp14:editId="672199CB">
+          <wp:inline distT="0" distB="0" distL="0" distR="0" wp14:anchorId="6BFDD771" wp14:editId="043EEA0A">
             <wp:extent cx="4303115" cy="2286000"/>
             <wp:effectExtent l="0" t="0" r="2540" b="0"/>
-            <wp:docPr id="7" name="Imagen 7"/>
+            <wp:docPr id="6" name="Imagen 6"/>
             <wp:cNvGraphicFramePr>
               <a:graphicFrameLocks xmlns:a="http://schemas.openxmlformats.org/drawingml/2006/main" noChangeAspect="1"/>
             </wp:cNvGraphicFramePr>
@@ -19258,7 +18800,7 @@
               <a:graphicData uri="http://schemas.openxmlformats.org/drawingml/2006/picture">
                 <pic:pic xmlns:pic="http://schemas.openxmlformats.org/drawingml/2006/picture">
                   <pic:nvPicPr>
-                    <pic:cNvPr id="7" name="carrito.png"/>
+                    <pic:cNvPr id="6" name="catalogo.png"/>
                     <pic:cNvPicPr/>
                   </pic:nvPicPr>
                   <pic:blipFill>
@@ -19298,31 +18840,23 @@
         </w:numPr>
       </w:pPr>
       <w:r>
-        <w:t>/</w:t>
+        <w:t>/carrito </w:t>
       </w:r>
       <w:proofErr w:type="spellStart"/>
       <w:r>
-        <w:t>checkout</w:t>
+        <w:t>Carrito</w:t>
       </w:r>
       <w:proofErr w:type="spellEnd"/>
       <w:r>
-        <w:t> </w:t>
+        <w:t xml:space="preserve"> (</w:t>
       </w:r>
       <w:proofErr w:type="spellStart"/>
       <w:r>
-        <w:t>Checkout</w:t>
+        <w:t>CartPage</w:t>
       </w:r>
       <w:proofErr w:type="spellEnd"/>
       <w:r>
-        <w:t xml:space="preserve"> (</w:t>
-      </w:r>
-      <w:proofErr w:type="spellStart"/>
-      <w:r>
-        <w:t>CheckoutPage</w:t>
-      </w:r>
-      <w:proofErr w:type="spellEnd"/>
-      <w:r>
-        <w:t>): captura de datos de compra y validación previa a generar recibo.</w:t>
+        <w:t>): gestión de productos seleccionados, cantidades, eliminación y resumen total.</w:t>
       </w:r>
     </w:p>
     <w:p>
@@ -19334,11 +18868,12 @@
           <w:noProof/>
           <w:lang w:eastAsia="es-ES"/>
         </w:rPr>
+        <w:lastRenderedPageBreak/>
         <w:drawing>
-          <wp:inline distT="0" distB="0" distL="0" distR="0" wp14:anchorId="0F15E993" wp14:editId="56AE644C">
+          <wp:inline distT="0" distB="0" distL="0" distR="0" wp14:anchorId="7CA528F7" wp14:editId="672199CB">
             <wp:extent cx="4303115" cy="2286000"/>
             <wp:effectExtent l="0" t="0" r="2540" b="0"/>
-            <wp:docPr id="8" name="Imagen 8"/>
+            <wp:docPr id="7" name="Imagen 7"/>
             <wp:cNvGraphicFramePr>
               <a:graphicFrameLocks xmlns:a="http://schemas.openxmlformats.org/drawingml/2006/main" noChangeAspect="1"/>
             </wp:cNvGraphicFramePr>
@@ -19346,7 +18881,7 @@
               <a:graphicData uri="http://schemas.openxmlformats.org/drawingml/2006/picture">
                 <pic:pic xmlns:pic="http://schemas.openxmlformats.org/drawingml/2006/picture">
                   <pic:nvPicPr>
-                    <pic:cNvPr id="8" name="checkout.png"/>
+                    <pic:cNvPr id="7" name="carrito.png"/>
                     <pic:cNvPicPr/>
                   </pic:nvPicPr>
                   <pic:blipFill>
@@ -19386,23 +18921,31 @@
         </w:numPr>
       </w:pPr>
       <w:r>
-        <w:t>/recibo </w:t>
+        <w:t>/</w:t>
       </w:r>
       <w:proofErr w:type="spellStart"/>
       <w:r>
-        <w:t>Recibo</w:t>
+        <w:t>checkout</w:t>
       </w:r>
       <w:proofErr w:type="spellEnd"/>
       <w:r>
+        <w:t> </w:t>
+      </w:r>
+      <w:proofErr w:type="spellStart"/>
+      <w:r>
+        <w:t>Checkout</w:t>
+      </w:r>
+      <w:proofErr w:type="spellEnd"/>
+      <w:r>
         <w:t xml:space="preserve"> (</w:t>
       </w:r>
       <w:proofErr w:type="spellStart"/>
       <w:r>
-        <w:t>ReceiptPage</w:t>
+        <w:t>CheckoutPage</w:t>
       </w:r>
       <w:proofErr w:type="spellEnd"/>
       <w:r>
-        <w:t>): confirmación de compra simulada, detalle de orden y accesos a productos adquiridos.</w:t>
+        <w:t>): captura de datos de compra y validación previa a generar recibo.</w:t>
       </w:r>
     </w:p>
     <w:p>
@@ -19415,10 +18958,10 @@
           <w:lang w:eastAsia="es-ES"/>
         </w:rPr>
         <w:drawing>
-          <wp:inline distT="0" distB="0" distL="0" distR="0" wp14:anchorId="7B4AA4C7" wp14:editId="79A05914">
+          <wp:inline distT="0" distB="0" distL="0" distR="0" wp14:anchorId="0F15E993" wp14:editId="56AE644C">
             <wp:extent cx="4303115" cy="2286000"/>
             <wp:effectExtent l="0" t="0" r="2540" b="0"/>
-            <wp:docPr id="13" name="Imagen 13"/>
+            <wp:docPr id="8" name="Imagen 8"/>
             <wp:cNvGraphicFramePr>
               <a:graphicFrameLocks xmlns:a="http://schemas.openxmlformats.org/drawingml/2006/main" noChangeAspect="1"/>
             </wp:cNvGraphicFramePr>
@@ -19426,7 +18969,7 @@
               <a:graphicData uri="http://schemas.openxmlformats.org/drawingml/2006/picture">
                 <pic:pic xmlns:pic="http://schemas.openxmlformats.org/drawingml/2006/picture">
                   <pic:nvPicPr>
-                    <pic:cNvPr id="13" name="confirmacion.png"/>
+                    <pic:cNvPr id="8" name="checkout.png"/>
                     <pic:cNvPicPr/>
                   </pic:nvPicPr>
                   <pic:blipFill>
@@ -19459,6 +19002,34 @@
     </w:p>
     <w:p>
       <w:pPr>
+        <w:pStyle w:val="Prrafodelista"/>
+        <w:numPr>
+          <w:ilvl w:val="0"/>
+          <w:numId w:val="13"/>
+        </w:numPr>
+      </w:pPr>
+      <w:r>
+        <w:t>/recibo </w:t>
+      </w:r>
+      <w:proofErr w:type="spellStart"/>
+      <w:r>
+        <w:t>Recibo</w:t>
+      </w:r>
+      <w:proofErr w:type="spellEnd"/>
+      <w:r>
+        <w:t xml:space="preserve"> (</w:t>
+      </w:r>
+      <w:proofErr w:type="spellStart"/>
+      <w:r>
+        <w:t>ReceiptPage</w:t>
+      </w:r>
+      <w:proofErr w:type="spellEnd"/>
+      <w:r>
+        <w:t>): confirmación de compra simulada, detalle de orden y accesos a productos adquiridos.</w:t>
+      </w:r>
+    </w:p>
+    <w:p>
+      <w:pPr>
         <w:jc w:val="center"/>
       </w:pPr>
       <w:r>
@@ -19466,12 +19037,11 @@
           <w:noProof/>
           <w:lang w:eastAsia="es-ES"/>
         </w:rPr>
-        <w:lastRenderedPageBreak/>
         <w:drawing>
-          <wp:inline distT="0" distB="0" distL="0" distR="0" wp14:anchorId="17865EF6" wp14:editId="18F5BF3D">
+          <wp:inline distT="0" distB="0" distL="0" distR="0" wp14:anchorId="7B4AA4C7" wp14:editId="79A05914">
             <wp:extent cx="4303115" cy="2286000"/>
             <wp:effectExtent l="0" t="0" r="2540" b="0"/>
-            <wp:docPr id="9" name="Imagen 9"/>
+            <wp:docPr id="13" name="Imagen 13"/>
             <wp:cNvGraphicFramePr>
               <a:graphicFrameLocks xmlns:a="http://schemas.openxmlformats.org/drawingml/2006/main" noChangeAspect="1"/>
             </wp:cNvGraphicFramePr>
@@ -19479,7 +19049,7 @@
               <a:graphicData uri="http://schemas.openxmlformats.org/drawingml/2006/picture">
                 <pic:pic xmlns:pic="http://schemas.openxmlformats.org/drawingml/2006/picture">
                   <pic:nvPicPr>
-                    <pic:cNvPr id="9" name="recibo.png"/>
+                    <pic:cNvPr id="13" name="confirmacion.png"/>
                     <pic:cNvPicPr/>
                   </pic:nvPicPr>
                   <pic:blipFill>
@@ -19512,40 +19082,6 @@
     </w:p>
     <w:p>
       <w:pPr>
-        <w:pStyle w:val="Prrafodelista"/>
-        <w:numPr>
-          <w:ilvl w:val="0"/>
-          <w:numId w:val="13"/>
-        </w:numPr>
-      </w:pPr>
-      <w:r>
-        <w:t>/bienvenida/</w:t>
-      </w:r>
-      <w:proofErr w:type="gramStart"/>
-      <w:r>
-        <w:t>:</w:t>
-      </w:r>
-      <w:proofErr w:type="spellStart"/>
-      <w:r>
-        <w:t>productId</w:t>
-      </w:r>
-      <w:proofErr w:type="spellEnd"/>
-      <w:proofErr w:type="gramEnd"/>
-      <w:r>
-        <w:t> Bienvenida de producto (</w:t>
-      </w:r>
-      <w:proofErr w:type="spellStart"/>
-      <w:r>
-        <w:t>ProductWelcomePage</w:t>
-      </w:r>
-      <w:proofErr w:type="spellEnd"/>
-      <w:r>
-        <w:t>): pantalla de acceso simulado al producto comprado.</w:t>
-      </w:r>
-    </w:p>
-    <w:p>
-      <w:pPr>
-        <w:pStyle w:val="Prrafodelista"/>
         <w:jc w:val="center"/>
       </w:pPr>
       <w:r>
@@ -19553,11 +19089,12 @@
           <w:noProof/>
           <w:lang w:eastAsia="es-ES"/>
         </w:rPr>
+        <w:lastRenderedPageBreak/>
         <w:drawing>
-          <wp:inline distT="0" distB="0" distL="0" distR="0" wp14:anchorId="26B63FA8" wp14:editId="3A6BC660">
-            <wp:extent cx="3442492" cy="1828800"/>
-            <wp:effectExtent l="0" t="0" r="5715" b="0"/>
-            <wp:docPr id="10" name="Imagen 10"/>
+          <wp:inline distT="0" distB="0" distL="0" distR="0" wp14:anchorId="17865EF6" wp14:editId="18F5BF3D">
+            <wp:extent cx="4303115" cy="2286000"/>
+            <wp:effectExtent l="0" t="0" r="2540" b="0"/>
+            <wp:docPr id="9" name="Imagen 9"/>
             <wp:cNvGraphicFramePr>
               <a:graphicFrameLocks xmlns:a="http://schemas.openxmlformats.org/drawingml/2006/main" noChangeAspect="1"/>
             </wp:cNvGraphicFramePr>
@@ -19565,7 +19102,7 @@
               <a:graphicData uri="http://schemas.openxmlformats.org/drawingml/2006/picture">
                 <pic:pic xmlns:pic="http://schemas.openxmlformats.org/drawingml/2006/picture">
                   <pic:nvPicPr>
-                    <pic:cNvPr id="10" name="bienvenidaHomehub.png"/>
+                    <pic:cNvPr id="9" name="recibo.png"/>
                     <pic:cNvPicPr/>
                   </pic:nvPicPr>
                   <pic:blipFill>
@@ -19583,7 +19120,7 @@
                   <pic:spPr>
                     <a:xfrm>
                       <a:off x="0" y="0"/>
-                      <a:ext cx="3442492" cy="1828800"/>
+                      <a:ext cx="4303115" cy="2286000"/>
                     </a:xfrm>
                     <a:prstGeom prst="rect">
                       <a:avLst/>
@@ -19595,16 +19132,55 @@
           </wp:inline>
         </w:drawing>
       </w:r>
+    </w:p>
+    <w:p>
+      <w:pPr>
+        <w:pStyle w:val="Prrafodelista"/>
+        <w:numPr>
+          <w:ilvl w:val="0"/>
+          <w:numId w:val="13"/>
+        </w:numPr>
+      </w:pPr>
+      <w:r>
+        <w:t>/bienvenida</w:t>
+      </w:r>
+      <w:proofErr w:type="gramStart"/>
+      <w:r>
+        <w:t>/:</w:t>
+      </w:r>
+      <w:proofErr w:type="spellStart"/>
+      <w:r>
+        <w:t>productId</w:t>
+      </w:r>
+      <w:proofErr w:type="spellEnd"/>
+      <w:proofErr w:type="gramEnd"/>
+      <w:r>
+        <w:t> Bienvenida de producto (</w:t>
+      </w:r>
+      <w:proofErr w:type="spellStart"/>
+      <w:r>
+        <w:t>ProductWelcomePage</w:t>
+      </w:r>
+      <w:proofErr w:type="spellEnd"/>
+      <w:r>
+        <w:t>): pantalla de acceso simulado al producto comprado.</w:t>
+      </w:r>
+    </w:p>
+    <w:p>
+      <w:pPr>
+        <w:pStyle w:val="Prrafodelista"/>
+        <w:jc w:val="center"/>
+      </w:pPr>
       <w:r>
         <w:rPr>
           <w:noProof/>
           <w:lang w:eastAsia="es-ES"/>
         </w:rPr>
         <w:drawing>
-          <wp:inline distT="0" distB="0" distL="0" distR="0" wp14:anchorId="0F3DA488" wp14:editId="325000B6">
+          <wp:inline distT="0" distB="0" distL="0" distR="0" wp14:anchorId="26B63FA8" wp14:editId="3A6BC660">
             <wp:extent cx="3442492" cy="1828800"/>
             <wp:effectExtent l="0" t="0" r="5715" b="0"/>
-            <wp:docPr id="11" name="Imagen 11"/>
+            <wp:docPr id="10" name="Imagen 10"/>
             <wp:cNvGraphicFramePr>
               <a:graphicFrameLocks xmlns:a="http://schemas.openxmlformats.org/drawingml/2006/main" noChangeAspect="1"/>
             </wp:cNvGraphicFramePr>
@@ -19612,7 +19188,7 @@
               <a:graphicData uri="http://schemas.openxmlformats.org/drawingml/2006/picture">
                 <pic:pic xmlns:pic="http://schemas.openxmlformats.org/drawingml/2006/picture">
                   <pic:nvPicPr>
-                    <pic:cNvPr id="11" name="bienvenidaLegalflow.png"/>
+                    <pic:cNvPr id="10" name="bienvenidaHomehub.png"/>
                     <pic:cNvPicPr/>
                   </pic:nvPicPr>
                   <pic:blipFill>
@@ -19648,10 +19224,10 @@
           <w:lang w:eastAsia="es-ES"/>
         </w:rPr>
         <w:drawing>
-          <wp:inline distT="0" distB="0" distL="0" distR="0" wp14:anchorId="36AA207F" wp14:editId="7C333BF6">
+          <wp:inline distT="0" distB="0" distL="0" distR="0" wp14:anchorId="0F3DA488" wp14:editId="325000B6">
             <wp:extent cx="3442492" cy="1828800"/>
             <wp:effectExtent l="0" t="0" r="5715" b="0"/>
-            <wp:docPr id="12" name="Imagen 12"/>
+            <wp:docPr id="11" name="Imagen 11"/>
             <wp:cNvGraphicFramePr>
               <a:graphicFrameLocks xmlns:a="http://schemas.openxmlformats.org/drawingml/2006/main" noChangeAspect="1"/>
             </wp:cNvGraphicFramePr>
@@ -19659,7 +19235,7 @@
               <a:graphicData uri="http://schemas.openxmlformats.org/drawingml/2006/picture">
                 <pic:pic xmlns:pic="http://schemas.openxmlformats.org/drawingml/2006/picture">
                   <pic:nvPicPr>
-                    <pic:cNvPr id="12" name="bienvenidaSafecase.png"/>
+                    <pic:cNvPr id="11" name="bienvenidaLegalflow.png"/>
                     <pic:cNvPicPr/>
                   </pic:nvPicPr>
                   <pic:blipFill>
@@ -19689,12 +19265,59 @@
           </wp:inline>
         </w:drawing>
       </w:r>
+      <w:r>
+        <w:rPr>
+          <w:noProof/>
+          <w:lang w:eastAsia="es-ES"/>
+        </w:rPr>
+        <w:drawing>
+          <wp:inline distT="0" distB="0" distL="0" distR="0" wp14:anchorId="36AA207F" wp14:editId="7C333BF6">
+            <wp:extent cx="3442492" cy="1828800"/>
+            <wp:effectExtent l="0" t="0" r="5715" b="0"/>
+            <wp:docPr id="12" name="Imagen 12"/>
+            <wp:cNvGraphicFramePr>
+              <a:graphicFrameLocks xmlns:a="http://schemas.openxmlformats.org/drawingml/2006/main" noChangeAspect="1"/>
+            </wp:cNvGraphicFramePr>
+            <a:graphic xmlns:a="http://schemas.openxmlformats.org/drawingml/2006/main">
+              <a:graphicData uri="http://schemas.openxmlformats.org/drawingml/2006/picture">
+                <pic:pic xmlns:pic="http://schemas.openxmlformats.org/drawingml/2006/picture">
+                  <pic:nvPicPr>
+                    <pic:cNvPr id="12" name="bienvenidaSafecase.png"/>
+                    <pic:cNvPicPr/>
+                  </pic:nvPicPr>
+                  <pic:blipFill>
+                    <a:blip r:embed="rId23" cstate="print">
+                      <a:extLst>
+                        <a:ext uri="{28A0092B-C50C-407E-A947-70E740481C1C}">
+                          <a14:useLocalDpi xmlns:a14="http://schemas.microsoft.com/office/drawing/2010/main" val="0"/>
+                        </a:ext>
+                      </a:extLst>
+                    </a:blip>
+                    <a:stretch>
+                      <a:fillRect/>
+                    </a:stretch>
+                  </pic:blipFill>
+                  <pic:spPr>
+                    <a:xfrm>
+                      <a:off x="0" y="0"/>
+                      <a:ext cx="3442492" cy="1828800"/>
+                    </a:xfrm>
+                    <a:prstGeom prst="rect">
+                      <a:avLst/>
+                    </a:prstGeom>
+                  </pic:spPr>
+                </pic:pic>
+              </a:graphicData>
+            </a:graphic>
+          </wp:inline>
+        </w:drawing>
+      </w:r>
     </w:p>
     <w:p>
       <w:pPr>
         <w:pStyle w:val="Ttulo2"/>
       </w:pPr>
-      <w:bookmarkStart w:id="58" w:name="_Toc223906591"/>
+      <w:bookmarkStart w:id="57" w:name="_Toc223906591"/>
       <w:r>
         <w:lastRenderedPageBreak/>
         <w:t>Flujo de usuario (catálogo → car</w:t>
@@ -19702,7 +19325,7 @@
       <w:r>
         <w:t>rito → simulación de compra)</w:t>
       </w:r>
-      <w:bookmarkEnd w:id="58"/>
+      <w:bookmarkEnd w:id="57"/>
     </w:p>
     <w:p>
       <w:pPr>
@@ -19731,7 +19354,7 @@
                     </pic:cNvPicPr>
                   </pic:nvPicPr>
                   <pic:blipFill>
-                    <a:blip r:embed="rId23" cstate="print">
+                    <a:blip r:embed="rId24" cstate="print">
                       <a:extLst>
                         <a:ext uri="{28A0092B-C50C-407E-A947-70E740481C1C}">
                           <a14:useLocalDpi xmlns:a14="http://schemas.microsoft.com/office/drawing/2010/main" val="0"/>
@@ -19767,12 +19390,12 @@
       <w:pPr>
         <w:pStyle w:val="Ttulo3"/>
       </w:pPr>
-      <w:bookmarkStart w:id="59" w:name="_Toc223906592"/>
+      <w:bookmarkStart w:id="58" w:name="_Toc223906592"/>
       <w:r>
         <w:lastRenderedPageBreak/>
         <w:t>Flujo operativo definido:</w:t>
       </w:r>
-      <w:bookmarkEnd w:id="59"/>
+      <w:bookmarkEnd w:id="58"/>
     </w:p>
     <w:p>
       <w:pPr>
@@ -19929,11 +19552,11 @@
         <w:t xml:space="preserve"> simulada</w:t>
       </w:r>
       <w:r>
-        <w:t>: accede a /bienvenida/</w:t>
+        <w:t>: accede a /bienvenida</w:t>
       </w:r>
       <w:proofErr w:type="gramStart"/>
       <w:r>
-        <w:t>:</w:t>
+        <w:t>/:</w:t>
       </w:r>
       <w:proofErr w:type="spellStart"/>
       <w:r>
@@ -19950,11 +19573,11 @@
       <w:pPr>
         <w:pStyle w:val="Ttulo3"/>
       </w:pPr>
-      <w:bookmarkStart w:id="60" w:name="_Toc223906593"/>
+      <w:bookmarkStart w:id="59" w:name="_Toc223906593"/>
       <w:r>
         <w:t>Elementos de soporte del flujo:</w:t>
       </w:r>
-      <w:bookmarkEnd w:id="60"/>
+      <w:bookmarkEnd w:id="59"/>
     </w:p>
     <w:p>
       <w:pPr>
@@ -19997,30 +19620,30 @@
       <w:pPr>
         <w:pStyle w:val="Ttulo2"/>
       </w:pPr>
-      <w:bookmarkStart w:id="61" w:name="_Toc223906594"/>
+      <w:bookmarkStart w:id="60" w:name="_Toc223906594"/>
       <w:r>
         <w:t>Relación entre arquitectura y objetivos del negocio</w:t>
       </w:r>
+      <w:bookmarkEnd w:id="60"/>
+    </w:p>
+    <w:p>
+      <w:pPr>
+        <w:ind w:firstLine="708"/>
+      </w:pPr>
+      <w:r>
+        <w:t>La arquitectura propuesta está directamente alineada con el objetivo comercial del proyecto: convertir capacidades técnicas en ventas digitales de productos de software.</w:t>
+      </w:r>
+    </w:p>
+    <w:p/>
+    <w:p>
+      <w:pPr>
+        <w:pStyle w:val="Ttulo3"/>
+      </w:pPr>
+      <w:bookmarkStart w:id="61" w:name="_Toc223906595"/>
+      <w:r>
+        <w:t>Aportes de la arquitectura a objetivos estratégicos:</w:t>
+      </w:r>
       <w:bookmarkEnd w:id="61"/>
-    </w:p>
-    <w:p>
-      <w:pPr>
-        <w:ind w:firstLine="708"/>
-      </w:pPr>
-      <w:r>
-        <w:t>La arquitectura propuesta está directamente alineada con el objetivo comercial del proyecto: convertir capacidades técnicas en ventas digitales de productos de software.</w:t>
-      </w:r>
-    </w:p>
-    <w:p/>
-    <w:p>
-      <w:pPr>
-        <w:pStyle w:val="Ttulo3"/>
-      </w:pPr>
-      <w:bookmarkStart w:id="62" w:name="_Toc223906595"/>
-      <w:r>
-        <w:t>Aportes de la arquitectura a objetivos estratégicos:</w:t>
-      </w:r>
-      <w:bookmarkEnd w:id="62"/>
     </w:p>
     <w:p>
       <w:pPr>
@@ -20176,7 +19799,7 @@
       <w:pPr>
         <w:pStyle w:val="Ttulo1"/>
       </w:pPr>
-      <w:bookmarkStart w:id="63" w:name="_Toc223906596"/>
+      <w:bookmarkStart w:id="62" w:name="_Toc223906596"/>
       <w:r>
         <w:rPr>
           <w:rStyle w:val="Ttulo1Car"/>
@@ -20185,21 +19808,21 @@
         <w:lastRenderedPageBreak/>
         <w:t>PLANIFICACIÓN ÁGIL E IMPLEMENTACIÓN WEB</w:t>
       </w:r>
+      <w:bookmarkEnd w:id="62"/>
+      <w:r>
+        <w:t xml:space="preserve"> </w:t>
+      </w:r>
+    </w:p>
+    <w:p/>
+    <w:p>
+      <w:pPr>
+        <w:pStyle w:val="Ttulo2"/>
+      </w:pPr>
+      <w:bookmarkStart w:id="63" w:name="_Toc223906597"/>
+      <w:r>
+        <w:t>Procesos clave identificados</w:t>
+      </w:r>
       <w:bookmarkEnd w:id="63"/>
-      <w:r>
-        <w:t xml:space="preserve"> </w:t>
-      </w:r>
-    </w:p>
-    <w:p/>
-    <w:p>
-      <w:pPr>
-        <w:pStyle w:val="Ttulo2"/>
-      </w:pPr>
-      <w:bookmarkStart w:id="64" w:name="_Toc223906597"/>
-      <w:r>
-        <w:t>Procesos clave identificados</w:t>
-      </w:r>
-      <w:bookmarkEnd w:id="64"/>
     </w:p>
     <w:p>
       <w:pPr>
@@ -20210,15 +19833,7 @@
         </w:numPr>
       </w:pPr>
       <w:r>
-        <w:t>Investigación y Definición: Análisis del entorno competitivo, ideación de los 3 productos (</w:t>
-      </w:r>
-      <w:proofErr w:type="spellStart"/>
-      <w:r>
-        <w:t>SafeCase</w:t>
-      </w:r>
-      <w:proofErr w:type="spellEnd"/>
-      <w:r>
-        <w:t xml:space="preserve">, </w:t>
+        <w:t xml:space="preserve">Investigación y Definición: Análisis del entorno competitivo, ideación de los 3 productos (SafeCase, </w:t>
       </w:r>
       <w:proofErr w:type="spellStart"/>
       <w:r>
@@ -20333,14 +19948,14 @@
           <w:lang w:val="es-GT"/>
         </w:rPr>
       </w:pPr>
-      <w:bookmarkStart w:id="65" w:name="_Toc223906598"/>
+      <w:bookmarkStart w:id="64" w:name="_Toc223906598"/>
       <w:r>
         <w:rPr>
           <w:lang w:val="es-GT"/>
         </w:rPr>
         <w:t>Sprint 1 — Investigación, Definición del Producto y Diseño Estratégico</w:t>
       </w:r>
-      <w:bookmarkEnd w:id="65"/>
+      <w:bookmarkEnd w:id="64"/>
     </w:p>
     <w:p>
       <w:pPr>
@@ -20402,14 +20017,14 @@
           <w:lang w:val="es-GT"/>
         </w:rPr>
       </w:pPr>
-      <w:bookmarkStart w:id="66" w:name="_Toc223906599"/>
+      <w:bookmarkStart w:id="65" w:name="_Toc223906599"/>
       <w:r>
         <w:rPr>
           <w:lang w:val="es-GT"/>
         </w:rPr>
         <w:t>Temas Correctos Trabajados en el Sprint 1</w:t>
       </w:r>
-      <w:bookmarkEnd w:id="66"/>
+      <w:bookmarkEnd w:id="65"/>
     </w:p>
     <w:p>
       <w:pPr>
@@ -20669,21 +20284,7 @@
         <w:rPr>
           <w:lang w:val="es-GT"/>
         </w:rPr>
-        <w:t xml:space="preserve">Idear producto 3 basado en </w:t>
-      </w:r>
-      <w:proofErr w:type="spellStart"/>
-      <w:r>
-        <w:rPr>
-          <w:lang w:val="es-GT"/>
-        </w:rPr>
-        <w:t>apps</w:t>
-      </w:r>
-      <w:proofErr w:type="spellEnd"/>
-      <w:r>
-        <w:rPr>
-          <w:lang w:val="es-GT"/>
-        </w:rPr>
-        <w:t xml:space="preserve"> móviles.</w:t>
+        <w:t>Idear producto 3 basado en apps móviles.</w:t>
       </w:r>
     </w:p>
     <w:p>
@@ -21067,21 +20668,7 @@
         <w:rPr>
           <w:lang w:val="es-GT"/>
         </w:rPr>
-        <w:t xml:space="preserve">Aplicar </w:t>
-      </w:r>
-      <w:proofErr w:type="spellStart"/>
-      <w:r>
-        <w:rPr>
-          <w:lang w:val="es-GT"/>
-        </w:rPr>
-        <w:t>Five</w:t>
-      </w:r>
-      <w:proofErr w:type="spellEnd"/>
-      <w:r>
-        <w:rPr>
-          <w:lang w:val="es-GT"/>
-        </w:rPr>
-        <w:t xml:space="preserve"> </w:t>
+        <w:t xml:space="preserve">Aplicar Five </w:t>
       </w:r>
       <w:proofErr w:type="spellStart"/>
       <w:r>
@@ -21163,14 +20750,14 @@
           <w:lang w:val="es-GT"/>
         </w:rPr>
       </w:pPr>
-      <w:bookmarkStart w:id="67" w:name="_Toc223906600"/>
+      <w:bookmarkStart w:id="66" w:name="_Toc223906600"/>
       <w:r>
         <w:rPr>
           <w:lang w:val="es-GT"/>
         </w:rPr>
         <w:t>Resultado Esperado del Sprint 1</w:t>
       </w:r>
-      <w:bookmarkEnd w:id="67"/>
+      <w:bookmarkEnd w:id="66"/>
     </w:p>
     <w:p>
       <w:pPr>
@@ -21299,28 +20886,14 @@
           <w:lang w:val="es-GT"/>
         </w:rPr>
       </w:pPr>
-      <w:bookmarkStart w:id="68" w:name="_Toc223906601"/>
-      <w:r>
-        <w:rPr>
-          <w:lang w:val="es-GT"/>
-        </w:rPr>
-        <w:t xml:space="preserve">Dinámica </w:t>
-      </w:r>
-      <w:proofErr w:type="spellStart"/>
-      <w:r>
-        <w:rPr>
-          <w:lang w:val="es-GT"/>
-        </w:rPr>
-        <w:t>Scrum</w:t>
-      </w:r>
-      <w:proofErr w:type="spellEnd"/>
-      <w:r>
-        <w:rPr>
-          <w:lang w:val="es-GT"/>
-        </w:rPr>
-        <w:t xml:space="preserve"> Observada en el Sprint 1</w:t>
-      </w:r>
-      <w:bookmarkEnd w:id="68"/>
+      <w:bookmarkStart w:id="67" w:name="_Toc223906601"/>
+      <w:r>
+        <w:rPr>
+          <w:lang w:val="es-GT"/>
+        </w:rPr>
+        <w:t>Dinámica Scrum Observada en el Sprint 1</w:t>
+      </w:r>
+      <w:bookmarkEnd w:id="67"/>
     </w:p>
     <w:p>
       <w:pPr>
@@ -21332,23 +20905,13 @@
           <w:lang w:val="es-GT"/>
         </w:rPr>
       </w:pPr>
-      <w:proofErr w:type="spellStart"/>
       <w:r>
         <w:rPr>
           <w:b/>
           <w:bCs/>
           <w:lang w:val="es-GT"/>
         </w:rPr>
-        <w:t>Backlog</w:t>
-      </w:r>
-      <w:proofErr w:type="spellEnd"/>
-      <w:r>
-        <w:rPr>
-          <w:b/>
-          <w:bCs/>
-          <w:lang w:val="es-GT"/>
-        </w:rPr>
-        <w:t>:</w:t>
+        <w:t>Backlog:</w:t>
       </w:r>
       <w:r>
         <w:rPr>
@@ -21430,21 +20993,7 @@
         <w:rPr>
           <w:lang w:val="es-GT"/>
         </w:rPr>
-        <w:t xml:space="preserve"> (VUCA, PEST, </w:t>
-      </w:r>
-      <w:proofErr w:type="spellStart"/>
-      <w:r>
-        <w:rPr>
-          <w:lang w:val="es-GT"/>
-        </w:rPr>
-        <w:t>Five</w:t>
-      </w:r>
-      <w:proofErr w:type="spellEnd"/>
-      <w:r>
-        <w:rPr>
-          <w:lang w:val="es-GT"/>
-        </w:rPr>
-        <w:t xml:space="preserve"> </w:t>
+        <w:t xml:space="preserve"> (VUCA, PEST, Five </w:t>
       </w:r>
       <w:proofErr w:type="spellStart"/>
       <w:r>
@@ -21548,14 +21097,14 @@
           <w:lang w:val="es-GT"/>
         </w:rPr>
       </w:pPr>
-      <w:bookmarkStart w:id="69" w:name="_Toc223906602"/>
+      <w:bookmarkStart w:id="68" w:name="_Toc223906602"/>
       <w:r>
         <w:rPr>
           <w:lang w:val="es-GT"/>
         </w:rPr>
         <w:t>Sprint 2 — Desarrollo del Sitio, Documentación y Cierre Ejecutivo</w:t>
       </w:r>
-      <w:bookmarkEnd w:id="69"/>
+      <w:bookmarkEnd w:id="68"/>
     </w:p>
     <w:p>
       <w:pPr>
@@ -21615,14 +21164,14 @@
           <w:lang w:val="es-GT"/>
         </w:rPr>
       </w:pPr>
-      <w:bookmarkStart w:id="70" w:name="_Toc223906603"/>
+      <w:bookmarkStart w:id="69" w:name="_Toc223906603"/>
       <w:r>
         <w:rPr>
           <w:lang w:val="es-GT"/>
         </w:rPr>
         <w:t>Temas Correctos Trabajados en el Sprint 2</w:t>
       </w:r>
-      <w:bookmarkEnd w:id="70"/>
+      <w:bookmarkEnd w:id="69"/>
     </w:p>
     <w:p>
       <w:pPr>
@@ -22071,14 +21620,14 @@
           <w:lang w:val="es-GT"/>
         </w:rPr>
       </w:pPr>
-      <w:bookmarkStart w:id="71" w:name="_Toc223906604"/>
+      <w:bookmarkStart w:id="70" w:name="_Toc223906604"/>
       <w:r>
         <w:rPr>
           <w:lang w:val="es-GT"/>
         </w:rPr>
         <w:t>Resultado Esperado del Sprint 2</w:t>
       </w:r>
-      <w:bookmarkEnd w:id="71"/>
+      <w:bookmarkEnd w:id="70"/>
     </w:p>
     <w:p>
       <w:pPr>
@@ -22104,7 +21653,21 @@
         <w:rPr>
           <w:lang w:val="es-GT"/>
         </w:rPr>
-        <w:t xml:space="preserve"> de QuetzalDev:</w:t>
+        <w:t xml:space="preserve"> de </w:t>
+      </w:r>
+      <w:proofErr w:type="spellStart"/>
+      <w:r>
+        <w:rPr>
+          <w:lang w:val="es-GT"/>
+        </w:rPr>
+        <w:t>QuetzalDev</w:t>
+      </w:r>
+      <w:proofErr w:type="spellEnd"/>
+      <w:r>
+        <w:rPr>
+          <w:lang w:val="es-GT"/>
+        </w:rPr>
+        <w:t>:</w:t>
       </w:r>
     </w:p>
     <w:p>
@@ -22258,29 +21821,15 @@
           <w:lang w:val="es-GT"/>
         </w:rPr>
       </w:pPr>
-      <w:bookmarkStart w:id="72" w:name="_Toc223906605"/>
+      <w:bookmarkStart w:id="71" w:name="_Toc223906605"/>
       <w:r>
         <w:rPr>
           <w:lang w:val="es-GT"/>
         </w:rPr>
         <w:lastRenderedPageBreak/>
-        <w:t xml:space="preserve">Dinámica </w:t>
-      </w:r>
-      <w:proofErr w:type="spellStart"/>
-      <w:r>
-        <w:rPr>
-          <w:lang w:val="es-GT"/>
-        </w:rPr>
-        <w:t>Scrum</w:t>
-      </w:r>
-      <w:proofErr w:type="spellEnd"/>
-      <w:r>
-        <w:rPr>
-          <w:lang w:val="es-GT"/>
-        </w:rPr>
-        <w:t xml:space="preserve"> Observada en el Sprint 2</w:t>
-      </w:r>
-      <w:bookmarkEnd w:id="72"/>
+        <w:t>Dinámica Scrum Observada en el Sprint 2</w:t>
+      </w:r>
+      <w:bookmarkEnd w:id="71"/>
     </w:p>
     <w:p>
       <w:pPr>
@@ -22292,23 +21841,13 @@
           <w:lang w:val="es-GT"/>
         </w:rPr>
       </w:pPr>
-      <w:proofErr w:type="spellStart"/>
       <w:r>
         <w:rPr>
           <w:b/>
           <w:bCs/>
           <w:lang w:val="es-GT"/>
         </w:rPr>
-        <w:t>Backlog</w:t>
-      </w:r>
-      <w:proofErr w:type="spellEnd"/>
-      <w:r>
-        <w:rPr>
-          <w:b/>
-          <w:bCs/>
-          <w:lang w:val="es-GT"/>
-        </w:rPr>
-        <w:t>:</w:t>
+        <w:t>Backlog:</w:t>
       </w:r>
       <w:r>
         <w:rPr>
@@ -22545,11 +22084,11 @@
       <w:pPr>
         <w:pStyle w:val="Ttulo2"/>
       </w:pPr>
-      <w:bookmarkStart w:id="73" w:name="_Toc223906606"/>
+      <w:bookmarkStart w:id="72" w:name="_Toc223906606"/>
       <w:r>
         <w:t>Enlace de la plataforma funcional</w:t>
       </w:r>
-      <w:bookmarkEnd w:id="73"/>
+      <w:bookmarkEnd w:id="72"/>
       <w:r>
         <w:t xml:space="preserve"> </w:t>
       </w:r>
@@ -22560,7 +22099,7 @@
         <w:ind w:firstLine="360"/>
         <w:jc w:val="left"/>
       </w:pPr>
-      <w:hyperlink r:id="rId24" w:anchor="/" w:history="1">
+      <w:hyperlink r:id="rId25" w:anchor="/" w:history="1">
         <w:r>
           <w:rPr>
             <w:rStyle w:val="Hipervnculo"/>
@@ -22648,12 +22187,12 @@
       <w:pPr>
         <w:pStyle w:val="Ttulo1"/>
       </w:pPr>
-      <w:bookmarkStart w:id="74" w:name="_Toc223906607"/>
+      <w:bookmarkStart w:id="73" w:name="_Toc223906607"/>
       <w:r>
         <w:lastRenderedPageBreak/>
         <w:t>CONCLUSIONES</w:t>
       </w:r>
-      <w:bookmarkEnd w:id="74"/>
+      <w:bookmarkEnd w:id="73"/>
     </w:p>
     <w:p/>
     <w:p>
@@ -22686,7 +22225,21 @@
         <w:rPr>
           <w:bCs/>
         </w:rPr>
-        <w:t xml:space="preserve"> para QuetzalDev responde de forma directa al problema central identificado: la falta de un canal digital estructurado para comercializar soluciones de software de manera escalable.</w:t>
+        <w:t xml:space="preserve"> para </w:t>
+      </w:r>
+      <w:proofErr w:type="spellStart"/>
+      <w:r>
+        <w:rPr>
+          <w:bCs/>
+        </w:rPr>
+        <w:t>QuetzalDev</w:t>
+      </w:r>
+      <w:proofErr w:type="spellEnd"/>
+      <w:r>
+        <w:rPr>
+          <w:bCs/>
+        </w:rPr>
+        <w:t xml:space="preserve"> responde de forma directa al problema central identificado: la falta de un canal digital estructurado para comercializar soluciones de software de manera escalable.</w:t>
       </w:r>
     </w:p>
     <w:p>
@@ -22705,21 +22258,7 @@
         <w:rPr>
           <w:bCs/>
         </w:rPr>
-        <w:t xml:space="preserve">La definición de los productos </w:t>
-      </w:r>
-      <w:proofErr w:type="spellStart"/>
-      <w:r>
-        <w:rPr>
-          <w:bCs/>
-        </w:rPr>
-        <w:t>SafeCase</w:t>
-      </w:r>
-      <w:proofErr w:type="spellEnd"/>
-      <w:r>
-        <w:rPr>
-          <w:bCs/>
-        </w:rPr>
-        <w:t xml:space="preserve">, </w:t>
+        <w:t xml:space="preserve">La definición de los productos SafeCase, </w:t>
       </w:r>
       <w:proofErr w:type="spellStart"/>
       <w:r>
@@ -22863,7 +22402,7 @@
       </w:pPr>
     </w:p>
     <w:sectPr>
-      <w:footerReference w:type="default" r:id="rId25"/>
+      <w:footerReference w:type="default" r:id="rId26"/>
       <w:pgSz w:w="11906" w:h="16838"/>
       <w:pgMar w:top="1440" w:right="1440" w:bottom="1440" w:left="1440" w:header="720" w:footer="720" w:gutter="0"/>
       <w:pgNumType w:start="1"/>
@@ -22875,7 +22414,7 @@
 </file>
 
 <file path=word/endnotes.xml><?xml version="1.0" encoding="utf-8"?>
-<w:endnotes xmlns:wpc="http://schemas.microsoft.com/office/word/2010/wordprocessingCanvas" xmlns:mc="http://schemas.openxmlformats.org/markup-compatibility/2006" xmlns:o="urn:schemas-microsoft-com:office:office" xmlns:r="http://schemas.openxmlformats.org/officeDocument/2006/relationships" xmlns:m="http://schemas.openxmlformats.org/officeDocument/2006/math" xmlns:v="urn:schemas-microsoft-com:vml" xmlns:wp14="http://schemas.microsoft.com/office/word/2010/wordprocessingDrawing" xmlns:wp="http://schemas.openxmlformats.org/drawingml/2006/wordprocessingDrawing" xmlns:w10="urn:schemas-microsoft-com:office:word" xmlns:w="http://schemas.openxmlformats.org/wordprocessingml/2006/main" xmlns:w14="http://schemas.microsoft.com/office/word/2010/wordml" xmlns:w15="http://schemas.microsoft.com/office/word/2012/wordml" xmlns:wpg="http://schemas.microsoft.com/office/word/2010/wordprocessingGroup" xmlns:wpi="http://schemas.microsoft.com/office/word/2010/wordprocessingInk" xmlns:wne="http://schemas.microsoft.com/office/word/2006/wordml" xmlns:wps="http://schemas.microsoft.com/office/word/2010/wordprocessingShape" mc:Ignorable="w14 w15 wp14">
+<w:endnotes xmlns:wpc="http://schemas.microsoft.com/office/word/2010/wordprocessingCanvas" xmlns:cx="http://schemas.microsoft.com/office/drawing/2014/chartex" xmlns:cx1="http://schemas.microsoft.com/office/drawing/2015/9/8/chartex" xmlns:cx2="http://schemas.microsoft.com/office/drawing/2015/10/21/chartex" xmlns:cx3="http://schemas.microsoft.com/office/drawing/2016/5/9/chartex" xmlns:cx4="http://schemas.microsoft.com/office/drawing/2016/5/10/chartex" xmlns:cx5="http://schemas.microsoft.com/office/drawing/2016/5/11/chartex" xmlns:cx6="http://schemas.microsoft.com/office/drawing/2016/5/12/chartex" xmlns:cx7="http://schemas.microsoft.com/office/drawing/2016/5/13/chartex" xmlns:cx8="http://schemas.microsoft.com/office/drawing/2016/5/14/chartex" xmlns:mc="http://schemas.openxmlformats.org/markup-compatibility/2006" xmlns:aink="http://schemas.microsoft.com/office/drawing/2016/ink" xmlns:am3d="http://schemas.microsoft.com/office/drawing/2017/model3d" xmlns:o="urn:schemas-microsoft-com:office:office" xmlns:oel="http://schemas.microsoft.com/office/2019/extlst" xmlns:r="http://schemas.openxmlformats.org/officeDocument/2006/relationships" xmlns:m="http://schemas.openxmlformats.org/officeDocument/2006/math" xmlns:v="urn:schemas-microsoft-com:vml" xmlns:wp14="http://schemas.microsoft.com/office/word/2010/wordprocessingDrawing" xmlns:wp="http://schemas.openxmlformats.org/drawingml/2006/wordprocessingDrawing" xmlns:w10="urn:schemas-microsoft-com:office:word" xmlns:w="http://schemas.openxmlformats.org/wordprocessingml/2006/main" xmlns:w14="http://schemas.microsoft.com/office/word/2010/wordml" xmlns:w15="http://schemas.microsoft.com/office/word/2012/wordml" xmlns:w16cex="http://schemas.microsoft.com/office/word/2018/wordml/cex" xmlns:w16cid="http://schemas.microsoft.com/office/word/2016/wordml/cid" xmlns:w16="http://schemas.microsoft.com/office/word/2018/wordml" xmlns:w16du="http://schemas.microsoft.com/office/word/2023/wordml/word16du" xmlns:w16sdtdh="http://schemas.microsoft.com/office/word/2020/wordml/sdtdatahash" xmlns:w16sdtfl="http://schemas.microsoft.com/office/word/2024/wordml/sdtformatlock" xmlns:w16se="http://schemas.microsoft.com/office/word/2015/wordml/symex" xmlns:wpg="http://schemas.microsoft.com/office/word/2010/wordprocessingGroup" xmlns:wpi="http://schemas.microsoft.com/office/word/2010/wordprocessingInk" xmlns:wne="http://schemas.microsoft.com/office/word/2006/wordml" xmlns:wps="http://schemas.microsoft.com/office/word/2010/wordprocessingShape" mc:Ignorable="w14 w15 w16se w16cid w16 w16cex w16sdtdh w16sdtfl w16du wp14">
   <w:endnote w:type="separator" w:id="-1">
     <w:p>
       <w:pPr>
@@ -22900,7 +22439,7 @@
 </file>
 
 <file path=word/footer1.xml><?xml version="1.0" encoding="utf-8"?>
-<w:ftr xmlns:wpc="http://schemas.microsoft.com/office/word/2010/wordprocessingCanvas" xmlns:mc="http://schemas.openxmlformats.org/markup-compatibility/2006" xmlns:o="urn:schemas-microsoft-com:office:office" xmlns:r="http://schemas.openxmlformats.org/officeDocument/2006/relationships" xmlns:m="http://schemas.openxmlformats.org/officeDocument/2006/math" xmlns:v="urn:schemas-microsoft-com:vml" xmlns:wp14="http://schemas.microsoft.com/office/word/2010/wordprocessingDrawing" xmlns:wp="http://schemas.openxmlformats.org/drawingml/2006/wordprocessingDrawing" xmlns:w10="urn:schemas-microsoft-com:office:word" xmlns:w="http://schemas.openxmlformats.org/wordprocessingml/2006/main" xmlns:w14="http://schemas.microsoft.com/office/word/2010/wordml" xmlns:w15="http://schemas.microsoft.com/office/word/2012/wordml" xmlns:wpg="http://schemas.microsoft.com/office/word/2010/wordprocessingGroup" xmlns:wpi="http://schemas.microsoft.com/office/word/2010/wordprocessingInk" xmlns:wne="http://schemas.microsoft.com/office/word/2006/wordml" xmlns:wps="http://schemas.microsoft.com/office/word/2010/wordprocessingShape" mc:Ignorable="w14 w15 wp14">
+<w:ftr xmlns:wpc="http://schemas.microsoft.com/office/word/2010/wordprocessingCanvas" xmlns:cx="http://schemas.microsoft.com/office/drawing/2014/chartex" xmlns:cx1="http://schemas.microsoft.com/office/drawing/2015/9/8/chartex" xmlns:cx2="http://schemas.microsoft.com/office/drawing/2015/10/21/chartex" xmlns:cx3="http://schemas.microsoft.com/office/drawing/2016/5/9/chartex" xmlns:cx4="http://schemas.microsoft.com/office/drawing/2016/5/10/chartex" xmlns:cx5="http://schemas.microsoft.com/office/drawing/2016/5/11/chartex" xmlns:cx6="http://schemas.microsoft.com/office/drawing/2016/5/12/chartex" xmlns:cx7="http://schemas.microsoft.com/office/drawing/2016/5/13/chartex" xmlns:cx8="http://schemas.microsoft.com/office/drawing/2016/5/14/chartex" xmlns:mc="http://schemas.openxmlformats.org/markup-compatibility/2006" xmlns:aink="http://schemas.microsoft.com/office/drawing/2016/ink" xmlns:am3d="http://schemas.microsoft.com/office/drawing/2017/model3d" xmlns:o="urn:schemas-microsoft-com:office:office" xmlns:oel="http://schemas.microsoft.com/office/2019/extlst" xmlns:r="http://schemas.openxmlformats.org/officeDocument/2006/relationships" xmlns:m="http://schemas.openxmlformats.org/officeDocument/2006/math" xmlns:v="urn:schemas-microsoft-com:vml" xmlns:wp14="http://schemas.microsoft.com/office/word/2010/wordprocessingDrawing" xmlns:wp="http://schemas.openxmlformats.org/drawingml/2006/wordprocessingDrawing" xmlns:w10="urn:schemas-microsoft-com:office:word" xmlns:w="http://schemas.openxmlformats.org/wordprocessingml/2006/main" xmlns:w14="http://schemas.microsoft.com/office/word/2010/wordml" xmlns:w15="http://schemas.microsoft.com/office/word/2012/wordml" xmlns:w16cex="http://schemas.microsoft.com/office/word/2018/wordml/cex" xmlns:w16cid="http://schemas.microsoft.com/office/word/2016/wordml/cid" xmlns:w16="http://schemas.microsoft.com/office/word/2018/wordml" xmlns:w16du="http://schemas.microsoft.com/office/word/2023/wordml/word16du" xmlns:w16sdtdh="http://schemas.microsoft.com/office/word/2020/wordml/sdtdatahash" xmlns:w16sdtfl="http://schemas.microsoft.com/office/word/2024/wordml/sdtformatlock" xmlns:w16se="http://schemas.microsoft.com/office/word/2015/wordml/symex" xmlns:wpg="http://schemas.microsoft.com/office/word/2010/wordprocessingGroup" xmlns:wpi="http://schemas.microsoft.com/office/word/2010/wordprocessingInk" xmlns:wne="http://schemas.microsoft.com/office/word/2006/wordml" xmlns:wps="http://schemas.microsoft.com/office/word/2010/wordprocessingShape" mc:Ignorable="w14 w15 w16se w16cid w16 w16cex w16sdtdh w16sdtfl w16du wp14">
   <w:p>
     <w:pPr>
       <w:pStyle w:val="Piedepgina"/>
@@ -22921,7 +22460,7 @@
 </file>
 
 <file path=word/footer2.xml><?xml version="1.0" encoding="utf-8"?>
-<w:ftr xmlns:wpc="http://schemas.microsoft.com/office/word/2010/wordprocessingCanvas" xmlns:mc="http://schemas.openxmlformats.org/markup-compatibility/2006" xmlns:o="urn:schemas-microsoft-com:office:office" xmlns:r="http://schemas.openxmlformats.org/officeDocument/2006/relationships" xmlns:m="http://schemas.openxmlformats.org/officeDocument/2006/math" xmlns:v="urn:schemas-microsoft-com:vml" xmlns:wp14="http://schemas.microsoft.com/office/word/2010/wordprocessingDrawing" xmlns:wp="http://schemas.openxmlformats.org/drawingml/2006/wordprocessingDrawing" xmlns:w10="urn:schemas-microsoft-com:office:word" xmlns:w="http://schemas.openxmlformats.org/wordprocessingml/2006/main" xmlns:w14="http://schemas.microsoft.com/office/word/2010/wordml" xmlns:w15="http://schemas.microsoft.com/office/word/2012/wordml" xmlns:wpg="http://schemas.microsoft.com/office/word/2010/wordprocessingGroup" xmlns:wpi="http://schemas.microsoft.com/office/word/2010/wordprocessingInk" xmlns:wne="http://schemas.microsoft.com/office/word/2006/wordml" xmlns:wps="http://schemas.microsoft.com/office/word/2010/wordprocessingShape" mc:Ignorable="w14 w15 wp14">
+<w:ftr xmlns:wpc="http://schemas.microsoft.com/office/word/2010/wordprocessingCanvas" xmlns:cx="http://schemas.microsoft.com/office/drawing/2014/chartex" xmlns:cx1="http://schemas.microsoft.com/office/drawing/2015/9/8/chartex" xmlns:cx2="http://schemas.microsoft.com/office/drawing/2015/10/21/chartex" xmlns:cx3="http://schemas.microsoft.com/office/drawing/2016/5/9/chartex" xmlns:cx4="http://schemas.microsoft.com/office/drawing/2016/5/10/chartex" xmlns:cx5="http://schemas.microsoft.com/office/drawing/2016/5/11/chartex" xmlns:cx6="http://schemas.microsoft.com/office/drawing/2016/5/12/chartex" xmlns:cx7="http://schemas.microsoft.com/office/drawing/2016/5/13/chartex" xmlns:cx8="http://schemas.microsoft.com/office/drawing/2016/5/14/chartex" xmlns:mc="http://schemas.openxmlformats.org/markup-compatibility/2006" xmlns:aink="http://schemas.microsoft.com/office/drawing/2016/ink" xmlns:am3d="http://schemas.microsoft.com/office/drawing/2017/model3d" xmlns:o="urn:schemas-microsoft-com:office:office" xmlns:oel="http://schemas.microsoft.com/office/2019/extlst" xmlns:r="http://schemas.openxmlformats.org/officeDocument/2006/relationships" xmlns:m="http://schemas.openxmlformats.org/officeDocument/2006/math" xmlns:v="urn:schemas-microsoft-com:vml" xmlns:wp14="http://schemas.microsoft.com/office/word/2010/wordprocessingDrawing" xmlns:wp="http://schemas.openxmlformats.org/drawingml/2006/wordprocessingDrawing" xmlns:w10="urn:schemas-microsoft-com:office:word" xmlns:w="http://schemas.openxmlformats.org/wordprocessingml/2006/main" xmlns:w14="http://schemas.microsoft.com/office/word/2010/wordml" xmlns:w15="http://schemas.microsoft.com/office/word/2012/wordml" xmlns:w16cex="http://schemas.microsoft.com/office/word/2018/wordml/cex" xmlns:w16cid="http://schemas.microsoft.com/office/word/2016/wordml/cid" xmlns:w16="http://schemas.microsoft.com/office/word/2018/wordml" xmlns:w16du="http://schemas.microsoft.com/office/word/2023/wordml/word16du" xmlns:w16sdtdh="http://schemas.microsoft.com/office/word/2020/wordml/sdtdatahash" xmlns:w16sdtfl="http://schemas.microsoft.com/office/word/2024/wordml/sdtformatlock" xmlns:w16se="http://schemas.microsoft.com/office/word/2015/wordml/symex" xmlns:wpg="http://schemas.microsoft.com/office/word/2010/wordprocessingGroup" xmlns:wpi="http://schemas.microsoft.com/office/word/2010/wordprocessingInk" xmlns:wne="http://schemas.microsoft.com/office/word/2006/wordml" xmlns:wps="http://schemas.microsoft.com/office/word/2010/wordprocessingShape" mc:Ignorable="w14 w15 w16se w16cid w16 w16cex w16sdtdh w16sdtfl w16du wp14">
   <w:sdt>
     <w:sdtPr>
       <w:id w:val="-1336447564"/>
@@ -22930,7 +22469,6 @@
         <w:docPartUnique/>
       </w:docPartObj>
     </w:sdtPr>
-    <w:sdtEndPr/>
     <w:sdtContent>
       <w:p>
         <w:pPr>
@@ -22972,7 +22510,7 @@
 </file>
 
 <file path=word/footnotes.xml><?xml version="1.0" encoding="utf-8"?>
-<w:footnotes xmlns:wpc="http://schemas.microsoft.com/office/word/2010/wordprocessingCanvas" xmlns:mc="http://schemas.openxmlformats.org/markup-compatibility/2006" xmlns:o="urn:schemas-microsoft-com:office:office" xmlns:r="http://schemas.openxmlformats.org/officeDocument/2006/relationships" xmlns:m="http://schemas.openxmlformats.org/officeDocument/2006/math" xmlns:v="urn:schemas-microsoft-com:vml" xmlns:wp14="http://schemas.microsoft.com/office/word/2010/wordprocessingDrawing" xmlns:wp="http://schemas.openxmlformats.org/drawingml/2006/wordprocessingDrawing" xmlns:w10="urn:schemas-microsoft-com:office:word" xmlns:w="http://schemas.openxmlformats.org/wordprocessingml/2006/main" xmlns:w14="http://schemas.microsoft.com/office/word/2010/wordml" xmlns:w15="http://schemas.microsoft.com/office/word/2012/wordml" xmlns:wpg="http://schemas.microsoft.com/office/word/2010/wordprocessingGroup" xmlns:wpi="http://schemas.microsoft.com/office/word/2010/wordprocessingInk" xmlns:wne="http://schemas.microsoft.com/office/word/2006/wordml" xmlns:wps="http://schemas.microsoft.com/office/word/2010/wordprocessingShape" mc:Ignorable="w14 w15 wp14">
+<w:footnotes xmlns:wpc="http://schemas.microsoft.com/office/word/2010/wordprocessingCanvas" xmlns:cx="http://schemas.microsoft.com/office/drawing/2014/chartex" xmlns:cx1="http://schemas.microsoft.com/office/drawing/2015/9/8/chartex" xmlns:cx2="http://schemas.microsoft.com/office/drawing/2015/10/21/chartex" xmlns:cx3="http://schemas.microsoft.com/office/drawing/2016/5/9/chartex" xmlns:cx4="http://schemas.microsoft.com/office/drawing/2016/5/10/chartex" xmlns:cx5="http://schemas.microsoft.com/office/drawing/2016/5/11/chartex" xmlns:cx6="http://schemas.microsoft.com/office/drawing/2016/5/12/chartex" xmlns:cx7="http://schemas.microsoft.com/office/drawing/2016/5/13/chartex" xmlns:cx8="http://schemas.microsoft.com/office/drawing/2016/5/14/chartex" xmlns:mc="http://schemas.openxmlformats.org/markup-compatibility/2006" xmlns:aink="http://schemas.microsoft.com/office/drawing/2016/ink" xmlns:am3d="http://schemas.microsoft.com/office/drawing/2017/model3d" xmlns:o="urn:schemas-microsoft-com:office:office" xmlns:oel="http://schemas.microsoft.com/office/2019/extlst" xmlns:r="http://schemas.openxmlformats.org/officeDocument/2006/relationships" xmlns:m="http://schemas.openxmlformats.org/officeDocument/2006/math" xmlns:v="urn:schemas-microsoft-com:vml" xmlns:wp14="http://schemas.microsoft.com/office/word/2010/wordprocessingDrawing" xmlns:wp="http://schemas.openxmlformats.org/drawingml/2006/wordprocessingDrawing" xmlns:w10="urn:schemas-microsoft-com:office:word" xmlns:w="http://schemas.openxmlformats.org/wordprocessingml/2006/main" xmlns:w14="http://schemas.microsoft.com/office/word/2010/wordml" xmlns:w15="http://schemas.microsoft.com/office/word/2012/wordml" xmlns:w16cex="http://schemas.microsoft.com/office/word/2018/wordml/cex" xmlns:w16cid="http://schemas.microsoft.com/office/word/2016/wordml/cid" xmlns:w16="http://schemas.microsoft.com/office/word/2018/wordml" xmlns:w16du="http://schemas.microsoft.com/office/word/2023/wordml/word16du" xmlns:w16sdtdh="http://schemas.microsoft.com/office/word/2020/wordml/sdtdatahash" xmlns:w16sdtfl="http://schemas.microsoft.com/office/word/2024/wordml/sdtformatlock" xmlns:w16se="http://schemas.microsoft.com/office/word/2015/wordml/symex" xmlns:wpg="http://schemas.microsoft.com/office/word/2010/wordprocessingGroup" xmlns:wpi="http://schemas.microsoft.com/office/word/2010/wordprocessingInk" xmlns:wne="http://schemas.microsoft.com/office/word/2006/wordml" xmlns:wps="http://schemas.microsoft.com/office/word/2010/wordprocessingShape" mc:Ignorable="w14 w15 w16se w16cid w16 w16cex w16sdtdh w16sdtfl w16du wp14">
   <w:footnote w:type="separator" w:id="-1">
     <w:p>
       <w:pPr>
@@ -22997,8 +22535,8 @@
 </file>
 
 <file path=word/numbering.xml><?xml version="1.0" encoding="utf-8"?>
-<w:numbering xmlns:wpc="http://schemas.microsoft.com/office/word/2010/wordprocessingCanvas" xmlns:mc="http://schemas.openxmlformats.org/markup-compatibility/2006" xmlns:o="urn:schemas-microsoft-com:office:office" xmlns:r="http://schemas.openxmlformats.org/officeDocument/2006/relationships" xmlns:m="http://schemas.openxmlformats.org/officeDocument/2006/math" xmlns:v="urn:schemas-microsoft-com:vml" xmlns:wp14="http://schemas.microsoft.com/office/word/2010/wordprocessingDrawing" xmlns:wp="http://schemas.openxmlformats.org/drawingml/2006/wordprocessingDrawing" xmlns:w10="urn:schemas-microsoft-com:office:word" xmlns:w="http://schemas.openxmlformats.org/wordprocessingml/2006/main" xmlns:w14="http://schemas.microsoft.com/office/word/2010/wordml" xmlns:w15="http://schemas.microsoft.com/office/word/2012/wordml" xmlns:wpg="http://schemas.microsoft.com/office/word/2010/wordprocessingGroup" xmlns:wpi="http://schemas.microsoft.com/office/word/2010/wordprocessingInk" xmlns:wne="http://schemas.microsoft.com/office/word/2006/wordml" xmlns:wps="http://schemas.microsoft.com/office/word/2010/wordprocessingShape" mc:Ignorable="w14 w15 wp14">
-  <w:abstractNum w:abstractNumId="0">
+<w:numbering xmlns:wpc="http://schemas.microsoft.com/office/word/2010/wordprocessingCanvas" xmlns:cx="http://schemas.microsoft.com/office/drawing/2014/chartex" xmlns:cx1="http://schemas.microsoft.com/office/drawing/2015/9/8/chartex" xmlns:cx2="http://schemas.microsoft.com/office/drawing/2015/10/21/chartex" xmlns:cx3="http://schemas.microsoft.com/office/drawing/2016/5/9/chartex" xmlns:cx4="http://schemas.microsoft.com/office/drawing/2016/5/10/chartex" xmlns:cx5="http://schemas.microsoft.com/office/drawing/2016/5/11/chartex" xmlns:cx6="http://schemas.microsoft.com/office/drawing/2016/5/12/chartex" xmlns:cx7="http://schemas.microsoft.com/office/drawing/2016/5/13/chartex" xmlns:cx8="http://schemas.microsoft.com/office/drawing/2016/5/14/chartex" xmlns:mc="http://schemas.openxmlformats.org/markup-compatibility/2006" xmlns:aink="http://schemas.microsoft.com/office/drawing/2016/ink" xmlns:am3d="http://schemas.microsoft.com/office/drawing/2017/model3d" xmlns:o="urn:schemas-microsoft-com:office:office" xmlns:oel="http://schemas.microsoft.com/office/2019/extlst" xmlns:r="http://schemas.openxmlformats.org/officeDocument/2006/relationships" xmlns:m="http://schemas.openxmlformats.org/officeDocument/2006/math" xmlns:v="urn:schemas-microsoft-com:vml" xmlns:wp14="http://schemas.microsoft.com/office/word/2010/wordprocessingDrawing" xmlns:wp="http://schemas.openxmlformats.org/drawingml/2006/wordprocessingDrawing" xmlns:w10="urn:schemas-microsoft-com:office:word" xmlns:w="http://schemas.openxmlformats.org/wordprocessingml/2006/main" xmlns:w14="http://schemas.microsoft.com/office/word/2010/wordml" xmlns:w15="http://schemas.microsoft.com/office/word/2012/wordml" xmlns:w16cex="http://schemas.microsoft.com/office/word/2018/wordml/cex" xmlns:w16cid="http://schemas.microsoft.com/office/word/2016/wordml/cid" xmlns:w16="http://schemas.microsoft.com/office/word/2018/wordml" xmlns:w16du="http://schemas.microsoft.com/office/word/2023/wordml/word16du" xmlns:w16sdtdh="http://schemas.microsoft.com/office/word/2020/wordml/sdtdatahash" xmlns:w16sdtfl="http://schemas.microsoft.com/office/word/2024/wordml/sdtformatlock" xmlns:w16se="http://schemas.microsoft.com/office/word/2015/wordml/symex" xmlns:wpg="http://schemas.microsoft.com/office/word/2010/wordprocessingGroup" xmlns:wpi="http://schemas.microsoft.com/office/word/2010/wordprocessingInk" xmlns:wne="http://schemas.microsoft.com/office/word/2006/wordml" xmlns:wps="http://schemas.microsoft.com/office/word/2010/wordprocessingShape" mc:Ignorable="w14 w15 w16se w16cid w16 w16cex w16sdtdh w16sdtfl w16du wp14">
+  <w:abstractNum w:abstractNumId="0" w15:restartNumberingAfterBreak="0">
     <w:nsid w:val="0AD24B59"/>
     <w:multiLevelType w:val="multilevel"/>
     <w:tmpl w:val="B45A4E68"/>
@@ -23147,7 +22685,7 @@
       </w:rPr>
     </w:lvl>
   </w:abstractNum>
-  <w:abstractNum w:abstractNumId="1">
+  <w:abstractNum w:abstractNumId="1" w15:restartNumberingAfterBreak="0">
     <w:nsid w:val="0B185205"/>
     <w:multiLevelType w:val="hybridMultilevel"/>
     <w:tmpl w:val="908E0B9C"/>
@@ -23260,7 +22798,7 @@
       </w:rPr>
     </w:lvl>
   </w:abstractNum>
-  <w:abstractNum w:abstractNumId="2">
+  <w:abstractNum w:abstractNumId="2" w15:restartNumberingAfterBreak="0">
     <w:nsid w:val="0D4D0641"/>
     <w:multiLevelType w:val="hybridMultilevel"/>
     <w:tmpl w:val="49C47878"/>
@@ -23373,7 +22911,7 @@
       </w:rPr>
     </w:lvl>
   </w:abstractNum>
-  <w:abstractNum w:abstractNumId="3">
+  <w:abstractNum w:abstractNumId="3" w15:restartNumberingAfterBreak="0">
     <w:nsid w:val="0E702450"/>
     <w:multiLevelType w:val="multilevel"/>
     <w:tmpl w:val="A530B916"/>
@@ -23522,7 +23060,7 @@
       </w:rPr>
     </w:lvl>
   </w:abstractNum>
-  <w:abstractNum w:abstractNumId="4">
+  <w:abstractNum w:abstractNumId="4" w15:restartNumberingAfterBreak="0">
     <w:nsid w:val="0EB9051A"/>
     <w:multiLevelType w:val="multilevel"/>
     <w:tmpl w:val="D3B2D4BE"/>
@@ -23671,7 +23209,7 @@
       </w:rPr>
     </w:lvl>
   </w:abstractNum>
-  <w:abstractNum w:abstractNumId="5">
+  <w:abstractNum w:abstractNumId="5" w15:restartNumberingAfterBreak="0">
     <w:nsid w:val="11634203"/>
     <w:multiLevelType w:val="multilevel"/>
     <w:tmpl w:val="7CF41F2E"/>
@@ -23820,7 +23358,7 @@
       </w:rPr>
     </w:lvl>
   </w:abstractNum>
-  <w:abstractNum w:abstractNumId="6">
+  <w:abstractNum w:abstractNumId="6" w15:restartNumberingAfterBreak="0">
     <w:nsid w:val="11EB29E0"/>
     <w:multiLevelType w:val="multilevel"/>
     <w:tmpl w:val="3F1A1A2E"/>
@@ -23969,7 +23507,7 @@
       </w:rPr>
     </w:lvl>
   </w:abstractNum>
-  <w:abstractNum w:abstractNumId="7">
+  <w:abstractNum w:abstractNumId="7" w15:restartNumberingAfterBreak="0">
     <w:nsid w:val="12C70326"/>
     <w:multiLevelType w:val="hybridMultilevel"/>
     <w:tmpl w:val="F15E4044"/>
@@ -24082,7 +23620,7 @@
       </w:rPr>
     </w:lvl>
   </w:abstractNum>
-  <w:abstractNum w:abstractNumId="8">
+  <w:abstractNum w:abstractNumId="8" w15:restartNumberingAfterBreak="0">
     <w:nsid w:val="19FF6E9A"/>
     <w:multiLevelType w:val="hybridMultilevel"/>
     <w:tmpl w:val="D69EF490"/>
@@ -24195,7 +23733,7 @@
       </w:rPr>
     </w:lvl>
   </w:abstractNum>
-  <w:abstractNum w:abstractNumId="9">
+  <w:abstractNum w:abstractNumId="9" w15:restartNumberingAfterBreak="0">
     <w:nsid w:val="1C2276B4"/>
     <w:multiLevelType w:val="multilevel"/>
     <w:tmpl w:val="4502BB36"/>
@@ -24344,7 +23882,7 @@
       </w:rPr>
     </w:lvl>
   </w:abstractNum>
-  <w:abstractNum w:abstractNumId="10">
+  <w:abstractNum w:abstractNumId="10" w15:restartNumberingAfterBreak="0">
     <w:nsid w:val="1C2B5E2E"/>
     <w:multiLevelType w:val="multilevel"/>
     <w:tmpl w:val="8604EA18"/>
@@ -24493,7 +24031,7 @@
       </w:rPr>
     </w:lvl>
   </w:abstractNum>
-  <w:abstractNum w:abstractNumId="11">
+  <w:abstractNum w:abstractNumId="11" w15:restartNumberingAfterBreak="0">
     <w:nsid w:val="1CF62EED"/>
     <w:multiLevelType w:val="multilevel"/>
     <w:tmpl w:val="E3C69D7E"/>
@@ -24642,7 +24180,7 @@
       </w:rPr>
     </w:lvl>
   </w:abstractNum>
-  <w:abstractNum w:abstractNumId="12">
+  <w:abstractNum w:abstractNumId="12" w15:restartNumberingAfterBreak="0">
     <w:nsid w:val="1E322AB7"/>
     <w:multiLevelType w:val="multilevel"/>
     <w:tmpl w:val="F0AEDECC"/>
@@ -24791,7 +24329,7 @@
       </w:rPr>
     </w:lvl>
   </w:abstractNum>
-  <w:abstractNum w:abstractNumId="13">
+  <w:abstractNum w:abstractNumId="13" w15:restartNumberingAfterBreak="0">
     <w:nsid w:val="1E7523E9"/>
     <w:multiLevelType w:val="hybridMultilevel"/>
     <w:tmpl w:val="CC8A7934"/>
@@ -24904,7 +24442,7 @@
       </w:rPr>
     </w:lvl>
   </w:abstractNum>
-  <w:abstractNum w:abstractNumId="14">
+  <w:abstractNum w:abstractNumId="14" w15:restartNumberingAfterBreak="0">
     <w:nsid w:val="21B2682E"/>
     <w:multiLevelType w:val="multilevel"/>
     <w:tmpl w:val="E6DACC42"/>
@@ -25053,7 +24591,7 @@
       </w:rPr>
     </w:lvl>
   </w:abstractNum>
-  <w:abstractNum w:abstractNumId="15">
+  <w:abstractNum w:abstractNumId="15" w15:restartNumberingAfterBreak="0">
     <w:nsid w:val="26280072"/>
     <w:multiLevelType w:val="hybridMultilevel"/>
     <w:tmpl w:val="8B6646D4"/>
@@ -25166,7 +24704,7 @@
       </w:rPr>
     </w:lvl>
   </w:abstractNum>
-  <w:abstractNum w:abstractNumId="16">
+  <w:abstractNum w:abstractNumId="16" w15:restartNumberingAfterBreak="0">
     <w:nsid w:val="284B6D13"/>
     <w:multiLevelType w:val="multilevel"/>
     <w:tmpl w:val="810AF762"/>
@@ -25315,7 +24853,7 @@
       </w:rPr>
     </w:lvl>
   </w:abstractNum>
-  <w:abstractNum w:abstractNumId="17">
+  <w:abstractNum w:abstractNumId="17" w15:restartNumberingAfterBreak="0">
     <w:nsid w:val="2AE43608"/>
     <w:multiLevelType w:val="multilevel"/>
     <w:tmpl w:val="1B8AE976"/>
@@ -25464,7 +25002,7 @@
       </w:rPr>
     </w:lvl>
   </w:abstractNum>
-  <w:abstractNum w:abstractNumId="18">
+  <w:abstractNum w:abstractNumId="18" w15:restartNumberingAfterBreak="0">
     <w:nsid w:val="2C90491E"/>
     <w:multiLevelType w:val="multilevel"/>
     <w:tmpl w:val="860AC074"/>
@@ -25613,7 +25151,7 @@
       </w:rPr>
     </w:lvl>
   </w:abstractNum>
-  <w:abstractNum w:abstractNumId="19">
+  <w:abstractNum w:abstractNumId="19" w15:restartNumberingAfterBreak="0">
     <w:nsid w:val="33C554A8"/>
     <w:multiLevelType w:val="multilevel"/>
     <w:tmpl w:val="F1920414"/>
@@ -25762,7 +25300,7 @@
       </w:rPr>
     </w:lvl>
   </w:abstractNum>
-  <w:abstractNum w:abstractNumId="20">
+  <w:abstractNum w:abstractNumId="20" w15:restartNumberingAfterBreak="0">
     <w:nsid w:val="345D15DA"/>
     <w:multiLevelType w:val="multilevel"/>
     <w:tmpl w:val="F66C0E02"/>
@@ -25911,7 +25449,7 @@
       </w:rPr>
     </w:lvl>
   </w:abstractNum>
-  <w:abstractNum w:abstractNumId="21">
+  <w:abstractNum w:abstractNumId="21" w15:restartNumberingAfterBreak="0">
     <w:nsid w:val="3AB20AB7"/>
     <w:multiLevelType w:val="hybridMultilevel"/>
     <w:tmpl w:val="85EA0802"/>
@@ -26024,7 +25562,7 @@
       </w:rPr>
     </w:lvl>
   </w:abstractNum>
-  <w:abstractNum w:abstractNumId="22">
+  <w:abstractNum w:abstractNumId="22" w15:restartNumberingAfterBreak="0">
     <w:nsid w:val="3CD32167"/>
     <w:multiLevelType w:val="hybridMultilevel"/>
     <w:tmpl w:val="94983730"/>
@@ -26112,7 +25650,7 @@
       </w:pPr>
     </w:lvl>
   </w:abstractNum>
-  <w:abstractNum w:abstractNumId="23">
+  <w:abstractNum w:abstractNumId="23" w15:restartNumberingAfterBreak="0">
     <w:nsid w:val="3DE541BE"/>
     <w:multiLevelType w:val="multilevel"/>
     <w:tmpl w:val="CA1412F8"/>
@@ -26261,7 +25799,7 @@
       </w:rPr>
     </w:lvl>
   </w:abstractNum>
-  <w:abstractNum w:abstractNumId="24">
+  <w:abstractNum w:abstractNumId="24" w15:restartNumberingAfterBreak="0">
     <w:nsid w:val="3FB2565D"/>
     <w:multiLevelType w:val="hybridMultilevel"/>
     <w:tmpl w:val="DD660C40"/>
@@ -26374,7 +25912,7 @@
       </w:rPr>
     </w:lvl>
   </w:abstractNum>
-  <w:abstractNum w:abstractNumId="25">
+  <w:abstractNum w:abstractNumId="25" w15:restartNumberingAfterBreak="0">
     <w:nsid w:val="400B2358"/>
     <w:multiLevelType w:val="multilevel"/>
     <w:tmpl w:val="1CB4A3EA"/>
@@ -26523,7 +26061,7 @@
       </w:rPr>
     </w:lvl>
   </w:abstractNum>
-  <w:abstractNum w:abstractNumId="26">
+  <w:abstractNum w:abstractNumId="26" w15:restartNumberingAfterBreak="0">
     <w:nsid w:val="41AB794A"/>
     <w:multiLevelType w:val="multilevel"/>
     <w:tmpl w:val="982A28D6"/>
@@ -26672,7 +26210,7 @@
       </w:rPr>
     </w:lvl>
   </w:abstractNum>
-  <w:abstractNum w:abstractNumId="27">
+  <w:abstractNum w:abstractNumId="27" w15:restartNumberingAfterBreak="0">
     <w:nsid w:val="44011581"/>
     <w:multiLevelType w:val="multilevel"/>
     <w:tmpl w:val="5BCE4140"/>
@@ -26821,7 +26359,7 @@
       </w:rPr>
     </w:lvl>
   </w:abstractNum>
-  <w:abstractNum w:abstractNumId="28">
+  <w:abstractNum w:abstractNumId="28" w15:restartNumberingAfterBreak="0">
     <w:nsid w:val="4807013F"/>
     <w:multiLevelType w:val="multilevel"/>
     <w:tmpl w:val="DDF0E6AC"/>
@@ -26970,7 +26508,7 @@
       </w:rPr>
     </w:lvl>
   </w:abstractNum>
-  <w:abstractNum w:abstractNumId="29">
+  <w:abstractNum w:abstractNumId="29" w15:restartNumberingAfterBreak="0">
     <w:nsid w:val="4BE00318"/>
     <w:multiLevelType w:val="multilevel"/>
     <w:tmpl w:val="AC9ECBE6"/>
@@ -27119,7 +26657,7 @@
       </w:rPr>
     </w:lvl>
   </w:abstractNum>
-  <w:abstractNum w:abstractNumId="30">
+  <w:abstractNum w:abstractNumId="30" w15:restartNumberingAfterBreak="0">
     <w:nsid w:val="513361A9"/>
     <w:multiLevelType w:val="hybridMultilevel"/>
     <w:tmpl w:val="C7C8F82C"/>
@@ -27232,7 +26770,7 @@
       </w:rPr>
     </w:lvl>
   </w:abstractNum>
-  <w:abstractNum w:abstractNumId="31">
+  <w:abstractNum w:abstractNumId="31" w15:restartNumberingAfterBreak="0">
     <w:nsid w:val="56024FA9"/>
     <w:multiLevelType w:val="hybridMultilevel"/>
     <w:tmpl w:val="7626FC98"/>
@@ -27345,7 +26883,7 @@
       </w:rPr>
     </w:lvl>
   </w:abstractNum>
-  <w:abstractNum w:abstractNumId="32">
+  <w:abstractNum w:abstractNumId="32" w15:restartNumberingAfterBreak="0">
     <w:nsid w:val="58D40229"/>
     <w:multiLevelType w:val="hybridMultilevel"/>
     <w:tmpl w:val="B75E4606"/>
@@ -27458,7 +26996,7 @@
       </w:rPr>
     </w:lvl>
   </w:abstractNum>
-  <w:abstractNum w:abstractNumId="33">
+  <w:abstractNum w:abstractNumId="33" w15:restartNumberingAfterBreak="0">
     <w:nsid w:val="5A827001"/>
     <w:multiLevelType w:val="multilevel"/>
     <w:tmpl w:val="57A6D6CE"/>
@@ -27607,7 +27145,7 @@
       </w:rPr>
     </w:lvl>
   </w:abstractNum>
-  <w:abstractNum w:abstractNumId="34">
+  <w:abstractNum w:abstractNumId="34" w15:restartNumberingAfterBreak="0">
     <w:nsid w:val="6260393E"/>
     <w:multiLevelType w:val="multilevel"/>
     <w:tmpl w:val="63DC6922"/>
@@ -27756,7 +27294,7 @@
       </w:rPr>
     </w:lvl>
   </w:abstractNum>
-  <w:abstractNum w:abstractNumId="35">
+  <w:abstractNum w:abstractNumId="35" w15:restartNumberingAfterBreak="0">
     <w:nsid w:val="62995058"/>
     <w:multiLevelType w:val="multilevel"/>
     <w:tmpl w:val="04046134"/>
@@ -27905,7 +27443,7 @@
       </w:rPr>
     </w:lvl>
   </w:abstractNum>
-  <w:abstractNum w:abstractNumId="36">
+  <w:abstractNum w:abstractNumId="36" w15:restartNumberingAfterBreak="0">
     <w:nsid w:val="63172271"/>
     <w:multiLevelType w:val="hybridMultilevel"/>
     <w:tmpl w:val="A50AF52C"/>
@@ -28018,7 +27556,7 @@
       </w:rPr>
     </w:lvl>
   </w:abstractNum>
-  <w:abstractNum w:abstractNumId="37">
+  <w:abstractNum w:abstractNumId="37" w15:restartNumberingAfterBreak="0">
     <w:nsid w:val="65536925"/>
     <w:multiLevelType w:val="multilevel"/>
     <w:tmpl w:val="DEFC15F2"/>
@@ -28167,7 +27705,7 @@
       </w:rPr>
     </w:lvl>
   </w:abstractNum>
-  <w:abstractNum w:abstractNumId="38">
+  <w:abstractNum w:abstractNumId="38" w15:restartNumberingAfterBreak="0">
     <w:nsid w:val="67F85490"/>
     <w:multiLevelType w:val="multilevel"/>
     <w:tmpl w:val="C1A8FBDE"/>
@@ -28316,7 +27854,7 @@
       </w:rPr>
     </w:lvl>
   </w:abstractNum>
-  <w:abstractNum w:abstractNumId="39">
+  <w:abstractNum w:abstractNumId="39" w15:restartNumberingAfterBreak="0">
     <w:nsid w:val="6BD22E20"/>
     <w:multiLevelType w:val="hybridMultilevel"/>
     <w:tmpl w:val="811469EA"/>
@@ -28429,7 +27967,7 @@
       </w:rPr>
     </w:lvl>
   </w:abstractNum>
-  <w:abstractNum w:abstractNumId="40">
+  <w:abstractNum w:abstractNumId="40" w15:restartNumberingAfterBreak="0">
     <w:nsid w:val="6D505F0B"/>
     <w:multiLevelType w:val="hybridMultilevel"/>
     <w:tmpl w:val="06F2C544"/>
@@ -28542,7 +28080,7 @@
       </w:rPr>
     </w:lvl>
   </w:abstractNum>
-  <w:abstractNum w:abstractNumId="41">
+  <w:abstractNum w:abstractNumId="41" w15:restartNumberingAfterBreak="0">
     <w:nsid w:val="77D16C24"/>
     <w:multiLevelType w:val="hybridMultilevel"/>
     <w:tmpl w:val="CBF041A0"/>
@@ -28655,7 +28193,7 @@
       </w:rPr>
     </w:lvl>
   </w:abstractNum>
-  <w:abstractNum w:abstractNumId="42">
+  <w:abstractNum w:abstractNumId="42" w15:restartNumberingAfterBreak="0">
     <w:nsid w:val="79661773"/>
     <w:multiLevelType w:val="multilevel"/>
     <w:tmpl w:val="875C47DA"/>
@@ -28804,7 +28342,7 @@
       </w:rPr>
     </w:lvl>
   </w:abstractNum>
-  <w:abstractNum w:abstractNumId="43">
+  <w:abstractNum w:abstractNumId="43" w15:restartNumberingAfterBreak="0">
     <w:nsid w:val="7EDE655C"/>
     <w:multiLevelType w:val="multilevel"/>
     <w:tmpl w:val="850223B8"/>
@@ -28953,136 +28491,136 @@
       </w:rPr>
     </w:lvl>
   </w:abstractNum>
-  <w:num w:numId="1">
+  <w:num w:numId="1" w16cid:durableId="252318366">
     <w:abstractNumId w:val="22"/>
   </w:num>
-  <w:num w:numId="2">
+  <w:num w:numId="2" w16cid:durableId="1869417125">
     <w:abstractNumId w:val="15"/>
   </w:num>
-  <w:num w:numId="3">
+  <w:num w:numId="3" w16cid:durableId="304428849">
     <w:abstractNumId w:val="4"/>
   </w:num>
-  <w:num w:numId="4">
+  <w:num w:numId="4" w16cid:durableId="1112550684">
     <w:abstractNumId w:val="34"/>
   </w:num>
-  <w:num w:numId="5">
+  <w:num w:numId="5" w16cid:durableId="2096632828">
     <w:abstractNumId w:val="33"/>
   </w:num>
-  <w:num w:numId="6">
+  <w:num w:numId="6" w16cid:durableId="53093353">
     <w:abstractNumId w:val="3"/>
   </w:num>
-  <w:num w:numId="7">
+  <w:num w:numId="7" w16cid:durableId="906916921">
     <w:abstractNumId w:val="35"/>
   </w:num>
-  <w:num w:numId="8">
+  <w:num w:numId="8" w16cid:durableId="158733327">
     <w:abstractNumId w:val="38"/>
   </w:num>
-  <w:num w:numId="9">
+  <w:num w:numId="9" w16cid:durableId="1384333484">
     <w:abstractNumId w:val="43"/>
   </w:num>
-  <w:num w:numId="10">
+  <w:num w:numId="10" w16cid:durableId="1850100928">
     <w:abstractNumId w:val="21"/>
   </w:num>
-  <w:num w:numId="11">
+  <w:num w:numId="11" w16cid:durableId="1721634926">
     <w:abstractNumId w:val="40"/>
   </w:num>
-  <w:num w:numId="12">
+  <w:num w:numId="12" w16cid:durableId="563877528">
     <w:abstractNumId w:val="24"/>
   </w:num>
-  <w:num w:numId="13">
+  <w:num w:numId="13" w16cid:durableId="1104037675">
     <w:abstractNumId w:val="2"/>
   </w:num>
-  <w:num w:numId="14">
+  <w:num w:numId="14" w16cid:durableId="2055999815">
     <w:abstractNumId w:val="1"/>
   </w:num>
-  <w:num w:numId="15">
+  <w:num w:numId="15" w16cid:durableId="2131388916">
     <w:abstractNumId w:val="27"/>
   </w:num>
-  <w:num w:numId="16">
+  <w:num w:numId="16" w16cid:durableId="338896557">
     <w:abstractNumId w:val="14"/>
   </w:num>
-  <w:num w:numId="17">
+  <w:num w:numId="17" w16cid:durableId="1862163114">
     <w:abstractNumId w:val="42"/>
   </w:num>
-  <w:num w:numId="18">
+  <w:num w:numId="18" w16cid:durableId="197353297">
     <w:abstractNumId w:val="37"/>
   </w:num>
-  <w:num w:numId="19">
+  <w:num w:numId="19" w16cid:durableId="1727987850">
     <w:abstractNumId w:val="17"/>
   </w:num>
-  <w:num w:numId="20">
+  <w:num w:numId="20" w16cid:durableId="1759522638">
     <w:abstractNumId w:val="11"/>
   </w:num>
-  <w:num w:numId="21">
+  <w:num w:numId="21" w16cid:durableId="1186096566">
     <w:abstractNumId w:val="25"/>
   </w:num>
-  <w:num w:numId="22">
+  <w:num w:numId="22" w16cid:durableId="960653236">
     <w:abstractNumId w:val="32"/>
   </w:num>
-  <w:num w:numId="23">
+  <w:num w:numId="23" w16cid:durableId="461071403">
     <w:abstractNumId w:val="9"/>
   </w:num>
-  <w:num w:numId="24">
+  <w:num w:numId="24" w16cid:durableId="1597210247">
     <w:abstractNumId w:val="12"/>
   </w:num>
-  <w:num w:numId="25">
+  <w:num w:numId="25" w16cid:durableId="41056746">
     <w:abstractNumId w:val="28"/>
   </w:num>
-  <w:num w:numId="26">
+  <w:num w:numId="26" w16cid:durableId="2124568531">
     <w:abstractNumId w:val="5"/>
   </w:num>
-  <w:num w:numId="27">
+  <w:num w:numId="27" w16cid:durableId="1655521512">
     <w:abstractNumId w:val="10"/>
   </w:num>
-  <w:num w:numId="28">
+  <w:num w:numId="28" w16cid:durableId="2144423586">
     <w:abstractNumId w:val="0"/>
   </w:num>
-  <w:num w:numId="29">
+  <w:num w:numId="29" w16cid:durableId="105779207">
     <w:abstractNumId w:val="26"/>
   </w:num>
-  <w:num w:numId="30">
+  <w:num w:numId="30" w16cid:durableId="491258051">
     <w:abstractNumId w:val="20"/>
   </w:num>
-  <w:num w:numId="31">
+  <w:num w:numId="31" w16cid:durableId="1707556555">
     <w:abstractNumId w:val="18"/>
   </w:num>
-  <w:num w:numId="32">
+  <w:num w:numId="32" w16cid:durableId="1540124617">
     <w:abstractNumId w:val="19"/>
   </w:num>
-  <w:num w:numId="33">
+  <w:num w:numId="33" w16cid:durableId="1547178886">
     <w:abstractNumId w:val="23"/>
   </w:num>
-  <w:num w:numId="34">
+  <w:num w:numId="34" w16cid:durableId="43529859">
     <w:abstractNumId w:val="29"/>
   </w:num>
-  <w:num w:numId="35">
+  <w:num w:numId="35" w16cid:durableId="956837830">
     <w:abstractNumId w:val="6"/>
   </w:num>
-  <w:num w:numId="36">
+  <w:num w:numId="36" w16cid:durableId="2047217954">
     <w:abstractNumId w:val="16"/>
   </w:num>
-  <w:num w:numId="37">
+  <w:num w:numId="37" w16cid:durableId="1732387487">
     <w:abstractNumId w:val="36"/>
   </w:num>
-  <w:num w:numId="38">
+  <w:num w:numId="38" w16cid:durableId="865556825">
     <w:abstractNumId w:val="30"/>
   </w:num>
-  <w:num w:numId="39">
+  <w:num w:numId="39" w16cid:durableId="1753509881">
     <w:abstractNumId w:val="7"/>
   </w:num>
-  <w:num w:numId="40">
+  <w:num w:numId="40" w16cid:durableId="303894626">
     <w:abstractNumId w:val="13"/>
   </w:num>
-  <w:num w:numId="41">
+  <w:num w:numId="41" w16cid:durableId="1830903722">
     <w:abstractNumId w:val="41"/>
   </w:num>
-  <w:num w:numId="42">
+  <w:num w:numId="42" w16cid:durableId="942884107">
     <w:abstractNumId w:val="39"/>
   </w:num>
-  <w:num w:numId="43">
+  <w:num w:numId="43" w16cid:durableId="2102018643">
     <w:abstractNumId w:val="8"/>
   </w:num>
-  <w:num w:numId="44">
+  <w:num w:numId="44" w16cid:durableId="304043266">
     <w:abstractNumId w:val="31"/>
   </w:num>
   <w:numIdMacAtCleanup w:val="44"/>
@@ -29090,7 +28628,7 @@
 </file>
 
 <file path=word/styles.xml><?xml version="1.0" encoding="utf-8"?>
-<w:styles xmlns:mc="http://schemas.openxmlformats.org/markup-compatibility/2006" xmlns:r="http://schemas.openxmlformats.org/officeDocument/2006/relationships" xmlns:w="http://schemas.openxmlformats.org/wordprocessingml/2006/main" xmlns:w14="http://schemas.microsoft.com/office/word/2010/wordml" xmlns:w15="http://schemas.microsoft.com/office/word/2012/wordml" mc:Ignorable="w14 w15">
+<w:styles xmlns:mc="http://schemas.openxmlformats.org/markup-compatibility/2006" xmlns:r="http://schemas.openxmlformats.org/officeDocument/2006/relationships" xmlns:w="http://schemas.openxmlformats.org/wordprocessingml/2006/main" xmlns:w14="http://schemas.microsoft.com/office/word/2010/wordml" xmlns:w15="http://schemas.microsoft.com/office/word/2012/wordml" xmlns:w16cex="http://schemas.microsoft.com/office/word/2018/wordml/cex" xmlns:w16cid="http://schemas.microsoft.com/office/word/2016/wordml/cid" xmlns:w16="http://schemas.microsoft.com/office/word/2018/wordml" xmlns:w16du="http://schemas.microsoft.com/office/word/2023/wordml/word16du" xmlns:w16sdtdh="http://schemas.microsoft.com/office/word/2020/wordml/sdtdatahash" xmlns:w16sdtfl="http://schemas.microsoft.com/office/word/2024/wordml/sdtformatlock" xmlns:w16se="http://schemas.microsoft.com/office/word/2015/wordml/symex" mc:Ignorable="w14 w15 w16se w16cid w16 w16cex w16sdtdh w16sdtfl w16du">
   <w:docDefaults>
     <w:rPrDefault>
       <w:rPr>
@@ -29106,7 +28644,7 @@
       </w:pPr>
     </w:pPrDefault>
   </w:docDefaults>
-  <w:latentStyles w:defLockedState="0" w:defUIPriority="99" w:defSemiHidden="0" w:defUnhideWhenUsed="0" w:defQFormat="0" w:count="371">
+  <w:latentStyles w:defLockedState="0" w:defUIPriority="99" w:defSemiHidden="0" w:defUnhideWhenUsed="0" w:defQFormat="0" w:count="376">
     <w:lsdException w:name="Normal" w:uiPriority="0" w:qFormat="1"/>
     <w:lsdException w:name="heading 1" w:uiPriority="9" w:qFormat="1"/>
     <w:lsdException w:name="heading 2" w:semiHidden="1" w:uiPriority="9" w:unhideWhenUsed="1" w:qFormat="1"/>
@@ -29478,6 +29016,11 @@
     <w:lsdException w:name="List Table 5 Dark Accent 6" w:uiPriority="50"/>
     <w:lsdException w:name="List Table 6 Colorful Accent 6" w:uiPriority="51"/>
     <w:lsdException w:name="List Table 7 Colorful Accent 6" w:uiPriority="52"/>
+    <w:lsdException w:name="Mention" w:semiHidden="1" w:unhideWhenUsed="1"/>
+    <w:lsdException w:name="Smart Hyperlink" w:semiHidden="1" w:unhideWhenUsed="1"/>
+    <w:lsdException w:name="Hashtag" w:semiHidden="1" w:unhideWhenUsed="1"/>
+    <w:lsdException w:name="Unresolved Mention" w:semiHidden="1" w:unhideWhenUsed="1"/>
+    <w:lsdException w:name="Smart Link" w:semiHidden="1" w:unhideWhenUsed="1"/>
   </w:latentStyles>
   <w:style w:type="paragraph" w:default="1" w:styleId="Normal">
     <w:name w:val="Normal"/>
@@ -29609,7 +29152,6 @@
       <w:spacing w:after="0" w:line="240" w:lineRule="auto"/>
     </w:pPr>
     <w:tblPr>
-      <w:tblInd w:w="0" w:type="dxa"/>
       <w:tblBorders>
         <w:top w:val="single" w:sz="4" w:space="0" w:color="auto"/>
         <w:left w:val="single" w:sz="4" w:space="0" w:color="auto"/>
@@ -29618,12 +29160,6 @@
         <w:insideH w:val="single" w:sz="4" w:space="0" w:color="auto"/>
         <w:insideV w:val="single" w:sz="4" w:space="0" w:color="auto"/>
       </w:tblBorders>
-      <w:tblCellMar>
-        <w:top w:w="0" w:type="dxa"/>
-        <w:left w:w="108" w:type="dxa"/>
-        <w:bottom w:w="0" w:type="dxa"/>
-        <w:right w:w="108" w:type="dxa"/>
-      </w:tblCellMar>
     </w:tblPr>
   </w:style>
   <w:style w:type="character" w:customStyle="1" w:styleId="Ttulo1Car">
@@ -29650,7 +29186,7 @@
       <w:sz w:val="28"/>
     </w:rPr>
   </w:style>
-  <w:style w:type="paragraph" w:styleId="TtulodeTDC">
+  <w:style w:type="paragraph" w:styleId="TtuloTDC">
     <w:name w:val="TOC Heading"/>
     <w:basedOn w:val="Ttulo1"/>
     <w:next w:val="Normal"/>
@@ -29763,7 +29299,7 @@
       <w:u w:val="single"/>
     </w:rPr>
   </w:style>
-  <w:style w:type="character" w:styleId="Textoennegrita">
+  <w:style w:type="character" w:styleId="Fuerte">
     <w:name w:val="Strong"/>
     <w:basedOn w:val="Fuentedeprrafopredeter"/>
     <w:uiPriority w:val="22"/>
@@ -29839,8 +29375,8 @@
       <w:ind w:left="480"/>
     </w:pPr>
   </w:style>
-  <w:style w:type="character" w:customStyle="1" w:styleId="UnresolvedMention">
-    <w:name w:val="Unresolved Mention"/>
+  <w:style w:type="character" w:customStyle="1" w:styleId="Mencinsinresolver1">
+    <w:name w:val="Mención sin resolver1"/>
     <w:basedOn w:val="Fuentedeprrafopredeter"/>
     <w:uiPriority w:val="99"/>
     <w:semiHidden/>

</xml_diff>

<commit_message>
chore: add temporary file for report
</commit_message>
<xml_diff>
--- a/doc/report/executive_report.docx
+++ b/doc/report/executive_report.docx
@@ -1,6 +1,6 @@
 
 <file path=word/document.xml><?xml version="1.0" encoding="utf-8"?>
-<w:document xmlns:wpc="http://schemas.microsoft.com/office/word/2010/wordprocessingCanvas" xmlns:mc="http://schemas.openxmlformats.org/markup-compatibility/2006" xmlns:o="urn:schemas-microsoft-com:office:office" xmlns:r="http://schemas.openxmlformats.org/officeDocument/2006/relationships" xmlns:m="http://schemas.openxmlformats.org/officeDocument/2006/math" xmlns:v="urn:schemas-microsoft-com:vml" xmlns:wp14="http://schemas.microsoft.com/office/word/2010/wordprocessingDrawing" xmlns:wp="http://schemas.openxmlformats.org/drawingml/2006/wordprocessingDrawing" xmlns:w10="urn:schemas-microsoft-com:office:word" xmlns:w="http://schemas.openxmlformats.org/wordprocessingml/2006/main" xmlns:w14="http://schemas.microsoft.com/office/word/2010/wordml" xmlns:w15="http://schemas.microsoft.com/office/word/2012/wordml" xmlns:wpg="http://schemas.microsoft.com/office/word/2010/wordprocessingGroup" xmlns:wpi="http://schemas.microsoft.com/office/word/2010/wordprocessingInk" xmlns:wne="http://schemas.microsoft.com/office/word/2006/wordml" xmlns:wps="http://schemas.microsoft.com/office/word/2010/wordprocessingShape" mc:Ignorable="w14 w15 wp14">
+<w:document xmlns:wpc="http://schemas.microsoft.com/office/word/2010/wordprocessingCanvas" xmlns:cx="http://schemas.microsoft.com/office/drawing/2014/chartex" xmlns:cx1="http://schemas.microsoft.com/office/drawing/2015/9/8/chartex" xmlns:cx2="http://schemas.microsoft.com/office/drawing/2015/10/21/chartex" xmlns:cx3="http://schemas.microsoft.com/office/drawing/2016/5/9/chartex" xmlns:cx4="http://schemas.microsoft.com/office/drawing/2016/5/10/chartex" xmlns:cx5="http://schemas.microsoft.com/office/drawing/2016/5/11/chartex" xmlns:cx6="http://schemas.microsoft.com/office/drawing/2016/5/12/chartex" xmlns:cx7="http://schemas.microsoft.com/office/drawing/2016/5/13/chartex" xmlns:cx8="http://schemas.microsoft.com/office/drawing/2016/5/14/chartex" xmlns:mc="http://schemas.openxmlformats.org/markup-compatibility/2006" xmlns:aink="http://schemas.microsoft.com/office/drawing/2016/ink" xmlns:am3d="http://schemas.microsoft.com/office/drawing/2017/model3d" xmlns:o="urn:schemas-microsoft-com:office:office" xmlns:oel="http://schemas.microsoft.com/office/2019/extlst" xmlns:r="http://schemas.openxmlformats.org/officeDocument/2006/relationships" xmlns:m="http://schemas.openxmlformats.org/officeDocument/2006/math" xmlns:v="urn:schemas-microsoft-com:vml" xmlns:wp14="http://schemas.microsoft.com/office/word/2010/wordprocessingDrawing" xmlns:wp="http://schemas.openxmlformats.org/drawingml/2006/wordprocessingDrawing" xmlns:w10="urn:schemas-microsoft-com:office:word" xmlns:w="http://schemas.openxmlformats.org/wordprocessingml/2006/main" xmlns:w14="http://schemas.microsoft.com/office/word/2010/wordml" xmlns:w15="http://schemas.microsoft.com/office/word/2012/wordml" xmlns:w16cex="http://schemas.microsoft.com/office/word/2018/wordml/cex" xmlns:w16cid="http://schemas.microsoft.com/office/word/2016/wordml/cid" xmlns:w16="http://schemas.microsoft.com/office/word/2018/wordml" xmlns:w16du="http://schemas.microsoft.com/office/word/2023/wordml/word16du" xmlns:w16sdtdh="http://schemas.microsoft.com/office/word/2020/wordml/sdtdatahash" xmlns:w16sdtfl="http://schemas.microsoft.com/office/word/2024/wordml/sdtformatlock" xmlns:w16se="http://schemas.microsoft.com/office/word/2015/wordml/symex" xmlns:wpg="http://schemas.microsoft.com/office/word/2010/wordprocessingGroup" xmlns:wpi="http://schemas.microsoft.com/office/word/2010/wordprocessingInk" xmlns:wne="http://schemas.microsoft.com/office/word/2006/wordml" xmlns:wps="http://schemas.microsoft.com/office/word/2010/wordprocessingShape" mc:Ignorable="w14 w15 w16se w16cid w16 w16cex w16sdtdh w16sdtfl w16du wp14">
   <w:body>
     <w:p>
       <w:r>
@@ -139,8 +139,17 @@
           <w:b/>
           <w:sz w:val="52"/>
         </w:rPr>
-        <w:t xml:space="preserve"> para QuetzalDev</w:t>
-      </w:r>
+        <w:t xml:space="preserve"> para </w:t>
+      </w:r>
+      <w:proofErr w:type="spellStart"/>
+      <w:r>
+        <w:rPr>
+          <w:b/>
+          <w:sz w:val="52"/>
+        </w:rPr>
+        <w:t>QuetzalDev</w:t>
+      </w:r>
+      <w:proofErr w:type="spellEnd"/>
     </w:p>
     <w:p/>
     <w:p/>
@@ -258,29 +267,8 @@
                 <w:lang w:val="en-US"/>
               </w:rPr>
             </w:pPr>
-            <w:proofErr w:type="spellStart"/>
-            <w:r>
-              <w:t>Enner</w:t>
-            </w:r>
-            <w:proofErr w:type="spellEnd"/>
-            <w:r>
-              <w:t xml:space="preserve"> </w:t>
-            </w:r>
-            <w:proofErr w:type="spellStart"/>
-            <w:r>
-              <w:t>Esaí</w:t>
-            </w:r>
-            <w:proofErr w:type="spellEnd"/>
-            <w:r>
-              <w:t xml:space="preserve"> </w:t>
-            </w:r>
-            <w:proofErr w:type="spellStart"/>
-            <w:r>
-              <w:t>Mendizabal</w:t>
-            </w:r>
-            <w:proofErr w:type="spellEnd"/>
-            <w:r>
-              <w:t xml:space="preserve"> Castro</w:t>
+            <w:r>
+              <w:t>Enner Esaí Mendizabal Castro</w:t>
             </w:r>
           </w:p>
         </w:tc>
@@ -368,7 +356,6 @@
         <w:t xml:space="preserve"> DEL AÑO 2026</w:t>
       </w:r>
     </w:p>
-    <w:p/>
     <w:p>
       <w:pPr>
         <w:jc w:val="center"/>
@@ -380,6 +367,7 @@
         <w:rPr>
           <w:b/>
         </w:rPr>
+        <w:lastRenderedPageBreak/>
         <w:t>INDICE</w:t>
       </w:r>
     </w:p>
@@ -398,11 +386,10 @@
           <w:docPartUnique/>
         </w:docPartObj>
       </w:sdtPr>
-      <w:sdtEndPr/>
       <w:sdtContent>
         <w:p>
           <w:pPr>
-            <w:pStyle w:val="TtulodeTDC"/>
+            <w:pStyle w:val="TtuloTDC"/>
             <w:rPr>
               <w:sz w:val="2"/>
               <w:szCs w:val="2"/>
@@ -6945,7 +6932,15 @@
       </w:r>
       <w:proofErr w:type="spellEnd"/>
       <w:r>
-        <w:t xml:space="preserve"> para QuetzalDev, empresa tecnológica que busca ampliar su alcance digital mediante la comercialización de productos de software derivados de sus líneas de servicio: ERP, desarrollo web y desarrollo de aplicaciones móviles.</w:t>
+        <w:t xml:space="preserve"> para </w:t>
+      </w:r>
+      <w:proofErr w:type="spellStart"/>
+      <w:r>
+        <w:t>QuetzalDev</w:t>
+      </w:r>
+      <w:proofErr w:type="spellEnd"/>
+      <w:r>
+        <w:t>, empresa tecnológica que busca ampliar su alcance digital mediante la comercialización de productos de software derivados de sus líneas de servicio: ERP, desarrollo web y desarrollo de aplicaciones móviles.</w:t>
       </w:r>
     </w:p>
     <w:p>
@@ -7029,7 +7024,15 @@
       </w:r>
       <w:proofErr w:type="spellEnd"/>
       <w:r>
-        <w:t xml:space="preserve"> para QuetzalDev que justifique, desde el análisis estratégico y la planificación ágil, la comercialización de tres productos de software con potencial de escalabilidad y adopción en el mercado digital.</w:t>
+        <w:t xml:space="preserve"> para </w:t>
+      </w:r>
+      <w:proofErr w:type="spellStart"/>
+      <w:r>
+        <w:t>QuetzalDev</w:t>
+      </w:r>
+      <w:proofErr w:type="spellEnd"/>
+      <w:r>
+        <w:t xml:space="preserve"> que justifique, desde el análisis estratégico y la planificación ágil, la comercialización de tres productos de software con potencial de escalabilidad y adopción en el mercado digital.</w:t>
       </w:r>
     </w:p>
     <w:p>
@@ -7075,23 +7078,7 @@
       </w:r>
       <w:proofErr w:type="spellEnd"/>
       <w:r>
-        <w:t xml:space="preserve"> VUCA, </w:t>
-      </w:r>
-      <w:proofErr w:type="spellStart"/>
-      <w:r>
-        <w:t>Diamond</w:t>
-      </w:r>
-      <w:proofErr w:type="spellEnd"/>
-      <w:r>
-        <w:t xml:space="preserve">, PEST, </w:t>
-      </w:r>
-      <w:proofErr w:type="spellStart"/>
-      <w:r>
-        <w:t>Five</w:t>
-      </w:r>
-      <w:proofErr w:type="spellEnd"/>
-      <w:r>
-        <w:t xml:space="preserve"> </w:t>
+        <w:t xml:space="preserve"> VUCA, Diamond, PEST, Five </w:t>
       </w:r>
       <w:proofErr w:type="spellStart"/>
       <w:r>
@@ -7229,23 +7216,7 @@
         <w:ind w:firstLine="360"/>
       </w:pPr>
       <w:r>
-        <w:t xml:space="preserve">El informe incluirá la aplicación estructurada de los siete marcos solicitados (VUCA, </w:t>
-      </w:r>
-      <w:proofErr w:type="spellStart"/>
-      <w:r>
-        <w:t>Diamond</w:t>
-      </w:r>
-      <w:proofErr w:type="spellEnd"/>
-      <w:r>
-        <w:t xml:space="preserve">, PEST, </w:t>
-      </w:r>
-      <w:proofErr w:type="spellStart"/>
-      <w:r>
-        <w:t>Five</w:t>
-      </w:r>
-      <w:proofErr w:type="spellEnd"/>
-      <w:r>
-        <w:t xml:space="preserve"> </w:t>
+        <w:t xml:space="preserve">El informe incluirá la aplicación estructurada de los siete marcos solicitados (VUCA, Diamond, PEST, Five </w:t>
       </w:r>
       <w:proofErr w:type="spellStart"/>
       <w:r>
@@ -7427,14 +7398,9 @@
       </w:pPr>
       <w:bookmarkStart w:id="12" w:name="_Toc223906546"/>
       <w:r>
-        <w:t xml:space="preserve">Producto 1 (basado en ERP): </w:t>
-      </w:r>
-      <w:proofErr w:type="spellStart"/>
-      <w:r>
-        <w:t>SafeCase</w:t>
+        <w:t>Producto 1 (basado en ERP): SafeCase</w:t>
       </w:r>
       <w:bookmarkEnd w:id="12"/>
-      <w:proofErr w:type="spellEnd"/>
     </w:p>
     <w:p/>
     <w:p>
@@ -7839,15 +7805,7 @@
         </w:numPr>
       </w:pPr>
       <w:r>
-        <w:t xml:space="preserve">Relación con la línea de servicio: desarrollo de </w:t>
-      </w:r>
-      <w:proofErr w:type="spellStart"/>
-      <w:r>
-        <w:t>apps</w:t>
-      </w:r>
-      <w:proofErr w:type="spellEnd"/>
-      <w:r>
-        <w:t xml:space="preserve"> móviles.</w:t>
+        <w:t>Relación con la línea de servicio: desarrollo de apps móviles.</w:t>
       </w:r>
     </w:p>
     <w:p>
@@ -8021,15 +7979,7 @@
         </w:numPr>
       </w:pPr>
       <w:r>
-        <w:t xml:space="preserve">Unifica la gestión de dispositivos en una sola </w:t>
-      </w:r>
-      <w:proofErr w:type="spellStart"/>
-      <w:r>
-        <w:t>app</w:t>
-      </w:r>
-      <w:proofErr w:type="spellEnd"/>
-      <w:r>
-        <w:t>.</w:t>
+        <w:t>Unifica la gestión de dispositivos en una sola app.</w:t>
       </w:r>
     </w:p>
     <w:p/>
@@ -8237,7 +8187,15 @@
             </w:r>
             <w:proofErr w:type="spellEnd"/>
             <w:r>
-              <w:t xml:space="preserve"> para QuetzalDev que venda 3 productos de software a partir de sus servicios base</w:t>
+              <w:t xml:space="preserve"> para </w:t>
+            </w:r>
+            <w:proofErr w:type="spellStart"/>
+            <w:r>
+              <w:t>QuetzalDev</w:t>
+            </w:r>
+            <w:proofErr w:type="spellEnd"/>
+            <w:r>
+              <w:t xml:space="preserve"> que venda 3 productos de software a partir de sus servicios base</w:t>
             </w:r>
             <w:r>
               <w:t>.</w:t>
@@ -9087,7 +9045,23 @@
           <w:b/>
           <w:bCs/>
         </w:rPr>
-        <w:t xml:space="preserve"> de QuetzalDev con éxito operativo.</w:t>
+        <w:t xml:space="preserve"> de </w:t>
+      </w:r>
+      <w:proofErr w:type="spellStart"/>
+      <w:r>
+        <w:rPr>
+          <w:b/>
+          <w:bCs/>
+        </w:rPr>
+        <w:t>QuetzalDev</w:t>
+      </w:r>
+      <w:proofErr w:type="spellEnd"/>
+      <w:r>
+        <w:rPr>
+          <w:b/>
+          <w:bCs/>
+        </w:rPr>
+        <w:t xml:space="preserve"> con éxito operativo.</w:t>
       </w:r>
     </w:p>
     <w:p>
@@ -10044,7 +10018,15 @@
       </w:r>
       <w:proofErr w:type="spellEnd"/>
       <w:r>
-        <w:t xml:space="preserve"> funcional para QuetzalDev que centralice el catálogo de productos, habilite carrito de compras y permita simulación de compra, integrando criterios de negocio, arquitectura de información y planeación ágil.</w:t>
+        <w:t xml:space="preserve"> funcional para </w:t>
+      </w:r>
+      <w:proofErr w:type="spellStart"/>
+      <w:r>
+        <w:t>QuetzalDev</w:t>
+      </w:r>
+      <w:proofErr w:type="spellEnd"/>
+      <w:r>
+        <w:t xml:space="preserve"> que centralice el catálogo de productos, habilite carrito de compras y permita simulación de compra, integrando criterios de negocio, arquitectura de información y planeación ágil.</w:t>
       </w:r>
     </w:p>
     <w:p>
@@ -10059,13 +10041,8 @@
           <w:numId w:val="8"/>
         </w:numPr>
       </w:pPr>
-      <w:proofErr w:type="spellStart"/>
-      <w:r>
-        <w:t>SafeCase</w:t>
-      </w:r>
-      <w:proofErr w:type="spellEnd"/>
-      <w:r>
-        <w:t xml:space="preserve"> (ERP): gestión y prevención del acoso laboral en entornos corporativos.</w:t>
+      <w:r>
+        <w:t>SafeCase (ERP): gestión y prevención del acoso laboral en entornos corporativos.</w:t>
       </w:r>
     </w:p>
     <w:p>
@@ -10097,15 +10074,7 @@
       </w:r>
       <w:proofErr w:type="spellEnd"/>
       <w:r>
-        <w:t xml:space="preserve"> (Móvil): centralización de dispositivos </w:t>
-      </w:r>
-      <w:proofErr w:type="spellStart"/>
-      <w:r>
-        <w:t>domóticos</w:t>
-      </w:r>
-      <w:proofErr w:type="spellEnd"/>
-      <w:r>
-        <w:t xml:space="preserve"> en una sola aplicación.</w:t>
+        <w:t xml:space="preserve"> (Móvil): centralización de dispositivos domóticos en una sola aplicación.</w:t>
       </w:r>
     </w:p>
     <w:p>
@@ -10148,23 +10117,7 @@
       </w:r>
       <w:proofErr w:type="spellEnd"/>
       <w:r>
-        <w:t xml:space="preserve"> de análisis (VUCA, </w:t>
-      </w:r>
-      <w:proofErr w:type="spellStart"/>
-      <w:r>
-        <w:t>Diamond</w:t>
-      </w:r>
-      <w:proofErr w:type="spellEnd"/>
-      <w:r>
-        <w:t xml:space="preserve">, PEST, </w:t>
-      </w:r>
-      <w:proofErr w:type="spellStart"/>
-      <w:r>
-        <w:t>Five</w:t>
-      </w:r>
-      <w:proofErr w:type="spellEnd"/>
-      <w:r>
-        <w:t xml:space="preserve"> </w:t>
+        <w:t xml:space="preserve"> de análisis (VUCA, Diamond, PEST, Five </w:t>
       </w:r>
       <w:proofErr w:type="spellStart"/>
       <w:r>
@@ -10299,9 +10252,77 @@
       <w:pPr>
         <w:pStyle w:val="Ttulo2"/>
       </w:pPr>
+      <w:r>
+        <w:lastRenderedPageBreak/>
+        <w:t>Mapa Detallado</w:t>
+      </w:r>
+    </w:p>
+    <w:p>
+      <w:r>
+        <w:rPr>
+          <w:noProof/>
+        </w:rPr>
+        <w:drawing>
+          <wp:inline distT="0" distB="0" distL="0" distR="0" wp14:anchorId="1AD80CEE" wp14:editId="54536FB5">
+            <wp:extent cx="5827795" cy="6019613"/>
+            <wp:effectExtent l="0" t="0" r="1905" b="635"/>
+            <wp:docPr id="2007547770" name="Imagen 1"/>
+            <wp:cNvGraphicFramePr>
+              <a:graphicFrameLocks xmlns:a="http://schemas.openxmlformats.org/drawingml/2006/main" noChangeAspect="1"/>
+            </wp:cNvGraphicFramePr>
+            <a:graphic xmlns:a="http://schemas.openxmlformats.org/drawingml/2006/main">
+              <a:graphicData uri="http://schemas.openxmlformats.org/drawingml/2006/picture">
+                <pic:pic xmlns:pic="http://schemas.openxmlformats.org/drawingml/2006/picture">
+                  <pic:nvPicPr>
+                    <pic:cNvPr id="0" name="Picture 1"/>
+                    <pic:cNvPicPr>
+                      <a:picLocks noChangeAspect="1" noChangeArrowheads="1"/>
+                    </pic:cNvPicPr>
+                  </pic:nvPicPr>
+                  <pic:blipFill rotWithShape="1">
+                    <a:blip r:embed="rId11" cstate="print">
+                      <a:extLst>
+                        <a:ext uri="{28A0092B-C50C-407E-A947-70E740481C1C}">
+                          <a14:useLocalDpi xmlns:a14="http://schemas.microsoft.com/office/drawing/2010/main" val="0"/>
+                        </a:ext>
+                      </a:extLst>
+                    </a:blip>
+                    <a:srcRect l="499" t="1027" r="1047" b="776"/>
+                    <a:stretch>
+                      <a:fillRect/>
+                    </a:stretch>
+                  </pic:blipFill>
+                  <pic:spPr bwMode="auto">
+                    <a:xfrm>
+                      <a:off x="0" y="0"/>
+                      <a:ext cx="5849723" cy="6042263"/>
+                    </a:xfrm>
+                    <a:prstGeom prst="rect">
+                      <a:avLst/>
+                    </a:prstGeom>
+                    <a:noFill/>
+                    <a:ln>
+                      <a:noFill/>
+                    </a:ln>
+                    <a:extLst>
+                      <a:ext uri="{53640926-AAD7-44D8-BBD7-CCE9431645EC}">
+                        <a14:shadowObscured xmlns:a14="http://schemas.microsoft.com/office/drawing/2010/main"/>
+                      </a:ext>
+                    </a:extLst>
+                  </pic:spPr>
+                </pic:pic>
+              </a:graphicData>
+            </a:graphic>
+          </wp:inline>
+        </w:drawing>
+      </w:r>
+    </w:p>
+    <w:p>
+      <w:pPr>
+        <w:pStyle w:val="Ttulo2"/>
+      </w:pPr>
       <w:bookmarkStart w:id="26" w:name="_Toc223906560"/>
       <w:r>
-        <w:lastRenderedPageBreak/>
         <w:t xml:space="preserve">Descripción </w:t>
       </w:r>
       <w:r>
@@ -10447,6 +10468,7 @@
           <w:bCs/>
           <w:lang w:val="es-GT"/>
         </w:rPr>
+        <w:lastRenderedPageBreak/>
         <w:t>Función en el ecosistema:</w:t>
       </w:r>
       <w:r>
@@ -11044,49 +11066,49 @@
         <w:rPr>
           <w:lang w:val="es-GT"/>
         </w:rPr>
-        <w:t xml:space="preserve"> Vista dinámica </w:t>
+        <w:t xml:space="preserve"> Vista dinámica parametrizada por </w:t>
       </w:r>
       <w:proofErr w:type="spellStart"/>
       <w:r>
         <w:rPr>
           <w:lang w:val="es-GT"/>
         </w:rPr>
-        <w:t>parametrizada</w:t>
+        <w:t>productId</w:t>
       </w:r>
       <w:proofErr w:type="spellEnd"/>
       <w:r>
         <w:rPr>
           <w:lang w:val="es-GT"/>
         </w:rPr>
-        <w:t xml:space="preserve"> por </w:t>
+        <w:t xml:space="preserve"> que actúa como el primer punto de </w:t>
       </w:r>
       <w:proofErr w:type="spellStart"/>
       <w:r>
         <w:rPr>
           <w:lang w:val="es-GT"/>
         </w:rPr>
-        <w:t>productId</w:t>
+        <w:t>onboarding</w:t>
       </w:r>
       <w:proofErr w:type="spellEnd"/>
       <w:r>
         <w:rPr>
           <w:lang w:val="es-GT"/>
         </w:rPr>
-        <w:t xml:space="preserve"> que actúa como el primer punto de </w:t>
+        <w:t xml:space="preserve"> </w:t>
       </w:r>
       <w:proofErr w:type="spellStart"/>
       <w:r>
         <w:rPr>
           <w:lang w:val="es-GT"/>
         </w:rPr>
-        <w:t>onboarding</w:t>
+        <w:t>post-compra</w:t>
       </w:r>
       <w:proofErr w:type="spellEnd"/>
       <w:r>
         <w:rPr>
           <w:lang w:val="es-GT"/>
         </w:rPr>
-        <w:t xml:space="preserve"> post-compra. Muestra </w:t>
+        <w:t xml:space="preserve">. Muestra </w:t>
       </w:r>
       <w:proofErr w:type="spellStart"/>
       <w:r>
@@ -11380,7 +11402,6 @@
           <w:bCs/>
           <w:lang w:val="es-GT"/>
         </w:rPr>
-        <w:lastRenderedPageBreak/>
         <w:t>Descripción:</w:t>
       </w:r>
       <w:r>
@@ -11401,35 +11422,7 @@
         <w:rPr>
           <w:lang w:val="es-GT"/>
         </w:rPr>
-        <w:t xml:space="preserve"> (empresa, NIT, email) se sincronizan con un CRM (</w:t>
-      </w:r>
-      <w:proofErr w:type="spellStart"/>
-      <w:r>
-        <w:rPr>
-          <w:lang w:val="es-GT"/>
-        </w:rPr>
-        <w:t>HubSpot</w:t>
-      </w:r>
-      <w:proofErr w:type="spellEnd"/>
-      <w:r>
-        <w:rPr>
-          <w:lang w:val="es-GT"/>
-        </w:rPr>
-        <w:t xml:space="preserve"> Free o </w:t>
-      </w:r>
-      <w:proofErr w:type="spellStart"/>
-      <w:r>
-        <w:rPr>
-          <w:lang w:val="es-GT"/>
-        </w:rPr>
-        <w:t>Zoho</w:t>
-      </w:r>
-      <w:proofErr w:type="spellEnd"/>
-      <w:r>
-        <w:rPr>
-          <w:lang w:val="es-GT"/>
-        </w:rPr>
-        <w:t xml:space="preserve"> CRM) para construir perfiles de cliente, identificar oportunidades de </w:t>
+        <w:t xml:space="preserve"> (empresa, NIT, email) se sincronizan con un CRM (HubSpot Free o Zoho CRM) para construir perfiles de cliente, identificar oportunidades de </w:t>
       </w:r>
       <w:proofErr w:type="spellStart"/>
       <w:r>
@@ -11499,12 +11492,15 @@
       </w:r>
     </w:p>
     <w:p/>
+    <w:p/>
+    <w:p/>
     <w:p>
       <w:pPr>
         <w:pStyle w:val="Ttulo2"/>
       </w:pPr>
       <w:bookmarkStart w:id="33" w:name="_Toc223906567"/>
       <w:r>
+        <w:lastRenderedPageBreak/>
         <w:t>Justificación estratégica del mapeo</w:t>
       </w:r>
       <w:bookmarkEnd w:id="33"/>
@@ -11530,15 +11526,7 @@
       </w:r>
       <w:proofErr w:type="spellEnd"/>
       <w:r>
-        <w:t>) y transformar prospectos en clientes recurrentes, maximizando el LTV (</w:t>
-      </w:r>
-      <w:proofErr w:type="spellStart"/>
-      <w:r>
-        <w:t>Life</w:t>
-      </w:r>
-      <w:proofErr w:type="spellEnd"/>
-      <w:r>
-        <w:t xml:space="preserve"> Time </w:t>
+        <w:t xml:space="preserve">) y transformar prospectos en clientes recurrentes, maximizando el LTV (Life Time </w:t>
       </w:r>
       <w:proofErr w:type="spellStart"/>
       <w:r>
@@ -11587,15 +11575,7 @@
         <w:ind w:firstLine="708"/>
       </w:pPr>
       <w:r>
-        <w:t>Para construir un panorama competitivo útil para la toma de decisiones, se seleccionaron 10 competidores considerando relación funcional con los tres productos del portafolio (</w:t>
-      </w:r>
-      <w:proofErr w:type="spellStart"/>
-      <w:r>
-        <w:t>SafeCase</w:t>
-      </w:r>
-      <w:proofErr w:type="spellEnd"/>
-      <w:r>
-        <w:t xml:space="preserve">, </w:t>
+        <w:t xml:space="preserve">Para construir un panorama competitivo útil para la toma de decisiones, se seleccionaron 10 competidores considerando relación funcional con los tres productos del portafolio (SafeCase, </w:t>
       </w:r>
       <w:proofErr w:type="spellStart"/>
       <w:r>
@@ -11823,13 +11803,8 @@
             <w:pPr>
               <w:jc w:val="center"/>
             </w:pPr>
-            <w:proofErr w:type="spellStart"/>
-            <w:r>
-              <w:t>SafeCase</w:t>
-            </w:r>
-            <w:proofErr w:type="spellEnd"/>
-            <w:r>
-              <w:t xml:space="preserve"> (ERP de denuncias)</w:t>
+            <w:r>
+              <w:t>SafeCase (ERP de denuncias)</w:t>
             </w:r>
           </w:p>
         </w:tc>
@@ -11909,6 +11884,316 @@
             <w:proofErr w:type="spellStart"/>
             <w:r>
               <w:t>AllVoices</w:t>
+            </w:r>
+            <w:proofErr w:type="spellEnd"/>
+          </w:p>
+        </w:tc>
+        <w:tc>
+          <w:tcPr>
+            <w:tcW w:w="0" w:type="auto"/>
+            <w:vAlign w:val="center"/>
+          </w:tcPr>
+          <w:p>
+            <w:pPr>
+              <w:jc w:val="center"/>
+            </w:pPr>
+            <w:r>
+              <w:t>SafeCase (ERP de denuncias)</w:t>
+            </w:r>
+          </w:p>
+        </w:tc>
+        <w:tc>
+          <w:tcPr>
+            <w:tcW w:w="0" w:type="auto"/>
+            <w:vAlign w:val="center"/>
+          </w:tcPr>
+          <w:p>
+            <w:pPr>
+              <w:jc w:val="center"/>
+            </w:pPr>
+            <w:r>
+              <w:t>Directo</w:t>
+            </w:r>
+          </w:p>
+        </w:tc>
+        <w:tc>
+          <w:tcPr>
+            <w:tcW w:w="0" w:type="auto"/>
+            <w:vAlign w:val="center"/>
+          </w:tcPr>
+          <w:p>
+            <w:pPr>
+              <w:jc w:val="center"/>
+            </w:pPr>
+            <w:r>
+              <w:t xml:space="preserve">Reportes confidenciales de acoso y conductas indebidas con </w:t>
+            </w:r>
+            <w:proofErr w:type="spellStart"/>
+            <w:r>
+              <w:t>analytics</w:t>
+            </w:r>
+            <w:proofErr w:type="spellEnd"/>
+            <w:r>
+              <w:t xml:space="preserve"> para RRHH.</w:t>
+            </w:r>
+          </w:p>
+        </w:tc>
+        <w:tc>
+          <w:tcPr>
+            <w:tcW w:w="0" w:type="auto"/>
+            <w:vAlign w:val="center"/>
+          </w:tcPr>
+          <w:p>
+            <w:pPr>
+              <w:jc w:val="center"/>
+            </w:pPr>
+            <w:r>
+              <w:t>Diferenciarse con localización normativa y precios más accesibles.</w:t>
+            </w:r>
+          </w:p>
+        </w:tc>
+      </w:tr>
+      <w:tr>
+        <w:tc>
+          <w:tcPr>
+            <w:tcW w:w="0" w:type="auto"/>
+            <w:vAlign w:val="center"/>
+          </w:tcPr>
+          <w:p>
+            <w:pPr>
+              <w:jc w:val="center"/>
+              <w:rPr>
+                <w:b/>
+              </w:rPr>
+            </w:pPr>
+            <w:r>
+              <w:rPr>
+                <w:b/>
+              </w:rPr>
+              <w:t>3</w:t>
+            </w:r>
+          </w:p>
+        </w:tc>
+        <w:tc>
+          <w:tcPr>
+            <w:tcW w:w="0" w:type="auto"/>
+            <w:vAlign w:val="center"/>
+          </w:tcPr>
+          <w:p>
+            <w:pPr>
+              <w:jc w:val="center"/>
+            </w:pPr>
+            <w:proofErr w:type="spellStart"/>
+            <w:r>
+              <w:t>FaceUp</w:t>
+            </w:r>
+            <w:proofErr w:type="spellEnd"/>
+          </w:p>
+        </w:tc>
+        <w:tc>
+          <w:tcPr>
+            <w:tcW w:w="0" w:type="auto"/>
+            <w:vAlign w:val="center"/>
+          </w:tcPr>
+          <w:p>
+            <w:pPr>
+              <w:jc w:val="center"/>
+            </w:pPr>
+            <w:r>
+              <w:t>SafeCase (ERP de denuncias)</w:t>
+            </w:r>
+          </w:p>
+        </w:tc>
+        <w:tc>
+          <w:tcPr>
+            <w:tcW w:w="0" w:type="auto"/>
+            <w:vAlign w:val="center"/>
+          </w:tcPr>
+          <w:p>
+            <w:pPr>
+              <w:jc w:val="center"/>
+            </w:pPr>
+            <w:r>
+              <w:t>Directo</w:t>
+            </w:r>
+          </w:p>
+        </w:tc>
+        <w:tc>
+          <w:tcPr>
+            <w:tcW w:w="0" w:type="auto"/>
+            <w:vAlign w:val="center"/>
+          </w:tcPr>
+          <w:p>
+            <w:pPr>
+              <w:jc w:val="center"/>
+            </w:pPr>
+            <w:r>
+              <w:t xml:space="preserve">Plataforma de </w:t>
+            </w:r>
+            <w:proofErr w:type="spellStart"/>
+            <w:r>
+              <w:t>whistleblowing</w:t>
+            </w:r>
+            <w:proofErr w:type="spellEnd"/>
+            <w:r>
+              <w:t xml:space="preserve"> con enfoque en seguridad del denunciante.</w:t>
+            </w:r>
+          </w:p>
+        </w:tc>
+        <w:tc>
+          <w:tcPr>
+            <w:tcW w:w="0" w:type="auto"/>
+            <w:vAlign w:val="center"/>
+          </w:tcPr>
+          <w:p>
+            <w:pPr>
+              <w:jc w:val="center"/>
+            </w:pPr>
+            <w:r>
+              <w:t>Ofrecer implementación rápida y enfoque educativo para cultura organizacional.</w:t>
+            </w:r>
+          </w:p>
+        </w:tc>
+      </w:tr>
+      <w:tr>
+        <w:tc>
+          <w:tcPr>
+            <w:tcW w:w="0" w:type="auto"/>
+            <w:vAlign w:val="center"/>
+          </w:tcPr>
+          <w:p>
+            <w:pPr>
+              <w:jc w:val="center"/>
+              <w:rPr>
+                <w:b/>
+              </w:rPr>
+            </w:pPr>
+            <w:r>
+              <w:rPr>
+                <w:b/>
+              </w:rPr>
+              <w:t>4</w:t>
+            </w:r>
+          </w:p>
+        </w:tc>
+        <w:tc>
+          <w:tcPr>
+            <w:tcW w:w="0" w:type="auto"/>
+            <w:vAlign w:val="center"/>
+          </w:tcPr>
+          <w:p>
+            <w:pPr>
+              <w:jc w:val="center"/>
+            </w:pPr>
+            <w:r>
+              <w:t>Clio</w:t>
+            </w:r>
+          </w:p>
+        </w:tc>
+        <w:tc>
+          <w:tcPr>
+            <w:tcW w:w="0" w:type="auto"/>
+            <w:vAlign w:val="center"/>
+          </w:tcPr>
+          <w:p>
+            <w:pPr>
+              <w:jc w:val="center"/>
+            </w:pPr>
+            <w:proofErr w:type="spellStart"/>
+            <w:r>
+              <w:t>LegalFlow</w:t>
+            </w:r>
+            <w:proofErr w:type="spellEnd"/>
+            <w:r>
+              <w:t xml:space="preserve"> (gestión legal web)</w:t>
+            </w:r>
+          </w:p>
+        </w:tc>
+        <w:tc>
+          <w:tcPr>
+            <w:tcW w:w="0" w:type="auto"/>
+            <w:vAlign w:val="center"/>
+          </w:tcPr>
+          <w:p>
+            <w:pPr>
+              <w:jc w:val="center"/>
+            </w:pPr>
+            <w:r>
+              <w:t>Directo</w:t>
+            </w:r>
+          </w:p>
+        </w:tc>
+        <w:tc>
+          <w:tcPr>
+            <w:tcW w:w="0" w:type="auto"/>
+            <w:vAlign w:val="center"/>
+          </w:tcPr>
+          <w:p>
+            <w:pPr>
+              <w:jc w:val="center"/>
+            </w:pPr>
+            <w:r>
+              <w:t xml:space="preserve">Suite </w:t>
+            </w:r>
+            <w:proofErr w:type="spellStart"/>
+            <w:r>
+              <w:t>cloud</w:t>
+            </w:r>
+            <w:proofErr w:type="spellEnd"/>
+            <w:r>
+              <w:t xml:space="preserve"> para gestión de bufetes: casos, documentos, agenda y facturación.</w:t>
+            </w:r>
+          </w:p>
+        </w:tc>
+        <w:tc>
+          <w:tcPr>
+            <w:tcW w:w="0" w:type="auto"/>
+            <w:vAlign w:val="center"/>
+          </w:tcPr>
+          <w:p>
+            <w:pPr>
+              <w:jc w:val="center"/>
+            </w:pPr>
+            <w:r>
+              <w:t>Posicionarse como alternativa más económica para firmas pequeñas.</w:t>
+            </w:r>
+          </w:p>
+        </w:tc>
+      </w:tr>
+      <w:tr>
+        <w:tc>
+          <w:tcPr>
+            <w:tcW w:w="0" w:type="auto"/>
+            <w:vAlign w:val="center"/>
+          </w:tcPr>
+          <w:p>
+            <w:pPr>
+              <w:jc w:val="center"/>
+              <w:rPr>
+                <w:b/>
+              </w:rPr>
+            </w:pPr>
+            <w:r>
+              <w:rPr>
+                <w:b/>
+              </w:rPr>
+              <w:lastRenderedPageBreak/>
+              <w:t>5</w:t>
+            </w:r>
+          </w:p>
+        </w:tc>
+        <w:tc>
+          <w:tcPr>
+            <w:tcW w:w="0" w:type="auto"/>
+            <w:vAlign w:val="center"/>
+          </w:tcPr>
+          <w:p>
+            <w:pPr>
+              <w:jc w:val="center"/>
+            </w:pPr>
+            <w:proofErr w:type="spellStart"/>
+            <w:r>
+              <w:t>MyCase</w:t>
             </w:r>
             <w:proofErr w:type="spellEnd"/>
           </w:p>
@@ -11924,11 +12209,11 @@
             </w:pPr>
             <w:proofErr w:type="spellStart"/>
             <w:r>
-              <w:t>SafeCase</w:t>
+              <w:t>LegalFlow</w:t>
             </w:r>
             <w:proofErr w:type="spellEnd"/>
             <w:r>
-              <w:t xml:space="preserve"> (ERP de denuncias)</w:t>
+              <w:t xml:space="preserve"> (gestión legal web)</w:t>
             </w:r>
           </w:p>
         </w:tc>
@@ -11956,15 +12241,7 @@
               <w:jc w:val="center"/>
             </w:pPr>
             <w:r>
-              <w:t xml:space="preserve">Reportes confidenciales de acoso y conductas indebidas con </w:t>
-            </w:r>
-            <w:proofErr w:type="spellStart"/>
-            <w:r>
-              <w:t>analytics</w:t>
-            </w:r>
-            <w:proofErr w:type="spellEnd"/>
-            <w:r>
-              <w:t xml:space="preserve"> para RRHH.</w:t>
+              <w:t>Gestión legal integral con portal de cliente y pagos en línea.</w:t>
             </w:r>
           </w:p>
         </w:tc>
@@ -11978,7 +12255,15 @@
               <w:jc w:val="center"/>
             </w:pPr>
             <w:r>
-              <w:t>Diferenciarse con localización normativa y precios más accesibles.</w:t>
+              <w:t xml:space="preserve">Diferenciarse con UX más clara y </w:t>
+            </w:r>
+            <w:proofErr w:type="spellStart"/>
+            <w:r>
+              <w:t>onboarding</w:t>
+            </w:r>
+            <w:proofErr w:type="spellEnd"/>
+            <w:r>
+              <w:t xml:space="preserve"> guiado en español.</w:t>
             </w:r>
           </w:p>
         </w:tc>
@@ -12000,7 +12285,7 @@
               <w:rPr>
                 <w:b/>
               </w:rPr>
-              <w:t>3</w:t>
+              <w:t>6</w:t>
             </w:r>
           </w:p>
         </w:tc>
@@ -12015,7 +12300,7 @@
             </w:pPr>
             <w:proofErr w:type="spellStart"/>
             <w:r>
-              <w:t>FaceUp</w:t>
+              <w:t>PracticePanther</w:t>
             </w:r>
             <w:proofErr w:type="spellEnd"/>
           </w:p>
@@ -12031,11 +12316,11 @@
             </w:pPr>
             <w:proofErr w:type="spellStart"/>
             <w:r>
-              <w:t>SafeCase</w:t>
+              <w:t>LegalFlow</w:t>
             </w:r>
             <w:proofErr w:type="spellEnd"/>
             <w:r>
-              <w:t xml:space="preserve"> (ERP de denuncias)</w:t>
+              <w:t xml:space="preserve"> (gestión legal web)</w:t>
             </w:r>
           </w:p>
         </w:tc>
@@ -12063,15 +12348,7 @@
               <w:jc w:val="center"/>
             </w:pPr>
             <w:r>
-              <w:t xml:space="preserve">Plataforma de </w:t>
-            </w:r>
-            <w:proofErr w:type="spellStart"/>
-            <w:r>
-              <w:t>whistleblowing</w:t>
-            </w:r>
-            <w:proofErr w:type="spellEnd"/>
-            <w:r>
-              <w:t xml:space="preserve"> con enfoque en seguridad del denunciante.</w:t>
+              <w:t>Automatización de flujos de trabajo legales y control financiero por expediente.</w:t>
             </w:r>
           </w:p>
         </w:tc>
@@ -12085,7 +12362,7 @@
               <w:jc w:val="center"/>
             </w:pPr>
             <w:r>
-              <w:t>Ofrecer implementación rápida y enfoque educativo para cultura organizacional.</w:t>
+              <w:t>Enfocarse en simplicidad operativa para despachos en crecimiento.</w:t>
             </w:r>
           </w:p>
         </w:tc>
@@ -12107,7 +12384,7 @@
               <w:rPr>
                 <w:b/>
               </w:rPr>
-              <w:t>4</w:t>
+              <w:t>7</w:t>
             </w:r>
           </w:p>
         </w:tc>
@@ -12120,9 +12397,12 @@
             <w:pPr>
               <w:jc w:val="center"/>
             </w:pPr>
+            <w:r>
+              <w:t xml:space="preserve">Samsung </w:t>
+            </w:r>
             <w:proofErr w:type="spellStart"/>
             <w:r>
-              <w:t>Clio</w:t>
+              <w:t>SmartThings</w:t>
             </w:r>
             <w:proofErr w:type="spellEnd"/>
           </w:p>
@@ -12138,11 +12418,11 @@
             </w:pPr>
             <w:proofErr w:type="spellStart"/>
             <w:r>
-              <w:t>LegalFlow</w:t>
+              <w:t>HomeHub</w:t>
             </w:r>
             <w:proofErr w:type="spellEnd"/>
             <w:r>
-              <w:t xml:space="preserve"> (gestión legal web)</w:t>
+              <w:t xml:space="preserve"> (app domótica)</w:t>
             </w:r>
           </w:p>
         </w:tc>
@@ -12170,15 +12450,7 @@
               <w:jc w:val="center"/>
             </w:pPr>
             <w:r>
-              <w:t xml:space="preserve">Suite </w:t>
-            </w:r>
-            <w:proofErr w:type="spellStart"/>
-            <w:r>
-              <w:t>cloud</w:t>
-            </w:r>
-            <w:proofErr w:type="spellEnd"/>
-            <w:r>
-              <w:t xml:space="preserve"> para gestión de bufetes: casos, documentos, agenda y facturación.</w:t>
+              <w:t>Plataforma para control y automatización de dispositivos IoT del hogar.</w:t>
             </w:r>
           </w:p>
         </w:tc>
@@ -12192,7 +12464,7 @@
               <w:jc w:val="center"/>
             </w:pPr>
             <w:r>
-              <w:t>Posicionarse como alternativa más económica para firmas pequeñas.</w:t>
+              <w:t>Competir con una experiencia unificada centrada en facilidad de uso.</w:t>
             </w:r>
           </w:p>
         </w:tc>
@@ -12214,8 +12486,7 @@
               <w:rPr>
                 <w:b/>
               </w:rPr>
-              <w:lastRenderedPageBreak/>
-              <w:t>5</w:t>
+              <w:t>8</w:t>
             </w:r>
           </w:p>
         </w:tc>
@@ -12228,9 +12499,12 @@
             <w:pPr>
               <w:jc w:val="center"/>
             </w:pPr>
+            <w:r>
+              <w:t xml:space="preserve">Home </w:t>
+            </w:r>
             <w:proofErr w:type="spellStart"/>
             <w:r>
-              <w:t>MyCase</w:t>
+              <w:t>Assistant</w:t>
             </w:r>
             <w:proofErr w:type="spellEnd"/>
           </w:p>
@@ -12246,11 +12520,11 @@
             </w:pPr>
             <w:proofErr w:type="spellStart"/>
             <w:r>
-              <w:t>LegalFlow</w:t>
+              <w:t>HomeHub</w:t>
             </w:r>
             <w:proofErr w:type="spellEnd"/>
             <w:r>
-              <w:t xml:space="preserve"> (gestión legal web)</w:t>
+              <w:t xml:space="preserve"> (app domótica)</w:t>
             </w:r>
           </w:p>
         </w:tc>
@@ -12278,7 +12552,15 @@
               <w:jc w:val="center"/>
             </w:pPr>
             <w:r>
-              <w:t>Gestión legal integral con portal de cliente y pagos en línea.</w:t>
+              <w:t>Ecosistema de automatización open-</w:t>
+            </w:r>
+            <w:proofErr w:type="spellStart"/>
+            <w:r>
+              <w:t>source</w:t>
+            </w:r>
+            <w:proofErr w:type="spellEnd"/>
+            <w:r>
+              <w:t xml:space="preserve"> altamente configurable.</w:t>
             </w:r>
           </w:p>
         </w:tc>
@@ -12292,15 +12574,7 @@
               <w:jc w:val="center"/>
             </w:pPr>
             <w:r>
-              <w:t xml:space="preserve">Diferenciarse con UX más clara y </w:t>
-            </w:r>
-            <w:proofErr w:type="spellStart"/>
-            <w:r>
-              <w:t>onboarding</w:t>
-            </w:r>
-            <w:proofErr w:type="spellEnd"/>
-            <w:r>
-              <w:t xml:space="preserve"> guiado en español.</w:t>
+              <w:t>Diferenciarse con menor complejidad técnica para usuario no experto.</w:t>
             </w:r>
           </w:p>
         </w:tc>
@@ -12322,7 +12596,29 @@
               <w:rPr>
                 <w:b/>
               </w:rPr>
-              <w:t>6</w:t>
+              <w:t>9</w:t>
+            </w:r>
+          </w:p>
+        </w:tc>
+        <w:tc>
+          <w:tcPr>
+            <w:tcW w:w="0" w:type="auto"/>
+            <w:vAlign w:val="center"/>
+          </w:tcPr>
+          <w:p>
+            <w:pPr>
+              <w:jc w:val="center"/>
+            </w:pPr>
+            <w:r>
+              <w:t>Apple Home (</w:t>
+            </w:r>
+            <w:proofErr w:type="spellStart"/>
+            <w:r>
+              <w:t>HomeKit</w:t>
+            </w:r>
+            <w:proofErr w:type="spellEnd"/>
+            <w:r>
+              <w:t>)</w:t>
             </w:r>
           </w:p>
         </w:tc>
@@ -12337,9 +12633,90 @@
             </w:pPr>
             <w:proofErr w:type="spellStart"/>
             <w:r>
-              <w:t>PracticePanther</w:t>
+              <w:t>HomeHub</w:t>
             </w:r>
             <w:proofErr w:type="spellEnd"/>
+            <w:r>
+              <w:t xml:space="preserve"> (app domótica)</w:t>
+            </w:r>
+          </w:p>
+        </w:tc>
+        <w:tc>
+          <w:tcPr>
+            <w:tcW w:w="0" w:type="auto"/>
+            <w:vAlign w:val="center"/>
+          </w:tcPr>
+          <w:p>
+            <w:pPr>
+              <w:jc w:val="center"/>
+            </w:pPr>
+            <w:r>
+              <w:t>Indirecto</w:t>
+            </w:r>
+          </w:p>
+        </w:tc>
+        <w:tc>
+          <w:tcPr>
+            <w:tcW w:w="0" w:type="auto"/>
+            <w:vAlign w:val="center"/>
+          </w:tcPr>
+          <w:p>
+            <w:pPr>
+              <w:jc w:val="center"/>
+            </w:pPr>
+            <w:r>
+              <w:t>Integración de hogar inteligente dentro del ecosistema Apple.</w:t>
+            </w:r>
+          </w:p>
+        </w:tc>
+        <w:tc>
+          <w:tcPr>
+            <w:tcW w:w="0" w:type="auto"/>
+            <w:vAlign w:val="center"/>
+          </w:tcPr>
+          <w:p>
+            <w:pPr>
+              <w:jc w:val="center"/>
+            </w:pPr>
+            <w:r>
+              <w:t>Apostar por compatibilidad multiplataforma sin dependencia de marca.</w:t>
+            </w:r>
+          </w:p>
+        </w:tc>
+      </w:tr>
+      <w:tr>
+        <w:tc>
+          <w:tcPr>
+            <w:tcW w:w="0" w:type="auto"/>
+            <w:vAlign w:val="center"/>
+          </w:tcPr>
+          <w:p>
+            <w:pPr>
+              <w:jc w:val="center"/>
+              <w:rPr>
+                <w:b/>
+              </w:rPr>
+            </w:pPr>
+            <w:r>
+              <w:rPr>
+                <w:b/>
+              </w:rPr>
+              <w:t>10</w:t>
+            </w:r>
+          </w:p>
+        </w:tc>
+        <w:tc>
+          <w:tcPr>
+            <w:tcW w:w="0" w:type="auto"/>
+            <w:vAlign w:val="center"/>
+          </w:tcPr>
+          <w:p>
+            <w:pPr>
+              <w:jc w:val="center"/>
+            </w:pPr>
+            <w:r>
+              <w:t>Google Home</w:t>
+            </w:r>
           </w:p>
         </w:tc>
         <w:tc>
@@ -12353,11 +12730,11 @@
             </w:pPr>
             <w:proofErr w:type="spellStart"/>
             <w:r>
-              <w:t>LegalFlow</w:t>
+              <w:t>HomeHub</w:t>
             </w:r>
             <w:proofErr w:type="spellEnd"/>
             <w:r>
-              <w:t xml:space="preserve"> (gestión legal web)</w:t>
+              <w:t xml:space="preserve"> (app domótica)</w:t>
             </w:r>
           </w:p>
         </w:tc>
@@ -12371,7 +12748,7 @@
               <w:jc w:val="center"/>
             </w:pPr>
             <w:r>
-              <w:t>Directo</w:t>
+              <w:t>Indirecto</w:t>
             </w:r>
           </w:p>
         </w:tc>
@@ -12385,7 +12762,7 @@
               <w:jc w:val="center"/>
             </w:pPr>
             <w:r>
-              <w:t>Automatización de flujos de trabajo legales y control financiero por expediente.</w:t>
+              <w:t>Control por voz y automatizaciones conectadas a servicios Google.</w:t>
             </w:r>
           </w:p>
         </w:tc>
@@ -12399,452 +12776,6 @@
               <w:jc w:val="center"/>
             </w:pPr>
             <w:r>
-              <w:t>Enfocarse en simplicidad operativa para despachos en crecimiento.</w:t>
-            </w:r>
-          </w:p>
-        </w:tc>
-      </w:tr>
-      <w:tr>
-        <w:tc>
-          <w:tcPr>
-            <w:tcW w:w="0" w:type="auto"/>
-            <w:vAlign w:val="center"/>
-          </w:tcPr>
-          <w:p>
-            <w:pPr>
-              <w:jc w:val="center"/>
-              <w:rPr>
-                <w:b/>
-              </w:rPr>
-            </w:pPr>
-            <w:r>
-              <w:rPr>
-                <w:b/>
-              </w:rPr>
-              <w:t>7</w:t>
-            </w:r>
-          </w:p>
-        </w:tc>
-        <w:tc>
-          <w:tcPr>
-            <w:tcW w:w="0" w:type="auto"/>
-            <w:vAlign w:val="center"/>
-          </w:tcPr>
-          <w:p>
-            <w:pPr>
-              <w:jc w:val="center"/>
-            </w:pPr>
-            <w:r>
-              <w:t xml:space="preserve">Samsung </w:t>
-            </w:r>
-            <w:proofErr w:type="spellStart"/>
-            <w:r>
-              <w:t>SmartThings</w:t>
-            </w:r>
-            <w:proofErr w:type="spellEnd"/>
-          </w:p>
-        </w:tc>
-        <w:tc>
-          <w:tcPr>
-            <w:tcW w:w="0" w:type="auto"/>
-            <w:vAlign w:val="center"/>
-          </w:tcPr>
-          <w:p>
-            <w:pPr>
-              <w:jc w:val="center"/>
-            </w:pPr>
-            <w:proofErr w:type="spellStart"/>
-            <w:r>
-              <w:t>HomeHub</w:t>
-            </w:r>
-            <w:proofErr w:type="spellEnd"/>
-            <w:r>
-              <w:t xml:space="preserve"> (</w:t>
-            </w:r>
-            <w:proofErr w:type="spellStart"/>
-            <w:r>
-              <w:t>app</w:t>
-            </w:r>
-            <w:proofErr w:type="spellEnd"/>
-            <w:r>
-              <w:t xml:space="preserve"> domótica)</w:t>
-            </w:r>
-          </w:p>
-        </w:tc>
-        <w:tc>
-          <w:tcPr>
-            <w:tcW w:w="0" w:type="auto"/>
-            <w:vAlign w:val="center"/>
-          </w:tcPr>
-          <w:p>
-            <w:pPr>
-              <w:jc w:val="center"/>
-            </w:pPr>
-            <w:r>
-              <w:t>Directo</w:t>
-            </w:r>
-          </w:p>
-        </w:tc>
-        <w:tc>
-          <w:tcPr>
-            <w:tcW w:w="0" w:type="auto"/>
-            <w:vAlign w:val="center"/>
-          </w:tcPr>
-          <w:p>
-            <w:pPr>
-              <w:jc w:val="center"/>
-            </w:pPr>
-            <w:r>
-              <w:t>Plataforma para control y automatización de dispositivos IoT del hogar.</w:t>
-            </w:r>
-          </w:p>
-        </w:tc>
-        <w:tc>
-          <w:tcPr>
-            <w:tcW w:w="0" w:type="auto"/>
-            <w:vAlign w:val="center"/>
-          </w:tcPr>
-          <w:p>
-            <w:pPr>
-              <w:jc w:val="center"/>
-            </w:pPr>
-            <w:r>
-              <w:t>Competir con una experiencia unificada centrada en facilidad de uso.</w:t>
-            </w:r>
-          </w:p>
-        </w:tc>
-      </w:tr>
-      <w:tr>
-        <w:tc>
-          <w:tcPr>
-            <w:tcW w:w="0" w:type="auto"/>
-            <w:vAlign w:val="center"/>
-          </w:tcPr>
-          <w:p>
-            <w:pPr>
-              <w:jc w:val="center"/>
-              <w:rPr>
-                <w:b/>
-              </w:rPr>
-            </w:pPr>
-            <w:r>
-              <w:rPr>
-                <w:b/>
-              </w:rPr>
-              <w:t>8</w:t>
-            </w:r>
-          </w:p>
-        </w:tc>
-        <w:tc>
-          <w:tcPr>
-            <w:tcW w:w="0" w:type="auto"/>
-            <w:vAlign w:val="center"/>
-          </w:tcPr>
-          <w:p>
-            <w:pPr>
-              <w:jc w:val="center"/>
-            </w:pPr>
-            <w:r>
-              <w:t xml:space="preserve">Home </w:t>
-            </w:r>
-            <w:proofErr w:type="spellStart"/>
-            <w:r>
-              <w:t>Assistant</w:t>
-            </w:r>
-            <w:proofErr w:type="spellEnd"/>
-          </w:p>
-        </w:tc>
-        <w:tc>
-          <w:tcPr>
-            <w:tcW w:w="0" w:type="auto"/>
-            <w:vAlign w:val="center"/>
-          </w:tcPr>
-          <w:p>
-            <w:pPr>
-              <w:jc w:val="center"/>
-            </w:pPr>
-            <w:proofErr w:type="spellStart"/>
-            <w:r>
-              <w:t>HomeHub</w:t>
-            </w:r>
-            <w:proofErr w:type="spellEnd"/>
-            <w:r>
-              <w:t xml:space="preserve"> (</w:t>
-            </w:r>
-            <w:proofErr w:type="spellStart"/>
-            <w:r>
-              <w:t>app</w:t>
-            </w:r>
-            <w:proofErr w:type="spellEnd"/>
-            <w:r>
-              <w:t xml:space="preserve"> domótica)</w:t>
-            </w:r>
-          </w:p>
-        </w:tc>
-        <w:tc>
-          <w:tcPr>
-            <w:tcW w:w="0" w:type="auto"/>
-            <w:vAlign w:val="center"/>
-          </w:tcPr>
-          <w:p>
-            <w:pPr>
-              <w:jc w:val="center"/>
-            </w:pPr>
-            <w:r>
-              <w:t>Directo</w:t>
-            </w:r>
-          </w:p>
-        </w:tc>
-        <w:tc>
-          <w:tcPr>
-            <w:tcW w:w="0" w:type="auto"/>
-            <w:vAlign w:val="center"/>
-          </w:tcPr>
-          <w:p>
-            <w:pPr>
-              <w:jc w:val="center"/>
-            </w:pPr>
-            <w:r>
-              <w:t>Ecosistema de automatización open-</w:t>
-            </w:r>
-            <w:proofErr w:type="spellStart"/>
-            <w:r>
-              <w:t>source</w:t>
-            </w:r>
-            <w:proofErr w:type="spellEnd"/>
-            <w:r>
-              <w:t xml:space="preserve"> altamente configurable.</w:t>
-            </w:r>
-          </w:p>
-        </w:tc>
-        <w:tc>
-          <w:tcPr>
-            <w:tcW w:w="0" w:type="auto"/>
-            <w:vAlign w:val="center"/>
-          </w:tcPr>
-          <w:p>
-            <w:pPr>
-              <w:jc w:val="center"/>
-            </w:pPr>
-            <w:r>
-              <w:t>Diferenciarse con menor complejidad técnica para usuario no experto.</w:t>
-            </w:r>
-          </w:p>
-        </w:tc>
-      </w:tr>
-      <w:tr>
-        <w:tc>
-          <w:tcPr>
-            <w:tcW w:w="0" w:type="auto"/>
-            <w:vAlign w:val="center"/>
-          </w:tcPr>
-          <w:p>
-            <w:pPr>
-              <w:jc w:val="center"/>
-              <w:rPr>
-                <w:b/>
-              </w:rPr>
-            </w:pPr>
-            <w:r>
-              <w:rPr>
-                <w:b/>
-              </w:rPr>
-              <w:t>9</w:t>
-            </w:r>
-          </w:p>
-        </w:tc>
-        <w:tc>
-          <w:tcPr>
-            <w:tcW w:w="0" w:type="auto"/>
-            <w:vAlign w:val="center"/>
-          </w:tcPr>
-          <w:p>
-            <w:pPr>
-              <w:jc w:val="center"/>
-            </w:pPr>
-            <w:r>
-              <w:t>Apple Home (</w:t>
-            </w:r>
-            <w:proofErr w:type="spellStart"/>
-            <w:r>
-              <w:t>HomeKit</w:t>
-            </w:r>
-            <w:proofErr w:type="spellEnd"/>
-            <w:r>
-              <w:t>)</w:t>
-            </w:r>
-          </w:p>
-        </w:tc>
-        <w:tc>
-          <w:tcPr>
-            <w:tcW w:w="0" w:type="auto"/>
-            <w:vAlign w:val="center"/>
-          </w:tcPr>
-          <w:p>
-            <w:pPr>
-              <w:jc w:val="center"/>
-            </w:pPr>
-            <w:proofErr w:type="spellStart"/>
-            <w:r>
-              <w:t>HomeHub</w:t>
-            </w:r>
-            <w:proofErr w:type="spellEnd"/>
-            <w:r>
-              <w:t xml:space="preserve"> (</w:t>
-            </w:r>
-            <w:proofErr w:type="spellStart"/>
-            <w:r>
-              <w:t>app</w:t>
-            </w:r>
-            <w:proofErr w:type="spellEnd"/>
-            <w:r>
-              <w:t xml:space="preserve"> domótica)</w:t>
-            </w:r>
-          </w:p>
-        </w:tc>
-        <w:tc>
-          <w:tcPr>
-            <w:tcW w:w="0" w:type="auto"/>
-            <w:vAlign w:val="center"/>
-          </w:tcPr>
-          <w:p>
-            <w:pPr>
-              <w:jc w:val="center"/>
-            </w:pPr>
-            <w:r>
-              <w:t>Indirecto</w:t>
-            </w:r>
-          </w:p>
-        </w:tc>
-        <w:tc>
-          <w:tcPr>
-            <w:tcW w:w="0" w:type="auto"/>
-            <w:vAlign w:val="center"/>
-          </w:tcPr>
-          <w:p>
-            <w:pPr>
-              <w:jc w:val="center"/>
-            </w:pPr>
-            <w:r>
-              <w:t>Integración de hogar inteligente dentro del ecosistema Apple.</w:t>
-            </w:r>
-          </w:p>
-        </w:tc>
-        <w:tc>
-          <w:tcPr>
-            <w:tcW w:w="0" w:type="auto"/>
-            <w:vAlign w:val="center"/>
-          </w:tcPr>
-          <w:p>
-            <w:pPr>
-              <w:jc w:val="center"/>
-            </w:pPr>
-            <w:r>
-              <w:t>Apostar por compatibilidad multiplataforma sin dependencia de marca.</w:t>
-            </w:r>
-          </w:p>
-        </w:tc>
-      </w:tr>
-      <w:tr>
-        <w:tc>
-          <w:tcPr>
-            <w:tcW w:w="0" w:type="auto"/>
-            <w:vAlign w:val="center"/>
-          </w:tcPr>
-          <w:p>
-            <w:pPr>
-              <w:jc w:val="center"/>
-              <w:rPr>
-                <w:b/>
-              </w:rPr>
-            </w:pPr>
-            <w:r>
-              <w:rPr>
-                <w:b/>
-              </w:rPr>
-              <w:t>10</w:t>
-            </w:r>
-          </w:p>
-        </w:tc>
-        <w:tc>
-          <w:tcPr>
-            <w:tcW w:w="0" w:type="auto"/>
-            <w:vAlign w:val="center"/>
-          </w:tcPr>
-          <w:p>
-            <w:pPr>
-              <w:jc w:val="center"/>
-            </w:pPr>
-            <w:r>
-              <w:t>Google Home</w:t>
-            </w:r>
-          </w:p>
-        </w:tc>
-        <w:tc>
-          <w:tcPr>
-            <w:tcW w:w="0" w:type="auto"/>
-            <w:vAlign w:val="center"/>
-          </w:tcPr>
-          <w:p>
-            <w:pPr>
-              <w:jc w:val="center"/>
-            </w:pPr>
-            <w:proofErr w:type="spellStart"/>
-            <w:r>
-              <w:t>HomeHub</w:t>
-            </w:r>
-            <w:proofErr w:type="spellEnd"/>
-            <w:r>
-              <w:t xml:space="preserve"> (</w:t>
-            </w:r>
-            <w:proofErr w:type="spellStart"/>
-            <w:r>
-              <w:t>app</w:t>
-            </w:r>
-            <w:proofErr w:type="spellEnd"/>
-            <w:r>
-              <w:t xml:space="preserve"> domótica)</w:t>
-            </w:r>
-          </w:p>
-        </w:tc>
-        <w:tc>
-          <w:tcPr>
-            <w:tcW w:w="0" w:type="auto"/>
-            <w:vAlign w:val="center"/>
-          </w:tcPr>
-          <w:p>
-            <w:pPr>
-              <w:jc w:val="center"/>
-            </w:pPr>
-            <w:r>
-              <w:t>Indirecto</w:t>
-            </w:r>
-          </w:p>
-        </w:tc>
-        <w:tc>
-          <w:tcPr>
-            <w:tcW w:w="0" w:type="auto"/>
-            <w:vAlign w:val="center"/>
-          </w:tcPr>
-          <w:p>
-            <w:pPr>
-              <w:jc w:val="center"/>
-            </w:pPr>
-            <w:r>
-              <w:t>Control por voz y automatizaciones conectadas a servicios Google.</w:t>
-            </w:r>
-          </w:p>
-        </w:tc>
-        <w:tc>
-          <w:tcPr>
-            <w:tcW w:w="0" w:type="auto"/>
-            <w:vAlign w:val="center"/>
-          </w:tcPr>
-          <w:p>
-            <w:pPr>
-              <w:jc w:val="center"/>
-            </w:pPr>
-            <w:r>
               <w:t>Destacar privacidad, personalización y consolidación de dispositivos heterogéneos.</w:t>
             </w:r>
           </w:p>
@@ -12889,7 +12820,6 @@
           <w:lang w:val="en-US"/>
         </w:rPr>
       </w:pPr>
-      <w:bookmarkStart w:id="37" w:name="_GoBack"/>
     </w:p>
     <w:p>
       <w:pPr>
@@ -12904,11 +12834,11 @@
       <w:pPr>
         <w:pStyle w:val="Ttulo3"/>
       </w:pPr>
-      <w:bookmarkStart w:id="38" w:name="_Toc223906571"/>
+      <w:bookmarkStart w:id="37" w:name="_Toc223906571"/>
       <w:r>
         <w:t>Implicaciones estratégicas para QuetzalDev:</w:t>
       </w:r>
-      <w:bookmarkEnd w:id="38"/>
+      <w:bookmarkEnd w:id="37"/>
     </w:p>
     <w:p>
       <w:pPr>
@@ -12943,15 +12873,7 @@
         </w:numPr>
       </w:pPr>
       <w:r>
-        <w:t>Diferenciación por verticalidad de solución: mantener productos especializados por nicho (</w:t>
-      </w:r>
-      <w:proofErr w:type="spellStart"/>
-      <w:r>
-        <w:t>SafeCase</w:t>
-      </w:r>
-      <w:proofErr w:type="spellEnd"/>
-      <w:r>
-        <w:t xml:space="preserve">, </w:t>
+        <w:t xml:space="preserve">Diferenciación por verticalidad de solución: mantener productos especializados por nicho (SafeCase, </w:t>
       </w:r>
       <w:proofErr w:type="spellStart"/>
       <w:r>
@@ -12993,10 +12915,17 @@
       </w:r>
       <w:proofErr w:type="spellEnd"/>
       <w:r>
-        <w:t>: QuetzalDev puede competir de manera efectiva no intentando superar a los líderes en amplitud funcional, sino reduciendo fricción, acelerando implementación y entregando valor específico por industria con una propuesta comercial digital simple y directa.</w:t>
-      </w:r>
-    </w:p>
-    <w:bookmarkEnd w:id="37"/>
+        <w:t xml:space="preserve">: </w:t>
+      </w:r>
+      <w:proofErr w:type="spellStart"/>
+      <w:r>
+        <w:t>QuetzalDev</w:t>
+      </w:r>
+      <w:proofErr w:type="spellEnd"/>
+      <w:r>
+        <w:t xml:space="preserve"> puede competir de manera efectiva no intentando superar a los líderes en amplitud funcional, sino reduciendo fricción, acelerando implementación y entregando valor específico por industria con una propuesta comercial digital simple y directa.</w:t>
+      </w:r>
+    </w:p>
     <w:p/>
     <w:p/>
     <w:p/>
@@ -13013,12 +12942,12 @@
       <w:pPr>
         <w:pStyle w:val="Ttulo2"/>
       </w:pPr>
-      <w:bookmarkStart w:id="39" w:name="_Toc223906572"/>
+      <w:bookmarkStart w:id="38" w:name="_Toc223906572"/>
       <w:r>
         <w:lastRenderedPageBreak/>
         <w:t>Análisis VUCA</w:t>
       </w:r>
-      <w:bookmarkEnd w:id="39"/>
+      <w:bookmarkEnd w:id="38"/>
     </w:p>
     <w:p/>
     <w:p>
@@ -13218,35 +13147,21 @@
               <w:rPr>
                 <w:lang w:val="es-GT"/>
               </w:rPr>
-              <w:t xml:space="preserve">, Next.js, </w:t>
+              <w:t xml:space="preserve">, Next.js, Vue) y los ecosistemas </w:t>
             </w:r>
             <w:proofErr w:type="spellStart"/>
             <w:r>
               <w:rPr>
                 <w:lang w:val="es-GT"/>
               </w:rPr>
-              <w:t>Vue</w:t>
+              <w:t>IoT</w:t>
             </w:r>
             <w:proofErr w:type="spellEnd"/>
             <w:r>
               <w:rPr>
                 <w:lang w:val="es-GT"/>
               </w:rPr>
-              <w:t>) y los ecosistemas IoT (</w:t>
-            </w:r>
-            <w:proofErr w:type="spellStart"/>
-            <w:r>
-              <w:rPr>
-                <w:lang w:val="es-GT"/>
-              </w:rPr>
-              <w:t>Matter</w:t>
-            </w:r>
-            <w:proofErr w:type="spellEnd"/>
-            <w:r>
-              <w:rPr>
-                <w:lang w:val="es-GT"/>
-              </w:rPr>
-              <w:t xml:space="preserve">, </w:t>
+              <w:t xml:space="preserve"> (Matter, </w:t>
             </w:r>
             <w:proofErr w:type="spellStart"/>
             <w:r>
@@ -13363,21 +13278,7 @@
               <w:rPr>
                 <w:lang w:val="es-GT"/>
               </w:rPr>
-              <w:t xml:space="preserve"> laboral (</w:t>
-            </w:r>
-            <w:proofErr w:type="spellStart"/>
-            <w:r>
-              <w:rPr>
-                <w:lang w:val="es-GT"/>
-              </w:rPr>
-              <w:t>SafeCase</w:t>
-            </w:r>
-            <w:proofErr w:type="spellEnd"/>
-            <w:r>
-              <w:rPr>
-                <w:lang w:val="es-GT"/>
-              </w:rPr>
-              <w:t xml:space="preserve">) depende de cambios regulatorios impredecibles en legislación laboral guatemalteca; la adopción de </w:t>
+              <w:t xml:space="preserve"> laboral (SafeCase) depende de cambios regulatorios impredecibles en legislación laboral guatemalteca; la adopción de </w:t>
             </w:r>
             <w:proofErr w:type="spellStart"/>
             <w:r>
@@ -13410,21 +13311,7 @@
               <w:rPr>
                 <w:lang w:val="es-GT"/>
               </w:rPr>
-              <w:t xml:space="preserve">Diseñar </w:t>
-            </w:r>
-            <w:proofErr w:type="spellStart"/>
-            <w:r>
-              <w:rPr>
-                <w:lang w:val="es-GT"/>
-              </w:rPr>
-              <w:t>SafeCase</w:t>
-            </w:r>
-            <w:proofErr w:type="spellEnd"/>
-            <w:r>
-              <w:rPr>
-                <w:lang w:val="es-GT"/>
-              </w:rPr>
-              <w:t xml:space="preserve"> con adaptabilidad regulatoria modular; lanzar </w:t>
+              <w:t xml:space="preserve">Diseñar SafeCase con adaptabilidad regulatoria modular; lanzar </w:t>
             </w:r>
             <w:proofErr w:type="spellStart"/>
             <w:r>
@@ -13629,56 +13516,34 @@
           <w:lang w:val="es-GT"/>
         </w:rPr>
       </w:pPr>
-      <w:bookmarkStart w:id="40" w:name="_Toc223906573"/>
+      <w:bookmarkStart w:id="39" w:name="_Toc223906573"/>
       <w:r>
         <w:rPr>
           <w:lang w:val="es-GT"/>
         </w:rPr>
         <w:lastRenderedPageBreak/>
-        <w:t xml:space="preserve">Diamante de </w:t>
-      </w:r>
-      <w:proofErr w:type="spellStart"/>
-      <w:r>
-        <w:rPr>
-          <w:lang w:val="es-GT"/>
-        </w:rPr>
-        <w:t>Porter</w:t>
-      </w:r>
-      <w:bookmarkEnd w:id="40"/>
-      <w:proofErr w:type="spellEnd"/>
-    </w:p>
-    <w:p>
-      <w:pPr>
-        <w:rPr>
-          <w:lang w:val="es-GT"/>
-        </w:rPr>
-      </w:pPr>
-    </w:p>
-    <w:p>
-      <w:pPr>
-        <w:rPr>
-          <w:lang w:val="es-GT"/>
-        </w:rPr>
-      </w:pPr>
-      <w:r>
-        <w:rPr>
-          <w:lang w:val="es-GT"/>
-        </w:rPr>
-        <w:t xml:space="preserve">El Diamante de </w:t>
-      </w:r>
-      <w:proofErr w:type="spellStart"/>
-      <w:r>
-        <w:rPr>
-          <w:lang w:val="es-GT"/>
-        </w:rPr>
-        <w:t>Porter</w:t>
-      </w:r>
-      <w:proofErr w:type="spellEnd"/>
-      <w:r>
-        <w:rPr>
-          <w:lang w:val="es-GT"/>
-        </w:rPr>
-        <w:t xml:space="preserve"> analiza las ventajas competitivas nacionales/regionales que favorecen o limitan a QuetzalDev.</w:t>
+        <w:t>Diamante de Porter</w:t>
+      </w:r>
+      <w:bookmarkEnd w:id="39"/>
+    </w:p>
+    <w:p>
+      <w:pPr>
+        <w:rPr>
+          <w:lang w:val="es-GT"/>
+        </w:rPr>
+      </w:pPr>
+    </w:p>
+    <w:p>
+      <w:pPr>
+        <w:rPr>
+          <w:lang w:val="es-GT"/>
+        </w:rPr>
+      </w:pPr>
+      <w:r>
+        <w:rPr>
+          <w:lang w:val="es-GT"/>
+        </w:rPr>
+        <w:t>El Diamante de Porter analiza las ventajas competitivas nacionales/regionales que favorecen o limitan a QuetzalDev.</w:t>
       </w:r>
     </w:p>
     <w:p>
@@ -13805,7 +13670,21 @@
               <w:rPr>
                 <w:lang w:val="es-GT"/>
               </w:rPr>
-              <w:t>/IoT.</w:t>
+              <w:t>/</w:t>
+            </w:r>
+            <w:proofErr w:type="spellStart"/>
+            <w:r>
+              <w:rPr>
+                <w:lang w:val="es-GT"/>
+              </w:rPr>
+              <w:t>IoT</w:t>
+            </w:r>
+            <w:proofErr w:type="spellEnd"/>
+            <w:r>
+              <w:rPr>
+                <w:lang w:val="es-GT"/>
+              </w:rPr>
+              <w:t>.</w:t>
             </w:r>
           </w:p>
         </w:tc>
@@ -13941,63 +13820,21 @@
               <w:rPr>
                 <w:lang w:val="es-GT"/>
               </w:rPr>
-              <w:t xml:space="preserve">, AWS y </w:t>
+              <w:t xml:space="preserve">, AWS y Azure tienen presencia regional, reduciendo costos de hosting. Ecosistemas como Google Home y Amazon Alexa ya están en el mercado guatemalteco, facilitando la adopción de </w:t>
             </w:r>
             <w:proofErr w:type="spellStart"/>
             <w:r>
               <w:rPr>
                 <w:lang w:val="es-GT"/>
               </w:rPr>
-              <w:t>Azure</w:t>
+              <w:t>HomeHub</w:t>
             </w:r>
             <w:proofErr w:type="spellEnd"/>
             <w:r>
               <w:rPr>
                 <w:lang w:val="es-GT"/>
               </w:rPr>
-              <w:t xml:space="preserve"> tienen presencia regional, reduciendo costos de </w:t>
-            </w:r>
-            <w:proofErr w:type="spellStart"/>
-            <w:r>
-              <w:rPr>
-                <w:lang w:val="es-GT"/>
-              </w:rPr>
-              <w:t>hosting</w:t>
-            </w:r>
-            <w:proofErr w:type="spellEnd"/>
-            <w:r>
-              <w:rPr>
-                <w:lang w:val="es-GT"/>
-              </w:rPr>
-              <w:t xml:space="preserve">. Ecosistemas como Google Home y Amazon Alexa ya están en el mercado guatemalteco, facilitando la adopción de </w:t>
-            </w:r>
-            <w:proofErr w:type="spellStart"/>
-            <w:r>
-              <w:rPr>
-                <w:lang w:val="es-GT"/>
-              </w:rPr>
-              <w:t>HomeHub</w:t>
-            </w:r>
-            <w:proofErr w:type="spellEnd"/>
-            <w:r>
-              <w:rPr>
-                <w:lang w:val="es-GT"/>
-              </w:rPr>
-              <w:t>. La industria de telecomunicaciones (</w:t>
-            </w:r>
-            <w:proofErr w:type="spellStart"/>
-            <w:r>
-              <w:rPr>
-                <w:lang w:val="es-GT"/>
-              </w:rPr>
-              <w:t>Tigo</w:t>
-            </w:r>
-            <w:proofErr w:type="spellEnd"/>
-            <w:r>
-              <w:rPr>
-                <w:lang w:val="es-GT"/>
-              </w:rPr>
-              <w:t>, Claro) impulsa la conectividad necesaria para productos IoT.</w:t>
+              <w:t>. La industria de telecomunicaciones (Tigo, Claro) impulsa la conectividad necesaria para productos IoT.</w:t>
             </w:r>
           </w:p>
         </w:tc>
@@ -14124,7 +13961,7 @@
           <w:lang w:val="es-GT"/>
         </w:rPr>
       </w:pPr>
-      <w:bookmarkStart w:id="41" w:name="_Toc223906574"/>
+      <w:bookmarkStart w:id="40" w:name="_Toc223906574"/>
       <w:r>
         <w:rPr>
           <w:lang w:val="es-GT"/>
@@ -14132,7 +13969,7 @@
         <w:lastRenderedPageBreak/>
         <w:t>Análisis PEST</w:t>
       </w:r>
-      <w:bookmarkEnd w:id="41"/>
+      <w:bookmarkEnd w:id="40"/>
     </w:p>
     <w:p>
       <w:pPr>
@@ -14286,19 +14123,11 @@
                 <w:lang w:val="es-GT"/>
               </w:rPr>
             </w:pPr>
-            <w:proofErr w:type="spellStart"/>
-            <w:r>
-              <w:rPr>
-                <w:lang w:val="es-GT"/>
-              </w:rPr>
-              <w:t>SafeCase</w:t>
-            </w:r>
-            <w:proofErr w:type="spellEnd"/>
-            <w:r>
-              <w:rPr>
-                <w:lang w:val="es-GT"/>
-              </w:rPr>
-              <w:t xml:space="preserve"> se beneficia de mayor regulación laboral. Riesgo moderado por protección de datos; mitigación con cifrado.</w:t>
+            <w:r>
+              <w:rPr>
+                <w:lang w:val="es-GT"/>
+              </w:rPr>
+              <w:t>SafeCase se beneficia de mayor regulación laboral. Riesgo moderado por protección de datos; mitigación con cifrado.</w:t>
             </w:r>
           </w:p>
         </w:tc>
@@ -14482,21 +14311,21 @@
               <w:rPr>
                 <w:lang w:val="es-GT"/>
               </w:rPr>
-              <w:t xml:space="preserve">Expansión 5G; dispositivos IoT con </w:t>
+              <w:t xml:space="preserve">Expansión 5G; dispositivos </w:t>
             </w:r>
             <w:proofErr w:type="spellStart"/>
             <w:r>
               <w:rPr>
                 <w:lang w:val="es-GT"/>
               </w:rPr>
-              <w:t>Matter</w:t>
+              <w:t>IoT</w:t>
             </w:r>
             <w:proofErr w:type="spellEnd"/>
             <w:r>
               <w:rPr>
                 <w:lang w:val="es-GT"/>
               </w:rPr>
-              <w:t xml:space="preserve">; estandarización de </w:t>
+              <w:t xml:space="preserve"> con Matter; estandarización de </w:t>
             </w:r>
             <w:proofErr w:type="spellStart"/>
             <w:r>
@@ -14570,22 +14399,14 @@
           <w:lang w:val="es-GT"/>
         </w:rPr>
       </w:pPr>
-      <w:bookmarkStart w:id="42" w:name="_Toc223906575"/>
-      <w:r>
-        <w:rPr>
-          <w:lang w:val="es-GT"/>
-        </w:rPr>
-        <w:t xml:space="preserve">Las 5 Fuerzas de </w:t>
-      </w:r>
-      <w:proofErr w:type="spellStart"/>
-      <w:r>
-        <w:rPr>
-          <w:lang w:val="es-GT"/>
-        </w:rPr>
-        <w:t>Porter</w:t>
-      </w:r>
-      <w:bookmarkEnd w:id="42"/>
-      <w:proofErr w:type="spellEnd"/>
+      <w:bookmarkStart w:id="41" w:name="_Toc223906575"/>
+      <w:r>
+        <w:rPr>
+          <w:lang w:val="es-GT"/>
+        </w:rPr>
+        <w:t>Las 5 Fuerzas de Porter</w:t>
+      </w:r>
+      <w:bookmarkEnd w:id="41"/>
     </w:p>
     <w:p>
       <w:pPr>
@@ -14594,7 +14415,7 @@
           <w:lang w:val="es-GT"/>
         </w:rPr>
       </w:pPr>
-      <w:bookmarkStart w:id="43" w:name="_Toc223906576"/>
+      <w:bookmarkStart w:id="42" w:name="_Toc223906576"/>
       <w:r>
         <w:rPr>
           <w:lang w:val="es-GT"/>
@@ -14609,7 +14430,7 @@
         </w:rPr>
         <w:t>Media-Alta</w:t>
       </w:r>
-      <w:bookmarkEnd w:id="43"/>
+      <w:bookmarkEnd w:id="42"/>
     </w:p>
     <w:p>
       <w:pPr>
@@ -14663,21 +14484,7 @@
         <w:rPr>
           <w:lang w:val="es-GT"/>
         </w:rPr>
-        <w:t xml:space="preserve">) con catálogos de miles de productos introduce una presión de precio permanente. La rivalidad aumenta si actores regionales como </w:t>
-      </w:r>
-      <w:proofErr w:type="spellStart"/>
-      <w:r>
-        <w:rPr>
-          <w:lang w:val="es-GT"/>
-        </w:rPr>
-        <w:t>ContaPyme</w:t>
-      </w:r>
-      <w:proofErr w:type="spellEnd"/>
-      <w:r>
-        <w:rPr>
-          <w:lang w:val="es-GT"/>
-        </w:rPr>
-        <w:t xml:space="preserve"> o Bitrix24 deciden expandirse al mercado guatemalteco con campañas agresivas.</w:t>
+        <w:t>) con catálogos de miles de productos introduce una presión de precio permanente. La rivalidad aumenta si actores regionales como ContaPyme o Bitrix24 deciden expandirse al mercado guatemalteco con campañas agresivas.</w:t>
       </w:r>
     </w:p>
     <w:p>
@@ -14694,7 +14501,7 @@
           <w:lang w:val="es-GT"/>
         </w:rPr>
       </w:pPr>
-      <w:bookmarkStart w:id="44" w:name="_Toc223906577"/>
+      <w:bookmarkStart w:id="43" w:name="_Toc223906577"/>
       <w:r>
         <w:rPr>
           <w:lang w:val="es-GT"/>
@@ -14709,7 +14516,7 @@
         </w:rPr>
         <w:t>Alta</w:t>
       </w:r>
-      <w:bookmarkEnd w:id="44"/>
+      <w:bookmarkEnd w:id="43"/>
     </w:p>
     <w:p>
       <w:pPr>
@@ -14745,7 +14552,6 @@
         <w:t xml:space="preserve">Sin embargo, la barrera real para QuetzalDev es la diferenciación por soporte local, conocimiento regulatorio guatemalteco </w:t>
       </w:r>
       <w:proofErr w:type="spellStart"/>
-      <w:proofErr w:type="gramStart"/>
       <w:r>
         <w:rPr>
           <w:lang w:val="es-GT"/>
@@ -14753,7 +14559,6 @@
         <w:t>y</w:t>
       </w:r>
       <w:proofErr w:type="spellEnd"/>
-      <w:proofErr w:type="gramEnd"/>
       <w:r>
         <w:rPr>
           <w:lang w:val="es-GT"/>
@@ -14789,7 +14594,7 @@
           <w:lang w:val="es-GT"/>
         </w:rPr>
       </w:pPr>
-      <w:bookmarkStart w:id="45" w:name="_Toc223906578"/>
+      <w:bookmarkStart w:id="44" w:name="_Toc223906578"/>
       <w:r>
         <w:rPr>
           <w:lang w:val="es-GT"/>
@@ -14805,7 +14610,7 @@
         </w:rPr>
         <w:t>Bajo</w:t>
       </w:r>
-      <w:bookmarkEnd w:id="45"/>
+      <w:bookmarkEnd w:id="44"/>
     </w:p>
     <w:p>
       <w:pPr>
@@ -14883,7 +14688,7 @@
           <w:lang w:val="es-GT"/>
         </w:rPr>
       </w:pPr>
-      <w:bookmarkStart w:id="46" w:name="_Toc223906579"/>
+      <w:bookmarkStart w:id="45" w:name="_Toc223906579"/>
       <w:r>
         <w:rPr>
           <w:lang w:val="es-GT"/>
@@ -14898,7 +14703,7 @@
         </w:rPr>
         <w:t>Media</w:t>
       </w:r>
-      <w:bookmarkEnd w:id="46"/>
+      <w:bookmarkEnd w:id="45"/>
     </w:p>
     <w:p>
       <w:pPr>
@@ -14934,7 +14739,7 @@
           <w:lang w:val="es-GT"/>
         </w:rPr>
       </w:pPr>
-      <w:bookmarkStart w:id="47" w:name="_Toc223906580"/>
+      <w:bookmarkStart w:id="46" w:name="_Toc223906580"/>
       <w:r>
         <w:rPr>
           <w:lang w:val="es-GT"/>
@@ -14949,7 +14754,7 @@
         </w:rPr>
         <w:t>Media</w:t>
       </w:r>
-      <w:bookmarkEnd w:id="47"/>
+      <w:bookmarkEnd w:id="46"/>
     </w:p>
     <w:p>
       <w:pPr>
@@ -14978,21 +14783,7 @@
         <w:rPr>
           <w:lang w:val="es-GT"/>
         </w:rPr>
-        <w:t>Excel/</w:t>
-      </w:r>
-      <w:proofErr w:type="spellStart"/>
-      <w:r>
-        <w:rPr>
-          <w:lang w:val="es-GT"/>
-        </w:rPr>
-        <w:t>Sheets</w:t>
-      </w:r>
-      <w:proofErr w:type="spellEnd"/>
-      <w:r>
-        <w:rPr>
-          <w:lang w:val="es-GT"/>
-        </w:rPr>
-        <w:t xml:space="preserve"> para gestión de casos legales,</w:t>
+        <w:t>Excel/Sheets para gestión de casos legales,</w:t>
       </w:r>
     </w:p>
     <w:p>
@@ -15005,19 +14796,11 @@
           <w:lang w:val="es-GT"/>
         </w:rPr>
       </w:pPr>
-      <w:proofErr w:type="spellStart"/>
-      <w:r>
-        <w:rPr>
-          <w:lang w:val="es-GT"/>
-        </w:rPr>
-        <w:t>WhatsApp</w:t>
-      </w:r>
-      <w:proofErr w:type="spellEnd"/>
-      <w:r>
-        <w:rPr>
-          <w:lang w:val="es-GT"/>
-        </w:rPr>
-        <w:t>/correo para denuncias laborales,</w:t>
+      <w:r>
+        <w:rPr>
+          <w:lang w:val="es-GT"/>
+        </w:rPr>
+        <w:t>WhatsApp/correo para denuncias laborales,</w:t>
       </w:r>
     </w:p>
     <w:p>
@@ -15155,7 +14938,7 @@
           <w:lang w:val="es-GT"/>
         </w:rPr>
       </w:pPr>
-      <w:bookmarkStart w:id="48" w:name="_Toc223906581"/>
+      <w:bookmarkStart w:id="47" w:name="_Toc223906581"/>
       <w:r>
         <w:rPr>
           <w:lang w:val="es-GT"/>
@@ -15163,7 +14946,7 @@
         <w:lastRenderedPageBreak/>
         <w:t>Análisis SWOT / FODA</w:t>
       </w:r>
-      <w:bookmarkEnd w:id="48"/>
+      <w:bookmarkEnd w:id="47"/>
     </w:p>
     <w:p>
       <w:pPr>
@@ -15640,21 +15423,7 @@
                 <w:lang w:val="es-GT"/>
               </w:rPr>
               <w:br/>
-              <w:t xml:space="preserve">A5. Cambios regulatorios para </w:t>
-            </w:r>
-            <w:proofErr w:type="spellStart"/>
-            <w:r>
-              <w:rPr>
-                <w:lang w:val="es-GT"/>
-              </w:rPr>
-              <w:t>SafeCase</w:t>
-            </w:r>
-            <w:proofErr w:type="spellEnd"/>
-            <w:r>
-              <w:rPr>
-                <w:lang w:val="es-GT"/>
-              </w:rPr>
-              <w:t>.</w:t>
+              <w:t>A5. Cambios regulatorios para SafeCase.</w:t>
             </w:r>
           </w:p>
         </w:tc>
@@ -15723,7 +15492,7 @@
           <w:lang w:val="es-GT"/>
         </w:rPr>
       </w:pPr>
-      <w:bookmarkStart w:id="49" w:name="_Toc223906582"/>
+      <w:bookmarkStart w:id="48" w:name="_Toc223906582"/>
       <w:r>
         <w:rPr>
           <w:lang w:val="es-GT"/>
@@ -15731,7 +15500,7 @@
         <w:lastRenderedPageBreak/>
         <w:t>Análisis TOWS / CAME</w:t>
       </w:r>
-      <w:bookmarkEnd w:id="49"/>
+      <w:bookmarkEnd w:id="48"/>
     </w:p>
     <w:p>
       <w:pPr>
@@ -15918,21 +15687,7 @@
               <w:rPr>
                 <w:lang w:val="es-GT"/>
               </w:rPr>
-              <w:t xml:space="preserve">F5+F3+O1+O5 → modelo de reventa para </w:t>
-            </w:r>
-            <w:proofErr w:type="spellStart"/>
-            <w:r>
-              <w:rPr>
-                <w:lang w:val="es-GT"/>
-              </w:rPr>
-              <w:t>SafeCase</w:t>
-            </w:r>
-            <w:proofErr w:type="spellEnd"/>
-            <w:r>
-              <w:rPr>
-                <w:lang w:val="es-GT"/>
-              </w:rPr>
-              <w:t>.</w:t>
+              <w:t>F5+F3+O1+O5 → modelo de reventa para SafeCase.</w:t>
             </w:r>
           </w:p>
         </w:tc>
@@ -16008,21 +15763,7 @@
               <w:rPr>
                 <w:lang w:val="es-GT"/>
               </w:rPr>
-              <w:t xml:space="preserve"> como </w:t>
-            </w:r>
-            <w:proofErr w:type="spellStart"/>
-            <w:r>
-              <w:rPr>
-                <w:lang w:val="es-GT"/>
-              </w:rPr>
-              <w:t>app</w:t>
-            </w:r>
-            <w:proofErr w:type="spellEnd"/>
-            <w:r>
-              <w:rPr>
-                <w:lang w:val="es-GT"/>
-              </w:rPr>
-              <w:t xml:space="preserve"> local con soporte en español.</w:t>
+              <w:t xml:space="preserve"> como app local con soporte en español.</w:t>
             </w:r>
           </w:p>
         </w:tc>
@@ -16138,36 +15879,8 @@
                 <w:bCs/>
                 <w:lang w:val="es-GT"/>
               </w:rPr>
-              <w:t xml:space="preserve">FA1 — </w:t>
-            </w:r>
-            <w:proofErr w:type="spellStart"/>
-            <w:r>
-              <w:rPr>
-                <w:b/>
-                <w:bCs/>
-                <w:lang w:val="es-GT"/>
-              </w:rPr>
-              <w:t>Moat</w:t>
-            </w:r>
-            <w:proofErr w:type="spellEnd"/>
-            <w:r>
-              <w:rPr>
-                <w:b/>
-                <w:bCs/>
-                <w:lang w:val="es-GT"/>
-              </w:rPr>
-              <w:t xml:space="preserve"> regulatorio para </w:t>
-            </w:r>
-            <w:proofErr w:type="spellStart"/>
-            <w:r>
-              <w:rPr>
-                <w:b/>
-                <w:bCs/>
-                <w:lang w:val="es-GT"/>
-              </w:rPr>
-              <w:t>SafeCase</w:t>
-            </w:r>
-            <w:proofErr w:type="spellEnd"/>
+              <w:t>FA1 — Moat regulatorio para SafeCase</w:t>
+            </w:r>
           </w:p>
         </w:tc>
         <w:tc>
@@ -16585,21 +16298,7 @@
               <w:rPr>
                 <w:lang w:val="es-GT"/>
               </w:rPr>
-              <w:t xml:space="preserve">D1+A3 → contenido en </w:t>
-            </w:r>
-            <w:proofErr w:type="spellStart"/>
-            <w:r>
-              <w:rPr>
-                <w:lang w:val="es-GT"/>
-              </w:rPr>
-              <w:t>LinkedIn</w:t>
-            </w:r>
-            <w:proofErr w:type="spellEnd"/>
-            <w:r>
-              <w:rPr>
-                <w:lang w:val="es-GT"/>
-              </w:rPr>
-              <w:t>/YouTube para construir confianza.</w:t>
+              <w:t>D1+A3 → contenido en LinkedIn/YouTube para construir confianza.</w:t>
             </w:r>
           </w:p>
         </w:tc>
@@ -16670,7 +16369,7 @@
           <w:lang w:val="es-GT"/>
         </w:rPr>
       </w:pPr>
-      <w:bookmarkStart w:id="50" w:name="_Toc223906583"/>
+      <w:bookmarkStart w:id="49" w:name="_Toc223906583"/>
       <w:r>
         <w:rPr>
           <w:lang w:val="es-GT"/>
@@ -16678,7 +16377,7 @@
         <w:lastRenderedPageBreak/>
         <w:t>Análisis SOAR</w:t>
       </w:r>
-      <w:bookmarkEnd w:id="50"/>
+      <w:bookmarkEnd w:id="49"/>
     </w:p>
     <w:p>
       <w:pPr>
@@ -16806,21 +16505,7 @@
               <w:rPr>
                 <w:lang w:val="es-GT"/>
               </w:rPr>
-              <w:t xml:space="preserve">; tres verticales diferenciados; UX </w:t>
-            </w:r>
-            <w:proofErr w:type="spellStart"/>
-            <w:r>
-              <w:rPr>
-                <w:lang w:val="es-GT"/>
-              </w:rPr>
-              <w:t>premium</w:t>
-            </w:r>
-            <w:proofErr w:type="spellEnd"/>
-            <w:r>
-              <w:rPr>
-                <w:lang w:val="es-GT"/>
-              </w:rPr>
-              <w:t>; precios bajos; sin licencias externas.</w:t>
+              <w:t>; tres verticales diferenciados; UX premium; precios bajos; sin licencias externas.</w:t>
             </w:r>
           </w:p>
         </w:tc>
@@ -16940,21 +16625,7 @@
               <w:rPr>
                 <w:lang w:val="es-GT"/>
               </w:rPr>
-              <w:t xml:space="preserve">Ser referente #1 en software empaquetado en GT; lanzar versión </w:t>
-            </w:r>
-            <w:proofErr w:type="spellStart"/>
-            <w:r>
-              <w:rPr>
-                <w:lang w:val="es-GT"/>
-              </w:rPr>
-              <w:t>SaaS</w:t>
-            </w:r>
-            <w:proofErr w:type="spellEnd"/>
-            <w:r>
-              <w:rPr>
-                <w:lang w:val="es-GT"/>
-              </w:rPr>
-              <w:t xml:space="preserve"> al año 2; expandir </w:t>
+              <w:t xml:space="preserve">Ser referente #1 en software empaquetado en GT; lanzar versión SaaS al año 2; expandir </w:t>
             </w:r>
             <w:proofErr w:type="spellStart"/>
             <w:r>
@@ -17014,21 +16685,7 @@
               <w:rPr>
                 <w:lang w:val="es-GT"/>
               </w:rPr>
-              <w:t>15 ventas en primer mes; NPS ≥70; tiempos de soporte &lt;4h; ingresos Q15</w:t>
-            </w:r>
-            <w:proofErr w:type="gramStart"/>
-            <w:r>
-              <w:rPr>
-                <w:lang w:val="es-GT"/>
-              </w:rPr>
-              <w:t>,000</w:t>
-            </w:r>
-            <w:proofErr w:type="gramEnd"/>
-            <w:r>
-              <w:rPr>
-                <w:lang w:val="es-GT"/>
-              </w:rPr>
-              <w:t>/3 meses; 3 reseñas verificadas por producto.</w:t>
+              <w:t>15 ventas en primer mes; NPS ≥70; tiempos de soporte &lt;4h; ingresos Q15,000/3 meses; 3 reseñas verificadas por producto.</w:t>
             </w:r>
           </w:p>
         </w:tc>
@@ -17090,7 +16747,7 @@
       <w:pPr>
         <w:pStyle w:val="Ttulo1"/>
       </w:pPr>
-      <w:bookmarkStart w:id="51" w:name="_Toc223906584"/>
+      <w:bookmarkStart w:id="50" w:name="_Toc223906584"/>
       <w:r>
         <w:lastRenderedPageBreak/>
         <w:t>A</w:t>
@@ -17101,24 +16758,24 @@
       <w:r>
         <w:t xml:space="preserve"> DEL SITIO</w:t>
       </w:r>
+      <w:bookmarkEnd w:id="50"/>
+    </w:p>
+    <w:p/>
+    <w:p>
+      <w:pPr>
+        <w:pStyle w:val="Ttulo2"/>
+        <w:rPr>
+          <w:lang w:val="es-GT"/>
+        </w:rPr>
+      </w:pPr>
+      <w:bookmarkStart w:id="51" w:name="_Toc223906585"/>
+      <w:r>
+        <w:rPr>
+          <w:lang w:val="es-GT"/>
+        </w:rPr>
+        <w:t>Decisiones Técnicas</w:t>
+      </w:r>
       <w:bookmarkEnd w:id="51"/>
-    </w:p>
-    <w:p/>
-    <w:p>
-      <w:pPr>
-        <w:pStyle w:val="Ttulo2"/>
-        <w:rPr>
-          <w:lang w:val="es-GT"/>
-        </w:rPr>
-      </w:pPr>
-      <w:bookmarkStart w:id="52" w:name="_Toc223906585"/>
-      <w:r>
-        <w:rPr>
-          <w:lang w:val="es-GT"/>
-        </w:rPr>
-        <w:t>Decisiones Técnicas</w:t>
-      </w:r>
-      <w:bookmarkEnd w:id="52"/>
     </w:p>
     <w:tbl>
       <w:tblPr>
@@ -17277,19 +16934,11 @@
                 <w:lang w:val="es-GT"/>
               </w:rPr>
             </w:pPr>
-            <w:proofErr w:type="spellStart"/>
-            <w:r>
-              <w:rPr>
-                <w:lang w:val="es-GT"/>
-              </w:rPr>
-              <w:t>Tipado</w:t>
-            </w:r>
-            <w:proofErr w:type="spellEnd"/>
-            <w:r>
-              <w:rPr>
-                <w:lang w:val="es-GT"/>
-              </w:rPr>
-              <w:t xml:space="preserve"> estático, ecosistema maduro</w:t>
+            <w:r>
+              <w:rPr>
+                <w:lang w:val="es-GT"/>
+              </w:rPr>
+              <w:t>Tipado estático, ecosistema maduro</w:t>
             </w:r>
           </w:p>
         </w:tc>
@@ -17318,16 +16967,8 @@
               <w:rPr>
                 <w:lang w:val="es-GT"/>
               </w:rPr>
-              <w:t xml:space="preserve"> </w:t>
-            </w:r>
-            <w:proofErr w:type="spellStart"/>
-            <w:r>
-              <w:rPr>
-                <w:lang w:val="es-GT"/>
-              </w:rPr>
-              <w:t>Tool</w:t>
-            </w:r>
-            <w:proofErr w:type="spellEnd"/>
+              <w:t xml:space="preserve"> Tool</w:t>
+            </w:r>
           </w:p>
         </w:tc>
         <w:tc>
@@ -17696,14 +17337,14 @@
           <w:lang w:val="es-GT"/>
         </w:rPr>
       </w:pPr>
-      <w:bookmarkStart w:id="53" w:name="_Toc223906586"/>
+      <w:bookmarkStart w:id="52" w:name="_Toc223906586"/>
       <w:r>
         <w:rPr>
           <w:lang w:val="es-GT"/>
         </w:rPr>
         <w:t>Mapa de Rutas de la Aplicación</w:t>
       </w:r>
-      <w:bookmarkEnd w:id="53"/>
+      <w:bookmarkEnd w:id="52"/>
     </w:p>
     <w:p>
       <w:pPr>
@@ -17891,14 +17532,14 @@
         <w:rPr>
           <w:lang w:val="es-GT"/>
         </w:rPr>
-        <w:t>└── /bienvenida/</w:t>
+        <w:t>└── /bienvenida</w:t>
       </w:r>
       <w:proofErr w:type="gramStart"/>
       <w:r>
         <w:rPr>
           <w:lang w:val="es-GT"/>
         </w:rPr>
-        <w:t>:</w:t>
+        <w:t>/:</w:t>
       </w:r>
       <w:proofErr w:type="spellStart"/>
       <w:r>
@@ -17938,14 +17579,14 @@
           <w:lang w:val="es-GT"/>
         </w:rPr>
       </w:pPr>
-      <w:bookmarkStart w:id="54" w:name="_Toc223906587"/>
+      <w:bookmarkStart w:id="53" w:name="_Toc223906587"/>
       <w:r>
         <w:rPr>
           <w:lang w:val="es-GT"/>
         </w:rPr>
         <w:t>Descripción Funcional por Vista</w:t>
       </w:r>
-      <w:bookmarkEnd w:id="54"/>
+      <w:bookmarkEnd w:id="53"/>
     </w:p>
     <w:p>
       <w:pPr>
@@ -17956,23 +17597,13 @@
           <w:lang w:val="es-GT"/>
         </w:rPr>
       </w:pPr>
-      <w:proofErr w:type="spellStart"/>
       <w:r>
         <w:rPr>
           <w:b/>
           <w:bCs/>
           <w:lang w:val="es-GT"/>
         </w:rPr>
-        <w:t>Landing</w:t>
-      </w:r>
-      <w:proofErr w:type="spellEnd"/>
-      <w:r>
-        <w:rPr>
-          <w:b/>
-          <w:bCs/>
-          <w:lang w:val="es-GT"/>
-        </w:rPr>
-        <w:t xml:space="preserve"> Page — /</w:t>
+        <w:t>Landing Page — /</w:t>
       </w:r>
     </w:p>
     <w:p>
@@ -18463,7 +18094,7 @@
           <w:bCs/>
           <w:lang w:val="es-GT"/>
         </w:rPr>
-        <w:t>Bienvenida — /bienvenida/</w:t>
+        <w:t>Bienvenida — /bienvenida</w:t>
       </w:r>
       <w:proofErr w:type="gramStart"/>
       <w:r>
@@ -18472,7 +18103,7 @@
           <w:bCs/>
           <w:lang w:val="es-GT"/>
         </w:rPr>
-        <w:t>:</w:t>
+        <w:t>/:</w:t>
       </w:r>
       <w:proofErr w:type="spellStart"/>
       <w:r>
@@ -18569,7 +18200,7 @@
           <w:lang w:val="es-GT"/>
         </w:rPr>
       </w:pPr>
-      <w:bookmarkStart w:id="55" w:name="_Toc223906588"/>
+      <w:bookmarkStart w:id="54" w:name="_Toc223906588"/>
       <w:r>
         <w:rPr>
           <w:lang w:val="es-GT"/>
@@ -18604,7 +18235,7 @@
         </w:rPr>
         <w:t>)</w:t>
       </w:r>
-      <w:bookmarkEnd w:id="55"/>
+      <w:bookmarkEnd w:id="54"/>
     </w:p>
     <w:p>
       <w:pPr>
@@ -18841,23 +18472,15 @@
         <w:rPr>
           <w:lang w:val="es-GT"/>
         </w:rPr>
-        <w:t xml:space="preserve">└── </w:t>
-      </w:r>
-      <w:proofErr w:type="spellStart"/>
-      <w:r>
-        <w:rPr>
-          <w:lang w:val="es-GT"/>
-        </w:rPr>
-        <w:t>Footer</w:t>
-      </w:r>
-      <w:proofErr w:type="spellEnd"/>
+        <w:t>└── Footer</w:t>
+      </w:r>
     </w:p>
     <w:p/>
     <w:p>
       <w:pPr>
         <w:pStyle w:val="Ttulo2"/>
       </w:pPr>
-      <w:bookmarkStart w:id="56" w:name="_Toc223906589"/>
+      <w:bookmarkStart w:id="55" w:name="_Toc223906589"/>
       <w:r>
         <w:lastRenderedPageBreak/>
         <w:t>Estructura del si</w:t>
@@ -18865,54 +18488,54 @@
       <w:r>
         <w:t>tio (secciones y navegación)</w:t>
       </w:r>
+      <w:bookmarkEnd w:id="55"/>
+    </w:p>
+    <w:p>
+      <w:pPr>
+        <w:ind w:firstLine="708"/>
+      </w:pPr>
+      <w:r>
+        <w:t xml:space="preserve">La arquitectura del sitio se implementa bajo una estructura jerárquica clara con </w:t>
+      </w:r>
+      <w:proofErr w:type="spellStart"/>
+      <w:r>
+        <w:t>layout</w:t>
+      </w:r>
+      <w:proofErr w:type="spellEnd"/>
+      <w:r>
+        <w:t xml:space="preserve"> persistente (</w:t>
+      </w:r>
+      <w:proofErr w:type="spellStart"/>
+      <w:r>
+        <w:t>navbar</w:t>
+      </w:r>
+      <w:proofErr w:type="spellEnd"/>
+      <w:r>
+        <w:t xml:space="preserve"> + contenido + </w:t>
+      </w:r>
+      <w:proofErr w:type="spellStart"/>
+      <w:r>
+        <w:t>footer</w:t>
+      </w:r>
+      <w:proofErr w:type="spellEnd"/>
+      <w:r>
+        <w:t>), permitiendo navegación consistente en todo el recorrido de compra.</w:t>
+      </w:r>
+    </w:p>
+    <w:p>
+      <w:pPr>
+        <w:ind w:firstLine="708"/>
+      </w:pPr>
+    </w:p>
+    <w:p>
+      <w:pPr>
+        <w:pStyle w:val="Ttulo3"/>
+      </w:pPr>
+      <w:bookmarkStart w:id="56" w:name="_Toc223906590"/>
+      <w:r>
+        <w:t>Mapa de páginas y rutas principales:</w:t>
+      </w:r>
       <w:bookmarkEnd w:id="56"/>
-    </w:p>
-    <w:p>
-      <w:pPr>
-        <w:ind w:firstLine="708"/>
-      </w:pPr>
-      <w:r>
-        <w:t xml:space="preserve">La arquitectura del sitio se implementa bajo una estructura jerárquica clara con </w:t>
-      </w:r>
-      <w:proofErr w:type="spellStart"/>
-      <w:r>
-        <w:t>layout</w:t>
-      </w:r>
-      <w:proofErr w:type="spellEnd"/>
-      <w:r>
-        <w:t xml:space="preserve"> persistente (</w:t>
-      </w:r>
-      <w:proofErr w:type="spellStart"/>
-      <w:r>
-        <w:t>navbar</w:t>
-      </w:r>
-      <w:proofErr w:type="spellEnd"/>
-      <w:r>
-        <w:t xml:space="preserve"> + contenido + </w:t>
-      </w:r>
-      <w:proofErr w:type="spellStart"/>
-      <w:r>
-        <w:t>footer</w:t>
-      </w:r>
-      <w:proofErr w:type="spellEnd"/>
-      <w:r>
-        <w:t>), permitiendo navegación consistente en todo el recorrido de compra.</w:t>
-      </w:r>
-    </w:p>
-    <w:p>
-      <w:pPr>
-        <w:ind w:firstLine="708"/>
-      </w:pPr>
-    </w:p>
-    <w:p>
-      <w:pPr>
-        <w:pStyle w:val="Ttulo3"/>
-      </w:pPr>
-      <w:bookmarkStart w:id="57" w:name="_Toc223906590"/>
-      <w:r>
-        <w:t>Mapa de páginas y rutas principales:</w:t>
-      </w:r>
-      <w:bookmarkEnd w:id="57"/>
     </w:p>
     <w:p>
       <w:pPr>
@@ -18964,53 +18587,6 @@
                 <pic:pic xmlns:pic="http://schemas.openxmlformats.org/drawingml/2006/picture">
                   <pic:nvPicPr>
                     <pic:cNvPr id="2" name="landing1.png"/>
-                    <pic:cNvPicPr/>
-                  </pic:nvPicPr>
-                  <pic:blipFill>
-                    <a:blip r:embed="rId11" cstate="print">
-                      <a:extLst>
-                        <a:ext uri="{28A0092B-C50C-407E-A947-70E740481C1C}">
-                          <a14:useLocalDpi xmlns:a14="http://schemas.microsoft.com/office/drawing/2010/main" val="0"/>
-                        </a:ext>
-                      </a:extLst>
-                    </a:blip>
-                    <a:stretch>
-                      <a:fillRect/>
-                    </a:stretch>
-                  </pic:blipFill>
-                  <pic:spPr>
-                    <a:xfrm>
-                      <a:off x="0" y="0"/>
-                      <a:ext cx="4303115" cy="2286000"/>
-                    </a:xfrm>
-                    <a:prstGeom prst="rect">
-                      <a:avLst/>
-                    </a:prstGeom>
-                  </pic:spPr>
-                </pic:pic>
-              </a:graphicData>
-            </a:graphic>
-          </wp:inline>
-        </w:drawing>
-      </w:r>
-      <w:r>
-        <w:rPr>
-          <w:noProof/>
-          <w:lang w:eastAsia="es-ES"/>
-        </w:rPr>
-        <w:drawing>
-          <wp:inline distT="0" distB="0" distL="0" distR="0" wp14:anchorId="6F7BD36C" wp14:editId="7C6ABB76">
-            <wp:extent cx="4303115" cy="2286000"/>
-            <wp:effectExtent l="0" t="0" r="2540" b="0"/>
-            <wp:docPr id="3" name="Imagen 3"/>
-            <wp:cNvGraphicFramePr>
-              <a:graphicFrameLocks xmlns:a="http://schemas.openxmlformats.org/drawingml/2006/main" noChangeAspect="1"/>
-            </wp:cNvGraphicFramePr>
-            <a:graphic xmlns:a="http://schemas.openxmlformats.org/drawingml/2006/main">
-              <a:graphicData uri="http://schemas.openxmlformats.org/drawingml/2006/picture">
-                <pic:pic xmlns:pic="http://schemas.openxmlformats.org/drawingml/2006/picture">
-                  <pic:nvPicPr>
-                    <pic:cNvPr id="3" name="landing2.png"/>
                     <pic:cNvPicPr/>
                   </pic:nvPicPr>
                   <pic:blipFill>
@@ -19045,12 +18621,11 @@
           <w:noProof/>
           <w:lang w:eastAsia="es-ES"/>
         </w:rPr>
-        <w:lastRenderedPageBreak/>
         <w:drawing>
-          <wp:inline distT="0" distB="0" distL="0" distR="0" wp14:anchorId="25A686FE" wp14:editId="0095921F">
+          <wp:inline distT="0" distB="0" distL="0" distR="0" wp14:anchorId="6F7BD36C" wp14:editId="7C6ABB76">
             <wp:extent cx="4303115" cy="2286000"/>
             <wp:effectExtent l="0" t="0" r="2540" b="0"/>
-            <wp:docPr id="4" name="Imagen 4"/>
+            <wp:docPr id="3" name="Imagen 3"/>
             <wp:cNvGraphicFramePr>
               <a:graphicFrameLocks xmlns:a="http://schemas.openxmlformats.org/drawingml/2006/main" noChangeAspect="1"/>
             </wp:cNvGraphicFramePr>
@@ -19058,7 +18633,7 @@
               <a:graphicData uri="http://schemas.openxmlformats.org/drawingml/2006/picture">
                 <pic:pic xmlns:pic="http://schemas.openxmlformats.org/drawingml/2006/picture">
                   <pic:nvPicPr>
-                    <pic:cNvPr id="4" name="landing3.png"/>
+                    <pic:cNvPr id="3" name="landing2.png"/>
                     <pic:cNvPicPr/>
                   </pic:nvPicPr>
                   <pic:blipFill>
@@ -19093,11 +18668,12 @@
           <w:noProof/>
           <w:lang w:eastAsia="es-ES"/>
         </w:rPr>
+        <w:lastRenderedPageBreak/>
         <w:drawing>
-          <wp:inline distT="0" distB="0" distL="0" distR="0" wp14:anchorId="05136C8F" wp14:editId="55384D64">
+          <wp:inline distT="0" distB="0" distL="0" distR="0" wp14:anchorId="25A686FE" wp14:editId="0095921F">
             <wp:extent cx="4303115" cy="2286000"/>
             <wp:effectExtent l="0" t="0" r="2540" b="0"/>
-            <wp:docPr id="5" name="Imagen 5"/>
+            <wp:docPr id="4" name="Imagen 4"/>
             <wp:cNvGraphicFramePr>
               <a:graphicFrameLocks xmlns:a="http://schemas.openxmlformats.org/drawingml/2006/main" noChangeAspect="1"/>
             </wp:cNvGraphicFramePr>
@@ -19105,7 +18681,7 @@
               <a:graphicData uri="http://schemas.openxmlformats.org/drawingml/2006/picture">
                 <pic:pic xmlns:pic="http://schemas.openxmlformats.org/drawingml/2006/picture">
                   <pic:nvPicPr>
-                    <pic:cNvPr id="5" name="landing4.png"/>
+                    <pic:cNvPr id="4" name="landing3.png"/>
                     <pic:cNvPicPr/>
                   </pic:nvPicPr>
                   <pic:blipFill>
@@ -19135,41 +18711,16 @@
           </wp:inline>
         </w:drawing>
       </w:r>
-    </w:p>
-    <w:p>
-      <w:pPr>
-        <w:pStyle w:val="Prrafodelista"/>
-        <w:numPr>
-          <w:ilvl w:val="0"/>
-          <w:numId w:val="13"/>
-        </w:numPr>
-      </w:pPr>
-      <w:r>
-        <w:t>/catalogo Catálogo (</w:t>
-      </w:r>
-      <w:proofErr w:type="spellStart"/>
-      <w:r>
-        <w:t>CatalogPage</w:t>
-      </w:r>
-      <w:proofErr w:type="spellEnd"/>
-      <w:r>
-        <w:t>): visualización de los 3 productos con ficha comercial completa y acción de agregar al carrito.</w:t>
-      </w:r>
-    </w:p>
-    <w:p>
-      <w:pPr>
-        <w:jc w:val="center"/>
-      </w:pPr>
       <w:r>
         <w:rPr>
           <w:noProof/>
           <w:lang w:eastAsia="es-ES"/>
         </w:rPr>
         <w:drawing>
-          <wp:inline distT="0" distB="0" distL="0" distR="0" wp14:anchorId="6BFDD771" wp14:editId="043EEA0A">
+          <wp:inline distT="0" distB="0" distL="0" distR="0" wp14:anchorId="05136C8F" wp14:editId="55384D64">
             <wp:extent cx="4303115" cy="2286000"/>
             <wp:effectExtent l="0" t="0" r="2540" b="0"/>
-            <wp:docPr id="6" name="Imagen 6"/>
+            <wp:docPr id="5" name="Imagen 5"/>
             <wp:cNvGraphicFramePr>
               <a:graphicFrameLocks xmlns:a="http://schemas.openxmlformats.org/drawingml/2006/main" noChangeAspect="1"/>
             </wp:cNvGraphicFramePr>
@@ -19177,7 +18728,7 @@
               <a:graphicData uri="http://schemas.openxmlformats.org/drawingml/2006/picture">
                 <pic:pic xmlns:pic="http://schemas.openxmlformats.org/drawingml/2006/picture">
                   <pic:nvPicPr>
-                    <pic:cNvPr id="6" name="catalogo.png"/>
+                    <pic:cNvPr id="5" name="landing4.png"/>
                     <pic:cNvPicPr/>
                   </pic:nvPicPr>
                   <pic:blipFill>
@@ -19217,23 +18768,15 @@
         </w:numPr>
       </w:pPr>
       <w:r>
-        <w:t>/carrito </w:t>
+        <w:t>/catalogo Catálogo (</w:t>
       </w:r>
       <w:proofErr w:type="spellStart"/>
       <w:r>
-        <w:t>Carrito</w:t>
+        <w:t>CatalogPage</w:t>
       </w:r>
       <w:proofErr w:type="spellEnd"/>
       <w:r>
-        <w:t xml:space="preserve"> (</w:t>
-      </w:r>
-      <w:proofErr w:type="spellStart"/>
-      <w:r>
-        <w:t>CartPage</w:t>
-      </w:r>
-      <w:proofErr w:type="spellEnd"/>
-      <w:r>
-        <w:t>): gestión de productos seleccionados, cantidades, eliminación y resumen total.</w:t>
+        <w:t>): visualización de los 3 productos con ficha comercial completa y acción de agregar al carrito.</w:t>
       </w:r>
     </w:p>
     <w:p>
@@ -19245,12 +18788,11 @@
           <w:noProof/>
           <w:lang w:eastAsia="es-ES"/>
         </w:rPr>
-        <w:lastRenderedPageBreak/>
         <w:drawing>
-          <wp:inline distT="0" distB="0" distL="0" distR="0" wp14:anchorId="7CA528F7" wp14:editId="672199CB">
+          <wp:inline distT="0" distB="0" distL="0" distR="0" wp14:anchorId="6BFDD771" wp14:editId="043EEA0A">
             <wp:extent cx="4303115" cy="2286000"/>
             <wp:effectExtent l="0" t="0" r="2540" b="0"/>
-            <wp:docPr id="7" name="Imagen 7"/>
+            <wp:docPr id="6" name="Imagen 6"/>
             <wp:cNvGraphicFramePr>
               <a:graphicFrameLocks xmlns:a="http://schemas.openxmlformats.org/drawingml/2006/main" noChangeAspect="1"/>
             </wp:cNvGraphicFramePr>
@@ -19258,7 +18800,7 @@
               <a:graphicData uri="http://schemas.openxmlformats.org/drawingml/2006/picture">
                 <pic:pic xmlns:pic="http://schemas.openxmlformats.org/drawingml/2006/picture">
                   <pic:nvPicPr>
-                    <pic:cNvPr id="7" name="carrito.png"/>
+                    <pic:cNvPr id="6" name="catalogo.png"/>
                     <pic:cNvPicPr/>
                   </pic:nvPicPr>
                   <pic:blipFill>
@@ -19298,31 +18840,23 @@
         </w:numPr>
       </w:pPr>
       <w:r>
-        <w:t>/</w:t>
+        <w:t>/carrito </w:t>
       </w:r>
       <w:proofErr w:type="spellStart"/>
       <w:r>
-        <w:t>checkout</w:t>
+        <w:t>Carrito</w:t>
       </w:r>
       <w:proofErr w:type="spellEnd"/>
       <w:r>
-        <w:t> </w:t>
+        <w:t xml:space="preserve"> (</w:t>
       </w:r>
       <w:proofErr w:type="spellStart"/>
       <w:r>
-        <w:t>Checkout</w:t>
+        <w:t>CartPage</w:t>
       </w:r>
       <w:proofErr w:type="spellEnd"/>
       <w:r>
-        <w:t xml:space="preserve"> (</w:t>
-      </w:r>
-      <w:proofErr w:type="spellStart"/>
-      <w:r>
-        <w:t>CheckoutPage</w:t>
-      </w:r>
-      <w:proofErr w:type="spellEnd"/>
-      <w:r>
-        <w:t>): captura de datos de compra y validación previa a generar recibo.</w:t>
+        <w:t>): gestión de productos seleccionados, cantidades, eliminación y resumen total.</w:t>
       </w:r>
     </w:p>
     <w:p>
@@ -19334,11 +18868,12 @@
           <w:noProof/>
           <w:lang w:eastAsia="es-ES"/>
         </w:rPr>
+        <w:lastRenderedPageBreak/>
         <w:drawing>
-          <wp:inline distT="0" distB="0" distL="0" distR="0" wp14:anchorId="0F15E993" wp14:editId="56AE644C">
+          <wp:inline distT="0" distB="0" distL="0" distR="0" wp14:anchorId="7CA528F7" wp14:editId="672199CB">
             <wp:extent cx="4303115" cy="2286000"/>
             <wp:effectExtent l="0" t="0" r="2540" b="0"/>
-            <wp:docPr id="8" name="Imagen 8"/>
+            <wp:docPr id="7" name="Imagen 7"/>
             <wp:cNvGraphicFramePr>
               <a:graphicFrameLocks xmlns:a="http://schemas.openxmlformats.org/drawingml/2006/main" noChangeAspect="1"/>
             </wp:cNvGraphicFramePr>
@@ -19346,7 +18881,7 @@
               <a:graphicData uri="http://schemas.openxmlformats.org/drawingml/2006/picture">
                 <pic:pic xmlns:pic="http://schemas.openxmlformats.org/drawingml/2006/picture">
                   <pic:nvPicPr>
-                    <pic:cNvPr id="8" name="checkout.png"/>
+                    <pic:cNvPr id="7" name="carrito.png"/>
                     <pic:cNvPicPr/>
                   </pic:nvPicPr>
                   <pic:blipFill>
@@ -19386,23 +18921,31 @@
         </w:numPr>
       </w:pPr>
       <w:r>
-        <w:t>/recibo </w:t>
+        <w:t>/</w:t>
       </w:r>
       <w:proofErr w:type="spellStart"/>
       <w:r>
-        <w:t>Recibo</w:t>
+        <w:t>checkout</w:t>
       </w:r>
       <w:proofErr w:type="spellEnd"/>
       <w:r>
+        <w:t> </w:t>
+      </w:r>
+      <w:proofErr w:type="spellStart"/>
+      <w:r>
+        <w:t>Checkout</w:t>
+      </w:r>
+      <w:proofErr w:type="spellEnd"/>
+      <w:r>
         <w:t xml:space="preserve"> (</w:t>
       </w:r>
       <w:proofErr w:type="spellStart"/>
       <w:r>
-        <w:t>ReceiptPage</w:t>
+        <w:t>CheckoutPage</w:t>
       </w:r>
       <w:proofErr w:type="spellEnd"/>
       <w:r>
-        <w:t>): confirmación de compra simulada, detalle de orden y accesos a productos adquiridos.</w:t>
+        <w:t>): captura de datos de compra y validación previa a generar recibo.</w:t>
       </w:r>
     </w:p>
     <w:p>
@@ -19415,10 +18958,10 @@
           <w:lang w:eastAsia="es-ES"/>
         </w:rPr>
         <w:drawing>
-          <wp:inline distT="0" distB="0" distL="0" distR="0" wp14:anchorId="7B4AA4C7" wp14:editId="79A05914">
+          <wp:inline distT="0" distB="0" distL="0" distR="0" wp14:anchorId="0F15E993" wp14:editId="56AE644C">
             <wp:extent cx="4303115" cy="2286000"/>
             <wp:effectExtent l="0" t="0" r="2540" b="0"/>
-            <wp:docPr id="13" name="Imagen 13"/>
+            <wp:docPr id="8" name="Imagen 8"/>
             <wp:cNvGraphicFramePr>
               <a:graphicFrameLocks xmlns:a="http://schemas.openxmlformats.org/drawingml/2006/main" noChangeAspect="1"/>
             </wp:cNvGraphicFramePr>
@@ -19426,7 +18969,7 @@
               <a:graphicData uri="http://schemas.openxmlformats.org/drawingml/2006/picture">
                 <pic:pic xmlns:pic="http://schemas.openxmlformats.org/drawingml/2006/picture">
                   <pic:nvPicPr>
-                    <pic:cNvPr id="13" name="confirmacion.png"/>
+                    <pic:cNvPr id="8" name="checkout.png"/>
                     <pic:cNvPicPr/>
                   </pic:nvPicPr>
                   <pic:blipFill>
@@ -19459,6 +19002,34 @@
     </w:p>
     <w:p>
       <w:pPr>
+        <w:pStyle w:val="Prrafodelista"/>
+        <w:numPr>
+          <w:ilvl w:val="0"/>
+          <w:numId w:val="13"/>
+        </w:numPr>
+      </w:pPr>
+      <w:r>
+        <w:t>/recibo </w:t>
+      </w:r>
+      <w:proofErr w:type="spellStart"/>
+      <w:r>
+        <w:t>Recibo</w:t>
+      </w:r>
+      <w:proofErr w:type="spellEnd"/>
+      <w:r>
+        <w:t xml:space="preserve"> (</w:t>
+      </w:r>
+      <w:proofErr w:type="spellStart"/>
+      <w:r>
+        <w:t>ReceiptPage</w:t>
+      </w:r>
+      <w:proofErr w:type="spellEnd"/>
+      <w:r>
+        <w:t>): confirmación de compra simulada, detalle de orden y accesos a productos adquiridos.</w:t>
+      </w:r>
+    </w:p>
+    <w:p>
+      <w:pPr>
         <w:jc w:val="center"/>
       </w:pPr>
       <w:r>
@@ -19466,12 +19037,11 @@
           <w:noProof/>
           <w:lang w:eastAsia="es-ES"/>
         </w:rPr>
-        <w:lastRenderedPageBreak/>
         <w:drawing>
-          <wp:inline distT="0" distB="0" distL="0" distR="0" wp14:anchorId="17865EF6" wp14:editId="18F5BF3D">
+          <wp:inline distT="0" distB="0" distL="0" distR="0" wp14:anchorId="7B4AA4C7" wp14:editId="79A05914">
             <wp:extent cx="4303115" cy="2286000"/>
             <wp:effectExtent l="0" t="0" r="2540" b="0"/>
-            <wp:docPr id="9" name="Imagen 9"/>
+            <wp:docPr id="13" name="Imagen 13"/>
             <wp:cNvGraphicFramePr>
               <a:graphicFrameLocks xmlns:a="http://schemas.openxmlformats.org/drawingml/2006/main" noChangeAspect="1"/>
             </wp:cNvGraphicFramePr>
@@ -19479,7 +19049,7 @@
               <a:graphicData uri="http://schemas.openxmlformats.org/drawingml/2006/picture">
                 <pic:pic xmlns:pic="http://schemas.openxmlformats.org/drawingml/2006/picture">
                   <pic:nvPicPr>
-                    <pic:cNvPr id="9" name="recibo.png"/>
+                    <pic:cNvPr id="13" name="confirmacion.png"/>
                     <pic:cNvPicPr/>
                   </pic:nvPicPr>
                   <pic:blipFill>
@@ -19512,40 +19082,6 @@
     </w:p>
     <w:p>
       <w:pPr>
-        <w:pStyle w:val="Prrafodelista"/>
-        <w:numPr>
-          <w:ilvl w:val="0"/>
-          <w:numId w:val="13"/>
-        </w:numPr>
-      </w:pPr>
-      <w:r>
-        <w:t>/bienvenida/</w:t>
-      </w:r>
-      <w:proofErr w:type="gramStart"/>
-      <w:r>
-        <w:t>:</w:t>
-      </w:r>
-      <w:proofErr w:type="spellStart"/>
-      <w:r>
-        <w:t>productId</w:t>
-      </w:r>
-      <w:proofErr w:type="spellEnd"/>
-      <w:proofErr w:type="gramEnd"/>
-      <w:r>
-        <w:t> Bienvenida de producto (</w:t>
-      </w:r>
-      <w:proofErr w:type="spellStart"/>
-      <w:r>
-        <w:t>ProductWelcomePage</w:t>
-      </w:r>
-      <w:proofErr w:type="spellEnd"/>
-      <w:r>
-        <w:t>): pantalla de acceso simulado al producto comprado.</w:t>
-      </w:r>
-    </w:p>
-    <w:p>
-      <w:pPr>
-        <w:pStyle w:val="Prrafodelista"/>
         <w:jc w:val="center"/>
       </w:pPr>
       <w:r>
@@ -19553,11 +19089,12 @@
           <w:noProof/>
           <w:lang w:eastAsia="es-ES"/>
         </w:rPr>
+        <w:lastRenderedPageBreak/>
         <w:drawing>
-          <wp:inline distT="0" distB="0" distL="0" distR="0" wp14:anchorId="26B63FA8" wp14:editId="3A6BC660">
-            <wp:extent cx="3442492" cy="1828800"/>
-            <wp:effectExtent l="0" t="0" r="5715" b="0"/>
-            <wp:docPr id="10" name="Imagen 10"/>
+          <wp:inline distT="0" distB="0" distL="0" distR="0" wp14:anchorId="17865EF6" wp14:editId="18F5BF3D">
+            <wp:extent cx="4303115" cy="2286000"/>
+            <wp:effectExtent l="0" t="0" r="2540" b="0"/>
+            <wp:docPr id="9" name="Imagen 9"/>
             <wp:cNvGraphicFramePr>
               <a:graphicFrameLocks xmlns:a="http://schemas.openxmlformats.org/drawingml/2006/main" noChangeAspect="1"/>
             </wp:cNvGraphicFramePr>
@@ -19565,7 +19102,7 @@
               <a:graphicData uri="http://schemas.openxmlformats.org/drawingml/2006/picture">
                 <pic:pic xmlns:pic="http://schemas.openxmlformats.org/drawingml/2006/picture">
                   <pic:nvPicPr>
-                    <pic:cNvPr id="10" name="bienvenidaHomehub.png"/>
+                    <pic:cNvPr id="9" name="recibo.png"/>
                     <pic:cNvPicPr/>
                   </pic:nvPicPr>
                   <pic:blipFill>
@@ -19583,7 +19120,7 @@
                   <pic:spPr>
                     <a:xfrm>
                       <a:off x="0" y="0"/>
-                      <a:ext cx="3442492" cy="1828800"/>
+                      <a:ext cx="4303115" cy="2286000"/>
                     </a:xfrm>
                     <a:prstGeom prst="rect">
                       <a:avLst/>
@@ -19595,16 +19132,55 @@
           </wp:inline>
         </w:drawing>
       </w:r>
+    </w:p>
+    <w:p>
+      <w:pPr>
+        <w:pStyle w:val="Prrafodelista"/>
+        <w:numPr>
+          <w:ilvl w:val="0"/>
+          <w:numId w:val="13"/>
+        </w:numPr>
+      </w:pPr>
+      <w:r>
+        <w:t>/bienvenida</w:t>
+      </w:r>
+      <w:proofErr w:type="gramStart"/>
+      <w:r>
+        <w:t>/:</w:t>
+      </w:r>
+      <w:proofErr w:type="spellStart"/>
+      <w:r>
+        <w:t>productId</w:t>
+      </w:r>
+      <w:proofErr w:type="spellEnd"/>
+      <w:proofErr w:type="gramEnd"/>
+      <w:r>
+        <w:t> Bienvenida de producto (</w:t>
+      </w:r>
+      <w:proofErr w:type="spellStart"/>
+      <w:r>
+        <w:t>ProductWelcomePage</w:t>
+      </w:r>
+      <w:proofErr w:type="spellEnd"/>
+      <w:r>
+        <w:t>): pantalla de acceso simulado al producto comprado.</w:t>
+      </w:r>
+    </w:p>
+    <w:p>
+      <w:pPr>
+        <w:pStyle w:val="Prrafodelista"/>
+        <w:jc w:val="center"/>
+      </w:pPr>
       <w:r>
         <w:rPr>
           <w:noProof/>
           <w:lang w:eastAsia="es-ES"/>
         </w:rPr>
         <w:drawing>
-          <wp:inline distT="0" distB="0" distL="0" distR="0" wp14:anchorId="0F3DA488" wp14:editId="325000B6">
+          <wp:inline distT="0" distB="0" distL="0" distR="0" wp14:anchorId="26B63FA8" wp14:editId="3A6BC660">
             <wp:extent cx="3442492" cy="1828800"/>
             <wp:effectExtent l="0" t="0" r="5715" b="0"/>
-            <wp:docPr id="11" name="Imagen 11"/>
+            <wp:docPr id="10" name="Imagen 10"/>
             <wp:cNvGraphicFramePr>
               <a:graphicFrameLocks xmlns:a="http://schemas.openxmlformats.org/drawingml/2006/main" noChangeAspect="1"/>
             </wp:cNvGraphicFramePr>
@@ -19612,7 +19188,7 @@
               <a:graphicData uri="http://schemas.openxmlformats.org/drawingml/2006/picture">
                 <pic:pic xmlns:pic="http://schemas.openxmlformats.org/drawingml/2006/picture">
                   <pic:nvPicPr>
-                    <pic:cNvPr id="11" name="bienvenidaLegalflow.png"/>
+                    <pic:cNvPr id="10" name="bienvenidaHomehub.png"/>
                     <pic:cNvPicPr/>
                   </pic:nvPicPr>
                   <pic:blipFill>
@@ -19648,10 +19224,10 @@
           <w:lang w:eastAsia="es-ES"/>
         </w:rPr>
         <w:drawing>
-          <wp:inline distT="0" distB="0" distL="0" distR="0" wp14:anchorId="36AA207F" wp14:editId="7C333BF6">
+          <wp:inline distT="0" distB="0" distL="0" distR="0" wp14:anchorId="0F3DA488" wp14:editId="325000B6">
             <wp:extent cx="3442492" cy="1828800"/>
             <wp:effectExtent l="0" t="0" r="5715" b="0"/>
-            <wp:docPr id="12" name="Imagen 12"/>
+            <wp:docPr id="11" name="Imagen 11"/>
             <wp:cNvGraphicFramePr>
               <a:graphicFrameLocks xmlns:a="http://schemas.openxmlformats.org/drawingml/2006/main" noChangeAspect="1"/>
             </wp:cNvGraphicFramePr>
@@ -19659,7 +19235,7 @@
               <a:graphicData uri="http://schemas.openxmlformats.org/drawingml/2006/picture">
                 <pic:pic xmlns:pic="http://schemas.openxmlformats.org/drawingml/2006/picture">
                   <pic:nvPicPr>
-                    <pic:cNvPr id="12" name="bienvenidaSafecase.png"/>
+                    <pic:cNvPr id="11" name="bienvenidaLegalflow.png"/>
                     <pic:cNvPicPr/>
                   </pic:nvPicPr>
                   <pic:blipFill>
@@ -19689,12 +19265,59 @@
           </wp:inline>
         </w:drawing>
       </w:r>
+      <w:r>
+        <w:rPr>
+          <w:noProof/>
+          <w:lang w:eastAsia="es-ES"/>
+        </w:rPr>
+        <w:drawing>
+          <wp:inline distT="0" distB="0" distL="0" distR="0" wp14:anchorId="36AA207F" wp14:editId="7C333BF6">
+            <wp:extent cx="3442492" cy="1828800"/>
+            <wp:effectExtent l="0" t="0" r="5715" b="0"/>
+            <wp:docPr id="12" name="Imagen 12"/>
+            <wp:cNvGraphicFramePr>
+              <a:graphicFrameLocks xmlns:a="http://schemas.openxmlformats.org/drawingml/2006/main" noChangeAspect="1"/>
+            </wp:cNvGraphicFramePr>
+            <a:graphic xmlns:a="http://schemas.openxmlformats.org/drawingml/2006/main">
+              <a:graphicData uri="http://schemas.openxmlformats.org/drawingml/2006/picture">
+                <pic:pic xmlns:pic="http://schemas.openxmlformats.org/drawingml/2006/picture">
+                  <pic:nvPicPr>
+                    <pic:cNvPr id="12" name="bienvenidaSafecase.png"/>
+                    <pic:cNvPicPr/>
+                  </pic:nvPicPr>
+                  <pic:blipFill>
+                    <a:blip r:embed="rId23" cstate="print">
+                      <a:extLst>
+                        <a:ext uri="{28A0092B-C50C-407E-A947-70E740481C1C}">
+                          <a14:useLocalDpi xmlns:a14="http://schemas.microsoft.com/office/drawing/2010/main" val="0"/>
+                        </a:ext>
+                      </a:extLst>
+                    </a:blip>
+                    <a:stretch>
+                      <a:fillRect/>
+                    </a:stretch>
+                  </pic:blipFill>
+                  <pic:spPr>
+                    <a:xfrm>
+                      <a:off x="0" y="0"/>
+                      <a:ext cx="3442492" cy="1828800"/>
+                    </a:xfrm>
+                    <a:prstGeom prst="rect">
+                      <a:avLst/>
+                    </a:prstGeom>
+                  </pic:spPr>
+                </pic:pic>
+              </a:graphicData>
+            </a:graphic>
+          </wp:inline>
+        </w:drawing>
+      </w:r>
     </w:p>
     <w:p>
       <w:pPr>
         <w:pStyle w:val="Ttulo2"/>
       </w:pPr>
-      <w:bookmarkStart w:id="58" w:name="_Toc223906591"/>
+      <w:bookmarkStart w:id="57" w:name="_Toc223906591"/>
       <w:r>
         <w:lastRenderedPageBreak/>
         <w:t>Flujo de usuario (catálogo → car</w:t>
@@ -19702,7 +19325,7 @@
       <w:r>
         <w:t>rito → simulación de compra)</w:t>
       </w:r>
-      <w:bookmarkEnd w:id="58"/>
+      <w:bookmarkEnd w:id="57"/>
     </w:p>
     <w:p>
       <w:pPr>
@@ -19731,7 +19354,7 @@
                     </pic:cNvPicPr>
                   </pic:nvPicPr>
                   <pic:blipFill>
-                    <a:blip r:embed="rId23" cstate="print">
+                    <a:blip r:embed="rId24" cstate="print">
                       <a:extLst>
                         <a:ext uri="{28A0092B-C50C-407E-A947-70E740481C1C}">
                           <a14:useLocalDpi xmlns:a14="http://schemas.microsoft.com/office/drawing/2010/main" val="0"/>
@@ -19767,12 +19390,12 @@
       <w:pPr>
         <w:pStyle w:val="Ttulo3"/>
       </w:pPr>
-      <w:bookmarkStart w:id="59" w:name="_Toc223906592"/>
+      <w:bookmarkStart w:id="58" w:name="_Toc223906592"/>
       <w:r>
         <w:lastRenderedPageBreak/>
         <w:t>Flujo operativo definido:</w:t>
       </w:r>
-      <w:bookmarkEnd w:id="59"/>
+      <w:bookmarkEnd w:id="58"/>
     </w:p>
     <w:p>
       <w:pPr>
@@ -19929,11 +19552,11 @@
         <w:t xml:space="preserve"> simulada</w:t>
       </w:r>
       <w:r>
-        <w:t>: accede a /bienvenida/</w:t>
+        <w:t>: accede a /bienvenida</w:t>
       </w:r>
       <w:proofErr w:type="gramStart"/>
       <w:r>
-        <w:t>:</w:t>
+        <w:t>/:</w:t>
       </w:r>
       <w:proofErr w:type="spellStart"/>
       <w:r>
@@ -19950,11 +19573,11 @@
       <w:pPr>
         <w:pStyle w:val="Ttulo3"/>
       </w:pPr>
-      <w:bookmarkStart w:id="60" w:name="_Toc223906593"/>
+      <w:bookmarkStart w:id="59" w:name="_Toc223906593"/>
       <w:r>
         <w:t>Elementos de soporte del flujo:</w:t>
       </w:r>
-      <w:bookmarkEnd w:id="60"/>
+      <w:bookmarkEnd w:id="59"/>
     </w:p>
     <w:p>
       <w:pPr>
@@ -19997,30 +19620,30 @@
       <w:pPr>
         <w:pStyle w:val="Ttulo2"/>
       </w:pPr>
-      <w:bookmarkStart w:id="61" w:name="_Toc223906594"/>
+      <w:bookmarkStart w:id="60" w:name="_Toc223906594"/>
       <w:r>
         <w:t>Relación entre arquitectura y objetivos del negocio</w:t>
       </w:r>
+      <w:bookmarkEnd w:id="60"/>
+    </w:p>
+    <w:p>
+      <w:pPr>
+        <w:ind w:firstLine="708"/>
+      </w:pPr>
+      <w:r>
+        <w:t>La arquitectura propuesta está directamente alineada con el objetivo comercial del proyecto: convertir capacidades técnicas en ventas digitales de productos de software.</w:t>
+      </w:r>
+    </w:p>
+    <w:p/>
+    <w:p>
+      <w:pPr>
+        <w:pStyle w:val="Ttulo3"/>
+      </w:pPr>
+      <w:bookmarkStart w:id="61" w:name="_Toc223906595"/>
+      <w:r>
+        <w:t>Aportes de la arquitectura a objetivos estratégicos:</w:t>
+      </w:r>
       <w:bookmarkEnd w:id="61"/>
-    </w:p>
-    <w:p>
-      <w:pPr>
-        <w:ind w:firstLine="708"/>
-      </w:pPr>
-      <w:r>
-        <w:t>La arquitectura propuesta está directamente alineada con el objetivo comercial del proyecto: convertir capacidades técnicas en ventas digitales de productos de software.</w:t>
-      </w:r>
-    </w:p>
-    <w:p/>
-    <w:p>
-      <w:pPr>
-        <w:pStyle w:val="Ttulo3"/>
-      </w:pPr>
-      <w:bookmarkStart w:id="62" w:name="_Toc223906595"/>
-      <w:r>
-        <w:t>Aportes de la arquitectura a objetivos estratégicos:</w:t>
-      </w:r>
-      <w:bookmarkEnd w:id="62"/>
     </w:p>
     <w:p>
       <w:pPr>
@@ -20176,7 +19799,7 @@
       <w:pPr>
         <w:pStyle w:val="Ttulo1"/>
       </w:pPr>
-      <w:bookmarkStart w:id="63" w:name="_Toc223906596"/>
+      <w:bookmarkStart w:id="62" w:name="_Toc223906596"/>
       <w:r>
         <w:rPr>
           <w:rStyle w:val="Ttulo1Car"/>
@@ -20185,21 +19808,21 @@
         <w:lastRenderedPageBreak/>
         <w:t>PLANIFICACIÓN ÁGIL E IMPLEMENTACIÓN WEB</w:t>
       </w:r>
+      <w:bookmarkEnd w:id="62"/>
+      <w:r>
+        <w:t xml:space="preserve"> </w:t>
+      </w:r>
+    </w:p>
+    <w:p/>
+    <w:p>
+      <w:pPr>
+        <w:pStyle w:val="Ttulo2"/>
+      </w:pPr>
+      <w:bookmarkStart w:id="63" w:name="_Toc223906597"/>
+      <w:r>
+        <w:t>Procesos clave identificados</w:t>
+      </w:r>
       <w:bookmarkEnd w:id="63"/>
-      <w:r>
-        <w:t xml:space="preserve"> </w:t>
-      </w:r>
-    </w:p>
-    <w:p/>
-    <w:p>
-      <w:pPr>
-        <w:pStyle w:val="Ttulo2"/>
-      </w:pPr>
-      <w:bookmarkStart w:id="64" w:name="_Toc223906597"/>
-      <w:r>
-        <w:t>Procesos clave identificados</w:t>
-      </w:r>
-      <w:bookmarkEnd w:id="64"/>
     </w:p>
     <w:p>
       <w:pPr>
@@ -20210,15 +19833,7 @@
         </w:numPr>
       </w:pPr>
       <w:r>
-        <w:t>Investigación y Definición: Análisis del entorno competitivo, ideación de los 3 productos (</w:t>
-      </w:r>
-      <w:proofErr w:type="spellStart"/>
-      <w:r>
-        <w:t>SafeCase</w:t>
-      </w:r>
-      <w:proofErr w:type="spellEnd"/>
-      <w:r>
-        <w:t xml:space="preserve">, </w:t>
+        <w:t xml:space="preserve">Investigación y Definición: Análisis del entorno competitivo, ideación de los 3 productos (SafeCase, </w:t>
       </w:r>
       <w:proofErr w:type="spellStart"/>
       <w:r>
@@ -20333,14 +19948,14 @@
           <w:lang w:val="es-GT"/>
         </w:rPr>
       </w:pPr>
-      <w:bookmarkStart w:id="65" w:name="_Toc223906598"/>
+      <w:bookmarkStart w:id="64" w:name="_Toc223906598"/>
       <w:r>
         <w:rPr>
           <w:lang w:val="es-GT"/>
         </w:rPr>
         <w:t>Sprint 1 — Investigación, Definición del Producto y Diseño Estratégico</w:t>
       </w:r>
-      <w:bookmarkEnd w:id="65"/>
+      <w:bookmarkEnd w:id="64"/>
     </w:p>
     <w:p>
       <w:pPr>
@@ -20402,14 +20017,14 @@
           <w:lang w:val="es-GT"/>
         </w:rPr>
       </w:pPr>
-      <w:bookmarkStart w:id="66" w:name="_Toc223906599"/>
+      <w:bookmarkStart w:id="65" w:name="_Toc223906599"/>
       <w:r>
         <w:rPr>
           <w:lang w:val="es-GT"/>
         </w:rPr>
         <w:t>Temas Correctos Trabajados en el Sprint 1</w:t>
       </w:r>
-      <w:bookmarkEnd w:id="66"/>
+      <w:bookmarkEnd w:id="65"/>
     </w:p>
     <w:p>
       <w:pPr>
@@ -20669,21 +20284,7 @@
         <w:rPr>
           <w:lang w:val="es-GT"/>
         </w:rPr>
-        <w:t xml:space="preserve">Idear producto 3 basado en </w:t>
-      </w:r>
-      <w:proofErr w:type="spellStart"/>
-      <w:r>
-        <w:rPr>
-          <w:lang w:val="es-GT"/>
-        </w:rPr>
-        <w:t>apps</w:t>
-      </w:r>
-      <w:proofErr w:type="spellEnd"/>
-      <w:r>
-        <w:rPr>
-          <w:lang w:val="es-GT"/>
-        </w:rPr>
-        <w:t xml:space="preserve"> móviles.</w:t>
+        <w:t>Idear producto 3 basado en apps móviles.</w:t>
       </w:r>
     </w:p>
     <w:p>
@@ -21067,21 +20668,7 @@
         <w:rPr>
           <w:lang w:val="es-GT"/>
         </w:rPr>
-        <w:t xml:space="preserve">Aplicar </w:t>
-      </w:r>
-      <w:proofErr w:type="spellStart"/>
-      <w:r>
-        <w:rPr>
-          <w:lang w:val="es-GT"/>
-        </w:rPr>
-        <w:t>Five</w:t>
-      </w:r>
-      <w:proofErr w:type="spellEnd"/>
-      <w:r>
-        <w:rPr>
-          <w:lang w:val="es-GT"/>
-        </w:rPr>
-        <w:t xml:space="preserve"> </w:t>
+        <w:t xml:space="preserve">Aplicar Five </w:t>
       </w:r>
       <w:proofErr w:type="spellStart"/>
       <w:r>
@@ -21163,14 +20750,14 @@
           <w:lang w:val="es-GT"/>
         </w:rPr>
       </w:pPr>
-      <w:bookmarkStart w:id="67" w:name="_Toc223906600"/>
+      <w:bookmarkStart w:id="66" w:name="_Toc223906600"/>
       <w:r>
         <w:rPr>
           <w:lang w:val="es-GT"/>
         </w:rPr>
         <w:t>Resultado Esperado del Sprint 1</w:t>
       </w:r>
-      <w:bookmarkEnd w:id="67"/>
+      <w:bookmarkEnd w:id="66"/>
     </w:p>
     <w:p>
       <w:pPr>
@@ -21299,28 +20886,14 @@
           <w:lang w:val="es-GT"/>
         </w:rPr>
       </w:pPr>
-      <w:bookmarkStart w:id="68" w:name="_Toc223906601"/>
-      <w:r>
-        <w:rPr>
-          <w:lang w:val="es-GT"/>
-        </w:rPr>
-        <w:t xml:space="preserve">Dinámica </w:t>
-      </w:r>
-      <w:proofErr w:type="spellStart"/>
-      <w:r>
-        <w:rPr>
-          <w:lang w:val="es-GT"/>
-        </w:rPr>
-        <w:t>Scrum</w:t>
-      </w:r>
-      <w:proofErr w:type="spellEnd"/>
-      <w:r>
-        <w:rPr>
-          <w:lang w:val="es-GT"/>
-        </w:rPr>
-        <w:t xml:space="preserve"> Observada en el Sprint 1</w:t>
-      </w:r>
-      <w:bookmarkEnd w:id="68"/>
+      <w:bookmarkStart w:id="67" w:name="_Toc223906601"/>
+      <w:r>
+        <w:rPr>
+          <w:lang w:val="es-GT"/>
+        </w:rPr>
+        <w:t>Dinámica Scrum Observada en el Sprint 1</w:t>
+      </w:r>
+      <w:bookmarkEnd w:id="67"/>
     </w:p>
     <w:p>
       <w:pPr>
@@ -21332,23 +20905,13 @@
           <w:lang w:val="es-GT"/>
         </w:rPr>
       </w:pPr>
-      <w:proofErr w:type="spellStart"/>
       <w:r>
         <w:rPr>
           <w:b/>
           <w:bCs/>
           <w:lang w:val="es-GT"/>
         </w:rPr>
-        <w:t>Backlog</w:t>
-      </w:r>
-      <w:proofErr w:type="spellEnd"/>
-      <w:r>
-        <w:rPr>
-          <w:b/>
-          <w:bCs/>
-          <w:lang w:val="es-GT"/>
-        </w:rPr>
-        <w:t>:</w:t>
+        <w:t>Backlog:</w:t>
       </w:r>
       <w:r>
         <w:rPr>
@@ -21430,21 +20993,7 @@
         <w:rPr>
           <w:lang w:val="es-GT"/>
         </w:rPr>
-        <w:t xml:space="preserve"> (VUCA, PEST, </w:t>
-      </w:r>
-      <w:proofErr w:type="spellStart"/>
-      <w:r>
-        <w:rPr>
-          <w:lang w:val="es-GT"/>
-        </w:rPr>
-        <w:t>Five</w:t>
-      </w:r>
-      <w:proofErr w:type="spellEnd"/>
-      <w:r>
-        <w:rPr>
-          <w:lang w:val="es-GT"/>
-        </w:rPr>
-        <w:t xml:space="preserve"> </w:t>
+        <w:t xml:space="preserve"> (VUCA, PEST, Five </w:t>
       </w:r>
       <w:proofErr w:type="spellStart"/>
       <w:r>
@@ -21548,14 +21097,14 @@
           <w:lang w:val="es-GT"/>
         </w:rPr>
       </w:pPr>
-      <w:bookmarkStart w:id="69" w:name="_Toc223906602"/>
+      <w:bookmarkStart w:id="68" w:name="_Toc223906602"/>
       <w:r>
         <w:rPr>
           <w:lang w:val="es-GT"/>
         </w:rPr>
         <w:t>Sprint 2 — Desarrollo del Sitio, Documentación y Cierre Ejecutivo</w:t>
       </w:r>
-      <w:bookmarkEnd w:id="69"/>
+      <w:bookmarkEnd w:id="68"/>
     </w:p>
     <w:p>
       <w:pPr>
@@ -21615,14 +21164,14 @@
           <w:lang w:val="es-GT"/>
         </w:rPr>
       </w:pPr>
-      <w:bookmarkStart w:id="70" w:name="_Toc223906603"/>
+      <w:bookmarkStart w:id="69" w:name="_Toc223906603"/>
       <w:r>
         <w:rPr>
           <w:lang w:val="es-GT"/>
         </w:rPr>
         <w:t>Temas Correctos Trabajados en el Sprint 2</w:t>
       </w:r>
-      <w:bookmarkEnd w:id="70"/>
+      <w:bookmarkEnd w:id="69"/>
     </w:p>
     <w:p>
       <w:pPr>
@@ -22071,14 +21620,14 @@
           <w:lang w:val="es-GT"/>
         </w:rPr>
       </w:pPr>
-      <w:bookmarkStart w:id="71" w:name="_Toc223906604"/>
+      <w:bookmarkStart w:id="70" w:name="_Toc223906604"/>
       <w:r>
         <w:rPr>
           <w:lang w:val="es-GT"/>
         </w:rPr>
         <w:t>Resultado Esperado del Sprint 2</w:t>
       </w:r>
-      <w:bookmarkEnd w:id="71"/>
+      <w:bookmarkEnd w:id="70"/>
     </w:p>
     <w:p>
       <w:pPr>
@@ -22104,7 +21653,21 @@
         <w:rPr>
           <w:lang w:val="es-GT"/>
         </w:rPr>
-        <w:t xml:space="preserve"> de QuetzalDev:</w:t>
+        <w:t xml:space="preserve"> de </w:t>
+      </w:r>
+      <w:proofErr w:type="spellStart"/>
+      <w:r>
+        <w:rPr>
+          <w:lang w:val="es-GT"/>
+        </w:rPr>
+        <w:t>QuetzalDev</w:t>
+      </w:r>
+      <w:proofErr w:type="spellEnd"/>
+      <w:r>
+        <w:rPr>
+          <w:lang w:val="es-GT"/>
+        </w:rPr>
+        <w:t>:</w:t>
       </w:r>
     </w:p>
     <w:p>
@@ -22258,29 +21821,15 @@
           <w:lang w:val="es-GT"/>
         </w:rPr>
       </w:pPr>
-      <w:bookmarkStart w:id="72" w:name="_Toc223906605"/>
+      <w:bookmarkStart w:id="71" w:name="_Toc223906605"/>
       <w:r>
         <w:rPr>
           <w:lang w:val="es-GT"/>
         </w:rPr>
         <w:lastRenderedPageBreak/>
-        <w:t xml:space="preserve">Dinámica </w:t>
-      </w:r>
-      <w:proofErr w:type="spellStart"/>
-      <w:r>
-        <w:rPr>
-          <w:lang w:val="es-GT"/>
-        </w:rPr>
-        <w:t>Scrum</w:t>
-      </w:r>
-      <w:proofErr w:type="spellEnd"/>
-      <w:r>
-        <w:rPr>
-          <w:lang w:val="es-GT"/>
-        </w:rPr>
-        <w:t xml:space="preserve"> Observada en el Sprint 2</w:t>
-      </w:r>
-      <w:bookmarkEnd w:id="72"/>
+        <w:t>Dinámica Scrum Observada en el Sprint 2</w:t>
+      </w:r>
+      <w:bookmarkEnd w:id="71"/>
     </w:p>
     <w:p>
       <w:pPr>
@@ -22292,23 +21841,13 @@
           <w:lang w:val="es-GT"/>
         </w:rPr>
       </w:pPr>
-      <w:proofErr w:type="spellStart"/>
       <w:r>
         <w:rPr>
           <w:b/>
           <w:bCs/>
           <w:lang w:val="es-GT"/>
         </w:rPr>
-        <w:t>Backlog</w:t>
-      </w:r>
-      <w:proofErr w:type="spellEnd"/>
-      <w:r>
-        <w:rPr>
-          <w:b/>
-          <w:bCs/>
-          <w:lang w:val="es-GT"/>
-        </w:rPr>
-        <w:t>:</w:t>
+        <w:t>Backlog:</w:t>
       </w:r>
       <w:r>
         <w:rPr>
@@ -22545,11 +22084,11 @@
       <w:pPr>
         <w:pStyle w:val="Ttulo2"/>
       </w:pPr>
-      <w:bookmarkStart w:id="73" w:name="_Toc223906606"/>
+      <w:bookmarkStart w:id="72" w:name="_Toc223906606"/>
       <w:r>
         <w:t>Enlace de la plataforma funcional</w:t>
       </w:r>
-      <w:bookmarkEnd w:id="73"/>
+      <w:bookmarkEnd w:id="72"/>
       <w:r>
         <w:t xml:space="preserve"> </w:t>
       </w:r>
@@ -22560,7 +22099,7 @@
         <w:ind w:firstLine="360"/>
         <w:jc w:val="left"/>
       </w:pPr>
-      <w:hyperlink r:id="rId24" w:anchor="/" w:history="1">
+      <w:hyperlink r:id="rId25" w:anchor="/" w:history="1">
         <w:r>
           <w:rPr>
             <w:rStyle w:val="Hipervnculo"/>
@@ -22648,12 +22187,12 @@
       <w:pPr>
         <w:pStyle w:val="Ttulo1"/>
       </w:pPr>
-      <w:bookmarkStart w:id="74" w:name="_Toc223906607"/>
+      <w:bookmarkStart w:id="73" w:name="_Toc223906607"/>
       <w:r>
         <w:lastRenderedPageBreak/>
         <w:t>CONCLUSIONES</w:t>
       </w:r>
-      <w:bookmarkEnd w:id="74"/>
+      <w:bookmarkEnd w:id="73"/>
     </w:p>
     <w:p/>
     <w:p>
@@ -22686,7 +22225,21 @@
         <w:rPr>
           <w:bCs/>
         </w:rPr>
-        <w:t xml:space="preserve"> para QuetzalDev responde de forma directa al problema central identificado: la falta de un canal digital estructurado para comercializar soluciones de software de manera escalable.</w:t>
+        <w:t xml:space="preserve"> para </w:t>
+      </w:r>
+      <w:proofErr w:type="spellStart"/>
+      <w:r>
+        <w:rPr>
+          <w:bCs/>
+        </w:rPr>
+        <w:t>QuetzalDev</w:t>
+      </w:r>
+      <w:proofErr w:type="spellEnd"/>
+      <w:r>
+        <w:rPr>
+          <w:bCs/>
+        </w:rPr>
+        <w:t xml:space="preserve"> responde de forma directa al problema central identificado: la falta de un canal digital estructurado para comercializar soluciones de software de manera escalable.</w:t>
       </w:r>
     </w:p>
     <w:p>
@@ -22705,21 +22258,7 @@
         <w:rPr>
           <w:bCs/>
         </w:rPr>
-        <w:t xml:space="preserve">La definición de los productos </w:t>
-      </w:r>
-      <w:proofErr w:type="spellStart"/>
-      <w:r>
-        <w:rPr>
-          <w:bCs/>
-        </w:rPr>
-        <w:t>SafeCase</w:t>
-      </w:r>
-      <w:proofErr w:type="spellEnd"/>
-      <w:r>
-        <w:rPr>
-          <w:bCs/>
-        </w:rPr>
-        <w:t xml:space="preserve">, </w:t>
+        <w:t xml:space="preserve">La definición de los productos SafeCase, </w:t>
       </w:r>
       <w:proofErr w:type="spellStart"/>
       <w:r>
@@ -22863,7 +22402,7 @@
       </w:pPr>
     </w:p>
     <w:sectPr>
-      <w:footerReference w:type="default" r:id="rId25"/>
+      <w:footerReference w:type="default" r:id="rId26"/>
       <w:pgSz w:w="11906" w:h="16838"/>
       <w:pgMar w:top="1440" w:right="1440" w:bottom="1440" w:left="1440" w:header="720" w:footer="720" w:gutter="0"/>
       <w:pgNumType w:start="1"/>
@@ -22875,7 +22414,7 @@
 </file>
 
 <file path=word/endnotes.xml><?xml version="1.0" encoding="utf-8"?>
-<w:endnotes xmlns:wpc="http://schemas.microsoft.com/office/word/2010/wordprocessingCanvas" xmlns:mc="http://schemas.openxmlformats.org/markup-compatibility/2006" xmlns:o="urn:schemas-microsoft-com:office:office" xmlns:r="http://schemas.openxmlformats.org/officeDocument/2006/relationships" xmlns:m="http://schemas.openxmlformats.org/officeDocument/2006/math" xmlns:v="urn:schemas-microsoft-com:vml" xmlns:wp14="http://schemas.microsoft.com/office/word/2010/wordprocessingDrawing" xmlns:wp="http://schemas.openxmlformats.org/drawingml/2006/wordprocessingDrawing" xmlns:w10="urn:schemas-microsoft-com:office:word" xmlns:w="http://schemas.openxmlformats.org/wordprocessingml/2006/main" xmlns:w14="http://schemas.microsoft.com/office/word/2010/wordml" xmlns:w15="http://schemas.microsoft.com/office/word/2012/wordml" xmlns:wpg="http://schemas.microsoft.com/office/word/2010/wordprocessingGroup" xmlns:wpi="http://schemas.microsoft.com/office/word/2010/wordprocessingInk" xmlns:wne="http://schemas.microsoft.com/office/word/2006/wordml" xmlns:wps="http://schemas.microsoft.com/office/word/2010/wordprocessingShape" mc:Ignorable="w14 w15 wp14">
+<w:endnotes xmlns:wpc="http://schemas.microsoft.com/office/word/2010/wordprocessingCanvas" xmlns:cx="http://schemas.microsoft.com/office/drawing/2014/chartex" xmlns:cx1="http://schemas.microsoft.com/office/drawing/2015/9/8/chartex" xmlns:cx2="http://schemas.microsoft.com/office/drawing/2015/10/21/chartex" xmlns:cx3="http://schemas.microsoft.com/office/drawing/2016/5/9/chartex" xmlns:cx4="http://schemas.microsoft.com/office/drawing/2016/5/10/chartex" xmlns:cx5="http://schemas.microsoft.com/office/drawing/2016/5/11/chartex" xmlns:cx6="http://schemas.microsoft.com/office/drawing/2016/5/12/chartex" xmlns:cx7="http://schemas.microsoft.com/office/drawing/2016/5/13/chartex" xmlns:cx8="http://schemas.microsoft.com/office/drawing/2016/5/14/chartex" xmlns:mc="http://schemas.openxmlformats.org/markup-compatibility/2006" xmlns:aink="http://schemas.microsoft.com/office/drawing/2016/ink" xmlns:am3d="http://schemas.microsoft.com/office/drawing/2017/model3d" xmlns:o="urn:schemas-microsoft-com:office:office" xmlns:oel="http://schemas.microsoft.com/office/2019/extlst" xmlns:r="http://schemas.openxmlformats.org/officeDocument/2006/relationships" xmlns:m="http://schemas.openxmlformats.org/officeDocument/2006/math" xmlns:v="urn:schemas-microsoft-com:vml" xmlns:wp14="http://schemas.microsoft.com/office/word/2010/wordprocessingDrawing" xmlns:wp="http://schemas.openxmlformats.org/drawingml/2006/wordprocessingDrawing" xmlns:w10="urn:schemas-microsoft-com:office:word" xmlns:w="http://schemas.openxmlformats.org/wordprocessingml/2006/main" xmlns:w14="http://schemas.microsoft.com/office/word/2010/wordml" xmlns:w15="http://schemas.microsoft.com/office/word/2012/wordml" xmlns:w16cex="http://schemas.microsoft.com/office/word/2018/wordml/cex" xmlns:w16cid="http://schemas.microsoft.com/office/word/2016/wordml/cid" xmlns:w16="http://schemas.microsoft.com/office/word/2018/wordml" xmlns:w16du="http://schemas.microsoft.com/office/word/2023/wordml/word16du" xmlns:w16sdtdh="http://schemas.microsoft.com/office/word/2020/wordml/sdtdatahash" xmlns:w16sdtfl="http://schemas.microsoft.com/office/word/2024/wordml/sdtformatlock" xmlns:w16se="http://schemas.microsoft.com/office/word/2015/wordml/symex" xmlns:wpg="http://schemas.microsoft.com/office/word/2010/wordprocessingGroup" xmlns:wpi="http://schemas.microsoft.com/office/word/2010/wordprocessingInk" xmlns:wne="http://schemas.microsoft.com/office/word/2006/wordml" xmlns:wps="http://schemas.microsoft.com/office/word/2010/wordprocessingShape" mc:Ignorable="w14 w15 w16se w16cid w16 w16cex w16sdtdh w16sdtfl w16du wp14">
   <w:endnote w:type="separator" w:id="-1">
     <w:p>
       <w:pPr>
@@ -22900,7 +22439,7 @@
 </file>
 
 <file path=word/footer1.xml><?xml version="1.0" encoding="utf-8"?>
-<w:ftr xmlns:wpc="http://schemas.microsoft.com/office/word/2010/wordprocessingCanvas" xmlns:mc="http://schemas.openxmlformats.org/markup-compatibility/2006" xmlns:o="urn:schemas-microsoft-com:office:office" xmlns:r="http://schemas.openxmlformats.org/officeDocument/2006/relationships" xmlns:m="http://schemas.openxmlformats.org/officeDocument/2006/math" xmlns:v="urn:schemas-microsoft-com:vml" xmlns:wp14="http://schemas.microsoft.com/office/word/2010/wordprocessingDrawing" xmlns:wp="http://schemas.openxmlformats.org/drawingml/2006/wordprocessingDrawing" xmlns:w10="urn:schemas-microsoft-com:office:word" xmlns:w="http://schemas.openxmlformats.org/wordprocessingml/2006/main" xmlns:w14="http://schemas.microsoft.com/office/word/2010/wordml" xmlns:w15="http://schemas.microsoft.com/office/word/2012/wordml" xmlns:wpg="http://schemas.microsoft.com/office/word/2010/wordprocessingGroup" xmlns:wpi="http://schemas.microsoft.com/office/word/2010/wordprocessingInk" xmlns:wne="http://schemas.microsoft.com/office/word/2006/wordml" xmlns:wps="http://schemas.microsoft.com/office/word/2010/wordprocessingShape" mc:Ignorable="w14 w15 wp14">
+<w:ftr xmlns:wpc="http://schemas.microsoft.com/office/word/2010/wordprocessingCanvas" xmlns:cx="http://schemas.microsoft.com/office/drawing/2014/chartex" xmlns:cx1="http://schemas.microsoft.com/office/drawing/2015/9/8/chartex" xmlns:cx2="http://schemas.microsoft.com/office/drawing/2015/10/21/chartex" xmlns:cx3="http://schemas.microsoft.com/office/drawing/2016/5/9/chartex" xmlns:cx4="http://schemas.microsoft.com/office/drawing/2016/5/10/chartex" xmlns:cx5="http://schemas.microsoft.com/office/drawing/2016/5/11/chartex" xmlns:cx6="http://schemas.microsoft.com/office/drawing/2016/5/12/chartex" xmlns:cx7="http://schemas.microsoft.com/office/drawing/2016/5/13/chartex" xmlns:cx8="http://schemas.microsoft.com/office/drawing/2016/5/14/chartex" xmlns:mc="http://schemas.openxmlformats.org/markup-compatibility/2006" xmlns:aink="http://schemas.microsoft.com/office/drawing/2016/ink" xmlns:am3d="http://schemas.microsoft.com/office/drawing/2017/model3d" xmlns:o="urn:schemas-microsoft-com:office:office" xmlns:oel="http://schemas.microsoft.com/office/2019/extlst" xmlns:r="http://schemas.openxmlformats.org/officeDocument/2006/relationships" xmlns:m="http://schemas.openxmlformats.org/officeDocument/2006/math" xmlns:v="urn:schemas-microsoft-com:vml" xmlns:wp14="http://schemas.microsoft.com/office/word/2010/wordprocessingDrawing" xmlns:wp="http://schemas.openxmlformats.org/drawingml/2006/wordprocessingDrawing" xmlns:w10="urn:schemas-microsoft-com:office:word" xmlns:w="http://schemas.openxmlformats.org/wordprocessingml/2006/main" xmlns:w14="http://schemas.microsoft.com/office/word/2010/wordml" xmlns:w15="http://schemas.microsoft.com/office/word/2012/wordml" xmlns:w16cex="http://schemas.microsoft.com/office/word/2018/wordml/cex" xmlns:w16cid="http://schemas.microsoft.com/office/word/2016/wordml/cid" xmlns:w16="http://schemas.microsoft.com/office/word/2018/wordml" xmlns:w16du="http://schemas.microsoft.com/office/word/2023/wordml/word16du" xmlns:w16sdtdh="http://schemas.microsoft.com/office/word/2020/wordml/sdtdatahash" xmlns:w16sdtfl="http://schemas.microsoft.com/office/word/2024/wordml/sdtformatlock" xmlns:w16se="http://schemas.microsoft.com/office/word/2015/wordml/symex" xmlns:wpg="http://schemas.microsoft.com/office/word/2010/wordprocessingGroup" xmlns:wpi="http://schemas.microsoft.com/office/word/2010/wordprocessingInk" xmlns:wne="http://schemas.microsoft.com/office/word/2006/wordml" xmlns:wps="http://schemas.microsoft.com/office/word/2010/wordprocessingShape" mc:Ignorable="w14 w15 w16se w16cid w16 w16cex w16sdtdh w16sdtfl w16du wp14">
   <w:p>
     <w:pPr>
       <w:pStyle w:val="Piedepgina"/>
@@ -22921,7 +22460,7 @@
 </file>
 
 <file path=word/footer2.xml><?xml version="1.0" encoding="utf-8"?>
-<w:ftr xmlns:wpc="http://schemas.microsoft.com/office/word/2010/wordprocessingCanvas" xmlns:mc="http://schemas.openxmlformats.org/markup-compatibility/2006" xmlns:o="urn:schemas-microsoft-com:office:office" xmlns:r="http://schemas.openxmlformats.org/officeDocument/2006/relationships" xmlns:m="http://schemas.openxmlformats.org/officeDocument/2006/math" xmlns:v="urn:schemas-microsoft-com:vml" xmlns:wp14="http://schemas.microsoft.com/office/word/2010/wordprocessingDrawing" xmlns:wp="http://schemas.openxmlformats.org/drawingml/2006/wordprocessingDrawing" xmlns:w10="urn:schemas-microsoft-com:office:word" xmlns:w="http://schemas.openxmlformats.org/wordprocessingml/2006/main" xmlns:w14="http://schemas.microsoft.com/office/word/2010/wordml" xmlns:w15="http://schemas.microsoft.com/office/word/2012/wordml" xmlns:wpg="http://schemas.microsoft.com/office/word/2010/wordprocessingGroup" xmlns:wpi="http://schemas.microsoft.com/office/word/2010/wordprocessingInk" xmlns:wne="http://schemas.microsoft.com/office/word/2006/wordml" xmlns:wps="http://schemas.microsoft.com/office/word/2010/wordprocessingShape" mc:Ignorable="w14 w15 wp14">
+<w:ftr xmlns:wpc="http://schemas.microsoft.com/office/word/2010/wordprocessingCanvas" xmlns:cx="http://schemas.microsoft.com/office/drawing/2014/chartex" xmlns:cx1="http://schemas.microsoft.com/office/drawing/2015/9/8/chartex" xmlns:cx2="http://schemas.microsoft.com/office/drawing/2015/10/21/chartex" xmlns:cx3="http://schemas.microsoft.com/office/drawing/2016/5/9/chartex" xmlns:cx4="http://schemas.microsoft.com/office/drawing/2016/5/10/chartex" xmlns:cx5="http://schemas.microsoft.com/office/drawing/2016/5/11/chartex" xmlns:cx6="http://schemas.microsoft.com/office/drawing/2016/5/12/chartex" xmlns:cx7="http://schemas.microsoft.com/office/drawing/2016/5/13/chartex" xmlns:cx8="http://schemas.microsoft.com/office/drawing/2016/5/14/chartex" xmlns:mc="http://schemas.openxmlformats.org/markup-compatibility/2006" xmlns:aink="http://schemas.microsoft.com/office/drawing/2016/ink" xmlns:am3d="http://schemas.microsoft.com/office/drawing/2017/model3d" xmlns:o="urn:schemas-microsoft-com:office:office" xmlns:oel="http://schemas.microsoft.com/office/2019/extlst" xmlns:r="http://schemas.openxmlformats.org/officeDocument/2006/relationships" xmlns:m="http://schemas.openxmlformats.org/officeDocument/2006/math" xmlns:v="urn:schemas-microsoft-com:vml" xmlns:wp14="http://schemas.microsoft.com/office/word/2010/wordprocessingDrawing" xmlns:wp="http://schemas.openxmlformats.org/drawingml/2006/wordprocessingDrawing" xmlns:w10="urn:schemas-microsoft-com:office:word" xmlns:w="http://schemas.openxmlformats.org/wordprocessingml/2006/main" xmlns:w14="http://schemas.microsoft.com/office/word/2010/wordml" xmlns:w15="http://schemas.microsoft.com/office/word/2012/wordml" xmlns:w16cex="http://schemas.microsoft.com/office/word/2018/wordml/cex" xmlns:w16cid="http://schemas.microsoft.com/office/word/2016/wordml/cid" xmlns:w16="http://schemas.microsoft.com/office/word/2018/wordml" xmlns:w16du="http://schemas.microsoft.com/office/word/2023/wordml/word16du" xmlns:w16sdtdh="http://schemas.microsoft.com/office/word/2020/wordml/sdtdatahash" xmlns:w16sdtfl="http://schemas.microsoft.com/office/word/2024/wordml/sdtformatlock" xmlns:w16se="http://schemas.microsoft.com/office/word/2015/wordml/symex" xmlns:wpg="http://schemas.microsoft.com/office/word/2010/wordprocessingGroup" xmlns:wpi="http://schemas.microsoft.com/office/word/2010/wordprocessingInk" xmlns:wne="http://schemas.microsoft.com/office/word/2006/wordml" xmlns:wps="http://schemas.microsoft.com/office/word/2010/wordprocessingShape" mc:Ignorable="w14 w15 w16se w16cid w16 w16cex w16sdtdh w16sdtfl w16du wp14">
   <w:sdt>
     <w:sdtPr>
       <w:id w:val="-1336447564"/>
@@ -22930,7 +22469,6 @@
         <w:docPartUnique/>
       </w:docPartObj>
     </w:sdtPr>
-    <w:sdtEndPr/>
     <w:sdtContent>
       <w:p>
         <w:pPr>
@@ -22972,7 +22510,7 @@
 </file>
 
 <file path=word/footnotes.xml><?xml version="1.0" encoding="utf-8"?>
-<w:footnotes xmlns:wpc="http://schemas.microsoft.com/office/word/2010/wordprocessingCanvas" xmlns:mc="http://schemas.openxmlformats.org/markup-compatibility/2006" xmlns:o="urn:schemas-microsoft-com:office:office" xmlns:r="http://schemas.openxmlformats.org/officeDocument/2006/relationships" xmlns:m="http://schemas.openxmlformats.org/officeDocument/2006/math" xmlns:v="urn:schemas-microsoft-com:vml" xmlns:wp14="http://schemas.microsoft.com/office/word/2010/wordprocessingDrawing" xmlns:wp="http://schemas.openxmlformats.org/drawingml/2006/wordprocessingDrawing" xmlns:w10="urn:schemas-microsoft-com:office:word" xmlns:w="http://schemas.openxmlformats.org/wordprocessingml/2006/main" xmlns:w14="http://schemas.microsoft.com/office/word/2010/wordml" xmlns:w15="http://schemas.microsoft.com/office/word/2012/wordml" xmlns:wpg="http://schemas.microsoft.com/office/word/2010/wordprocessingGroup" xmlns:wpi="http://schemas.microsoft.com/office/word/2010/wordprocessingInk" xmlns:wne="http://schemas.microsoft.com/office/word/2006/wordml" xmlns:wps="http://schemas.microsoft.com/office/word/2010/wordprocessingShape" mc:Ignorable="w14 w15 wp14">
+<w:footnotes xmlns:wpc="http://schemas.microsoft.com/office/word/2010/wordprocessingCanvas" xmlns:cx="http://schemas.microsoft.com/office/drawing/2014/chartex" xmlns:cx1="http://schemas.microsoft.com/office/drawing/2015/9/8/chartex" xmlns:cx2="http://schemas.microsoft.com/office/drawing/2015/10/21/chartex" xmlns:cx3="http://schemas.microsoft.com/office/drawing/2016/5/9/chartex" xmlns:cx4="http://schemas.microsoft.com/office/drawing/2016/5/10/chartex" xmlns:cx5="http://schemas.microsoft.com/office/drawing/2016/5/11/chartex" xmlns:cx6="http://schemas.microsoft.com/office/drawing/2016/5/12/chartex" xmlns:cx7="http://schemas.microsoft.com/office/drawing/2016/5/13/chartex" xmlns:cx8="http://schemas.microsoft.com/office/drawing/2016/5/14/chartex" xmlns:mc="http://schemas.openxmlformats.org/markup-compatibility/2006" xmlns:aink="http://schemas.microsoft.com/office/drawing/2016/ink" xmlns:am3d="http://schemas.microsoft.com/office/drawing/2017/model3d" xmlns:o="urn:schemas-microsoft-com:office:office" xmlns:oel="http://schemas.microsoft.com/office/2019/extlst" xmlns:r="http://schemas.openxmlformats.org/officeDocument/2006/relationships" xmlns:m="http://schemas.openxmlformats.org/officeDocument/2006/math" xmlns:v="urn:schemas-microsoft-com:vml" xmlns:wp14="http://schemas.microsoft.com/office/word/2010/wordprocessingDrawing" xmlns:wp="http://schemas.openxmlformats.org/drawingml/2006/wordprocessingDrawing" xmlns:w10="urn:schemas-microsoft-com:office:word" xmlns:w="http://schemas.openxmlformats.org/wordprocessingml/2006/main" xmlns:w14="http://schemas.microsoft.com/office/word/2010/wordml" xmlns:w15="http://schemas.microsoft.com/office/word/2012/wordml" xmlns:w16cex="http://schemas.microsoft.com/office/word/2018/wordml/cex" xmlns:w16cid="http://schemas.microsoft.com/office/word/2016/wordml/cid" xmlns:w16="http://schemas.microsoft.com/office/word/2018/wordml" xmlns:w16du="http://schemas.microsoft.com/office/word/2023/wordml/word16du" xmlns:w16sdtdh="http://schemas.microsoft.com/office/word/2020/wordml/sdtdatahash" xmlns:w16sdtfl="http://schemas.microsoft.com/office/word/2024/wordml/sdtformatlock" xmlns:w16se="http://schemas.microsoft.com/office/word/2015/wordml/symex" xmlns:wpg="http://schemas.microsoft.com/office/word/2010/wordprocessingGroup" xmlns:wpi="http://schemas.microsoft.com/office/word/2010/wordprocessingInk" xmlns:wne="http://schemas.microsoft.com/office/word/2006/wordml" xmlns:wps="http://schemas.microsoft.com/office/word/2010/wordprocessingShape" mc:Ignorable="w14 w15 w16se w16cid w16 w16cex w16sdtdh w16sdtfl w16du wp14">
   <w:footnote w:type="separator" w:id="-1">
     <w:p>
       <w:pPr>
@@ -22997,8 +22535,8 @@
 </file>
 
 <file path=word/numbering.xml><?xml version="1.0" encoding="utf-8"?>
-<w:numbering xmlns:wpc="http://schemas.microsoft.com/office/word/2010/wordprocessingCanvas" xmlns:mc="http://schemas.openxmlformats.org/markup-compatibility/2006" xmlns:o="urn:schemas-microsoft-com:office:office" xmlns:r="http://schemas.openxmlformats.org/officeDocument/2006/relationships" xmlns:m="http://schemas.openxmlformats.org/officeDocument/2006/math" xmlns:v="urn:schemas-microsoft-com:vml" xmlns:wp14="http://schemas.microsoft.com/office/word/2010/wordprocessingDrawing" xmlns:wp="http://schemas.openxmlformats.org/drawingml/2006/wordprocessingDrawing" xmlns:w10="urn:schemas-microsoft-com:office:word" xmlns:w="http://schemas.openxmlformats.org/wordprocessingml/2006/main" xmlns:w14="http://schemas.microsoft.com/office/word/2010/wordml" xmlns:w15="http://schemas.microsoft.com/office/word/2012/wordml" xmlns:wpg="http://schemas.microsoft.com/office/word/2010/wordprocessingGroup" xmlns:wpi="http://schemas.microsoft.com/office/word/2010/wordprocessingInk" xmlns:wne="http://schemas.microsoft.com/office/word/2006/wordml" xmlns:wps="http://schemas.microsoft.com/office/word/2010/wordprocessingShape" mc:Ignorable="w14 w15 wp14">
-  <w:abstractNum w:abstractNumId="0">
+<w:numbering xmlns:wpc="http://schemas.microsoft.com/office/word/2010/wordprocessingCanvas" xmlns:cx="http://schemas.microsoft.com/office/drawing/2014/chartex" xmlns:cx1="http://schemas.microsoft.com/office/drawing/2015/9/8/chartex" xmlns:cx2="http://schemas.microsoft.com/office/drawing/2015/10/21/chartex" xmlns:cx3="http://schemas.microsoft.com/office/drawing/2016/5/9/chartex" xmlns:cx4="http://schemas.microsoft.com/office/drawing/2016/5/10/chartex" xmlns:cx5="http://schemas.microsoft.com/office/drawing/2016/5/11/chartex" xmlns:cx6="http://schemas.microsoft.com/office/drawing/2016/5/12/chartex" xmlns:cx7="http://schemas.microsoft.com/office/drawing/2016/5/13/chartex" xmlns:cx8="http://schemas.microsoft.com/office/drawing/2016/5/14/chartex" xmlns:mc="http://schemas.openxmlformats.org/markup-compatibility/2006" xmlns:aink="http://schemas.microsoft.com/office/drawing/2016/ink" xmlns:am3d="http://schemas.microsoft.com/office/drawing/2017/model3d" xmlns:o="urn:schemas-microsoft-com:office:office" xmlns:oel="http://schemas.microsoft.com/office/2019/extlst" xmlns:r="http://schemas.openxmlformats.org/officeDocument/2006/relationships" xmlns:m="http://schemas.openxmlformats.org/officeDocument/2006/math" xmlns:v="urn:schemas-microsoft-com:vml" xmlns:wp14="http://schemas.microsoft.com/office/word/2010/wordprocessingDrawing" xmlns:wp="http://schemas.openxmlformats.org/drawingml/2006/wordprocessingDrawing" xmlns:w10="urn:schemas-microsoft-com:office:word" xmlns:w="http://schemas.openxmlformats.org/wordprocessingml/2006/main" xmlns:w14="http://schemas.microsoft.com/office/word/2010/wordml" xmlns:w15="http://schemas.microsoft.com/office/word/2012/wordml" xmlns:w16cex="http://schemas.microsoft.com/office/word/2018/wordml/cex" xmlns:w16cid="http://schemas.microsoft.com/office/word/2016/wordml/cid" xmlns:w16="http://schemas.microsoft.com/office/word/2018/wordml" xmlns:w16du="http://schemas.microsoft.com/office/word/2023/wordml/word16du" xmlns:w16sdtdh="http://schemas.microsoft.com/office/word/2020/wordml/sdtdatahash" xmlns:w16sdtfl="http://schemas.microsoft.com/office/word/2024/wordml/sdtformatlock" xmlns:w16se="http://schemas.microsoft.com/office/word/2015/wordml/symex" xmlns:wpg="http://schemas.microsoft.com/office/word/2010/wordprocessingGroup" xmlns:wpi="http://schemas.microsoft.com/office/word/2010/wordprocessingInk" xmlns:wne="http://schemas.microsoft.com/office/word/2006/wordml" xmlns:wps="http://schemas.microsoft.com/office/word/2010/wordprocessingShape" mc:Ignorable="w14 w15 w16se w16cid w16 w16cex w16sdtdh w16sdtfl w16du wp14">
+  <w:abstractNum w:abstractNumId="0" w15:restartNumberingAfterBreak="0">
     <w:nsid w:val="0AD24B59"/>
     <w:multiLevelType w:val="multilevel"/>
     <w:tmpl w:val="B45A4E68"/>
@@ -23147,7 +22685,7 @@
       </w:rPr>
     </w:lvl>
   </w:abstractNum>
-  <w:abstractNum w:abstractNumId="1">
+  <w:abstractNum w:abstractNumId="1" w15:restartNumberingAfterBreak="0">
     <w:nsid w:val="0B185205"/>
     <w:multiLevelType w:val="hybridMultilevel"/>
     <w:tmpl w:val="908E0B9C"/>
@@ -23260,7 +22798,7 @@
       </w:rPr>
     </w:lvl>
   </w:abstractNum>
-  <w:abstractNum w:abstractNumId="2">
+  <w:abstractNum w:abstractNumId="2" w15:restartNumberingAfterBreak="0">
     <w:nsid w:val="0D4D0641"/>
     <w:multiLevelType w:val="hybridMultilevel"/>
     <w:tmpl w:val="49C47878"/>
@@ -23373,7 +22911,7 @@
       </w:rPr>
     </w:lvl>
   </w:abstractNum>
-  <w:abstractNum w:abstractNumId="3">
+  <w:abstractNum w:abstractNumId="3" w15:restartNumberingAfterBreak="0">
     <w:nsid w:val="0E702450"/>
     <w:multiLevelType w:val="multilevel"/>
     <w:tmpl w:val="A530B916"/>
@@ -23522,7 +23060,7 @@
       </w:rPr>
     </w:lvl>
   </w:abstractNum>
-  <w:abstractNum w:abstractNumId="4">
+  <w:abstractNum w:abstractNumId="4" w15:restartNumberingAfterBreak="0">
     <w:nsid w:val="0EB9051A"/>
     <w:multiLevelType w:val="multilevel"/>
     <w:tmpl w:val="D3B2D4BE"/>
@@ -23671,7 +23209,7 @@
       </w:rPr>
     </w:lvl>
   </w:abstractNum>
-  <w:abstractNum w:abstractNumId="5">
+  <w:abstractNum w:abstractNumId="5" w15:restartNumberingAfterBreak="0">
     <w:nsid w:val="11634203"/>
     <w:multiLevelType w:val="multilevel"/>
     <w:tmpl w:val="7CF41F2E"/>
@@ -23820,7 +23358,7 @@
       </w:rPr>
     </w:lvl>
   </w:abstractNum>
-  <w:abstractNum w:abstractNumId="6">
+  <w:abstractNum w:abstractNumId="6" w15:restartNumberingAfterBreak="0">
     <w:nsid w:val="11EB29E0"/>
     <w:multiLevelType w:val="multilevel"/>
     <w:tmpl w:val="3F1A1A2E"/>
@@ -23969,7 +23507,7 @@
       </w:rPr>
     </w:lvl>
   </w:abstractNum>
-  <w:abstractNum w:abstractNumId="7">
+  <w:abstractNum w:abstractNumId="7" w15:restartNumberingAfterBreak="0">
     <w:nsid w:val="12C70326"/>
     <w:multiLevelType w:val="hybridMultilevel"/>
     <w:tmpl w:val="F15E4044"/>
@@ -24082,7 +23620,7 @@
       </w:rPr>
     </w:lvl>
   </w:abstractNum>
-  <w:abstractNum w:abstractNumId="8">
+  <w:abstractNum w:abstractNumId="8" w15:restartNumberingAfterBreak="0">
     <w:nsid w:val="19FF6E9A"/>
     <w:multiLevelType w:val="hybridMultilevel"/>
     <w:tmpl w:val="D69EF490"/>
@@ -24195,7 +23733,7 @@
       </w:rPr>
     </w:lvl>
   </w:abstractNum>
-  <w:abstractNum w:abstractNumId="9">
+  <w:abstractNum w:abstractNumId="9" w15:restartNumberingAfterBreak="0">
     <w:nsid w:val="1C2276B4"/>
     <w:multiLevelType w:val="multilevel"/>
     <w:tmpl w:val="4502BB36"/>
@@ -24344,7 +23882,7 @@
       </w:rPr>
     </w:lvl>
   </w:abstractNum>
-  <w:abstractNum w:abstractNumId="10">
+  <w:abstractNum w:abstractNumId="10" w15:restartNumberingAfterBreak="0">
     <w:nsid w:val="1C2B5E2E"/>
     <w:multiLevelType w:val="multilevel"/>
     <w:tmpl w:val="8604EA18"/>
@@ -24493,7 +24031,7 @@
       </w:rPr>
     </w:lvl>
   </w:abstractNum>
-  <w:abstractNum w:abstractNumId="11">
+  <w:abstractNum w:abstractNumId="11" w15:restartNumberingAfterBreak="0">
     <w:nsid w:val="1CF62EED"/>
     <w:multiLevelType w:val="multilevel"/>
     <w:tmpl w:val="E3C69D7E"/>
@@ -24642,7 +24180,7 @@
       </w:rPr>
     </w:lvl>
   </w:abstractNum>
-  <w:abstractNum w:abstractNumId="12">
+  <w:abstractNum w:abstractNumId="12" w15:restartNumberingAfterBreak="0">
     <w:nsid w:val="1E322AB7"/>
     <w:multiLevelType w:val="multilevel"/>
     <w:tmpl w:val="F0AEDECC"/>
@@ -24791,7 +24329,7 @@
       </w:rPr>
     </w:lvl>
   </w:abstractNum>
-  <w:abstractNum w:abstractNumId="13">
+  <w:abstractNum w:abstractNumId="13" w15:restartNumberingAfterBreak="0">
     <w:nsid w:val="1E7523E9"/>
     <w:multiLevelType w:val="hybridMultilevel"/>
     <w:tmpl w:val="CC8A7934"/>
@@ -24904,7 +24442,7 @@
       </w:rPr>
     </w:lvl>
   </w:abstractNum>
-  <w:abstractNum w:abstractNumId="14">
+  <w:abstractNum w:abstractNumId="14" w15:restartNumberingAfterBreak="0">
     <w:nsid w:val="21B2682E"/>
     <w:multiLevelType w:val="multilevel"/>
     <w:tmpl w:val="E6DACC42"/>
@@ -25053,7 +24591,7 @@
       </w:rPr>
     </w:lvl>
   </w:abstractNum>
-  <w:abstractNum w:abstractNumId="15">
+  <w:abstractNum w:abstractNumId="15" w15:restartNumberingAfterBreak="0">
     <w:nsid w:val="26280072"/>
     <w:multiLevelType w:val="hybridMultilevel"/>
     <w:tmpl w:val="8B6646D4"/>
@@ -25166,7 +24704,7 @@
       </w:rPr>
     </w:lvl>
   </w:abstractNum>
-  <w:abstractNum w:abstractNumId="16">
+  <w:abstractNum w:abstractNumId="16" w15:restartNumberingAfterBreak="0">
     <w:nsid w:val="284B6D13"/>
     <w:multiLevelType w:val="multilevel"/>
     <w:tmpl w:val="810AF762"/>
@@ -25315,7 +24853,7 @@
       </w:rPr>
     </w:lvl>
   </w:abstractNum>
-  <w:abstractNum w:abstractNumId="17">
+  <w:abstractNum w:abstractNumId="17" w15:restartNumberingAfterBreak="0">
     <w:nsid w:val="2AE43608"/>
     <w:multiLevelType w:val="multilevel"/>
     <w:tmpl w:val="1B8AE976"/>
@@ -25464,7 +25002,7 @@
       </w:rPr>
     </w:lvl>
   </w:abstractNum>
-  <w:abstractNum w:abstractNumId="18">
+  <w:abstractNum w:abstractNumId="18" w15:restartNumberingAfterBreak="0">
     <w:nsid w:val="2C90491E"/>
     <w:multiLevelType w:val="multilevel"/>
     <w:tmpl w:val="860AC074"/>
@@ -25613,7 +25151,7 @@
       </w:rPr>
     </w:lvl>
   </w:abstractNum>
-  <w:abstractNum w:abstractNumId="19">
+  <w:abstractNum w:abstractNumId="19" w15:restartNumberingAfterBreak="0">
     <w:nsid w:val="33C554A8"/>
     <w:multiLevelType w:val="multilevel"/>
     <w:tmpl w:val="F1920414"/>
@@ -25762,7 +25300,7 @@
       </w:rPr>
     </w:lvl>
   </w:abstractNum>
-  <w:abstractNum w:abstractNumId="20">
+  <w:abstractNum w:abstractNumId="20" w15:restartNumberingAfterBreak="0">
     <w:nsid w:val="345D15DA"/>
     <w:multiLevelType w:val="multilevel"/>
     <w:tmpl w:val="F66C0E02"/>
@@ -25911,7 +25449,7 @@
       </w:rPr>
     </w:lvl>
   </w:abstractNum>
-  <w:abstractNum w:abstractNumId="21">
+  <w:abstractNum w:abstractNumId="21" w15:restartNumberingAfterBreak="0">
     <w:nsid w:val="3AB20AB7"/>
     <w:multiLevelType w:val="hybridMultilevel"/>
     <w:tmpl w:val="85EA0802"/>
@@ -26024,7 +25562,7 @@
       </w:rPr>
     </w:lvl>
   </w:abstractNum>
-  <w:abstractNum w:abstractNumId="22">
+  <w:abstractNum w:abstractNumId="22" w15:restartNumberingAfterBreak="0">
     <w:nsid w:val="3CD32167"/>
     <w:multiLevelType w:val="hybridMultilevel"/>
     <w:tmpl w:val="94983730"/>
@@ -26112,7 +25650,7 @@
       </w:pPr>
     </w:lvl>
   </w:abstractNum>
-  <w:abstractNum w:abstractNumId="23">
+  <w:abstractNum w:abstractNumId="23" w15:restartNumberingAfterBreak="0">
     <w:nsid w:val="3DE541BE"/>
     <w:multiLevelType w:val="multilevel"/>
     <w:tmpl w:val="CA1412F8"/>
@@ -26261,7 +25799,7 @@
       </w:rPr>
     </w:lvl>
   </w:abstractNum>
-  <w:abstractNum w:abstractNumId="24">
+  <w:abstractNum w:abstractNumId="24" w15:restartNumberingAfterBreak="0">
     <w:nsid w:val="3FB2565D"/>
     <w:multiLevelType w:val="hybridMultilevel"/>
     <w:tmpl w:val="DD660C40"/>
@@ -26374,7 +25912,7 @@
       </w:rPr>
     </w:lvl>
   </w:abstractNum>
-  <w:abstractNum w:abstractNumId="25">
+  <w:abstractNum w:abstractNumId="25" w15:restartNumberingAfterBreak="0">
     <w:nsid w:val="400B2358"/>
     <w:multiLevelType w:val="multilevel"/>
     <w:tmpl w:val="1CB4A3EA"/>
@@ -26523,7 +26061,7 @@
       </w:rPr>
     </w:lvl>
   </w:abstractNum>
-  <w:abstractNum w:abstractNumId="26">
+  <w:abstractNum w:abstractNumId="26" w15:restartNumberingAfterBreak="0">
     <w:nsid w:val="41AB794A"/>
     <w:multiLevelType w:val="multilevel"/>
     <w:tmpl w:val="982A28D6"/>
@@ -26672,7 +26210,7 @@
       </w:rPr>
     </w:lvl>
   </w:abstractNum>
-  <w:abstractNum w:abstractNumId="27">
+  <w:abstractNum w:abstractNumId="27" w15:restartNumberingAfterBreak="0">
     <w:nsid w:val="44011581"/>
     <w:multiLevelType w:val="multilevel"/>
     <w:tmpl w:val="5BCE4140"/>
@@ -26821,7 +26359,7 @@
       </w:rPr>
     </w:lvl>
   </w:abstractNum>
-  <w:abstractNum w:abstractNumId="28">
+  <w:abstractNum w:abstractNumId="28" w15:restartNumberingAfterBreak="0">
     <w:nsid w:val="4807013F"/>
     <w:multiLevelType w:val="multilevel"/>
     <w:tmpl w:val="DDF0E6AC"/>
@@ -26970,7 +26508,7 @@
       </w:rPr>
     </w:lvl>
   </w:abstractNum>
-  <w:abstractNum w:abstractNumId="29">
+  <w:abstractNum w:abstractNumId="29" w15:restartNumberingAfterBreak="0">
     <w:nsid w:val="4BE00318"/>
     <w:multiLevelType w:val="multilevel"/>
     <w:tmpl w:val="AC9ECBE6"/>
@@ -27119,7 +26657,7 @@
       </w:rPr>
     </w:lvl>
   </w:abstractNum>
-  <w:abstractNum w:abstractNumId="30">
+  <w:abstractNum w:abstractNumId="30" w15:restartNumberingAfterBreak="0">
     <w:nsid w:val="513361A9"/>
     <w:multiLevelType w:val="hybridMultilevel"/>
     <w:tmpl w:val="C7C8F82C"/>
@@ -27232,7 +26770,7 @@
       </w:rPr>
     </w:lvl>
   </w:abstractNum>
-  <w:abstractNum w:abstractNumId="31">
+  <w:abstractNum w:abstractNumId="31" w15:restartNumberingAfterBreak="0">
     <w:nsid w:val="56024FA9"/>
     <w:multiLevelType w:val="hybridMultilevel"/>
     <w:tmpl w:val="7626FC98"/>
@@ -27345,7 +26883,7 @@
       </w:rPr>
     </w:lvl>
   </w:abstractNum>
-  <w:abstractNum w:abstractNumId="32">
+  <w:abstractNum w:abstractNumId="32" w15:restartNumberingAfterBreak="0">
     <w:nsid w:val="58D40229"/>
     <w:multiLevelType w:val="hybridMultilevel"/>
     <w:tmpl w:val="B75E4606"/>
@@ -27458,7 +26996,7 @@
       </w:rPr>
     </w:lvl>
   </w:abstractNum>
-  <w:abstractNum w:abstractNumId="33">
+  <w:abstractNum w:abstractNumId="33" w15:restartNumberingAfterBreak="0">
     <w:nsid w:val="5A827001"/>
     <w:multiLevelType w:val="multilevel"/>
     <w:tmpl w:val="57A6D6CE"/>
@@ -27607,7 +27145,7 @@
       </w:rPr>
     </w:lvl>
   </w:abstractNum>
-  <w:abstractNum w:abstractNumId="34">
+  <w:abstractNum w:abstractNumId="34" w15:restartNumberingAfterBreak="0">
     <w:nsid w:val="6260393E"/>
     <w:multiLevelType w:val="multilevel"/>
     <w:tmpl w:val="63DC6922"/>
@@ -27756,7 +27294,7 @@
       </w:rPr>
     </w:lvl>
   </w:abstractNum>
-  <w:abstractNum w:abstractNumId="35">
+  <w:abstractNum w:abstractNumId="35" w15:restartNumberingAfterBreak="0">
     <w:nsid w:val="62995058"/>
     <w:multiLevelType w:val="multilevel"/>
     <w:tmpl w:val="04046134"/>
@@ -27905,7 +27443,7 @@
       </w:rPr>
     </w:lvl>
   </w:abstractNum>
-  <w:abstractNum w:abstractNumId="36">
+  <w:abstractNum w:abstractNumId="36" w15:restartNumberingAfterBreak="0">
     <w:nsid w:val="63172271"/>
     <w:multiLevelType w:val="hybridMultilevel"/>
     <w:tmpl w:val="A50AF52C"/>
@@ -28018,7 +27556,7 @@
       </w:rPr>
     </w:lvl>
   </w:abstractNum>
-  <w:abstractNum w:abstractNumId="37">
+  <w:abstractNum w:abstractNumId="37" w15:restartNumberingAfterBreak="0">
     <w:nsid w:val="65536925"/>
     <w:multiLevelType w:val="multilevel"/>
     <w:tmpl w:val="DEFC15F2"/>
@@ -28167,7 +27705,7 @@
       </w:rPr>
     </w:lvl>
   </w:abstractNum>
-  <w:abstractNum w:abstractNumId="38">
+  <w:abstractNum w:abstractNumId="38" w15:restartNumberingAfterBreak="0">
     <w:nsid w:val="67F85490"/>
     <w:multiLevelType w:val="multilevel"/>
     <w:tmpl w:val="C1A8FBDE"/>
@@ -28316,7 +27854,7 @@
       </w:rPr>
     </w:lvl>
   </w:abstractNum>
-  <w:abstractNum w:abstractNumId="39">
+  <w:abstractNum w:abstractNumId="39" w15:restartNumberingAfterBreak="0">
     <w:nsid w:val="6BD22E20"/>
     <w:multiLevelType w:val="hybridMultilevel"/>
     <w:tmpl w:val="811469EA"/>
@@ -28429,7 +27967,7 @@
       </w:rPr>
     </w:lvl>
   </w:abstractNum>
-  <w:abstractNum w:abstractNumId="40">
+  <w:abstractNum w:abstractNumId="40" w15:restartNumberingAfterBreak="0">
     <w:nsid w:val="6D505F0B"/>
     <w:multiLevelType w:val="hybridMultilevel"/>
     <w:tmpl w:val="06F2C544"/>
@@ -28542,7 +28080,7 @@
       </w:rPr>
     </w:lvl>
   </w:abstractNum>
-  <w:abstractNum w:abstractNumId="41">
+  <w:abstractNum w:abstractNumId="41" w15:restartNumberingAfterBreak="0">
     <w:nsid w:val="77D16C24"/>
     <w:multiLevelType w:val="hybridMultilevel"/>
     <w:tmpl w:val="CBF041A0"/>
@@ -28655,7 +28193,7 @@
       </w:rPr>
     </w:lvl>
   </w:abstractNum>
-  <w:abstractNum w:abstractNumId="42">
+  <w:abstractNum w:abstractNumId="42" w15:restartNumberingAfterBreak="0">
     <w:nsid w:val="79661773"/>
     <w:multiLevelType w:val="multilevel"/>
     <w:tmpl w:val="875C47DA"/>
@@ -28804,7 +28342,7 @@
       </w:rPr>
     </w:lvl>
   </w:abstractNum>
-  <w:abstractNum w:abstractNumId="43">
+  <w:abstractNum w:abstractNumId="43" w15:restartNumberingAfterBreak="0">
     <w:nsid w:val="7EDE655C"/>
     <w:multiLevelType w:val="multilevel"/>
     <w:tmpl w:val="850223B8"/>
@@ -28953,136 +28491,136 @@
       </w:rPr>
     </w:lvl>
   </w:abstractNum>
-  <w:num w:numId="1">
+  <w:num w:numId="1" w16cid:durableId="252318366">
     <w:abstractNumId w:val="22"/>
   </w:num>
-  <w:num w:numId="2">
+  <w:num w:numId="2" w16cid:durableId="1869417125">
     <w:abstractNumId w:val="15"/>
   </w:num>
-  <w:num w:numId="3">
+  <w:num w:numId="3" w16cid:durableId="304428849">
     <w:abstractNumId w:val="4"/>
   </w:num>
-  <w:num w:numId="4">
+  <w:num w:numId="4" w16cid:durableId="1112550684">
     <w:abstractNumId w:val="34"/>
   </w:num>
-  <w:num w:numId="5">
+  <w:num w:numId="5" w16cid:durableId="2096632828">
     <w:abstractNumId w:val="33"/>
   </w:num>
-  <w:num w:numId="6">
+  <w:num w:numId="6" w16cid:durableId="53093353">
     <w:abstractNumId w:val="3"/>
   </w:num>
-  <w:num w:numId="7">
+  <w:num w:numId="7" w16cid:durableId="906916921">
     <w:abstractNumId w:val="35"/>
   </w:num>
-  <w:num w:numId="8">
+  <w:num w:numId="8" w16cid:durableId="158733327">
     <w:abstractNumId w:val="38"/>
   </w:num>
-  <w:num w:numId="9">
+  <w:num w:numId="9" w16cid:durableId="1384333484">
     <w:abstractNumId w:val="43"/>
   </w:num>
-  <w:num w:numId="10">
+  <w:num w:numId="10" w16cid:durableId="1850100928">
     <w:abstractNumId w:val="21"/>
   </w:num>
-  <w:num w:numId="11">
+  <w:num w:numId="11" w16cid:durableId="1721634926">
     <w:abstractNumId w:val="40"/>
   </w:num>
-  <w:num w:numId="12">
+  <w:num w:numId="12" w16cid:durableId="563877528">
     <w:abstractNumId w:val="24"/>
   </w:num>
-  <w:num w:numId="13">
+  <w:num w:numId="13" w16cid:durableId="1104037675">
     <w:abstractNumId w:val="2"/>
   </w:num>
-  <w:num w:numId="14">
+  <w:num w:numId="14" w16cid:durableId="2055999815">
     <w:abstractNumId w:val="1"/>
   </w:num>
-  <w:num w:numId="15">
+  <w:num w:numId="15" w16cid:durableId="2131388916">
     <w:abstractNumId w:val="27"/>
   </w:num>
-  <w:num w:numId="16">
+  <w:num w:numId="16" w16cid:durableId="338896557">
     <w:abstractNumId w:val="14"/>
   </w:num>
-  <w:num w:numId="17">
+  <w:num w:numId="17" w16cid:durableId="1862163114">
     <w:abstractNumId w:val="42"/>
   </w:num>
-  <w:num w:numId="18">
+  <w:num w:numId="18" w16cid:durableId="197353297">
     <w:abstractNumId w:val="37"/>
   </w:num>
-  <w:num w:numId="19">
+  <w:num w:numId="19" w16cid:durableId="1727987850">
     <w:abstractNumId w:val="17"/>
   </w:num>
-  <w:num w:numId="20">
+  <w:num w:numId="20" w16cid:durableId="1759522638">
     <w:abstractNumId w:val="11"/>
   </w:num>
-  <w:num w:numId="21">
+  <w:num w:numId="21" w16cid:durableId="1186096566">
     <w:abstractNumId w:val="25"/>
   </w:num>
-  <w:num w:numId="22">
+  <w:num w:numId="22" w16cid:durableId="960653236">
     <w:abstractNumId w:val="32"/>
   </w:num>
-  <w:num w:numId="23">
+  <w:num w:numId="23" w16cid:durableId="461071403">
     <w:abstractNumId w:val="9"/>
   </w:num>
-  <w:num w:numId="24">
+  <w:num w:numId="24" w16cid:durableId="1597210247">
     <w:abstractNumId w:val="12"/>
   </w:num>
-  <w:num w:numId="25">
+  <w:num w:numId="25" w16cid:durableId="41056746">
     <w:abstractNumId w:val="28"/>
   </w:num>
-  <w:num w:numId="26">
+  <w:num w:numId="26" w16cid:durableId="2124568531">
     <w:abstractNumId w:val="5"/>
   </w:num>
-  <w:num w:numId="27">
+  <w:num w:numId="27" w16cid:durableId="1655521512">
     <w:abstractNumId w:val="10"/>
   </w:num>
-  <w:num w:numId="28">
+  <w:num w:numId="28" w16cid:durableId="2144423586">
     <w:abstractNumId w:val="0"/>
   </w:num>
-  <w:num w:numId="29">
+  <w:num w:numId="29" w16cid:durableId="105779207">
     <w:abstractNumId w:val="26"/>
   </w:num>
-  <w:num w:numId="30">
+  <w:num w:numId="30" w16cid:durableId="491258051">
     <w:abstractNumId w:val="20"/>
   </w:num>
-  <w:num w:numId="31">
+  <w:num w:numId="31" w16cid:durableId="1707556555">
     <w:abstractNumId w:val="18"/>
   </w:num>
-  <w:num w:numId="32">
+  <w:num w:numId="32" w16cid:durableId="1540124617">
     <w:abstractNumId w:val="19"/>
   </w:num>
-  <w:num w:numId="33">
+  <w:num w:numId="33" w16cid:durableId="1547178886">
     <w:abstractNumId w:val="23"/>
   </w:num>
-  <w:num w:numId="34">
+  <w:num w:numId="34" w16cid:durableId="43529859">
     <w:abstractNumId w:val="29"/>
   </w:num>
-  <w:num w:numId="35">
+  <w:num w:numId="35" w16cid:durableId="956837830">
     <w:abstractNumId w:val="6"/>
   </w:num>
-  <w:num w:numId="36">
+  <w:num w:numId="36" w16cid:durableId="2047217954">
     <w:abstractNumId w:val="16"/>
   </w:num>
-  <w:num w:numId="37">
+  <w:num w:numId="37" w16cid:durableId="1732387487">
     <w:abstractNumId w:val="36"/>
   </w:num>
-  <w:num w:numId="38">
+  <w:num w:numId="38" w16cid:durableId="865556825">
     <w:abstractNumId w:val="30"/>
   </w:num>
-  <w:num w:numId="39">
+  <w:num w:numId="39" w16cid:durableId="1753509881">
     <w:abstractNumId w:val="7"/>
   </w:num>
-  <w:num w:numId="40">
+  <w:num w:numId="40" w16cid:durableId="303894626">
     <w:abstractNumId w:val="13"/>
   </w:num>
-  <w:num w:numId="41">
+  <w:num w:numId="41" w16cid:durableId="1830903722">
     <w:abstractNumId w:val="41"/>
   </w:num>
-  <w:num w:numId="42">
+  <w:num w:numId="42" w16cid:durableId="942884107">
     <w:abstractNumId w:val="39"/>
   </w:num>
-  <w:num w:numId="43">
+  <w:num w:numId="43" w16cid:durableId="2102018643">
     <w:abstractNumId w:val="8"/>
   </w:num>
-  <w:num w:numId="44">
+  <w:num w:numId="44" w16cid:durableId="304043266">
     <w:abstractNumId w:val="31"/>
   </w:num>
   <w:numIdMacAtCleanup w:val="44"/>
@@ -29090,7 +28628,7 @@
 </file>
 
 <file path=word/styles.xml><?xml version="1.0" encoding="utf-8"?>
-<w:styles xmlns:mc="http://schemas.openxmlformats.org/markup-compatibility/2006" xmlns:r="http://schemas.openxmlformats.org/officeDocument/2006/relationships" xmlns:w="http://schemas.openxmlformats.org/wordprocessingml/2006/main" xmlns:w14="http://schemas.microsoft.com/office/word/2010/wordml" xmlns:w15="http://schemas.microsoft.com/office/word/2012/wordml" mc:Ignorable="w14 w15">
+<w:styles xmlns:mc="http://schemas.openxmlformats.org/markup-compatibility/2006" xmlns:r="http://schemas.openxmlformats.org/officeDocument/2006/relationships" xmlns:w="http://schemas.openxmlformats.org/wordprocessingml/2006/main" xmlns:w14="http://schemas.microsoft.com/office/word/2010/wordml" xmlns:w15="http://schemas.microsoft.com/office/word/2012/wordml" xmlns:w16cex="http://schemas.microsoft.com/office/word/2018/wordml/cex" xmlns:w16cid="http://schemas.microsoft.com/office/word/2016/wordml/cid" xmlns:w16="http://schemas.microsoft.com/office/word/2018/wordml" xmlns:w16du="http://schemas.microsoft.com/office/word/2023/wordml/word16du" xmlns:w16sdtdh="http://schemas.microsoft.com/office/word/2020/wordml/sdtdatahash" xmlns:w16sdtfl="http://schemas.microsoft.com/office/word/2024/wordml/sdtformatlock" xmlns:w16se="http://schemas.microsoft.com/office/word/2015/wordml/symex" mc:Ignorable="w14 w15 w16se w16cid w16 w16cex w16sdtdh w16sdtfl w16du">
   <w:docDefaults>
     <w:rPrDefault>
       <w:rPr>
@@ -29106,7 +28644,7 @@
       </w:pPr>
     </w:pPrDefault>
   </w:docDefaults>
-  <w:latentStyles w:defLockedState="0" w:defUIPriority="99" w:defSemiHidden="0" w:defUnhideWhenUsed="0" w:defQFormat="0" w:count="371">
+  <w:latentStyles w:defLockedState="0" w:defUIPriority="99" w:defSemiHidden="0" w:defUnhideWhenUsed="0" w:defQFormat="0" w:count="376">
     <w:lsdException w:name="Normal" w:uiPriority="0" w:qFormat="1"/>
     <w:lsdException w:name="heading 1" w:uiPriority="9" w:qFormat="1"/>
     <w:lsdException w:name="heading 2" w:semiHidden="1" w:uiPriority="9" w:unhideWhenUsed="1" w:qFormat="1"/>
@@ -29478,6 +29016,11 @@
     <w:lsdException w:name="List Table 5 Dark Accent 6" w:uiPriority="50"/>
     <w:lsdException w:name="List Table 6 Colorful Accent 6" w:uiPriority="51"/>
     <w:lsdException w:name="List Table 7 Colorful Accent 6" w:uiPriority="52"/>
+    <w:lsdException w:name="Mention" w:semiHidden="1" w:unhideWhenUsed="1"/>
+    <w:lsdException w:name="Smart Hyperlink" w:semiHidden="1" w:unhideWhenUsed="1"/>
+    <w:lsdException w:name="Hashtag" w:semiHidden="1" w:unhideWhenUsed="1"/>
+    <w:lsdException w:name="Unresolved Mention" w:semiHidden="1" w:unhideWhenUsed="1"/>
+    <w:lsdException w:name="Smart Link" w:semiHidden="1" w:unhideWhenUsed="1"/>
   </w:latentStyles>
   <w:style w:type="paragraph" w:default="1" w:styleId="Normal">
     <w:name w:val="Normal"/>
@@ -29609,7 +29152,6 @@
       <w:spacing w:after="0" w:line="240" w:lineRule="auto"/>
     </w:pPr>
     <w:tblPr>
-      <w:tblInd w:w="0" w:type="dxa"/>
       <w:tblBorders>
         <w:top w:val="single" w:sz="4" w:space="0" w:color="auto"/>
         <w:left w:val="single" w:sz="4" w:space="0" w:color="auto"/>
@@ -29618,12 +29160,6 @@
         <w:insideH w:val="single" w:sz="4" w:space="0" w:color="auto"/>
         <w:insideV w:val="single" w:sz="4" w:space="0" w:color="auto"/>
       </w:tblBorders>
-      <w:tblCellMar>
-        <w:top w:w="0" w:type="dxa"/>
-        <w:left w:w="108" w:type="dxa"/>
-        <w:bottom w:w="0" w:type="dxa"/>
-        <w:right w:w="108" w:type="dxa"/>
-      </w:tblCellMar>
     </w:tblPr>
   </w:style>
   <w:style w:type="character" w:customStyle="1" w:styleId="Ttulo1Car">
@@ -29650,7 +29186,7 @@
       <w:sz w:val="28"/>
     </w:rPr>
   </w:style>
-  <w:style w:type="paragraph" w:styleId="TtulodeTDC">
+  <w:style w:type="paragraph" w:styleId="TtuloTDC">
     <w:name w:val="TOC Heading"/>
     <w:basedOn w:val="Ttulo1"/>
     <w:next w:val="Normal"/>
@@ -29763,7 +29299,7 @@
       <w:u w:val="single"/>
     </w:rPr>
   </w:style>
-  <w:style w:type="character" w:styleId="Textoennegrita">
+  <w:style w:type="character" w:styleId="Fuerte">
     <w:name w:val="Strong"/>
     <w:basedOn w:val="Fuentedeprrafopredeter"/>
     <w:uiPriority w:val="22"/>
@@ -29839,8 +29375,8 @@
       <w:ind w:left="480"/>
     </w:pPr>
   </w:style>
-  <w:style w:type="character" w:customStyle="1" w:styleId="UnresolvedMention">
-    <w:name w:val="Unresolved Mention"/>
+  <w:style w:type="character" w:customStyle="1" w:styleId="Mencinsinresolver1">
+    <w:name w:val="Mención sin resolver1"/>
     <w:basedOn w:val="Fuentedeprrafopredeter"/>
     <w:uiPriority w:val="99"/>
     <w:semiHidden/>

</xml_diff>